<commit_message>
Agregación de Requerimientos Funcionales sobre finanzas, acompañantes y valoración
</commit_message>
<xml_diff>
--- a/TPI Análisis de sistemas.docx
+++ b/TPI Análisis de sistemas.docx
@@ -1,6 +1,6 @@
 
 <file path=word/document.xml><?xml version="1.0" encoding="utf-8"?>
-<w:document xmlns:wpc="http://schemas.microsoft.com/office/word/2010/wordprocessingCanvas" xmlns:mc="http://schemas.openxmlformats.org/markup-compatibility/2006" xmlns:o="urn:schemas-microsoft-com:office:office" xmlns:r="http://schemas.openxmlformats.org/officeDocument/2006/relationships" xmlns:m="http://schemas.openxmlformats.org/officeDocument/2006/math" xmlns:v="urn:schemas-microsoft-com:vml" xmlns:wp14="http://schemas.microsoft.com/office/word/2010/wordprocessingDrawing" xmlns:wp="http://schemas.openxmlformats.org/drawingml/2006/wordprocessingDrawing" xmlns:w10="urn:schemas-microsoft-com:office:word" xmlns:w="http://schemas.openxmlformats.org/wordprocessingml/2006/main" xmlns:w14="http://schemas.microsoft.com/office/word/2010/wordml" xmlns:w15="http://schemas.microsoft.com/office/word/2012/wordml" xmlns:wpg="http://schemas.microsoft.com/office/word/2010/wordprocessingGroup" xmlns:wpi="http://schemas.microsoft.com/office/word/2010/wordprocessingInk" xmlns:wne="http://schemas.microsoft.com/office/word/2006/wordml" xmlns:wps="http://schemas.microsoft.com/office/word/2010/wordprocessingShape" mc:Ignorable="w14 w15 wp14">
+<w:document xmlns:wpc="http://schemas.microsoft.com/office/word/2010/wordprocessingCanvas" xmlns:mc="http://schemas.openxmlformats.org/markup-compatibility/2006" xmlns:o="urn:schemas-microsoft-com:office:office" xmlns:r="http://schemas.openxmlformats.org/officeDocument/2006/relationships" xmlns:m="http://schemas.openxmlformats.org/officeDocument/2006/math" xmlns:v="urn:schemas-microsoft-com:vml" xmlns:wp14="http://schemas.microsoft.com/office/word/2010/wordprocessingDrawing" xmlns:wp="http://schemas.openxmlformats.org/drawingml/2006/wordprocessingDrawing" xmlns:w10="urn:schemas-microsoft-com:office:word" xmlns:w="http://schemas.openxmlformats.org/wordprocessingml/2006/main" xmlns:w14="http://schemas.microsoft.com/office/word/2010/wordml" xmlns:wpg="http://schemas.microsoft.com/office/word/2010/wordprocessingGroup" xmlns:wpi="http://schemas.microsoft.com/office/word/2010/wordprocessingInk" xmlns:wne="http://schemas.microsoft.com/office/word/2006/wordml" xmlns:wps="http://schemas.microsoft.com/office/word/2010/wordprocessingShape" mc:Ignorable="w14 wp14">
   <w:body>
     <w:p>
       <w:pPr>
@@ -378,51 +378,8 @@
         </w:rPr>
         <w:t xml:space="preserve"> </w:t>
       </w:r>
-    </w:p>
-    <w:p>
-      <w:pPr>
-        <w:pStyle w:val="Ttulo2"/>
-        <w:ind w:left="0"/>
-        <w:rPr>
-          <w:sz w:val="18"/>
-          <w:szCs w:val="18"/>
-          <w:lang w:val="es-AR"/>
-        </w:rPr>
-      </w:pPr>
       <w:bookmarkStart w:id="3" w:name="_u31e971vnvql" w:colFirst="0" w:colLast="0"/>
       <w:bookmarkEnd w:id="3"/>
-      <w:r>
-        <w:rPr>
-          <w:color w:val="000000"/>
-          <w:lang w:val="es-AR"/>
-        </w:rPr>
-        <w:t>ACTOR</w:t>
-      </w:r>
-      <w:proofErr w:type="gramStart"/>
-      <w:r>
-        <w:rPr>
-          <w:color w:val="000000"/>
-          <w:lang w:val="es-AR"/>
-        </w:rPr>
-        <w:t>:</w:t>
-      </w:r>
-      <w:r>
-        <w:rPr>
-          <w:lang w:val="es-AR"/>
-        </w:rPr>
-        <w:t xml:space="preserve"> </w:t>
-      </w:r>
-      <w:r>
-        <w:rPr>
-          <w:rFonts w:ascii="Arial" w:eastAsia="Arial" w:hAnsi="Arial" w:cs="Arial"/>
-          <w:color w:val="000000"/>
-          <w:sz w:val="22"/>
-          <w:szCs w:val="22"/>
-          <w:lang w:val="es-AR"/>
-        </w:rPr>
-        <w:t xml:space="preserve"> usuario</w:t>
-      </w:r>
-      <w:proofErr w:type="gramEnd"/>
     </w:p>
     <w:tbl>
       <w:tblPr>
@@ -811,7 +768,7 @@
                 <w:sz w:val="20"/>
                 <w:szCs w:val="20"/>
               </w:rPr>
-              <w:t>RF3</w:t>
+              <w:t>003</w:t>
             </w:r>
           </w:p>
           <w:p>
@@ -888,7 +845,12 @@
             </w:r>
             <w:proofErr w:type="spellStart"/>
             <w:r>
-              <w:t>datos</w:t>
+              <w:t>dat</w:t>
+            </w:r>
+            <w:bookmarkStart w:id="4" w:name="_GoBack"/>
+            <w:bookmarkEnd w:id="4"/>
+            <w:r>
+              <w:t>os</w:t>
             </w:r>
             <w:proofErr w:type="spellEnd"/>
             <w:r>
@@ -927,7 +889,7 @@
                 <w:sz w:val="20"/>
                 <w:szCs w:val="20"/>
               </w:rPr>
-              <w:t>RF4</w:t>
+              <w:t>004</w:t>
             </w:r>
           </w:p>
           <w:p>
@@ -1079,7 +1041,7 @@
                 <w:sz w:val="20"/>
                 <w:szCs w:val="20"/>
               </w:rPr>
-              <w:t>RF5</w:t>
+              <w:t>006</w:t>
             </w:r>
           </w:p>
           <w:p>
@@ -1124,6 +1086,208 @@
                 <w:lang w:val="es-AR"/>
               </w:rPr>
             </w:pPr>
+            <w:r>
+              <w:rPr>
+                <w:rFonts w:ascii="Helvetica" w:hAnsi="Helvetica" w:cs="Helvetica"/>
+              </w:rPr>
+              <w:t xml:space="preserve">Registrar el </w:t>
+            </w:r>
+            <w:proofErr w:type="spellStart"/>
+            <w:r>
+              <w:rPr>
+                <w:rFonts w:ascii="Helvetica" w:hAnsi="Helvetica" w:cs="Helvetica"/>
+              </w:rPr>
+              <w:t>pago</w:t>
+            </w:r>
+            <w:proofErr w:type="spellEnd"/>
+            <w:r>
+              <w:rPr>
+                <w:rFonts w:ascii="Helvetica" w:hAnsi="Helvetica" w:cs="Helvetica"/>
+              </w:rPr>
+              <w:t xml:space="preserve"> de un </w:t>
+            </w:r>
+            <w:proofErr w:type="spellStart"/>
+            <w:r>
+              <w:rPr>
+                <w:rFonts w:ascii="Helvetica" w:hAnsi="Helvetica" w:cs="Helvetica"/>
+              </w:rPr>
+              <w:t>retiro</w:t>
+            </w:r>
+            <w:proofErr w:type="spellEnd"/>
+            <w:r>
+              <w:rPr>
+                <w:rFonts w:ascii="Helvetica" w:hAnsi="Helvetica" w:cs="Helvetica"/>
+              </w:rPr>
+              <w:t xml:space="preserve">. El </w:t>
+            </w:r>
+            <w:proofErr w:type="spellStart"/>
+            <w:r>
+              <w:rPr>
+                <w:rFonts w:ascii="Helvetica" w:hAnsi="Helvetica" w:cs="Helvetica"/>
+              </w:rPr>
+              <w:t>sistema</w:t>
+            </w:r>
+            <w:proofErr w:type="spellEnd"/>
+            <w:r>
+              <w:rPr>
+                <w:rFonts w:ascii="Helvetica" w:hAnsi="Helvetica" w:cs="Helvetica"/>
+              </w:rPr>
+              <w:t xml:space="preserve"> </w:t>
+            </w:r>
+            <w:proofErr w:type="spellStart"/>
+            <w:r>
+              <w:rPr>
+                <w:rFonts w:ascii="Helvetica" w:hAnsi="Helvetica" w:cs="Helvetica"/>
+              </w:rPr>
+              <w:t>deberá</w:t>
+            </w:r>
+            <w:proofErr w:type="spellEnd"/>
+            <w:r>
+              <w:rPr>
+                <w:rFonts w:ascii="Helvetica" w:hAnsi="Helvetica" w:cs="Helvetica"/>
+              </w:rPr>
+              <w:t xml:space="preserve"> </w:t>
+            </w:r>
+            <w:proofErr w:type="spellStart"/>
+            <w:r>
+              <w:rPr>
+                <w:rFonts w:ascii="Helvetica" w:hAnsi="Helvetica" w:cs="Helvetica"/>
+              </w:rPr>
+              <w:t>permitir</w:t>
+            </w:r>
+            <w:proofErr w:type="spellEnd"/>
+            <w:r>
+              <w:rPr>
+                <w:rFonts w:ascii="Helvetica" w:hAnsi="Helvetica" w:cs="Helvetica"/>
+              </w:rPr>
+              <w:t xml:space="preserve"> registrar el </w:t>
+            </w:r>
+            <w:proofErr w:type="spellStart"/>
+            <w:r>
+              <w:rPr>
+                <w:rFonts w:ascii="Helvetica" w:hAnsi="Helvetica" w:cs="Helvetica"/>
+              </w:rPr>
+              <w:t>pago</w:t>
+            </w:r>
+            <w:proofErr w:type="spellEnd"/>
+            <w:r>
+              <w:rPr>
+                <w:rFonts w:ascii="Helvetica" w:hAnsi="Helvetica" w:cs="Helvetica"/>
+              </w:rPr>
+              <w:t xml:space="preserve"> total y/o </w:t>
+            </w:r>
+            <w:proofErr w:type="spellStart"/>
+            <w:r>
+              <w:rPr>
+                <w:rFonts w:ascii="Helvetica" w:hAnsi="Helvetica" w:cs="Helvetica"/>
+              </w:rPr>
+              <w:t>parcial</w:t>
+            </w:r>
+            <w:proofErr w:type="spellEnd"/>
+            <w:r>
+              <w:rPr>
+                <w:rFonts w:ascii="Helvetica" w:hAnsi="Helvetica" w:cs="Helvetica"/>
+              </w:rPr>
+              <w:t xml:space="preserve"> del </w:t>
+            </w:r>
+            <w:proofErr w:type="spellStart"/>
+            <w:r>
+              <w:rPr>
+                <w:rFonts w:ascii="Helvetica" w:hAnsi="Helvetica" w:cs="Helvetica"/>
+              </w:rPr>
+              <w:t>retiro</w:t>
+            </w:r>
+            <w:proofErr w:type="spellEnd"/>
+            <w:r>
+              <w:rPr>
+                <w:rFonts w:ascii="Helvetica" w:hAnsi="Helvetica" w:cs="Helvetica"/>
+              </w:rPr>
+              <w:t xml:space="preserve"> </w:t>
+            </w:r>
+            <w:proofErr w:type="spellStart"/>
+            <w:r>
+              <w:rPr>
+                <w:rFonts w:ascii="Helvetica" w:hAnsi="Helvetica" w:cs="Helvetica"/>
+              </w:rPr>
+              <w:t>teniendo</w:t>
+            </w:r>
+            <w:proofErr w:type="spellEnd"/>
+            <w:r>
+              <w:rPr>
+                <w:rFonts w:ascii="Helvetica" w:hAnsi="Helvetica" w:cs="Helvetica"/>
+              </w:rPr>
+              <w:t xml:space="preserve"> </w:t>
+            </w:r>
+            <w:proofErr w:type="spellStart"/>
+            <w:r>
+              <w:rPr>
+                <w:rFonts w:ascii="Helvetica" w:hAnsi="Helvetica" w:cs="Helvetica"/>
+              </w:rPr>
+              <w:t>en</w:t>
+            </w:r>
+            <w:proofErr w:type="spellEnd"/>
+            <w:r>
+              <w:rPr>
+                <w:rFonts w:ascii="Helvetica" w:hAnsi="Helvetica" w:cs="Helvetica"/>
+              </w:rPr>
+              <w:t xml:space="preserve"> </w:t>
+            </w:r>
+            <w:proofErr w:type="spellStart"/>
+            <w:r>
+              <w:rPr>
+                <w:rFonts w:ascii="Helvetica" w:hAnsi="Helvetica" w:cs="Helvetica"/>
+              </w:rPr>
+              <w:t>cuenta</w:t>
+            </w:r>
+            <w:proofErr w:type="spellEnd"/>
+            <w:r>
+              <w:rPr>
+                <w:rFonts w:ascii="Helvetica" w:hAnsi="Helvetica" w:cs="Helvetica"/>
+              </w:rPr>
+              <w:t xml:space="preserve"> </w:t>
+            </w:r>
+            <w:proofErr w:type="spellStart"/>
+            <w:r>
+              <w:rPr>
+                <w:rFonts w:ascii="Helvetica" w:hAnsi="Helvetica" w:cs="Helvetica"/>
+              </w:rPr>
+              <w:t>fecha</w:t>
+            </w:r>
+            <w:proofErr w:type="spellEnd"/>
+            <w:r>
+              <w:rPr>
+                <w:rFonts w:ascii="Helvetica" w:hAnsi="Helvetica" w:cs="Helvetica"/>
+              </w:rPr>
+              <w:t xml:space="preserve">, </w:t>
+            </w:r>
+            <w:proofErr w:type="spellStart"/>
+            <w:r>
+              <w:rPr>
+                <w:rFonts w:ascii="Helvetica" w:hAnsi="Helvetica" w:cs="Helvetica"/>
+              </w:rPr>
+              <w:t>monto</w:t>
+            </w:r>
+            <w:proofErr w:type="spellEnd"/>
+            <w:r>
+              <w:rPr>
+                <w:rFonts w:ascii="Helvetica" w:hAnsi="Helvetica" w:cs="Helvetica"/>
+              </w:rPr>
+              <w:t xml:space="preserve">, </w:t>
+            </w:r>
+            <w:proofErr w:type="spellStart"/>
+            <w:r>
+              <w:rPr>
+                <w:rFonts w:ascii="Helvetica" w:hAnsi="Helvetica" w:cs="Helvetica"/>
+              </w:rPr>
+              <w:t>método</w:t>
+            </w:r>
+            <w:proofErr w:type="spellEnd"/>
+            <w:r>
+              <w:rPr>
+                <w:rFonts w:ascii="Helvetica" w:hAnsi="Helvetica" w:cs="Helvetica"/>
+              </w:rPr>
+              <w:t>.</w:t>
+            </w:r>
           </w:p>
         </w:tc>
       </w:tr>
@@ -1157,7 +1321,7 @@
                 <w:sz w:val="20"/>
                 <w:szCs w:val="20"/>
               </w:rPr>
-              <w:t>RF6</w:t>
+              <w:t>007</w:t>
             </w:r>
           </w:p>
           <w:p>
@@ -1199,6 +1363,146 @@
               <w:spacing w:line="240" w:lineRule="auto"/>
               <w:ind w:left="0"/>
             </w:pPr>
+            <w:r>
+              <w:rPr>
+                <w:rFonts w:ascii="Helvetica" w:hAnsi="Helvetica" w:cs="Helvetica"/>
+              </w:rPr>
+              <w:t xml:space="preserve">Registrar la </w:t>
+            </w:r>
+            <w:proofErr w:type="spellStart"/>
+            <w:r>
+              <w:rPr>
+                <w:rFonts w:ascii="Helvetica" w:hAnsi="Helvetica" w:cs="Helvetica"/>
+              </w:rPr>
+              <w:t>valoración</w:t>
+            </w:r>
+            <w:proofErr w:type="spellEnd"/>
+            <w:r>
+              <w:rPr>
+                <w:rFonts w:ascii="Helvetica" w:hAnsi="Helvetica" w:cs="Helvetica"/>
+              </w:rPr>
+              <w:t xml:space="preserve"> personal del </w:t>
+            </w:r>
+            <w:proofErr w:type="spellStart"/>
+            <w:r>
+              <w:rPr>
+                <w:rFonts w:ascii="Helvetica" w:hAnsi="Helvetica" w:cs="Helvetica"/>
+              </w:rPr>
+              <w:t>retiro</w:t>
+            </w:r>
+            <w:proofErr w:type="spellEnd"/>
+            <w:r>
+              <w:rPr>
+                <w:rFonts w:ascii="Helvetica" w:hAnsi="Helvetica" w:cs="Helvetica"/>
+              </w:rPr>
+              <w:t xml:space="preserve">. El </w:t>
+            </w:r>
+            <w:proofErr w:type="spellStart"/>
+            <w:r>
+              <w:rPr>
+                <w:rFonts w:ascii="Helvetica" w:hAnsi="Helvetica" w:cs="Helvetica"/>
+              </w:rPr>
+              <w:t>sistema</w:t>
+            </w:r>
+            <w:proofErr w:type="spellEnd"/>
+            <w:r>
+              <w:rPr>
+                <w:rFonts w:ascii="Helvetica" w:hAnsi="Helvetica" w:cs="Helvetica"/>
+              </w:rPr>
+              <w:t xml:space="preserve"> </w:t>
+            </w:r>
+            <w:proofErr w:type="spellStart"/>
+            <w:r>
+              <w:rPr>
+                <w:rFonts w:ascii="Helvetica" w:hAnsi="Helvetica" w:cs="Helvetica"/>
+              </w:rPr>
+              <w:t>deberá</w:t>
+            </w:r>
+            <w:proofErr w:type="spellEnd"/>
+            <w:r>
+              <w:rPr>
+                <w:rFonts w:ascii="Helvetica" w:hAnsi="Helvetica" w:cs="Helvetica"/>
+              </w:rPr>
+              <w:t xml:space="preserve"> </w:t>
+            </w:r>
+            <w:proofErr w:type="spellStart"/>
+            <w:r>
+              <w:rPr>
+                <w:rFonts w:ascii="Helvetica" w:hAnsi="Helvetica" w:cs="Helvetica"/>
+              </w:rPr>
+              <w:t>permitir</w:t>
+            </w:r>
+            <w:proofErr w:type="spellEnd"/>
+            <w:r>
+              <w:rPr>
+                <w:rFonts w:ascii="Helvetica" w:hAnsi="Helvetica" w:cs="Helvetica"/>
+              </w:rPr>
+              <w:t xml:space="preserve"> registrar una </w:t>
+            </w:r>
+            <w:proofErr w:type="spellStart"/>
+            <w:r>
+              <w:rPr>
+                <w:rFonts w:ascii="Helvetica" w:hAnsi="Helvetica" w:cs="Helvetica"/>
+              </w:rPr>
+              <w:t>puntuación</w:t>
+            </w:r>
+            <w:proofErr w:type="spellEnd"/>
+            <w:r>
+              <w:rPr>
+                <w:rFonts w:ascii="Helvetica" w:hAnsi="Helvetica" w:cs="Helvetica"/>
+              </w:rPr>
+              <w:t xml:space="preserve"> y/o </w:t>
+            </w:r>
+            <w:proofErr w:type="spellStart"/>
+            <w:r>
+              <w:rPr>
+                <w:rFonts w:ascii="Helvetica" w:hAnsi="Helvetica" w:cs="Helvetica"/>
+              </w:rPr>
+              <w:t>reseña</w:t>
+            </w:r>
+            <w:proofErr w:type="spellEnd"/>
+            <w:r>
+              <w:rPr>
+                <w:rFonts w:ascii="Helvetica" w:hAnsi="Helvetica" w:cs="Helvetica"/>
+              </w:rPr>
+              <w:t xml:space="preserve"> </w:t>
+            </w:r>
+            <w:proofErr w:type="spellStart"/>
+            <w:r>
+              <w:rPr>
+                <w:rFonts w:ascii="Helvetica" w:hAnsi="Helvetica" w:cs="Helvetica"/>
+              </w:rPr>
+              <w:t>sobre</w:t>
+            </w:r>
+            <w:proofErr w:type="spellEnd"/>
+            <w:r>
+              <w:rPr>
+                <w:rFonts w:ascii="Helvetica" w:hAnsi="Helvetica" w:cs="Helvetica"/>
+              </w:rPr>
+              <w:t xml:space="preserve"> el </w:t>
+            </w:r>
+            <w:proofErr w:type="spellStart"/>
+            <w:r>
+              <w:rPr>
+                <w:rFonts w:ascii="Helvetica" w:hAnsi="Helvetica" w:cs="Helvetica"/>
+              </w:rPr>
+              <w:t>retiro</w:t>
+            </w:r>
+            <w:proofErr w:type="spellEnd"/>
+            <w:r>
+              <w:rPr>
+                <w:rFonts w:ascii="Helvetica" w:hAnsi="Helvetica" w:cs="Helvetica"/>
+              </w:rPr>
+              <w:t xml:space="preserve"> </w:t>
+            </w:r>
+            <w:proofErr w:type="spellStart"/>
+            <w:r>
+              <w:rPr>
+                <w:rFonts w:ascii="Helvetica" w:hAnsi="Helvetica" w:cs="Helvetica"/>
+              </w:rPr>
+              <w:t>asistido</w:t>
+            </w:r>
+            <w:proofErr w:type="spellEnd"/>
           </w:p>
         </w:tc>
       </w:tr>
@@ -1232,7 +1536,7 @@
                 <w:sz w:val="20"/>
                 <w:szCs w:val="20"/>
               </w:rPr>
-              <w:t>RF7</w:t>
+              <w:t>008</w:t>
             </w:r>
           </w:p>
           <w:p>
@@ -1277,6 +1581,182 @@
                 <w:lang w:val="es-AR"/>
               </w:rPr>
             </w:pPr>
+            <w:proofErr w:type="spellStart"/>
+            <w:r>
+              <w:rPr>
+                <w:rFonts w:ascii="Helvetica" w:hAnsi="Helvetica" w:cs="Helvetica"/>
+              </w:rPr>
+              <w:t>Compartir</w:t>
+            </w:r>
+            <w:proofErr w:type="spellEnd"/>
+            <w:r>
+              <w:rPr>
+                <w:rFonts w:ascii="Helvetica" w:hAnsi="Helvetica" w:cs="Helvetica"/>
+              </w:rPr>
+              <w:t xml:space="preserve"> </w:t>
+            </w:r>
+            <w:proofErr w:type="spellStart"/>
+            <w:r>
+              <w:rPr>
+                <w:rFonts w:ascii="Helvetica" w:hAnsi="Helvetica" w:cs="Helvetica"/>
+              </w:rPr>
+              <w:t>información</w:t>
+            </w:r>
+            <w:proofErr w:type="spellEnd"/>
+            <w:r>
+              <w:rPr>
+                <w:rFonts w:ascii="Helvetica" w:hAnsi="Helvetica" w:cs="Helvetica"/>
+              </w:rPr>
+              <w:t xml:space="preserve"> </w:t>
+            </w:r>
+            <w:proofErr w:type="spellStart"/>
+            <w:r>
+              <w:rPr>
+                <w:rFonts w:ascii="Helvetica" w:hAnsi="Helvetica" w:cs="Helvetica"/>
+              </w:rPr>
+              <w:t>sobre</w:t>
+            </w:r>
+            <w:proofErr w:type="spellEnd"/>
+            <w:r>
+              <w:rPr>
+                <w:rFonts w:ascii="Helvetica" w:hAnsi="Helvetica" w:cs="Helvetica"/>
+              </w:rPr>
+              <w:t xml:space="preserve"> el </w:t>
+            </w:r>
+            <w:proofErr w:type="spellStart"/>
+            <w:r>
+              <w:rPr>
+                <w:rFonts w:ascii="Helvetica" w:hAnsi="Helvetica" w:cs="Helvetica"/>
+              </w:rPr>
+              <w:t>retiro</w:t>
+            </w:r>
+            <w:proofErr w:type="spellEnd"/>
+            <w:r>
+              <w:rPr>
+                <w:rFonts w:ascii="Helvetica" w:hAnsi="Helvetica" w:cs="Helvetica"/>
+              </w:rPr>
+              <w:t xml:space="preserve">. El </w:t>
+            </w:r>
+            <w:proofErr w:type="spellStart"/>
+            <w:r>
+              <w:rPr>
+                <w:rFonts w:ascii="Helvetica" w:hAnsi="Helvetica" w:cs="Helvetica"/>
+              </w:rPr>
+              <w:t>sistema</w:t>
+            </w:r>
+            <w:proofErr w:type="spellEnd"/>
+            <w:r>
+              <w:rPr>
+                <w:rFonts w:ascii="Helvetica" w:hAnsi="Helvetica" w:cs="Helvetica"/>
+              </w:rPr>
+              <w:t xml:space="preserve"> </w:t>
+            </w:r>
+            <w:proofErr w:type="spellStart"/>
+            <w:r>
+              <w:rPr>
+                <w:rFonts w:ascii="Helvetica" w:hAnsi="Helvetica" w:cs="Helvetica"/>
+              </w:rPr>
+              <w:t>deberá</w:t>
+            </w:r>
+            <w:proofErr w:type="spellEnd"/>
+            <w:r>
+              <w:rPr>
+                <w:rFonts w:ascii="Helvetica" w:hAnsi="Helvetica" w:cs="Helvetica"/>
+              </w:rPr>
+              <w:t xml:space="preserve"> </w:t>
+            </w:r>
+            <w:proofErr w:type="spellStart"/>
+            <w:r>
+              <w:rPr>
+                <w:rFonts w:ascii="Helvetica" w:hAnsi="Helvetica" w:cs="Helvetica"/>
+              </w:rPr>
+              <w:t>permitir</w:t>
+            </w:r>
+            <w:proofErr w:type="spellEnd"/>
+            <w:r>
+              <w:rPr>
+                <w:rFonts w:ascii="Helvetica" w:hAnsi="Helvetica" w:cs="Helvetica"/>
+              </w:rPr>
+              <w:t xml:space="preserve"> </w:t>
+            </w:r>
+            <w:proofErr w:type="spellStart"/>
+            <w:r>
+              <w:rPr>
+                <w:rFonts w:ascii="Helvetica" w:hAnsi="Helvetica" w:cs="Helvetica"/>
+              </w:rPr>
+              <w:t>compartir</w:t>
+            </w:r>
+            <w:proofErr w:type="spellEnd"/>
+            <w:r>
+              <w:rPr>
+                <w:rFonts w:ascii="Helvetica" w:hAnsi="Helvetica" w:cs="Helvetica"/>
+              </w:rPr>
+              <w:t xml:space="preserve"> la </w:t>
+            </w:r>
+            <w:proofErr w:type="spellStart"/>
+            <w:r>
+              <w:rPr>
+                <w:rFonts w:ascii="Helvetica" w:hAnsi="Helvetica" w:cs="Helvetica"/>
+              </w:rPr>
+              <w:t>información</w:t>
+            </w:r>
+            <w:proofErr w:type="spellEnd"/>
+            <w:r>
+              <w:rPr>
+                <w:rFonts w:ascii="Helvetica" w:hAnsi="Helvetica" w:cs="Helvetica"/>
+              </w:rPr>
+              <w:t xml:space="preserve"> </w:t>
+            </w:r>
+            <w:proofErr w:type="spellStart"/>
+            <w:r>
+              <w:rPr>
+                <w:rFonts w:ascii="Helvetica" w:hAnsi="Helvetica" w:cs="Helvetica"/>
+              </w:rPr>
+              <w:t>registrada</w:t>
+            </w:r>
+            <w:proofErr w:type="spellEnd"/>
+            <w:r>
+              <w:rPr>
+                <w:rFonts w:ascii="Helvetica" w:hAnsi="Helvetica" w:cs="Helvetica"/>
+              </w:rPr>
+              <w:t xml:space="preserve"> de un </w:t>
+            </w:r>
+            <w:proofErr w:type="spellStart"/>
+            <w:r>
+              <w:rPr>
+                <w:rFonts w:ascii="Helvetica" w:hAnsi="Helvetica" w:cs="Helvetica"/>
+              </w:rPr>
+              <w:t>retiro</w:t>
+            </w:r>
+            <w:proofErr w:type="spellEnd"/>
+            <w:r>
+              <w:rPr>
+                <w:rFonts w:ascii="Helvetica" w:hAnsi="Helvetica" w:cs="Helvetica"/>
+              </w:rPr>
+              <w:t xml:space="preserve"> con </w:t>
+            </w:r>
+            <w:proofErr w:type="spellStart"/>
+            <w:r>
+              <w:rPr>
+                <w:rFonts w:ascii="Helvetica" w:hAnsi="Helvetica" w:cs="Helvetica"/>
+              </w:rPr>
+              <w:t>otros</w:t>
+            </w:r>
+            <w:proofErr w:type="spellEnd"/>
+            <w:r>
+              <w:rPr>
+                <w:rFonts w:ascii="Helvetica" w:hAnsi="Helvetica" w:cs="Helvetica"/>
+              </w:rPr>
+              <w:t xml:space="preserve"> </w:t>
+            </w:r>
+            <w:proofErr w:type="spellStart"/>
+            <w:r>
+              <w:rPr>
+                <w:rFonts w:ascii="Helvetica" w:hAnsi="Helvetica" w:cs="Helvetica"/>
+              </w:rPr>
+              <w:t>usuarios</w:t>
+            </w:r>
+            <w:proofErr w:type="spellEnd"/>
           </w:p>
         </w:tc>
       </w:tr>
@@ -1310,7 +1790,7 @@
                 <w:sz w:val="20"/>
                 <w:szCs w:val="20"/>
               </w:rPr>
-              <w:t>RF8</w:t>
+              <w:t>009</w:t>
             </w:r>
           </w:p>
           <w:p>
@@ -1347,6 +1827,21 @@
             </w:tcMar>
             <w:vAlign w:val="center"/>
           </w:tcPr>
+          <w:p>
+            <w:pPr>
+              <w:pStyle w:val="NormalWeb"/>
+              <w:spacing w:before="0" w:beforeAutospacing="0" w:after="0" w:afterAutospacing="0"/>
+              <w:ind w:right="61"/>
+              <w:jc w:val="both"/>
+            </w:pPr>
+            <w:r>
+              <w:rPr>
+                <w:rFonts w:ascii="Arial" w:hAnsi="Arial" w:cs="Arial"/>
+                <w:color w:val="000000"/>
+              </w:rPr>
+              <w:t>Enviar alerta de proximidad de la fecha de inscripción de retiro dado de alta.  El sistema deberá enviar una alerta cuando se acerque la fecha límite de inscripción a un retiro dado de alta.</w:t>
+            </w:r>
+          </w:p>
           <w:p>
             <w:pPr>
               <w:spacing w:after="0" w:line="240" w:lineRule="auto"/>
@@ -1388,7 +1883,7 @@
                 <w:sz w:val="20"/>
                 <w:szCs w:val="20"/>
               </w:rPr>
-              <w:t>RF9</w:t>
+              <w:t>010</w:t>
             </w:r>
           </w:p>
           <w:p>
@@ -1427,847 +1922,48 @@
           </w:tcPr>
           <w:p>
             <w:pPr>
-              <w:spacing w:after="0" w:line="240" w:lineRule="auto"/>
-              <w:ind w:left="0" w:right="61"/>
-              <w:rPr>
-                <w:lang w:val="es-AR"/>
-              </w:rPr>
-            </w:pPr>
-          </w:p>
-        </w:tc>
-      </w:tr>
-      <w:tr>
-        <w:tc>
-          <w:tcPr>
-            <w:tcW w:w="1335" w:type="dxa"/>
-            <w:shd w:val="clear" w:color="auto" w:fill="auto"/>
-            <w:tcMar>
-              <w:top w:w="5" w:type="dxa"/>
-              <w:left w:w="5" w:type="dxa"/>
-              <w:bottom w:w="5" w:type="dxa"/>
-              <w:right w:w="5" w:type="dxa"/>
-            </w:tcMar>
-            <w:vAlign w:val="center"/>
-          </w:tcPr>
-          <w:p>
-            <w:pPr>
-              <w:spacing w:line="240" w:lineRule="auto"/>
-              <w:jc w:val="left"/>
-              <w:rPr>
-                <w:color w:val="FFAA00"/>
-              </w:rPr>
-            </w:pPr>
-            <w:r>
-              <w:rPr>
-                <w:rFonts w:ascii="Open Sans ExtraBold" w:eastAsia="Open Sans ExtraBold" w:hAnsi="Open Sans ExtraBold" w:cs="Open Sans ExtraBold"/>
-                <w:b/>
-                <w:bCs/>
-                <w:color w:val="FFAA00"/>
-                <w:sz w:val="20"/>
-                <w:szCs w:val="20"/>
-              </w:rPr>
-              <w:t>RF10</w:t>
-            </w:r>
-          </w:p>
-          <w:p>
-            <w:pPr>
-              <w:widowControl w:val="0"/>
-              <w:pBdr>
-                <w:top w:val="nil"/>
-                <w:left w:val="nil"/>
-                <w:bottom w:val="nil"/>
-                <w:right w:val="nil"/>
-                <w:between w:val="nil"/>
-              </w:pBdr>
-              <w:spacing w:after="0" w:line="240" w:lineRule="auto"/>
-              <w:ind w:left="0" w:right="0"/>
-              <w:jc w:val="left"/>
-              <w:rPr>
-                <w:rFonts w:ascii="Open Sans ExtraBold" w:eastAsia="Open Sans ExtraBold" w:hAnsi="Open Sans ExtraBold" w:cs="Open Sans ExtraBold"/>
-                <w:color w:val="FFAA00"/>
-                <w:sz w:val="20"/>
-                <w:szCs w:val="20"/>
-              </w:rPr>
-            </w:pPr>
-          </w:p>
-        </w:tc>
-        <w:tc>
-          <w:tcPr>
-            <w:tcW w:w="8565" w:type="dxa"/>
-            <w:shd w:val="clear" w:color="auto" w:fill="auto"/>
-            <w:tcMar>
-              <w:top w:w="5" w:type="dxa"/>
-              <w:left w:w="5" w:type="dxa"/>
-              <w:bottom w:w="5" w:type="dxa"/>
-              <w:right w:w="5" w:type="dxa"/>
-            </w:tcMar>
-            <w:vAlign w:val="center"/>
-          </w:tcPr>
-          <w:p>
-            <w:pPr>
-              <w:spacing w:after="0" w:line="240" w:lineRule="auto"/>
-              <w:ind w:left="0" w:right="61"/>
-              <w:rPr>
-                <w:lang w:val="es-AR"/>
-              </w:rPr>
-            </w:pPr>
-          </w:p>
-        </w:tc>
-      </w:tr>
-      <w:tr>
-        <w:tc>
-          <w:tcPr>
-            <w:tcW w:w="1335" w:type="dxa"/>
-            <w:shd w:val="clear" w:color="auto" w:fill="auto"/>
-            <w:tcMar>
-              <w:top w:w="5" w:type="dxa"/>
-              <w:left w:w="5" w:type="dxa"/>
-              <w:bottom w:w="5" w:type="dxa"/>
-              <w:right w:w="5" w:type="dxa"/>
-            </w:tcMar>
-            <w:vAlign w:val="center"/>
-          </w:tcPr>
-          <w:p>
-            <w:pPr>
-              <w:spacing w:line="240" w:lineRule="auto"/>
-              <w:jc w:val="left"/>
-              <w:rPr>
-                <w:color w:val="FFAA00"/>
-              </w:rPr>
-            </w:pPr>
-            <w:r>
-              <w:rPr>
-                <w:rFonts w:ascii="Open Sans ExtraBold" w:eastAsia="Open Sans ExtraBold" w:hAnsi="Open Sans ExtraBold" w:cs="Open Sans ExtraBold"/>
-                <w:b/>
-                <w:bCs/>
-                <w:color w:val="FFAA00"/>
-                <w:sz w:val="20"/>
-                <w:szCs w:val="20"/>
-              </w:rPr>
-              <w:t>RF11</w:t>
-            </w:r>
-          </w:p>
-          <w:p>
-            <w:pPr>
-              <w:widowControl w:val="0"/>
-              <w:pBdr>
-                <w:top w:val="nil"/>
-                <w:left w:val="nil"/>
-                <w:bottom w:val="nil"/>
-                <w:right w:val="nil"/>
-                <w:between w:val="nil"/>
-              </w:pBdr>
-              <w:spacing w:after="0" w:line="240" w:lineRule="auto"/>
-              <w:ind w:left="0" w:right="0"/>
-              <w:jc w:val="left"/>
-              <w:rPr>
-                <w:rFonts w:ascii="Open Sans ExtraBold" w:eastAsia="Open Sans ExtraBold" w:hAnsi="Open Sans ExtraBold" w:cs="Open Sans ExtraBold"/>
-                <w:color w:val="FFAA00"/>
-                <w:sz w:val="20"/>
-                <w:szCs w:val="20"/>
-              </w:rPr>
-            </w:pPr>
-          </w:p>
-        </w:tc>
-        <w:tc>
-          <w:tcPr>
-            <w:tcW w:w="8565" w:type="dxa"/>
-            <w:shd w:val="clear" w:color="auto" w:fill="auto"/>
-            <w:tcMar>
-              <w:top w:w="5" w:type="dxa"/>
-              <w:left w:w="5" w:type="dxa"/>
-              <w:bottom w:w="5" w:type="dxa"/>
-              <w:right w:w="5" w:type="dxa"/>
-            </w:tcMar>
-            <w:vAlign w:val="center"/>
-          </w:tcPr>
-          <w:p>
-            <w:pPr>
-              <w:spacing w:after="0" w:line="240" w:lineRule="auto"/>
-              <w:ind w:left="0" w:right="61"/>
-            </w:pPr>
-            <w:r>
-              <w:t xml:space="preserve"> </w:t>
-            </w:r>
-          </w:p>
-        </w:tc>
-      </w:tr>
-      <w:tr>
-        <w:tc>
-          <w:tcPr>
-            <w:tcW w:w="1335" w:type="dxa"/>
-            <w:shd w:val="clear" w:color="auto" w:fill="auto"/>
-            <w:tcMar>
-              <w:top w:w="5" w:type="dxa"/>
-              <w:left w:w="5" w:type="dxa"/>
-              <w:bottom w:w="5" w:type="dxa"/>
-              <w:right w:w="5" w:type="dxa"/>
-            </w:tcMar>
-            <w:vAlign w:val="center"/>
-          </w:tcPr>
-          <w:p>
-            <w:pPr>
-              <w:spacing w:line="240" w:lineRule="auto"/>
-              <w:jc w:val="left"/>
-              <w:rPr>
-                <w:color w:val="FFAA00"/>
-              </w:rPr>
-            </w:pPr>
-            <w:r>
-              <w:rPr>
-                <w:rFonts w:ascii="Open Sans ExtraBold" w:eastAsia="Open Sans ExtraBold" w:hAnsi="Open Sans ExtraBold" w:cs="Open Sans ExtraBold"/>
-                <w:b/>
-                <w:bCs/>
-                <w:color w:val="FFAA00"/>
-                <w:sz w:val="20"/>
-                <w:szCs w:val="20"/>
-              </w:rPr>
-              <w:t>RF12</w:t>
-            </w:r>
-          </w:p>
-          <w:p>
-            <w:pPr>
-              <w:widowControl w:val="0"/>
-              <w:pBdr>
-                <w:top w:val="nil"/>
-                <w:left w:val="nil"/>
-                <w:bottom w:val="nil"/>
-                <w:right w:val="nil"/>
-                <w:between w:val="nil"/>
-              </w:pBdr>
-              <w:spacing w:after="0" w:line="240" w:lineRule="auto"/>
-              <w:ind w:left="0" w:right="0"/>
-              <w:jc w:val="left"/>
-              <w:rPr>
-                <w:rFonts w:ascii="Open Sans ExtraBold" w:eastAsia="Open Sans ExtraBold" w:hAnsi="Open Sans ExtraBold" w:cs="Open Sans ExtraBold"/>
-                <w:color w:val="FFAA00"/>
-                <w:sz w:val="20"/>
-                <w:szCs w:val="20"/>
-              </w:rPr>
-            </w:pPr>
-          </w:p>
-        </w:tc>
-        <w:tc>
-          <w:tcPr>
-            <w:tcW w:w="8565" w:type="dxa"/>
-            <w:shd w:val="clear" w:color="auto" w:fill="auto"/>
-            <w:tcMar>
-              <w:top w:w="5" w:type="dxa"/>
-              <w:left w:w="5" w:type="dxa"/>
-              <w:bottom w:w="5" w:type="dxa"/>
-              <w:right w:w="5" w:type="dxa"/>
-            </w:tcMar>
-            <w:vAlign w:val="center"/>
-          </w:tcPr>
-          <w:p>
-            <w:pPr>
-              <w:spacing w:after="0" w:line="240" w:lineRule="auto"/>
-              <w:ind w:left="0" w:right="61"/>
-              <w:rPr>
-                <w:shd w:val="clear" w:color="auto" w:fill="A61C00"/>
-              </w:rPr>
-            </w:pPr>
-          </w:p>
-        </w:tc>
-      </w:tr>
-      <w:tr>
-        <w:trPr>
-          <w:trHeight w:val="590"/>
-        </w:trPr>
-        <w:tc>
-          <w:tcPr>
-            <w:tcW w:w="1335" w:type="dxa"/>
-            <w:shd w:val="clear" w:color="auto" w:fill="auto"/>
-            <w:tcMar>
-              <w:top w:w="5" w:type="dxa"/>
-              <w:left w:w="5" w:type="dxa"/>
-              <w:bottom w:w="5" w:type="dxa"/>
-              <w:right w:w="5" w:type="dxa"/>
-            </w:tcMar>
-            <w:vAlign w:val="center"/>
-          </w:tcPr>
-          <w:p>
-            <w:pPr>
-              <w:widowControl w:val="0"/>
-              <w:pBdr>
-                <w:top w:val="nil"/>
-                <w:left w:val="nil"/>
-                <w:bottom w:val="nil"/>
-                <w:right w:val="nil"/>
-                <w:between w:val="nil"/>
-              </w:pBdr>
-              <w:spacing w:after="0" w:line="240" w:lineRule="auto"/>
-              <w:ind w:left="0" w:right="0"/>
-              <w:jc w:val="center"/>
-              <w:rPr>
-                <w:rFonts w:ascii="Open Sans ExtraBold" w:eastAsia="Open Sans ExtraBold" w:hAnsi="Open Sans ExtraBold" w:cs="Open Sans ExtraBold"/>
-                <w:sz w:val="20"/>
-                <w:szCs w:val="20"/>
-              </w:rPr>
-            </w:pPr>
-            <w:bookmarkStart w:id="4" w:name="_GoBack"/>
-            <w:bookmarkEnd w:id="4"/>
-            <w:r>
-              <w:rPr>
-                <w:rFonts w:ascii="Open Sans ExtraBold" w:eastAsia="Open Sans ExtraBold" w:hAnsi="Open Sans ExtraBold" w:cs="Open Sans ExtraBold"/>
-                <w:sz w:val="20"/>
-                <w:szCs w:val="20"/>
-              </w:rPr>
-              <w:t>RF13</w:t>
-            </w:r>
-          </w:p>
-        </w:tc>
-        <w:tc>
-          <w:tcPr>
-            <w:tcW w:w="8565" w:type="dxa"/>
-            <w:shd w:val="clear" w:color="auto" w:fill="auto"/>
-            <w:tcMar>
-              <w:top w:w="5" w:type="dxa"/>
-              <w:left w:w="5" w:type="dxa"/>
-              <w:bottom w:w="5" w:type="dxa"/>
-              <w:right w:w="5" w:type="dxa"/>
-            </w:tcMar>
-            <w:vAlign w:val="center"/>
-          </w:tcPr>
-          <w:p>
-            <w:pPr>
-              <w:spacing w:after="0" w:line="240" w:lineRule="auto"/>
-              <w:ind w:left="0" w:right="61"/>
-              <w:rPr>
-                <w:highlight w:val="green"/>
-              </w:rPr>
-            </w:pPr>
-          </w:p>
-        </w:tc>
-      </w:tr>
-      <w:tr>
-        <w:trPr>
-          <w:trHeight w:val="682"/>
-        </w:trPr>
-        <w:tc>
-          <w:tcPr>
-            <w:tcW w:w="1335" w:type="dxa"/>
-            <w:shd w:val="clear" w:color="auto" w:fill="auto"/>
-            <w:tcMar>
-              <w:top w:w="5" w:type="dxa"/>
-              <w:left w:w="5" w:type="dxa"/>
-              <w:bottom w:w="5" w:type="dxa"/>
-              <w:right w:w="5" w:type="dxa"/>
-            </w:tcMar>
-            <w:vAlign w:val="center"/>
-          </w:tcPr>
-          <w:p>
-            <w:pPr>
-              <w:spacing w:line="240" w:lineRule="auto"/>
-              <w:rPr>
-                <w:rFonts w:ascii="Open Sans ExtraBold" w:eastAsia="Open Sans ExtraBold" w:hAnsi="Open Sans ExtraBold" w:cs="Open Sans ExtraBold"/>
-                <w:b/>
-                <w:bCs/>
-                <w:sz w:val="20"/>
-                <w:szCs w:val="20"/>
-              </w:rPr>
-            </w:pPr>
-            <w:r>
-              <w:rPr>
-                <w:rFonts w:ascii="Open Sans ExtraBold" w:eastAsia="Open Sans ExtraBold" w:hAnsi="Open Sans ExtraBold" w:cs="Open Sans ExtraBold"/>
-                <w:b/>
-                <w:bCs/>
-                <w:sz w:val="20"/>
-                <w:szCs w:val="20"/>
-              </w:rPr>
-              <w:t>RF14</w:t>
-            </w:r>
-          </w:p>
-        </w:tc>
-        <w:tc>
-          <w:tcPr>
-            <w:tcW w:w="8565" w:type="dxa"/>
-            <w:shd w:val="clear" w:color="auto" w:fill="auto"/>
-            <w:tcMar>
-              <w:top w:w="5" w:type="dxa"/>
-              <w:left w:w="5" w:type="dxa"/>
-              <w:bottom w:w="5" w:type="dxa"/>
-              <w:right w:w="5" w:type="dxa"/>
-            </w:tcMar>
-            <w:vAlign w:val="center"/>
-          </w:tcPr>
-          <w:p>
-            <w:pPr>
-              <w:spacing w:after="0" w:line="240" w:lineRule="auto"/>
-              <w:ind w:left="0" w:right="61"/>
-            </w:pPr>
-          </w:p>
-        </w:tc>
-      </w:tr>
-      <w:tr>
-        <w:trPr>
-          <w:trHeight w:val="575"/>
-        </w:trPr>
-        <w:tc>
-          <w:tcPr>
-            <w:tcW w:w="1335" w:type="dxa"/>
-            <w:shd w:val="clear" w:color="auto" w:fill="auto"/>
-            <w:tcMar>
-              <w:top w:w="5" w:type="dxa"/>
-              <w:left w:w="5" w:type="dxa"/>
-              <w:bottom w:w="5" w:type="dxa"/>
-              <w:right w:w="5" w:type="dxa"/>
-            </w:tcMar>
-            <w:vAlign w:val="center"/>
-          </w:tcPr>
-          <w:p>
-            <w:pPr>
-              <w:widowControl w:val="0"/>
-              <w:pBdr>
-                <w:top w:val="nil"/>
-                <w:left w:val="nil"/>
-                <w:bottom w:val="nil"/>
-                <w:right w:val="nil"/>
-                <w:between w:val="nil"/>
-              </w:pBdr>
-              <w:spacing w:after="0" w:line="240" w:lineRule="auto"/>
-              <w:ind w:left="0" w:right="0"/>
-              <w:jc w:val="left"/>
-              <w:rPr>
-                <w:rFonts w:ascii="Open Sans ExtraBold" w:eastAsia="Open Sans ExtraBold" w:hAnsi="Open Sans ExtraBold" w:cs="Open Sans ExtraBold"/>
-                <w:sz w:val="20"/>
-                <w:szCs w:val="20"/>
-              </w:rPr>
-            </w:pPr>
-          </w:p>
-        </w:tc>
-        <w:tc>
-          <w:tcPr>
-            <w:tcW w:w="8565" w:type="dxa"/>
-            <w:shd w:val="clear" w:color="auto" w:fill="auto"/>
-            <w:tcMar>
-              <w:top w:w="5" w:type="dxa"/>
-              <w:left w:w="5" w:type="dxa"/>
-              <w:bottom w:w="5" w:type="dxa"/>
-              <w:right w:w="5" w:type="dxa"/>
-            </w:tcMar>
-            <w:vAlign w:val="center"/>
-          </w:tcPr>
-          <w:p>
-            <w:pPr>
-              <w:spacing w:after="0" w:line="240" w:lineRule="auto"/>
-              <w:ind w:left="0" w:right="61"/>
-            </w:pPr>
-          </w:p>
-        </w:tc>
-      </w:tr>
-      <w:tr>
-        <w:tc>
-          <w:tcPr>
-            <w:tcW w:w="1335" w:type="dxa"/>
-            <w:shd w:val="clear" w:color="auto" w:fill="auto"/>
-            <w:tcMar>
-              <w:top w:w="5" w:type="dxa"/>
-              <w:left w:w="5" w:type="dxa"/>
-              <w:bottom w:w="5" w:type="dxa"/>
-              <w:right w:w="5" w:type="dxa"/>
-            </w:tcMar>
-            <w:vAlign w:val="center"/>
-          </w:tcPr>
-          <w:p>
-            <w:pPr>
-              <w:spacing w:line="240" w:lineRule="auto"/>
-            </w:pPr>
-            <w:r>
-              <w:rPr>
-                <w:rFonts w:ascii="Open Sans ExtraBold" w:eastAsia="Open Sans ExtraBold" w:hAnsi="Open Sans ExtraBold" w:cs="Open Sans ExtraBold"/>
-                <w:b/>
-                <w:bCs/>
-                <w:sz w:val="20"/>
-                <w:szCs w:val="20"/>
-              </w:rPr>
-              <w:t>RF15</w:t>
-            </w:r>
-          </w:p>
-          <w:p>
-            <w:pPr>
-              <w:widowControl w:val="0"/>
-              <w:pBdr>
-                <w:top w:val="nil"/>
-                <w:left w:val="nil"/>
-                <w:bottom w:val="nil"/>
-                <w:right w:val="nil"/>
-                <w:between w:val="nil"/>
-              </w:pBdr>
-              <w:spacing w:after="0" w:line="240" w:lineRule="auto"/>
-              <w:ind w:left="0" w:right="0"/>
-              <w:jc w:val="left"/>
-              <w:rPr>
-                <w:rFonts w:ascii="Open Sans ExtraBold" w:eastAsia="Open Sans ExtraBold" w:hAnsi="Open Sans ExtraBold" w:cs="Open Sans ExtraBold"/>
-                <w:sz w:val="20"/>
-                <w:szCs w:val="20"/>
-              </w:rPr>
-            </w:pPr>
-          </w:p>
-        </w:tc>
-        <w:tc>
-          <w:tcPr>
-            <w:tcW w:w="8565" w:type="dxa"/>
-            <w:shd w:val="clear" w:color="auto" w:fill="auto"/>
-            <w:tcMar>
-              <w:top w:w="5" w:type="dxa"/>
-              <w:left w:w="5" w:type="dxa"/>
-              <w:bottom w:w="5" w:type="dxa"/>
-              <w:right w:w="5" w:type="dxa"/>
-            </w:tcMar>
-            <w:vAlign w:val="center"/>
-          </w:tcPr>
-          <w:p>
-            <w:pPr>
-              <w:widowControl w:val="0"/>
-              <w:pBdr>
-                <w:top w:val="nil"/>
-                <w:left w:val="nil"/>
-                <w:bottom w:val="nil"/>
-                <w:right w:val="nil"/>
-                <w:between w:val="nil"/>
-              </w:pBdr>
-              <w:spacing w:after="0" w:line="240" w:lineRule="auto"/>
-              <w:ind w:left="0" w:right="61"/>
-              <w:jc w:val="left"/>
-              <w:rPr>
-                <w:rFonts w:ascii="Open Sans ExtraBold" w:eastAsia="Open Sans ExtraBold" w:hAnsi="Open Sans ExtraBold" w:cs="Open Sans ExtraBold"/>
-                <w:sz w:val="20"/>
-                <w:szCs w:val="20"/>
-              </w:rPr>
-            </w:pPr>
-          </w:p>
-        </w:tc>
-      </w:tr>
-      <w:tr>
-        <w:tc>
-          <w:tcPr>
-            <w:tcW w:w="1335" w:type="dxa"/>
-            <w:shd w:val="clear" w:color="auto" w:fill="auto"/>
-            <w:tcMar>
-              <w:top w:w="5" w:type="dxa"/>
-              <w:left w:w="5" w:type="dxa"/>
-              <w:bottom w:w="5" w:type="dxa"/>
-              <w:right w:w="5" w:type="dxa"/>
-            </w:tcMar>
-            <w:vAlign w:val="center"/>
-          </w:tcPr>
-          <w:p>
-            <w:pPr>
-              <w:spacing w:line="240" w:lineRule="auto"/>
-            </w:pPr>
-            <w:r>
-              <w:rPr>
-                <w:rFonts w:ascii="Open Sans ExtraBold" w:eastAsia="Open Sans ExtraBold" w:hAnsi="Open Sans ExtraBold" w:cs="Open Sans ExtraBold"/>
-                <w:b/>
-                <w:bCs/>
-                <w:sz w:val="20"/>
-                <w:szCs w:val="20"/>
-              </w:rPr>
-              <w:t>RF16</w:t>
-            </w:r>
-          </w:p>
-          <w:p>
-            <w:pPr>
-              <w:widowControl w:val="0"/>
-              <w:pBdr>
-                <w:top w:val="nil"/>
-                <w:left w:val="nil"/>
-                <w:bottom w:val="nil"/>
-                <w:right w:val="nil"/>
-                <w:between w:val="nil"/>
-              </w:pBdr>
-              <w:spacing w:after="0" w:line="240" w:lineRule="auto"/>
-              <w:ind w:left="0" w:right="0"/>
-              <w:jc w:val="left"/>
-              <w:rPr>
-                <w:rFonts w:ascii="Open Sans ExtraBold" w:eastAsia="Open Sans ExtraBold" w:hAnsi="Open Sans ExtraBold" w:cs="Open Sans ExtraBold"/>
-                <w:sz w:val="20"/>
-                <w:szCs w:val="20"/>
-              </w:rPr>
-            </w:pPr>
-          </w:p>
-        </w:tc>
-        <w:tc>
-          <w:tcPr>
-            <w:tcW w:w="8565" w:type="dxa"/>
-            <w:shd w:val="clear" w:color="auto" w:fill="auto"/>
-            <w:tcMar>
-              <w:top w:w="5" w:type="dxa"/>
-              <w:left w:w="5" w:type="dxa"/>
-              <w:bottom w:w="5" w:type="dxa"/>
-              <w:right w:w="5" w:type="dxa"/>
-            </w:tcMar>
-            <w:vAlign w:val="center"/>
-          </w:tcPr>
-          <w:p>
-            <w:pPr>
-              <w:widowControl w:val="0"/>
-              <w:pBdr>
-                <w:top w:val="nil"/>
-                <w:left w:val="nil"/>
-                <w:bottom w:val="nil"/>
-                <w:right w:val="nil"/>
-                <w:between w:val="nil"/>
-              </w:pBdr>
-              <w:spacing w:after="0" w:line="240" w:lineRule="auto"/>
-              <w:ind w:left="0" w:right="61"/>
-              <w:jc w:val="left"/>
-              <w:rPr>
-                <w:rFonts w:ascii="Open Sans ExtraBold" w:eastAsia="Open Sans ExtraBold" w:hAnsi="Open Sans ExtraBold" w:cs="Open Sans ExtraBold"/>
-                <w:sz w:val="20"/>
-                <w:szCs w:val="20"/>
-              </w:rPr>
-            </w:pPr>
-          </w:p>
-        </w:tc>
-      </w:tr>
-      <w:tr>
-        <w:tc>
-          <w:tcPr>
-            <w:tcW w:w="1335" w:type="dxa"/>
-            <w:shd w:val="clear" w:color="auto" w:fill="auto"/>
-            <w:tcMar>
-              <w:top w:w="5" w:type="dxa"/>
-              <w:left w:w="5" w:type="dxa"/>
-              <w:bottom w:w="5" w:type="dxa"/>
-              <w:right w:w="5" w:type="dxa"/>
-            </w:tcMar>
-            <w:vAlign w:val="center"/>
-          </w:tcPr>
-          <w:p>
-            <w:pPr>
-              <w:spacing w:line="240" w:lineRule="auto"/>
-            </w:pPr>
-            <w:r>
-              <w:rPr>
-                <w:rFonts w:ascii="Open Sans ExtraBold" w:eastAsia="Open Sans ExtraBold" w:hAnsi="Open Sans ExtraBold" w:cs="Open Sans ExtraBold"/>
-                <w:b/>
-                <w:bCs/>
-                <w:sz w:val="20"/>
-                <w:szCs w:val="20"/>
-              </w:rPr>
-              <w:t>RF17</w:t>
-            </w:r>
-          </w:p>
-          <w:p>
-            <w:pPr>
-              <w:widowControl w:val="0"/>
-              <w:pBdr>
-                <w:top w:val="nil"/>
-                <w:left w:val="nil"/>
-                <w:bottom w:val="nil"/>
-                <w:right w:val="nil"/>
-                <w:between w:val="nil"/>
-              </w:pBdr>
-              <w:spacing w:after="0" w:line="240" w:lineRule="auto"/>
-              <w:ind w:left="0" w:right="0"/>
-              <w:jc w:val="left"/>
-              <w:rPr>
-                <w:rFonts w:ascii="Open Sans ExtraBold" w:eastAsia="Open Sans ExtraBold" w:hAnsi="Open Sans ExtraBold" w:cs="Open Sans ExtraBold"/>
-                <w:sz w:val="20"/>
-                <w:szCs w:val="20"/>
-              </w:rPr>
-            </w:pPr>
-          </w:p>
-        </w:tc>
-        <w:tc>
-          <w:tcPr>
-            <w:tcW w:w="8565" w:type="dxa"/>
-            <w:shd w:val="clear" w:color="auto" w:fill="auto"/>
-            <w:tcMar>
-              <w:top w:w="5" w:type="dxa"/>
-              <w:left w:w="5" w:type="dxa"/>
-              <w:bottom w:w="5" w:type="dxa"/>
-              <w:right w:w="5" w:type="dxa"/>
-            </w:tcMar>
-            <w:vAlign w:val="center"/>
-          </w:tcPr>
-          <w:p>
-            <w:pPr>
-              <w:widowControl w:val="0"/>
-              <w:pBdr>
-                <w:top w:val="nil"/>
-                <w:left w:val="nil"/>
-                <w:bottom w:val="nil"/>
-                <w:right w:val="nil"/>
-                <w:between w:val="nil"/>
-              </w:pBdr>
-              <w:spacing w:after="0" w:line="240" w:lineRule="auto"/>
-              <w:ind w:left="0" w:right="61"/>
-              <w:jc w:val="left"/>
-              <w:rPr>
-                <w:rFonts w:ascii="Open Sans ExtraBold" w:eastAsia="Open Sans ExtraBold" w:hAnsi="Open Sans ExtraBold" w:cs="Open Sans ExtraBold"/>
-                <w:sz w:val="20"/>
-                <w:szCs w:val="20"/>
-              </w:rPr>
-            </w:pPr>
-          </w:p>
-        </w:tc>
-      </w:tr>
-      <w:tr>
-        <w:tc>
-          <w:tcPr>
-            <w:tcW w:w="1335" w:type="dxa"/>
-            <w:shd w:val="clear" w:color="auto" w:fill="auto"/>
-            <w:tcMar>
-              <w:top w:w="5" w:type="dxa"/>
-              <w:left w:w="5" w:type="dxa"/>
-              <w:bottom w:w="5" w:type="dxa"/>
-              <w:right w:w="5" w:type="dxa"/>
-            </w:tcMar>
-            <w:vAlign w:val="center"/>
-          </w:tcPr>
-          <w:p>
-            <w:pPr>
-              <w:spacing w:line="240" w:lineRule="auto"/>
-            </w:pPr>
-            <w:r>
-              <w:rPr>
-                <w:rFonts w:ascii="Open Sans ExtraBold" w:eastAsia="Open Sans ExtraBold" w:hAnsi="Open Sans ExtraBold" w:cs="Open Sans ExtraBold"/>
-                <w:b/>
-                <w:bCs/>
-                <w:sz w:val="20"/>
-                <w:szCs w:val="20"/>
-              </w:rPr>
-              <w:t>RF18</w:t>
-            </w:r>
-          </w:p>
-          <w:p>
-            <w:pPr>
-              <w:widowControl w:val="0"/>
-              <w:pBdr>
-                <w:top w:val="nil"/>
-                <w:left w:val="nil"/>
-                <w:bottom w:val="nil"/>
-                <w:right w:val="nil"/>
-                <w:between w:val="nil"/>
-              </w:pBdr>
-              <w:spacing w:after="0" w:line="240" w:lineRule="auto"/>
-              <w:ind w:left="0" w:right="0"/>
-              <w:jc w:val="left"/>
-              <w:rPr>
-                <w:rFonts w:ascii="Open Sans ExtraBold" w:eastAsia="Open Sans ExtraBold" w:hAnsi="Open Sans ExtraBold" w:cs="Open Sans ExtraBold"/>
-                <w:sz w:val="20"/>
-                <w:szCs w:val="20"/>
-              </w:rPr>
-            </w:pPr>
-          </w:p>
-        </w:tc>
-        <w:tc>
-          <w:tcPr>
-            <w:tcW w:w="8565" w:type="dxa"/>
-            <w:shd w:val="clear" w:color="auto" w:fill="auto"/>
-            <w:tcMar>
-              <w:top w:w="5" w:type="dxa"/>
-              <w:left w:w="5" w:type="dxa"/>
-              <w:bottom w:w="5" w:type="dxa"/>
-              <w:right w:w="5" w:type="dxa"/>
-            </w:tcMar>
-            <w:vAlign w:val="center"/>
-          </w:tcPr>
-          <w:p>
-            <w:pPr>
-              <w:widowControl w:val="0"/>
-              <w:pBdr>
-                <w:top w:val="nil"/>
-                <w:left w:val="nil"/>
-                <w:bottom w:val="nil"/>
-                <w:right w:val="nil"/>
-                <w:between w:val="nil"/>
-              </w:pBdr>
-              <w:spacing w:after="0" w:line="240" w:lineRule="auto"/>
-              <w:ind w:left="0" w:right="61"/>
-              <w:jc w:val="left"/>
-              <w:rPr>
-                <w:rFonts w:ascii="Open Sans ExtraBold" w:eastAsia="Open Sans ExtraBold" w:hAnsi="Open Sans ExtraBold" w:cs="Open Sans ExtraBold"/>
-                <w:sz w:val="20"/>
-                <w:szCs w:val="20"/>
-              </w:rPr>
-            </w:pPr>
-          </w:p>
-        </w:tc>
-      </w:tr>
-      <w:tr>
-        <w:tc>
-          <w:tcPr>
-            <w:tcW w:w="1335" w:type="dxa"/>
-            <w:shd w:val="clear" w:color="auto" w:fill="auto"/>
-            <w:tcMar>
-              <w:top w:w="5" w:type="dxa"/>
-              <w:left w:w="5" w:type="dxa"/>
-              <w:bottom w:w="5" w:type="dxa"/>
-              <w:right w:w="5" w:type="dxa"/>
-            </w:tcMar>
-            <w:vAlign w:val="center"/>
-          </w:tcPr>
-          <w:p>
-            <w:pPr>
-              <w:spacing w:line="240" w:lineRule="auto"/>
-            </w:pPr>
-            <w:r>
-              <w:rPr>
-                <w:rFonts w:ascii="Open Sans ExtraBold" w:eastAsia="Open Sans ExtraBold" w:hAnsi="Open Sans ExtraBold" w:cs="Open Sans ExtraBold"/>
-                <w:b/>
-                <w:bCs/>
-                <w:sz w:val="20"/>
-                <w:szCs w:val="20"/>
-              </w:rPr>
-              <w:t>RF19</w:t>
-            </w:r>
-          </w:p>
-          <w:p>
-            <w:pPr>
-              <w:widowControl w:val="0"/>
-              <w:pBdr>
-                <w:top w:val="nil"/>
-                <w:left w:val="nil"/>
-                <w:bottom w:val="nil"/>
-                <w:right w:val="nil"/>
-                <w:between w:val="nil"/>
-              </w:pBdr>
-              <w:spacing w:after="0" w:line="240" w:lineRule="auto"/>
-              <w:ind w:left="0" w:right="0"/>
-              <w:jc w:val="left"/>
-              <w:rPr>
-                <w:rFonts w:ascii="Open Sans ExtraBold" w:eastAsia="Open Sans ExtraBold" w:hAnsi="Open Sans ExtraBold" w:cs="Open Sans ExtraBold"/>
-                <w:sz w:val="20"/>
-                <w:szCs w:val="20"/>
-              </w:rPr>
-            </w:pPr>
-          </w:p>
-        </w:tc>
-        <w:tc>
-          <w:tcPr>
-            <w:tcW w:w="8565" w:type="dxa"/>
-            <w:shd w:val="clear" w:color="auto" w:fill="auto"/>
-            <w:tcMar>
-              <w:top w:w="5" w:type="dxa"/>
-              <w:left w:w="5" w:type="dxa"/>
-              <w:bottom w:w="5" w:type="dxa"/>
-              <w:right w:w="5" w:type="dxa"/>
-            </w:tcMar>
-            <w:vAlign w:val="center"/>
-          </w:tcPr>
-          <w:p>
-            <w:pPr>
-              <w:widowControl w:val="0"/>
-              <w:pBdr>
-                <w:top w:val="nil"/>
-                <w:left w:val="nil"/>
-                <w:bottom w:val="nil"/>
-                <w:right w:val="nil"/>
-                <w:between w:val="nil"/>
-              </w:pBdr>
-              <w:spacing w:after="0" w:line="240" w:lineRule="auto"/>
-              <w:ind w:left="0" w:right="61"/>
-              <w:jc w:val="left"/>
-              <w:rPr>
-                <w:rFonts w:ascii="Open Sans ExtraBold" w:eastAsia="Open Sans ExtraBold" w:hAnsi="Open Sans ExtraBold" w:cs="Open Sans ExtraBold"/>
-                <w:sz w:val="20"/>
-                <w:szCs w:val="20"/>
-              </w:rPr>
-            </w:pPr>
+              <w:pStyle w:val="NormalWeb"/>
+              <w:spacing w:before="0" w:beforeAutospacing="0" w:after="0" w:afterAutospacing="0"/>
+              <w:ind w:right="-531"/>
+              <w:jc w:val="both"/>
+            </w:pPr>
+            <w:r>
+              <w:rPr>
+                <w:rFonts w:ascii="Arial" w:hAnsi="Arial" w:cs="Arial"/>
+                <w:color w:val="000000"/>
+              </w:rPr>
+              <w:t>Registrar el cronograma de actividades de un retiro. El sistema deberá </w:t>
+            </w:r>
+          </w:p>
+          <w:p>
+            <w:pPr>
+              <w:pStyle w:val="NormalWeb"/>
+              <w:spacing w:before="0" w:beforeAutospacing="0" w:after="0" w:afterAutospacing="0"/>
+              <w:ind w:right="-531"/>
+              <w:jc w:val="both"/>
+            </w:pPr>
+            <w:r>
+              <w:rPr>
+                <w:rFonts w:ascii="Arial" w:hAnsi="Arial" w:cs="Arial"/>
+                <w:color w:val="000000"/>
+              </w:rPr>
+              <w:t>Permitir registrar las actividades, los tiempos, que tiempo dura la actividad.</w:t>
+            </w:r>
+          </w:p>
+          <w:p>
+            <w:pPr>
+              <w:pStyle w:val="NormalWeb"/>
+              <w:spacing w:before="0" w:beforeAutospacing="0" w:after="0" w:afterAutospacing="0"/>
+              <w:ind w:right="-531"/>
+              <w:jc w:val="both"/>
+            </w:pPr>
+            <w:r>
+              <w:rPr>
+                <w:rFonts w:ascii="Arial" w:hAnsi="Arial" w:cs="Arial"/>
+                <w:color w:val="000000"/>
+              </w:rPr>
+              <w:t>(Agregada en clase)</w:t>
+            </w:r>
           </w:p>
         </w:tc>
       </w:tr>
@@ -2281,7 +1977,7 @@
       </w:pPr>
     </w:p>
     <w:sectPr>
-      <w:headerReference w:type="default" r:id="rId7"/>
+      <w:headerReference w:type="default" r:id="rId8"/>
       <w:pgSz w:w="12240" w:h="15840"/>
       <w:pgMar w:top="1440" w:right="1440" w:bottom="1440" w:left="1440" w:header="720" w:footer="720" w:gutter="0"/>
       <w:pgNumType w:start="1"/>
@@ -2292,7 +1988,7 @@
 </file>
 
 <file path=word/endnotes.xml><?xml version="1.0" encoding="utf-8"?>
-<w:endnotes xmlns:wpc="http://schemas.microsoft.com/office/word/2010/wordprocessingCanvas" xmlns:mc="http://schemas.openxmlformats.org/markup-compatibility/2006" xmlns:o="urn:schemas-microsoft-com:office:office" xmlns:r="http://schemas.openxmlformats.org/officeDocument/2006/relationships" xmlns:m="http://schemas.openxmlformats.org/officeDocument/2006/math" xmlns:v="urn:schemas-microsoft-com:vml" xmlns:wp14="http://schemas.microsoft.com/office/word/2010/wordprocessingDrawing" xmlns:wp="http://schemas.openxmlformats.org/drawingml/2006/wordprocessingDrawing" xmlns:w10="urn:schemas-microsoft-com:office:word" xmlns:w="http://schemas.openxmlformats.org/wordprocessingml/2006/main" xmlns:w14="http://schemas.microsoft.com/office/word/2010/wordml" xmlns:w15="http://schemas.microsoft.com/office/word/2012/wordml" xmlns:wpg="http://schemas.microsoft.com/office/word/2010/wordprocessingGroup" xmlns:wpi="http://schemas.microsoft.com/office/word/2010/wordprocessingInk" xmlns:wne="http://schemas.microsoft.com/office/word/2006/wordml" xmlns:wps="http://schemas.microsoft.com/office/word/2010/wordprocessingShape" mc:Ignorable="w14 w15 wp14">
+<w:endnotes xmlns:wpc="http://schemas.microsoft.com/office/word/2010/wordprocessingCanvas" xmlns:mc="http://schemas.openxmlformats.org/markup-compatibility/2006" xmlns:o="urn:schemas-microsoft-com:office:office" xmlns:r="http://schemas.openxmlformats.org/officeDocument/2006/relationships" xmlns:m="http://schemas.openxmlformats.org/officeDocument/2006/math" xmlns:v="urn:schemas-microsoft-com:vml" xmlns:wp14="http://schemas.microsoft.com/office/word/2010/wordprocessingDrawing" xmlns:wp="http://schemas.openxmlformats.org/drawingml/2006/wordprocessingDrawing" xmlns:w10="urn:schemas-microsoft-com:office:word" xmlns:w="http://schemas.openxmlformats.org/wordprocessingml/2006/main" xmlns:w14="http://schemas.microsoft.com/office/word/2010/wordml" xmlns:wpg="http://schemas.microsoft.com/office/word/2010/wordprocessingGroup" xmlns:wpi="http://schemas.microsoft.com/office/word/2010/wordprocessingInk" xmlns:wne="http://schemas.microsoft.com/office/word/2006/wordml" xmlns:wps="http://schemas.microsoft.com/office/word/2010/wordprocessingShape" mc:Ignorable="w14 wp14">
   <w:endnote w:type="separator" w:id="-1">
     <w:p>
       <w:pPr>
@@ -2317,7 +2013,7 @@
 </file>
 
 <file path=word/footnotes.xml><?xml version="1.0" encoding="utf-8"?>
-<w:footnotes xmlns:wpc="http://schemas.microsoft.com/office/word/2010/wordprocessingCanvas" xmlns:mc="http://schemas.openxmlformats.org/markup-compatibility/2006" xmlns:o="urn:schemas-microsoft-com:office:office" xmlns:r="http://schemas.openxmlformats.org/officeDocument/2006/relationships" xmlns:m="http://schemas.openxmlformats.org/officeDocument/2006/math" xmlns:v="urn:schemas-microsoft-com:vml" xmlns:wp14="http://schemas.microsoft.com/office/word/2010/wordprocessingDrawing" xmlns:wp="http://schemas.openxmlformats.org/drawingml/2006/wordprocessingDrawing" xmlns:w10="urn:schemas-microsoft-com:office:word" xmlns:w="http://schemas.openxmlformats.org/wordprocessingml/2006/main" xmlns:w14="http://schemas.microsoft.com/office/word/2010/wordml" xmlns:w15="http://schemas.microsoft.com/office/word/2012/wordml" xmlns:wpg="http://schemas.microsoft.com/office/word/2010/wordprocessingGroup" xmlns:wpi="http://schemas.microsoft.com/office/word/2010/wordprocessingInk" xmlns:wne="http://schemas.microsoft.com/office/word/2006/wordml" xmlns:wps="http://schemas.microsoft.com/office/word/2010/wordprocessingShape" mc:Ignorable="w14 w15 wp14">
+<w:footnotes xmlns:wpc="http://schemas.microsoft.com/office/word/2010/wordprocessingCanvas" xmlns:mc="http://schemas.openxmlformats.org/markup-compatibility/2006" xmlns:o="urn:schemas-microsoft-com:office:office" xmlns:r="http://schemas.openxmlformats.org/officeDocument/2006/relationships" xmlns:m="http://schemas.openxmlformats.org/officeDocument/2006/math" xmlns:v="urn:schemas-microsoft-com:vml" xmlns:wp14="http://schemas.microsoft.com/office/word/2010/wordprocessingDrawing" xmlns:wp="http://schemas.openxmlformats.org/drawingml/2006/wordprocessingDrawing" xmlns:w10="urn:schemas-microsoft-com:office:word" xmlns:w="http://schemas.openxmlformats.org/wordprocessingml/2006/main" xmlns:w14="http://schemas.microsoft.com/office/word/2010/wordml" xmlns:wpg="http://schemas.microsoft.com/office/word/2010/wordprocessingGroup" xmlns:wpi="http://schemas.microsoft.com/office/word/2010/wordprocessingInk" xmlns:wne="http://schemas.microsoft.com/office/word/2006/wordml" xmlns:wps="http://schemas.microsoft.com/office/word/2010/wordprocessingShape" mc:Ignorable="w14 wp14">
   <w:footnote w:type="separator" w:id="-1">
     <w:p>
       <w:pPr>
@@ -2342,7 +2038,7 @@
 </file>
 
 <file path=word/header1.xml><?xml version="1.0" encoding="utf-8"?>
-<w:hdr xmlns:wpc="http://schemas.microsoft.com/office/word/2010/wordprocessingCanvas" xmlns:mc="http://schemas.openxmlformats.org/markup-compatibility/2006" xmlns:o="urn:schemas-microsoft-com:office:office" xmlns:r="http://schemas.openxmlformats.org/officeDocument/2006/relationships" xmlns:m="http://schemas.openxmlformats.org/officeDocument/2006/math" xmlns:v="urn:schemas-microsoft-com:vml" xmlns:wp14="http://schemas.microsoft.com/office/word/2010/wordprocessingDrawing" xmlns:wp="http://schemas.openxmlformats.org/drawingml/2006/wordprocessingDrawing" xmlns:w10="urn:schemas-microsoft-com:office:word" xmlns:w="http://schemas.openxmlformats.org/wordprocessingml/2006/main" xmlns:w14="http://schemas.microsoft.com/office/word/2010/wordml" xmlns:w15="http://schemas.microsoft.com/office/word/2012/wordml" xmlns:wpg="http://schemas.microsoft.com/office/word/2010/wordprocessingGroup" xmlns:wpi="http://schemas.microsoft.com/office/word/2010/wordprocessingInk" xmlns:wne="http://schemas.microsoft.com/office/word/2006/wordml" xmlns:wps="http://schemas.microsoft.com/office/word/2010/wordprocessingShape" mc:Ignorable="w14 w15 wp14">
+<w:hdr xmlns:wpc="http://schemas.microsoft.com/office/word/2010/wordprocessingCanvas" xmlns:mc="http://schemas.openxmlformats.org/markup-compatibility/2006" xmlns:o="urn:schemas-microsoft-com:office:office" xmlns:r="http://schemas.openxmlformats.org/officeDocument/2006/relationships" xmlns:m="http://schemas.openxmlformats.org/officeDocument/2006/math" xmlns:v="urn:schemas-microsoft-com:vml" xmlns:wp14="http://schemas.microsoft.com/office/word/2010/wordprocessingDrawing" xmlns:wp="http://schemas.openxmlformats.org/drawingml/2006/wordprocessingDrawing" xmlns:w10="urn:schemas-microsoft-com:office:word" xmlns:w="http://schemas.openxmlformats.org/wordprocessingml/2006/main" xmlns:w14="http://schemas.microsoft.com/office/word/2010/wordml" xmlns:wpg="http://schemas.microsoft.com/office/word/2010/wordprocessingGroup" xmlns:wpi="http://schemas.microsoft.com/office/word/2010/wordprocessingInk" xmlns:wne="http://schemas.microsoft.com/office/word/2006/wordml" xmlns:wps="http://schemas.microsoft.com/office/word/2010/wordprocessingShape" mc:Ignorable="w14 wp14">
   <w:p>
     <w:pPr>
       <w:spacing w:before="200" w:after="0"/>
@@ -2508,8 +2204,8 @@
 </file>
 
 <file path=word/numbering.xml><?xml version="1.0" encoding="utf-8"?>
-<w:numbering xmlns:wpc="http://schemas.microsoft.com/office/word/2010/wordprocessingCanvas" xmlns:mc="http://schemas.openxmlformats.org/markup-compatibility/2006" xmlns:o="urn:schemas-microsoft-com:office:office" xmlns:r="http://schemas.openxmlformats.org/officeDocument/2006/relationships" xmlns:m="http://schemas.openxmlformats.org/officeDocument/2006/math" xmlns:v="urn:schemas-microsoft-com:vml" xmlns:wp14="http://schemas.microsoft.com/office/word/2010/wordprocessingDrawing" xmlns:wp="http://schemas.openxmlformats.org/drawingml/2006/wordprocessingDrawing" xmlns:w10="urn:schemas-microsoft-com:office:word" xmlns:w="http://schemas.openxmlformats.org/wordprocessingml/2006/main" xmlns:w14="http://schemas.microsoft.com/office/word/2010/wordml" xmlns:w15="http://schemas.microsoft.com/office/word/2012/wordml" xmlns:wpg="http://schemas.microsoft.com/office/word/2010/wordprocessingGroup" xmlns:wpi="http://schemas.microsoft.com/office/word/2010/wordprocessingInk" xmlns:wne="http://schemas.microsoft.com/office/word/2006/wordml" xmlns:wps="http://schemas.microsoft.com/office/word/2010/wordprocessingShape" mc:Ignorable="w14 w15 wp14">
-  <w:abstractNum w:abstractNumId="0" w15:restartNumberingAfterBreak="0">
+<w:numbering xmlns:wpc="http://schemas.microsoft.com/office/word/2010/wordprocessingCanvas" xmlns:mc="http://schemas.openxmlformats.org/markup-compatibility/2006" xmlns:o="urn:schemas-microsoft-com:office:office" xmlns:r="http://schemas.openxmlformats.org/officeDocument/2006/relationships" xmlns:m="http://schemas.openxmlformats.org/officeDocument/2006/math" xmlns:v="urn:schemas-microsoft-com:vml" xmlns:wp14="http://schemas.microsoft.com/office/word/2010/wordprocessingDrawing" xmlns:wp="http://schemas.openxmlformats.org/drawingml/2006/wordprocessingDrawing" xmlns:w10="urn:schemas-microsoft-com:office:word" xmlns:w="http://schemas.openxmlformats.org/wordprocessingml/2006/main" xmlns:w14="http://schemas.microsoft.com/office/word/2010/wordml" xmlns:wpg="http://schemas.microsoft.com/office/word/2010/wordprocessingGroup" xmlns:wpi="http://schemas.microsoft.com/office/word/2010/wordprocessingInk" xmlns:wne="http://schemas.microsoft.com/office/word/2006/wordml" xmlns:wps="http://schemas.microsoft.com/office/word/2010/wordprocessingShape" mc:Ignorable="w14 wp14">
+  <w:abstractNum w:abstractNumId="0">
     <w:nsid w:val="0ED06403"/>
     <w:multiLevelType w:val="multilevel"/>
     <w:tmpl w:val="42A2A5C6"/>
@@ -2629,7 +2325,7 @@
 </file>
 
 <file path=word/styles.xml><?xml version="1.0" encoding="utf-8"?>
-<w:styles xmlns:mc="http://schemas.openxmlformats.org/markup-compatibility/2006" xmlns:r="http://schemas.openxmlformats.org/officeDocument/2006/relationships" xmlns:w="http://schemas.openxmlformats.org/wordprocessingml/2006/main" xmlns:w14="http://schemas.microsoft.com/office/word/2010/wordml" xmlns:w15="http://schemas.microsoft.com/office/word/2012/wordml" mc:Ignorable="w14 w15">
+<w:styles xmlns:mc="http://schemas.openxmlformats.org/markup-compatibility/2006" xmlns:r="http://schemas.openxmlformats.org/officeDocument/2006/relationships" xmlns:w="http://schemas.openxmlformats.org/wordprocessingml/2006/main" xmlns:w14="http://schemas.microsoft.com/office/word/2010/wordml" mc:Ignorable="w14">
   <w:docDefaults>
     <w:rPrDefault>
       <w:rPr>
@@ -2647,378 +2343,144 @@
       </w:pPr>
     </w:pPrDefault>
   </w:docDefaults>
-  <w:latentStyles w:defLockedState="0" w:defUIPriority="99" w:defSemiHidden="0" w:defUnhideWhenUsed="0" w:defQFormat="0" w:count="371">
-    <w:lsdException w:name="Normal" w:uiPriority="0" w:qFormat="1"/>
-    <w:lsdException w:name="heading 1" w:uiPriority="9" w:qFormat="1"/>
-    <w:lsdException w:name="heading 2" w:semiHidden="1" w:uiPriority="9" w:unhideWhenUsed="1" w:qFormat="1"/>
-    <w:lsdException w:name="heading 3" w:semiHidden="1" w:uiPriority="9" w:unhideWhenUsed="1" w:qFormat="1"/>
-    <w:lsdException w:name="heading 4" w:semiHidden="1" w:uiPriority="9" w:unhideWhenUsed="1" w:qFormat="1"/>
-    <w:lsdException w:name="heading 5" w:semiHidden="1" w:uiPriority="9" w:unhideWhenUsed="1" w:qFormat="1"/>
-    <w:lsdException w:name="heading 6" w:semiHidden="1" w:uiPriority="9" w:unhideWhenUsed="1" w:qFormat="1"/>
-    <w:lsdException w:name="heading 7" w:semiHidden="1" w:uiPriority="9" w:unhideWhenUsed="1" w:qFormat="1"/>
-    <w:lsdException w:name="heading 8" w:semiHidden="1" w:uiPriority="9" w:unhideWhenUsed="1" w:qFormat="1"/>
-    <w:lsdException w:name="heading 9" w:semiHidden="1" w:uiPriority="9" w:unhideWhenUsed="1" w:qFormat="1"/>
-    <w:lsdException w:name="index 1" w:semiHidden="1" w:unhideWhenUsed="1"/>
-    <w:lsdException w:name="index 2" w:semiHidden="1" w:unhideWhenUsed="1"/>
-    <w:lsdException w:name="index 3" w:semiHidden="1" w:unhideWhenUsed="1"/>
-    <w:lsdException w:name="index 4" w:semiHidden="1" w:unhideWhenUsed="1"/>
-    <w:lsdException w:name="index 5" w:semiHidden="1" w:unhideWhenUsed="1"/>
-    <w:lsdException w:name="index 6" w:semiHidden="1" w:unhideWhenUsed="1"/>
-    <w:lsdException w:name="index 7" w:semiHidden="1" w:unhideWhenUsed="1"/>
-    <w:lsdException w:name="index 8" w:semiHidden="1" w:unhideWhenUsed="1"/>
-    <w:lsdException w:name="index 9" w:semiHidden="1" w:unhideWhenUsed="1"/>
-    <w:lsdException w:name="toc 1" w:semiHidden="1" w:uiPriority="39" w:unhideWhenUsed="1"/>
-    <w:lsdException w:name="toc 2" w:semiHidden="1" w:uiPriority="39" w:unhideWhenUsed="1"/>
-    <w:lsdException w:name="toc 3" w:semiHidden="1" w:uiPriority="39" w:unhideWhenUsed="1"/>
-    <w:lsdException w:name="toc 4" w:semiHidden="1" w:uiPriority="39" w:unhideWhenUsed="1"/>
-    <w:lsdException w:name="toc 5" w:semiHidden="1" w:uiPriority="39" w:unhideWhenUsed="1"/>
-    <w:lsdException w:name="toc 6" w:semiHidden="1" w:uiPriority="39" w:unhideWhenUsed="1"/>
-    <w:lsdException w:name="toc 7" w:semiHidden="1" w:uiPriority="39" w:unhideWhenUsed="1"/>
-    <w:lsdException w:name="toc 8" w:semiHidden="1" w:uiPriority="39" w:unhideWhenUsed="1"/>
-    <w:lsdException w:name="toc 9" w:semiHidden="1" w:uiPriority="39" w:unhideWhenUsed="1"/>
-    <w:lsdException w:name="Normal Indent" w:semiHidden="1" w:unhideWhenUsed="1"/>
-    <w:lsdException w:name="footnote text" w:semiHidden="1" w:unhideWhenUsed="1"/>
-    <w:lsdException w:name="annotation text" w:semiHidden="1" w:unhideWhenUsed="1"/>
-    <w:lsdException w:name="header" w:semiHidden="1" w:unhideWhenUsed="1"/>
-    <w:lsdException w:name="footer" w:semiHidden="1" w:unhideWhenUsed="1"/>
-    <w:lsdException w:name="index heading" w:semiHidden="1" w:unhideWhenUsed="1"/>
-    <w:lsdException w:name="caption" w:semiHidden="1" w:uiPriority="35" w:unhideWhenUsed="1" w:qFormat="1"/>
-    <w:lsdException w:name="table of figures" w:semiHidden="1" w:unhideWhenUsed="1"/>
-    <w:lsdException w:name="envelope address" w:semiHidden="1" w:unhideWhenUsed="1"/>
-    <w:lsdException w:name="envelope return" w:semiHidden="1" w:unhideWhenUsed="1"/>
-    <w:lsdException w:name="footnote reference" w:semiHidden="1" w:unhideWhenUsed="1"/>
-    <w:lsdException w:name="annotation reference" w:semiHidden="1" w:unhideWhenUsed="1"/>
-    <w:lsdException w:name="line number" w:semiHidden="1" w:unhideWhenUsed="1"/>
-    <w:lsdException w:name="page number" w:semiHidden="1" w:unhideWhenUsed="1"/>
-    <w:lsdException w:name="endnote reference" w:semiHidden="1" w:unhideWhenUsed="1"/>
-    <w:lsdException w:name="endnote text" w:semiHidden="1" w:unhideWhenUsed="1"/>
-    <w:lsdException w:name="table of authorities" w:semiHidden="1" w:unhideWhenUsed="1"/>
-    <w:lsdException w:name="macro" w:semiHidden="1" w:unhideWhenUsed="1"/>
-    <w:lsdException w:name="toa heading" w:semiHidden="1" w:unhideWhenUsed="1"/>
-    <w:lsdException w:name="List" w:semiHidden="1" w:unhideWhenUsed="1"/>
-    <w:lsdException w:name="List Bullet" w:semiHidden="1" w:unhideWhenUsed="1"/>
-    <w:lsdException w:name="List Number" w:semiHidden="1" w:unhideWhenUsed="1"/>
-    <w:lsdException w:name="List 2" w:semiHidden="1" w:unhideWhenUsed="1"/>
-    <w:lsdException w:name="List 3" w:semiHidden="1" w:unhideWhenUsed="1"/>
-    <w:lsdException w:name="List 4" w:semiHidden="1" w:unhideWhenUsed="1"/>
-    <w:lsdException w:name="List 5" w:semiHidden="1" w:unhideWhenUsed="1"/>
-    <w:lsdException w:name="List Bullet 2" w:semiHidden="1" w:unhideWhenUsed="1"/>
-    <w:lsdException w:name="List Bullet 3" w:semiHidden="1" w:unhideWhenUsed="1"/>
-    <w:lsdException w:name="List Bullet 4" w:semiHidden="1" w:unhideWhenUsed="1"/>
-    <w:lsdException w:name="List Bullet 5" w:semiHidden="1" w:unhideWhenUsed="1"/>
-    <w:lsdException w:name="List Number 2" w:semiHidden="1" w:unhideWhenUsed="1"/>
-    <w:lsdException w:name="List Number 3" w:semiHidden="1" w:unhideWhenUsed="1"/>
-    <w:lsdException w:name="List Number 4" w:semiHidden="1" w:unhideWhenUsed="1"/>
-    <w:lsdException w:name="List Number 5" w:semiHidden="1" w:unhideWhenUsed="1"/>
-    <w:lsdException w:name="Title" w:uiPriority="10" w:qFormat="1"/>
-    <w:lsdException w:name="Closing" w:semiHidden="1" w:unhideWhenUsed="1"/>
-    <w:lsdException w:name="Signature" w:semiHidden="1" w:unhideWhenUsed="1"/>
-    <w:lsdException w:name="Default Paragraph Font" w:semiHidden="1" w:uiPriority="1" w:unhideWhenUsed="1"/>
-    <w:lsdException w:name="Body Text" w:semiHidden="1" w:unhideWhenUsed="1"/>
-    <w:lsdException w:name="Body Text Indent" w:semiHidden="1" w:unhideWhenUsed="1"/>
-    <w:lsdException w:name="List Continue" w:semiHidden="1" w:unhideWhenUsed="1"/>
-    <w:lsdException w:name="List Continue 2" w:semiHidden="1" w:unhideWhenUsed="1"/>
-    <w:lsdException w:name="List Continue 3" w:semiHidden="1" w:unhideWhenUsed="1"/>
-    <w:lsdException w:name="List Continue 4" w:semiHidden="1" w:unhideWhenUsed="1"/>
-    <w:lsdException w:name="List Continue 5" w:semiHidden="1" w:unhideWhenUsed="1"/>
-    <w:lsdException w:name="Message Header" w:semiHidden="1" w:unhideWhenUsed="1"/>
-    <w:lsdException w:name="Subtitle" w:uiPriority="11" w:qFormat="1"/>
-    <w:lsdException w:name="Salutation" w:semiHidden="1" w:unhideWhenUsed="1"/>
-    <w:lsdException w:name="Date" w:semiHidden="1" w:unhideWhenUsed="1"/>
-    <w:lsdException w:name="Body Text First Indent" w:semiHidden="1" w:unhideWhenUsed="1"/>
-    <w:lsdException w:name="Body Text First Indent 2" w:semiHidden="1" w:unhideWhenUsed="1"/>
-    <w:lsdException w:name="Note Heading" w:semiHidden="1" w:unhideWhenUsed="1"/>
-    <w:lsdException w:name="Body Text 2" w:semiHidden="1" w:unhideWhenUsed="1"/>
-    <w:lsdException w:name="Body Text 3" w:semiHidden="1" w:unhideWhenUsed="1"/>
-    <w:lsdException w:name="Body Text Indent 2" w:semiHidden="1" w:unhideWhenUsed="1"/>
-    <w:lsdException w:name="Body Text Indent 3" w:semiHidden="1" w:unhideWhenUsed="1"/>
-    <w:lsdException w:name="Block Text" w:semiHidden="1" w:unhideWhenUsed="1"/>
-    <w:lsdException w:name="Hyperlink" w:semiHidden="1" w:unhideWhenUsed="1"/>
-    <w:lsdException w:name="FollowedHyperlink" w:semiHidden="1" w:unhideWhenUsed="1"/>
-    <w:lsdException w:name="Strong" w:uiPriority="22" w:qFormat="1"/>
-    <w:lsdException w:name="Emphasis" w:uiPriority="20" w:qFormat="1"/>
-    <w:lsdException w:name="Document Map" w:semiHidden="1" w:unhideWhenUsed="1"/>
-    <w:lsdException w:name="Plain Text" w:semiHidden="1" w:unhideWhenUsed="1"/>
-    <w:lsdException w:name="E-mail Signature" w:semiHidden="1" w:unhideWhenUsed="1"/>
-    <w:lsdException w:name="HTML Top of Form" w:semiHidden="1" w:unhideWhenUsed="1"/>
-    <w:lsdException w:name="HTML Bottom of Form" w:semiHidden="1" w:unhideWhenUsed="1"/>
-    <w:lsdException w:name="Normal (Web)" w:semiHidden="1" w:unhideWhenUsed="1"/>
-    <w:lsdException w:name="HTML Acronym" w:semiHidden="1" w:unhideWhenUsed="1"/>
-    <w:lsdException w:name="HTML Address" w:semiHidden="1" w:unhideWhenUsed="1"/>
-    <w:lsdException w:name="HTML Cite" w:semiHidden="1" w:unhideWhenUsed="1"/>
-    <w:lsdException w:name="HTML Code" w:semiHidden="1" w:unhideWhenUsed="1"/>
-    <w:lsdException w:name="HTML Definition" w:semiHidden="1" w:unhideWhenUsed="1"/>
-    <w:lsdException w:name="HTML Keyboard" w:semiHidden="1" w:unhideWhenUsed="1"/>
-    <w:lsdException w:name="HTML Preformatted" w:semiHidden="1" w:unhideWhenUsed="1"/>
-    <w:lsdException w:name="HTML Sample" w:semiHidden="1" w:unhideWhenUsed="1"/>
-    <w:lsdException w:name="HTML Typewriter" w:semiHidden="1" w:unhideWhenUsed="1"/>
-    <w:lsdException w:name="HTML Variable" w:semiHidden="1" w:unhideWhenUsed="1"/>
-    <w:lsdException w:name="Normal Table" w:semiHidden="1" w:unhideWhenUsed="1"/>
-    <w:lsdException w:name="annotation subject" w:semiHidden="1" w:unhideWhenUsed="1"/>
-    <w:lsdException w:name="No List" w:semiHidden="1" w:unhideWhenUsed="1"/>
-    <w:lsdException w:name="Outline List 1" w:semiHidden="1" w:unhideWhenUsed="1"/>
-    <w:lsdException w:name="Outline List 2" w:semiHidden="1" w:unhideWhenUsed="1"/>
-    <w:lsdException w:name="Outline List 3" w:semiHidden="1" w:unhideWhenUsed="1"/>
-    <w:lsdException w:name="Table Simple 1" w:semiHidden="1" w:unhideWhenUsed="1"/>
-    <w:lsdException w:name="Table Simple 2" w:semiHidden="1" w:unhideWhenUsed="1"/>
-    <w:lsdException w:name="Table Simple 3" w:semiHidden="1" w:unhideWhenUsed="1"/>
-    <w:lsdException w:name="Table Classic 1" w:semiHidden="1" w:unhideWhenUsed="1"/>
-    <w:lsdException w:name="Table Classic 2" w:semiHidden="1" w:unhideWhenUsed="1"/>
-    <w:lsdException w:name="Table Classic 3" w:semiHidden="1" w:unhideWhenUsed="1"/>
-    <w:lsdException w:name="Table Classic 4" w:semiHidden="1" w:unhideWhenUsed="1"/>
-    <w:lsdException w:name="Table Colorful 1" w:semiHidden="1" w:unhideWhenUsed="1"/>
-    <w:lsdException w:name="Table Colorful 2" w:semiHidden="1" w:unhideWhenUsed="1"/>
-    <w:lsdException w:name="Table Colorful 3" w:semiHidden="1" w:unhideWhenUsed="1"/>
-    <w:lsdException w:name="Table Columns 1" w:semiHidden="1" w:unhideWhenUsed="1"/>
-    <w:lsdException w:name="Table Columns 2" w:semiHidden="1" w:unhideWhenUsed="1"/>
-    <w:lsdException w:name="Table Columns 3" w:semiHidden="1" w:unhideWhenUsed="1"/>
-    <w:lsdException w:name="Table Columns 4" w:semiHidden="1" w:unhideWhenUsed="1"/>
-    <w:lsdException w:name="Table Columns 5" w:semiHidden="1" w:unhideWhenUsed="1"/>
-    <w:lsdException w:name="Table Grid 1" w:semiHidden="1" w:unhideWhenUsed="1"/>
-    <w:lsdException w:name="Table Grid 2" w:semiHidden="1" w:unhideWhenUsed="1"/>
-    <w:lsdException w:name="Table Grid 3" w:semiHidden="1" w:unhideWhenUsed="1"/>
-    <w:lsdException w:name="Table Grid 4" w:semiHidden="1" w:unhideWhenUsed="1"/>
-    <w:lsdException w:name="Table Grid 5" w:semiHidden="1" w:unhideWhenUsed="1"/>
-    <w:lsdException w:name="Table Grid 6" w:semiHidden="1" w:unhideWhenUsed="1"/>
-    <w:lsdException w:name="Table Grid 7" w:semiHidden="1" w:unhideWhenUsed="1"/>
-    <w:lsdException w:name="Table Grid 8" w:semiHidden="1" w:unhideWhenUsed="1"/>
-    <w:lsdException w:name="Table List 1" w:semiHidden="1" w:unhideWhenUsed="1"/>
-    <w:lsdException w:name="Table List 2" w:semiHidden="1" w:unhideWhenUsed="1"/>
-    <w:lsdException w:name="Table List 3" w:semiHidden="1" w:unhideWhenUsed="1"/>
-    <w:lsdException w:name="Table List 4" w:semiHidden="1" w:unhideWhenUsed="1"/>
-    <w:lsdException w:name="Table List 5" w:semiHidden="1" w:unhideWhenUsed="1"/>
-    <w:lsdException w:name="Table List 6" w:semiHidden="1" w:unhideWhenUsed="1"/>
-    <w:lsdException w:name="Table List 7" w:semiHidden="1" w:unhideWhenUsed="1"/>
-    <w:lsdException w:name="Table List 8" w:semiHidden="1" w:unhideWhenUsed="1"/>
-    <w:lsdException w:name="Table 3D effects 1" w:semiHidden="1" w:unhideWhenUsed="1"/>
-    <w:lsdException w:name="Table 3D effects 2" w:semiHidden="1" w:unhideWhenUsed="1"/>
-    <w:lsdException w:name="Table 3D effects 3" w:semiHidden="1" w:unhideWhenUsed="1"/>
-    <w:lsdException w:name="Table Contemporary" w:semiHidden="1" w:unhideWhenUsed="1"/>
-    <w:lsdException w:name="Table Elegant" w:semiHidden="1" w:unhideWhenUsed="1"/>
-    <w:lsdException w:name="Table Professional" w:semiHidden="1" w:unhideWhenUsed="1"/>
-    <w:lsdException w:name="Table Subtle 1" w:semiHidden="1" w:unhideWhenUsed="1"/>
-    <w:lsdException w:name="Table Subtle 2" w:semiHidden="1" w:unhideWhenUsed="1"/>
-    <w:lsdException w:name="Table Web 1" w:semiHidden="1" w:unhideWhenUsed="1"/>
-    <w:lsdException w:name="Table Web 2" w:semiHidden="1" w:unhideWhenUsed="1"/>
-    <w:lsdException w:name="Table Web 3" w:semiHidden="1" w:unhideWhenUsed="1"/>
-    <w:lsdException w:name="Balloon Text" w:semiHidden="1" w:unhideWhenUsed="1"/>
-    <w:lsdException w:name="Table Grid" w:uiPriority="59"/>
-    <w:lsdException w:name="Table Theme" w:semiHidden="1" w:unhideWhenUsed="1"/>
-    <w:lsdException w:name="Placeholder Text" w:semiHidden="1"/>
-    <w:lsdException w:name="No Spacing" w:uiPriority="1" w:qFormat="1"/>
-    <w:lsdException w:name="Light Shading" w:uiPriority="60"/>
-    <w:lsdException w:name="Light List" w:uiPriority="61"/>
-    <w:lsdException w:name="Light Grid" w:uiPriority="62"/>
-    <w:lsdException w:name="Medium Shading 1" w:uiPriority="63"/>
-    <w:lsdException w:name="Medium Shading 2" w:uiPriority="64"/>
-    <w:lsdException w:name="Medium List 1" w:uiPriority="65"/>
-    <w:lsdException w:name="Medium List 2" w:uiPriority="66"/>
-    <w:lsdException w:name="Medium Grid 1" w:uiPriority="67"/>
-    <w:lsdException w:name="Medium Grid 2" w:uiPriority="68"/>
-    <w:lsdException w:name="Medium Grid 3" w:uiPriority="69"/>
-    <w:lsdException w:name="Dark List" w:uiPriority="70"/>
-    <w:lsdException w:name="Colorful Shading" w:uiPriority="71"/>
-    <w:lsdException w:name="Colorful List" w:uiPriority="72"/>
-    <w:lsdException w:name="Colorful Grid" w:uiPriority="73"/>
-    <w:lsdException w:name="Light Shading Accent 1" w:uiPriority="60"/>
-    <w:lsdException w:name="Light List Accent 1" w:uiPriority="61"/>
-    <w:lsdException w:name="Light Grid Accent 1" w:uiPriority="62"/>
-    <w:lsdException w:name="Medium Shading 1 Accent 1" w:uiPriority="63"/>
-    <w:lsdException w:name="Medium Shading 2 Accent 1" w:uiPriority="64"/>
-    <w:lsdException w:name="Medium List 1 Accent 1" w:uiPriority="65"/>
-    <w:lsdException w:name="Revision" w:semiHidden="1"/>
-    <w:lsdException w:name="List Paragraph" w:uiPriority="34" w:qFormat="1"/>
-    <w:lsdException w:name="Quote" w:uiPriority="29" w:qFormat="1"/>
-    <w:lsdException w:name="Intense Quote" w:uiPriority="30" w:qFormat="1"/>
-    <w:lsdException w:name="Medium List 2 Accent 1" w:uiPriority="66"/>
-    <w:lsdException w:name="Medium Grid 1 Accent 1" w:uiPriority="67"/>
-    <w:lsdException w:name="Medium Grid 2 Accent 1" w:uiPriority="68"/>
-    <w:lsdException w:name="Medium Grid 3 Accent 1" w:uiPriority="69"/>
-    <w:lsdException w:name="Dark List Accent 1" w:uiPriority="70"/>
-    <w:lsdException w:name="Colorful Shading Accent 1" w:uiPriority="71"/>
-    <w:lsdException w:name="Colorful List Accent 1" w:uiPriority="72"/>
-    <w:lsdException w:name="Colorful Grid Accent 1" w:uiPriority="73"/>
-    <w:lsdException w:name="Light Shading Accent 2" w:uiPriority="60"/>
-    <w:lsdException w:name="Light List Accent 2" w:uiPriority="61"/>
-    <w:lsdException w:name="Light Grid Accent 2" w:uiPriority="62"/>
-    <w:lsdException w:name="Medium Shading 1 Accent 2" w:uiPriority="63"/>
-    <w:lsdException w:name="Medium Shading 2 Accent 2" w:uiPriority="64"/>
-    <w:lsdException w:name="Medium List 1 Accent 2" w:uiPriority="65"/>
-    <w:lsdException w:name="Medium List 2 Accent 2" w:uiPriority="66"/>
-    <w:lsdException w:name="Medium Grid 1 Accent 2" w:uiPriority="67"/>
-    <w:lsdException w:name="Medium Grid 2 Accent 2" w:uiPriority="68"/>
-    <w:lsdException w:name="Medium Grid 3 Accent 2" w:uiPriority="69"/>
-    <w:lsdException w:name="Dark List Accent 2" w:uiPriority="70"/>
-    <w:lsdException w:name="Colorful Shading Accent 2" w:uiPriority="71"/>
-    <w:lsdException w:name="Colorful List Accent 2" w:uiPriority="72"/>
-    <w:lsdException w:name="Colorful Grid Accent 2" w:uiPriority="73"/>
-    <w:lsdException w:name="Light Shading Accent 3" w:uiPriority="60"/>
-    <w:lsdException w:name="Light List Accent 3" w:uiPriority="61"/>
-    <w:lsdException w:name="Light Grid Accent 3" w:uiPriority="62"/>
-    <w:lsdException w:name="Medium Shading 1 Accent 3" w:uiPriority="63"/>
-    <w:lsdException w:name="Medium Shading 2 Accent 3" w:uiPriority="64"/>
-    <w:lsdException w:name="Medium List 1 Accent 3" w:uiPriority="65"/>
-    <w:lsdException w:name="Medium List 2 Accent 3" w:uiPriority="66"/>
-    <w:lsdException w:name="Medium Grid 1 Accent 3" w:uiPriority="67"/>
-    <w:lsdException w:name="Medium Grid 2 Accent 3" w:uiPriority="68"/>
-    <w:lsdException w:name="Medium Grid 3 Accent 3" w:uiPriority="69"/>
-    <w:lsdException w:name="Dark List Accent 3" w:uiPriority="70"/>
-    <w:lsdException w:name="Colorful Shading Accent 3" w:uiPriority="71"/>
-    <w:lsdException w:name="Colorful List Accent 3" w:uiPriority="72"/>
-    <w:lsdException w:name="Colorful Grid Accent 3" w:uiPriority="73"/>
-    <w:lsdException w:name="Light Shading Accent 4" w:uiPriority="60"/>
-    <w:lsdException w:name="Light List Accent 4" w:uiPriority="61"/>
-    <w:lsdException w:name="Light Grid Accent 4" w:uiPriority="62"/>
-    <w:lsdException w:name="Medium Shading 1 Accent 4" w:uiPriority="63"/>
-    <w:lsdException w:name="Medium Shading 2 Accent 4" w:uiPriority="64"/>
-    <w:lsdException w:name="Medium List 1 Accent 4" w:uiPriority="65"/>
-    <w:lsdException w:name="Medium List 2 Accent 4" w:uiPriority="66"/>
-    <w:lsdException w:name="Medium Grid 1 Accent 4" w:uiPriority="67"/>
-    <w:lsdException w:name="Medium Grid 2 Accent 4" w:uiPriority="68"/>
-    <w:lsdException w:name="Medium Grid 3 Accent 4" w:uiPriority="69"/>
-    <w:lsdException w:name="Dark List Accent 4" w:uiPriority="70"/>
-    <w:lsdException w:name="Colorful Shading Accent 4" w:uiPriority="71"/>
-    <w:lsdException w:name="Colorful List Accent 4" w:uiPriority="72"/>
-    <w:lsdException w:name="Colorful Grid Accent 4" w:uiPriority="73"/>
-    <w:lsdException w:name="Light Shading Accent 5" w:uiPriority="60"/>
-    <w:lsdException w:name="Light List Accent 5" w:uiPriority="61"/>
-    <w:lsdException w:name="Light Grid Accent 5" w:uiPriority="62"/>
-    <w:lsdException w:name="Medium Shading 1 Accent 5" w:uiPriority="63"/>
-    <w:lsdException w:name="Medium Shading 2 Accent 5" w:uiPriority="64"/>
-    <w:lsdException w:name="Medium List 1 Accent 5" w:uiPriority="65"/>
-    <w:lsdException w:name="Medium List 2 Accent 5" w:uiPriority="66"/>
-    <w:lsdException w:name="Medium Grid 1 Accent 5" w:uiPriority="67"/>
-    <w:lsdException w:name="Medium Grid 2 Accent 5" w:uiPriority="68"/>
-    <w:lsdException w:name="Medium Grid 3 Accent 5" w:uiPriority="69"/>
-    <w:lsdException w:name="Dark List Accent 5" w:uiPriority="70"/>
-    <w:lsdException w:name="Colorful Shading Accent 5" w:uiPriority="71"/>
-    <w:lsdException w:name="Colorful List Accent 5" w:uiPriority="72"/>
-    <w:lsdException w:name="Colorful Grid Accent 5" w:uiPriority="73"/>
-    <w:lsdException w:name="Light Shading Accent 6" w:uiPriority="60"/>
-    <w:lsdException w:name="Light List Accent 6" w:uiPriority="61"/>
-    <w:lsdException w:name="Light Grid Accent 6" w:uiPriority="62"/>
-    <w:lsdException w:name="Medium Shading 1 Accent 6" w:uiPriority="63"/>
-    <w:lsdException w:name="Medium Shading 2 Accent 6" w:uiPriority="64"/>
-    <w:lsdException w:name="Medium List 1 Accent 6" w:uiPriority="65"/>
-    <w:lsdException w:name="Medium List 2 Accent 6" w:uiPriority="66"/>
-    <w:lsdException w:name="Medium Grid 1 Accent 6" w:uiPriority="67"/>
-    <w:lsdException w:name="Medium Grid 2 Accent 6" w:uiPriority="68"/>
-    <w:lsdException w:name="Medium Grid 3 Accent 6" w:uiPriority="69"/>
-    <w:lsdException w:name="Dark List Accent 6" w:uiPriority="70"/>
-    <w:lsdException w:name="Colorful Shading Accent 6" w:uiPriority="71"/>
-    <w:lsdException w:name="Colorful List Accent 6" w:uiPriority="72"/>
-    <w:lsdException w:name="Colorful Grid Accent 6" w:uiPriority="73"/>
-    <w:lsdException w:name="Subtle Emphasis" w:uiPriority="19" w:qFormat="1"/>
-    <w:lsdException w:name="Intense Emphasis" w:uiPriority="21" w:qFormat="1"/>
-    <w:lsdException w:name="Subtle Reference" w:uiPriority="31" w:qFormat="1"/>
-    <w:lsdException w:name="Intense Reference" w:uiPriority="32" w:qFormat="1"/>
-    <w:lsdException w:name="Book Title" w:uiPriority="33" w:qFormat="1"/>
-    <w:lsdException w:name="Bibliography" w:semiHidden="1" w:uiPriority="37" w:unhideWhenUsed="1"/>
-    <w:lsdException w:name="TOC Heading" w:semiHidden="1" w:uiPriority="39" w:unhideWhenUsed="1" w:qFormat="1"/>
-    <w:lsdException w:name="Plain Table 1" w:uiPriority="41"/>
-    <w:lsdException w:name="Plain Table 2" w:uiPriority="42"/>
-    <w:lsdException w:name="Plain Table 3" w:uiPriority="43"/>
-    <w:lsdException w:name="Plain Table 4" w:uiPriority="44"/>
-    <w:lsdException w:name="Plain Table 5" w:uiPriority="45"/>
-    <w:lsdException w:name="Grid Table Light" w:uiPriority="40"/>
-    <w:lsdException w:name="Grid Table 1 Light" w:uiPriority="46"/>
-    <w:lsdException w:name="Grid Table 2" w:uiPriority="47"/>
-    <w:lsdException w:name="Grid Table 3" w:uiPriority="48"/>
-    <w:lsdException w:name="Grid Table 4" w:uiPriority="49"/>
-    <w:lsdException w:name="Grid Table 5 Dark" w:uiPriority="50"/>
-    <w:lsdException w:name="Grid Table 6 Colorful" w:uiPriority="51"/>
-    <w:lsdException w:name="Grid Table 7 Colorful" w:uiPriority="52"/>
-    <w:lsdException w:name="Grid Table 1 Light Accent 1" w:uiPriority="46"/>
-    <w:lsdException w:name="Grid Table 2 Accent 1" w:uiPriority="47"/>
-    <w:lsdException w:name="Grid Table 3 Accent 1" w:uiPriority="48"/>
-    <w:lsdException w:name="Grid Table 4 Accent 1" w:uiPriority="49"/>
-    <w:lsdException w:name="Grid Table 5 Dark Accent 1" w:uiPriority="50"/>
-    <w:lsdException w:name="Grid Table 6 Colorful Accent 1" w:uiPriority="51"/>
-    <w:lsdException w:name="Grid Table 7 Colorful Accent 1" w:uiPriority="52"/>
-    <w:lsdException w:name="Grid Table 1 Light Accent 2" w:uiPriority="46"/>
-    <w:lsdException w:name="Grid Table 2 Accent 2" w:uiPriority="47"/>
-    <w:lsdException w:name="Grid Table 3 Accent 2" w:uiPriority="48"/>
-    <w:lsdException w:name="Grid Table 4 Accent 2" w:uiPriority="49"/>
-    <w:lsdException w:name="Grid Table 5 Dark Accent 2" w:uiPriority="50"/>
-    <w:lsdException w:name="Grid Table 6 Colorful Accent 2" w:uiPriority="51"/>
-    <w:lsdException w:name="Grid Table 7 Colorful Accent 2" w:uiPriority="52"/>
-    <w:lsdException w:name="Grid Table 1 Light Accent 3" w:uiPriority="46"/>
-    <w:lsdException w:name="Grid Table 2 Accent 3" w:uiPriority="47"/>
-    <w:lsdException w:name="Grid Table 3 Accent 3" w:uiPriority="48"/>
-    <w:lsdException w:name="Grid Table 4 Accent 3" w:uiPriority="49"/>
-    <w:lsdException w:name="Grid Table 5 Dark Accent 3" w:uiPriority="50"/>
-    <w:lsdException w:name="Grid Table 6 Colorful Accent 3" w:uiPriority="51"/>
-    <w:lsdException w:name="Grid Table 7 Colorful Accent 3" w:uiPriority="52"/>
-    <w:lsdException w:name="Grid Table 1 Light Accent 4" w:uiPriority="46"/>
-    <w:lsdException w:name="Grid Table 2 Accent 4" w:uiPriority="47"/>
-    <w:lsdException w:name="Grid Table 3 Accent 4" w:uiPriority="48"/>
-    <w:lsdException w:name="Grid Table 4 Accent 4" w:uiPriority="49"/>
-    <w:lsdException w:name="Grid Table 5 Dark Accent 4" w:uiPriority="50"/>
-    <w:lsdException w:name="Grid Table 6 Colorful Accent 4" w:uiPriority="51"/>
-    <w:lsdException w:name="Grid Table 7 Colorful Accent 4" w:uiPriority="52"/>
-    <w:lsdException w:name="Grid Table 1 Light Accent 5" w:uiPriority="46"/>
-    <w:lsdException w:name="Grid Table 2 Accent 5" w:uiPriority="47"/>
-    <w:lsdException w:name="Grid Table 3 Accent 5" w:uiPriority="48"/>
-    <w:lsdException w:name="Grid Table 4 Accent 5" w:uiPriority="49"/>
-    <w:lsdException w:name="Grid Table 5 Dark Accent 5" w:uiPriority="50"/>
-    <w:lsdException w:name="Grid Table 6 Colorful Accent 5" w:uiPriority="51"/>
-    <w:lsdException w:name="Grid Table 7 Colorful Accent 5" w:uiPriority="52"/>
-    <w:lsdException w:name="Grid Table 1 Light Accent 6" w:uiPriority="46"/>
-    <w:lsdException w:name="Grid Table 2 Accent 6" w:uiPriority="47"/>
-    <w:lsdException w:name="Grid Table 3 Accent 6" w:uiPriority="48"/>
-    <w:lsdException w:name="Grid Table 4 Accent 6" w:uiPriority="49"/>
-    <w:lsdException w:name="Grid Table 5 Dark Accent 6" w:uiPriority="50"/>
-    <w:lsdException w:name="Grid Table 6 Colorful Accent 6" w:uiPriority="51"/>
-    <w:lsdException w:name="Grid Table 7 Colorful Accent 6" w:uiPriority="52"/>
-    <w:lsdException w:name="List Table 1 Light" w:uiPriority="46"/>
-    <w:lsdException w:name="List Table 2" w:uiPriority="47"/>
-    <w:lsdException w:name="List Table 3" w:uiPriority="48"/>
-    <w:lsdException w:name="List Table 4" w:uiPriority="49"/>
-    <w:lsdException w:name="List Table 5 Dark" w:uiPriority="50"/>
-    <w:lsdException w:name="List Table 6 Colorful" w:uiPriority="51"/>
-    <w:lsdException w:name="List Table 7 Colorful" w:uiPriority="52"/>
-    <w:lsdException w:name="List Table 1 Light Accent 1" w:uiPriority="46"/>
-    <w:lsdException w:name="List Table 2 Accent 1" w:uiPriority="47"/>
-    <w:lsdException w:name="List Table 3 Accent 1" w:uiPriority="48"/>
-    <w:lsdException w:name="List Table 4 Accent 1" w:uiPriority="49"/>
-    <w:lsdException w:name="List Table 5 Dark Accent 1" w:uiPriority="50"/>
-    <w:lsdException w:name="List Table 6 Colorful Accent 1" w:uiPriority="51"/>
-    <w:lsdException w:name="List Table 7 Colorful Accent 1" w:uiPriority="52"/>
-    <w:lsdException w:name="List Table 1 Light Accent 2" w:uiPriority="46"/>
-    <w:lsdException w:name="List Table 2 Accent 2" w:uiPriority="47"/>
-    <w:lsdException w:name="List Table 3 Accent 2" w:uiPriority="48"/>
-    <w:lsdException w:name="List Table 4 Accent 2" w:uiPriority="49"/>
-    <w:lsdException w:name="List Table 5 Dark Accent 2" w:uiPriority="50"/>
-    <w:lsdException w:name="List Table 6 Colorful Accent 2" w:uiPriority="51"/>
-    <w:lsdException w:name="List Table 7 Colorful Accent 2" w:uiPriority="52"/>
-    <w:lsdException w:name="List Table 1 Light Accent 3" w:uiPriority="46"/>
-    <w:lsdException w:name="List Table 2 Accent 3" w:uiPriority="47"/>
-    <w:lsdException w:name="List Table 3 Accent 3" w:uiPriority="48"/>
-    <w:lsdException w:name="List Table 4 Accent 3" w:uiPriority="49"/>
-    <w:lsdException w:name="List Table 5 Dark Accent 3" w:uiPriority="50"/>
-    <w:lsdException w:name="List Table 6 Colorful Accent 3" w:uiPriority="51"/>
-    <w:lsdException w:name="List Table 7 Colorful Accent 3" w:uiPriority="52"/>
-    <w:lsdException w:name="List Table 1 Light Accent 4" w:uiPriority="46"/>
-    <w:lsdException w:name="List Table 2 Accent 4" w:uiPriority="47"/>
-    <w:lsdException w:name="List Table 3 Accent 4" w:uiPriority="48"/>
-    <w:lsdException w:name="List Table 4 Accent 4" w:uiPriority="49"/>
-    <w:lsdException w:name="List Table 5 Dark Accent 4" w:uiPriority="50"/>
-    <w:lsdException w:name="List Table 6 Colorful Accent 4" w:uiPriority="51"/>
-    <w:lsdException w:name="List Table 7 Colorful Accent 4" w:uiPriority="52"/>
-    <w:lsdException w:name="List Table 1 Light Accent 5" w:uiPriority="46"/>
-    <w:lsdException w:name="List Table 2 Accent 5" w:uiPriority="47"/>
-    <w:lsdException w:name="List Table 3 Accent 5" w:uiPriority="48"/>
-    <w:lsdException w:name="List Table 4 Accent 5" w:uiPriority="49"/>
-    <w:lsdException w:name="List Table 5 Dark Accent 5" w:uiPriority="50"/>
-    <w:lsdException w:name="List Table 6 Colorful Accent 5" w:uiPriority="51"/>
-    <w:lsdException w:name="List Table 7 Colorful Accent 5" w:uiPriority="52"/>
-    <w:lsdException w:name="List Table 1 Light Accent 6" w:uiPriority="46"/>
-    <w:lsdException w:name="List Table 2 Accent 6" w:uiPriority="47"/>
-    <w:lsdException w:name="List Table 3 Accent 6" w:uiPriority="48"/>
-    <w:lsdException w:name="List Table 4 Accent 6" w:uiPriority="49"/>
-    <w:lsdException w:name="List Table 5 Dark Accent 6" w:uiPriority="50"/>
-    <w:lsdException w:name="List Table 6 Colorful Accent 6" w:uiPriority="51"/>
-    <w:lsdException w:name="List Table 7 Colorful Accent 6" w:uiPriority="52"/>
+  <w:latentStyles w:defLockedState="0" w:defUIPriority="99" w:defSemiHidden="1" w:defUnhideWhenUsed="1" w:defQFormat="0" w:count="267">
+    <w:lsdException w:name="Normal" w:semiHidden="0" w:uiPriority="0" w:unhideWhenUsed="0" w:qFormat="1"/>
+    <w:lsdException w:name="heading 1" w:semiHidden="0" w:uiPriority="9" w:unhideWhenUsed="0" w:qFormat="1"/>
+    <w:lsdException w:name="heading 2" w:uiPriority="9" w:qFormat="1"/>
+    <w:lsdException w:name="heading 3" w:uiPriority="9" w:qFormat="1"/>
+    <w:lsdException w:name="heading 4" w:uiPriority="9" w:qFormat="1"/>
+    <w:lsdException w:name="heading 5" w:uiPriority="9" w:qFormat="1"/>
+    <w:lsdException w:name="heading 6" w:uiPriority="9" w:qFormat="1"/>
+    <w:lsdException w:name="heading 7" w:uiPriority="9" w:qFormat="1"/>
+    <w:lsdException w:name="heading 8" w:uiPriority="9" w:qFormat="1"/>
+    <w:lsdException w:name="heading 9" w:uiPriority="9" w:qFormat="1"/>
+    <w:lsdException w:name="toc 1" w:uiPriority="39"/>
+    <w:lsdException w:name="toc 2" w:uiPriority="39"/>
+    <w:lsdException w:name="toc 3" w:uiPriority="39"/>
+    <w:lsdException w:name="toc 4" w:uiPriority="39"/>
+    <w:lsdException w:name="toc 5" w:uiPriority="39"/>
+    <w:lsdException w:name="toc 6" w:uiPriority="39"/>
+    <w:lsdException w:name="toc 7" w:uiPriority="39"/>
+    <w:lsdException w:name="toc 8" w:uiPriority="39"/>
+    <w:lsdException w:name="toc 9" w:uiPriority="39"/>
+    <w:lsdException w:name="caption" w:uiPriority="35" w:qFormat="1"/>
+    <w:lsdException w:name="Title" w:semiHidden="0" w:uiPriority="10" w:unhideWhenUsed="0" w:qFormat="1"/>
+    <w:lsdException w:name="Default Paragraph Font" w:uiPriority="1"/>
+    <w:lsdException w:name="Subtitle" w:semiHidden="0" w:uiPriority="11" w:unhideWhenUsed="0" w:qFormat="1"/>
+    <w:lsdException w:name="Strong" w:semiHidden="0" w:uiPriority="22" w:unhideWhenUsed="0" w:qFormat="1"/>
+    <w:lsdException w:name="Emphasis" w:semiHidden="0" w:uiPriority="20" w:unhideWhenUsed="0" w:qFormat="1"/>
+    <w:lsdException w:name="Table Grid" w:semiHidden="0" w:uiPriority="59" w:unhideWhenUsed="0"/>
+    <w:lsdException w:name="Placeholder Text" w:unhideWhenUsed="0"/>
+    <w:lsdException w:name="No Spacing" w:semiHidden="0" w:uiPriority="1" w:unhideWhenUsed="0" w:qFormat="1"/>
+    <w:lsdException w:name="Light Shading" w:semiHidden="0" w:uiPriority="60" w:unhideWhenUsed="0"/>
+    <w:lsdException w:name="Light List" w:semiHidden="0" w:uiPriority="61" w:unhideWhenUsed="0"/>
+    <w:lsdException w:name="Light Grid" w:semiHidden="0" w:uiPriority="62" w:unhideWhenUsed="0"/>
+    <w:lsdException w:name="Medium Shading 1" w:semiHidden="0" w:uiPriority="63" w:unhideWhenUsed="0"/>
+    <w:lsdException w:name="Medium Shading 2" w:semiHidden="0" w:uiPriority="64" w:unhideWhenUsed="0"/>
+    <w:lsdException w:name="Medium List 1" w:semiHidden="0" w:uiPriority="65" w:unhideWhenUsed="0"/>
+    <w:lsdException w:name="Medium List 2" w:semiHidden="0" w:uiPriority="66" w:unhideWhenUsed="0"/>
+    <w:lsdException w:name="Medium Grid 1" w:semiHidden="0" w:uiPriority="67" w:unhideWhenUsed="0"/>
+    <w:lsdException w:name="Medium Grid 2" w:semiHidden="0" w:uiPriority="68" w:unhideWhenUsed="0"/>
+    <w:lsdException w:name="Medium Grid 3" w:semiHidden="0" w:uiPriority="69" w:unhideWhenUsed="0"/>
+    <w:lsdException w:name="Dark List" w:semiHidden="0" w:uiPriority="70" w:unhideWhenUsed="0"/>
+    <w:lsdException w:name="Colorful Shading" w:semiHidden="0" w:uiPriority="71" w:unhideWhenUsed="0"/>
+    <w:lsdException w:name="Colorful List" w:semiHidden="0" w:uiPriority="72" w:unhideWhenUsed="0"/>
+    <w:lsdException w:name="Colorful Grid" w:semiHidden="0" w:uiPriority="73" w:unhideWhenUsed="0"/>
+    <w:lsdException w:name="Light Shading Accent 1" w:semiHidden="0" w:uiPriority="60" w:unhideWhenUsed="0"/>
+    <w:lsdException w:name="Light List Accent 1" w:semiHidden="0" w:uiPriority="61" w:unhideWhenUsed="0"/>
+    <w:lsdException w:name="Light Grid Accent 1" w:semiHidden="0" w:uiPriority="62" w:unhideWhenUsed="0"/>
+    <w:lsdException w:name="Medium Shading 1 Accent 1" w:semiHidden="0" w:uiPriority="63" w:unhideWhenUsed="0"/>
+    <w:lsdException w:name="Medium Shading 2 Accent 1" w:semiHidden="0" w:uiPriority="64" w:unhideWhenUsed="0"/>
+    <w:lsdException w:name="Medium List 1 Accent 1" w:semiHidden="0" w:uiPriority="65" w:unhideWhenUsed="0"/>
+    <w:lsdException w:name="Revision" w:unhideWhenUsed="0"/>
+    <w:lsdException w:name="List Paragraph" w:semiHidden="0" w:uiPriority="34" w:unhideWhenUsed="0" w:qFormat="1"/>
+    <w:lsdException w:name="Quote" w:semiHidden="0" w:uiPriority="29" w:unhideWhenUsed="0" w:qFormat="1"/>
+    <w:lsdException w:name="Intense Quote" w:semiHidden="0" w:uiPriority="30" w:unhideWhenUsed="0" w:qFormat="1"/>
+    <w:lsdException w:name="Medium List 2 Accent 1" w:semiHidden="0" w:uiPriority="66" w:unhideWhenUsed="0"/>
+    <w:lsdException w:name="Medium Grid 1 Accent 1" w:semiHidden="0" w:uiPriority="67" w:unhideWhenUsed="0"/>
+    <w:lsdException w:name="Medium Grid 2 Accent 1" w:semiHidden="0" w:uiPriority="68" w:unhideWhenUsed="0"/>
+    <w:lsdException w:name="Medium Grid 3 Accent 1" w:semiHidden="0" w:uiPriority="69" w:unhideWhenUsed="0"/>
+    <w:lsdException w:name="Dark List Accent 1" w:semiHidden="0" w:uiPriority="70" w:unhideWhenUsed="0"/>
+    <w:lsdException w:name="Colorful Shading Accent 1" w:semiHidden="0" w:uiPriority="71" w:unhideWhenUsed="0"/>
+    <w:lsdException w:name="Colorful List Accent 1" w:semiHidden="0" w:uiPriority="72" w:unhideWhenUsed="0"/>
+    <w:lsdException w:name="Colorful Grid Accent 1" w:semiHidden="0" w:uiPriority="73" w:unhideWhenUsed="0"/>
+    <w:lsdException w:name="Light Shading Accent 2" w:semiHidden="0" w:uiPriority="60" w:unhideWhenUsed="0"/>
+    <w:lsdException w:name="Light List Accent 2" w:semiHidden="0" w:uiPriority="61" w:unhideWhenUsed="0"/>
+    <w:lsdException w:name="Light Grid Accent 2" w:semiHidden="0" w:uiPriority="62" w:unhideWhenUsed="0"/>
+    <w:lsdException w:name="Medium Shading 1 Accent 2" w:semiHidden="0" w:uiPriority="63" w:unhideWhenUsed="0"/>
+    <w:lsdException w:name="Medium Shading 2 Accent 2" w:semiHidden="0" w:uiPriority="64" w:unhideWhenUsed="0"/>
+    <w:lsdException w:name="Medium List 1 Accent 2" w:semiHidden="0" w:uiPriority="65" w:unhideWhenUsed="0"/>
+    <w:lsdException w:name="Medium List 2 Accent 2" w:semiHidden="0" w:uiPriority="66" w:unhideWhenUsed="0"/>
+    <w:lsdException w:name="Medium Grid 1 Accent 2" w:semiHidden="0" w:uiPriority="67" w:unhideWhenUsed="0"/>
+    <w:lsdException w:name="Medium Grid 2 Accent 2" w:semiHidden="0" w:uiPriority="68" w:unhideWhenUsed="0"/>
+    <w:lsdException w:name="Medium Grid 3 Accent 2" w:semiHidden="0" w:uiPriority="69" w:unhideWhenUsed="0"/>
+    <w:lsdException w:name="Dark List Accent 2" w:semiHidden="0" w:uiPriority="70" w:unhideWhenUsed="0"/>
+    <w:lsdException w:name="Colorful Shading Accent 2" w:semiHidden="0" w:uiPriority="71" w:unhideWhenUsed="0"/>
+    <w:lsdException w:name="Colorful List Accent 2" w:semiHidden="0" w:uiPriority="72" w:unhideWhenUsed="0"/>
+    <w:lsdException w:name="Colorful Grid Accent 2" w:semiHidden="0" w:uiPriority="73" w:unhideWhenUsed="0"/>
+    <w:lsdException w:name="Light Shading Accent 3" w:semiHidden="0" w:uiPriority="60" w:unhideWhenUsed="0"/>
+    <w:lsdException w:name="Light List Accent 3" w:semiHidden="0" w:uiPriority="61" w:unhideWhenUsed="0"/>
+    <w:lsdException w:name="Light Grid Accent 3" w:semiHidden="0" w:uiPriority="62" w:unhideWhenUsed="0"/>
+    <w:lsdException w:name="Medium Shading 1 Accent 3" w:semiHidden="0" w:uiPriority="63" w:unhideWhenUsed="0"/>
+    <w:lsdException w:name="Medium Shading 2 Accent 3" w:semiHidden="0" w:uiPriority="64" w:unhideWhenUsed="0"/>
+    <w:lsdException w:name="Medium List 1 Accent 3" w:semiHidden="0" w:uiPriority="65" w:unhideWhenUsed="0"/>
+    <w:lsdException w:name="Medium List 2 Accent 3" w:semiHidden="0" w:uiPriority="66" w:unhideWhenUsed="0"/>
+    <w:lsdException w:name="Medium Grid 1 Accent 3" w:semiHidden="0" w:uiPriority="67" w:unhideWhenUsed="0"/>
+    <w:lsdException w:name="Medium Grid 2 Accent 3" w:semiHidden="0" w:uiPriority="68" w:unhideWhenUsed="0"/>
+    <w:lsdException w:name="Medium Grid 3 Accent 3" w:semiHidden="0" w:uiPriority="69" w:unhideWhenUsed="0"/>
+    <w:lsdException w:name="Dark List Accent 3" w:semiHidden="0" w:uiPriority="70" w:unhideWhenUsed="0"/>
+    <w:lsdException w:name="Colorful Shading Accent 3" w:semiHidden="0" w:uiPriority="71" w:unhideWhenUsed="0"/>
+    <w:lsdException w:name="Colorful List Accent 3" w:semiHidden="0" w:uiPriority="72" w:unhideWhenUsed="0"/>
+    <w:lsdException w:name="Colorful Grid Accent 3" w:semiHidden="0" w:uiPriority="73" w:unhideWhenUsed="0"/>
+    <w:lsdException w:name="Light Shading Accent 4" w:semiHidden="0" w:uiPriority="60" w:unhideWhenUsed="0"/>
+    <w:lsdException w:name="Light List Accent 4" w:semiHidden="0" w:uiPriority="61" w:unhideWhenUsed="0"/>
+    <w:lsdException w:name="Light Grid Accent 4" w:semiHidden="0" w:uiPriority="62" w:unhideWhenUsed="0"/>
+    <w:lsdException w:name="Medium Shading 1 Accent 4" w:semiHidden="0" w:uiPriority="63" w:unhideWhenUsed="0"/>
+    <w:lsdException w:name="Medium Shading 2 Accent 4" w:semiHidden="0" w:uiPriority="64" w:unhideWhenUsed="0"/>
+    <w:lsdException w:name="Medium List 1 Accent 4" w:semiHidden="0" w:uiPriority="65" w:unhideWhenUsed="0"/>
+    <w:lsdException w:name="Medium List 2 Accent 4" w:semiHidden="0" w:uiPriority="66" w:unhideWhenUsed="0"/>
+    <w:lsdException w:name="Medium Grid 1 Accent 4" w:semiHidden="0" w:uiPriority="67" w:unhideWhenUsed="0"/>
+    <w:lsdException w:name="Medium Grid 2 Accent 4" w:semiHidden="0" w:uiPriority="68" w:unhideWhenUsed="0"/>
+    <w:lsdException w:name="Medium Grid 3 Accent 4" w:semiHidden="0" w:uiPriority="69" w:unhideWhenUsed="0"/>
+    <w:lsdException w:name="Dark List Accent 4" w:semiHidden="0" w:uiPriority="70" w:unhideWhenUsed="0"/>
+    <w:lsdException w:name="Colorful Shading Accent 4" w:semiHidden="0" w:uiPriority="71" w:unhideWhenUsed="0"/>
+    <w:lsdException w:name="Colorful List Accent 4" w:semiHidden="0" w:uiPriority="72" w:unhideWhenUsed="0"/>
+    <w:lsdException w:name="Colorful Grid Accent 4" w:semiHidden="0" w:uiPriority="73" w:unhideWhenUsed="0"/>
+    <w:lsdException w:name="Light Shading Accent 5" w:semiHidden="0" w:uiPriority="60" w:unhideWhenUsed="0"/>
+    <w:lsdException w:name="Light List Accent 5" w:semiHidden="0" w:uiPriority="61" w:unhideWhenUsed="0"/>
+    <w:lsdException w:name="Light Grid Accent 5" w:semiHidden="0" w:uiPriority="62" w:unhideWhenUsed="0"/>
+    <w:lsdException w:name="Medium Shading 1 Accent 5" w:semiHidden="0" w:uiPriority="63" w:unhideWhenUsed="0"/>
+    <w:lsdException w:name="Medium Shading 2 Accent 5" w:semiHidden="0" w:uiPriority="64" w:unhideWhenUsed="0"/>
+    <w:lsdException w:name="Medium List 1 Accent 5" w:semiHidden="0" w:uiPriority="65" w:unhideWhenUsed="0"/>
+    <w:lsdException w:name="Medium List 2 Accent 5" w:semiHidden="0" w:uiPriority="66" w:unhideWhenUsed="0"/>
+    <w:lsdException w:name="Medium Grid 1 Accent 5" w:semiHidden="0" w:uiPriority="67" w:unhideWhenUsed="0"/>
+    <w:lsdException w:name="Medium Grid 2 Accent 5" w:semiHidden="0" w:uiPriority="68" w:unhideWhenUsed="0"/>
+    <w:lsdException w:name="Medium Grid 3 Accent 5" w:semiHidden="0" w:uiPriority="69" w:unhideWhenUsed="0"/>
+    <w:lsdException w:name="Dark List Accent 5" w:semiHidden="0" w:uiPriority="70" w:unhideWhenUsed="0"/>
+    <w:lsdException w:name="Colorful Shading Accent 5" w:semiHidden="0" w:uiPriority="71" w:unhideWhenUsed="0"/>
+    <w:lsdException w:name="Colorful List Accent 5" w:semiHidden="0" w:uiPriority="72" w:unhideWhenUsed="0"/>
+    <w:lsdException w:name="Colorful Grid Accent 5" w:semiHidden="0" w:uiPriority="73" w:unhideWhenUsed="0"/>
+    <w:lsdException w:name="Light Shading Accent 6" w:semiHidden="0" w:uiPriority="60" w:unhideWhenUsed="0"/>
+    <w:lsdException w:name="Light List Accent 6" w:semiHidden="0" w:uiPriority="61" w:unhideWhenUsed="0"/>
+    <w:lsdException w:name="Light Grid Accent 6" w:semiHidden="0" w:uiPriority="62" w:unhideWhenUsed="0"/>
+    <w:lsdException w:name="Medium Shading 1 Accent 6" w:semiHidden="0" w:uiPriority="63" w:unhideWhenUsed="0"/>
+    <w:lsdException w:name="Medium Shading 2 Accent 6" w:semiHidden="0" w:uiPriority="64" w:unhideWhenUsed="0"/>
+    <w:lsdException w:name="Medium List 1 Accent 6" w:semiHidden="0" w:uiPriority="65" w:unhideWhenUsed="0"/>
+    <w:lsdException w:name="Medium List 2 Accent 6" w:semiHidden="0" w:uiPriority="66" w:unhideWhenUsed="0"/>
+    <w:lsdException w:name="Medium Grid 1 Accent 6" w:semiHidden="0" w:uiPriority="67" w:unhideWhenUsed="0"/>
+    <w:lsdException w:name="Medium Grid 2 Accent 6" w:semiHidden="0" w:uiPriority="68" w:unhideWhenUsed="0"/>
+    <w:lsdException w:name="Medium Grid 3 Accent 6" w:semiHidden="0" w:uiPriority="69" w:unhideWhenUsed="0"/>
+    <w:lsdException w:name="Dark List Accent 6" w:semiHidden="0" w:uiPriority="70" w:unhideWhenUsed="0"/>
+    <w:lsdException w:name="Colorful Shading Accent 6" w:semiHidden="0" w:uiPriority="71" w:unhideWhenUsed="0"/>
+    <w:lsdException w:name="Colorful List Accent 6" w:semiHidden="0" w:uiPriority="72" w:unhideWhenUsed="0"/>
+    <w:lsdException w:name="Colorful Grid Accent 6" w:semiHidden="0" w:uiPriority="73" w:unhideWhenUsed="0"/>
+    <w:lsdException w:name="Subtle Emphasis" w:semiHidden="0" w:uiPriority="19" w:unhideWhenUsed="0" w:qFormat="1"/>
+    <w:lsdException w:name="Intense Emphasis" w:semiHidden="0" w:uiPriority="21" w:unhideWhenUsed="0" w:qFormat="1"/>
+    <w:lsdException w:name="Subtle Reference" w:semiHidden="0" w:uiPriority="31" w:unhideWhenUsed="0" w:qFormat="1"/>
+    <w:lsdException w:name="Intense Reference" w:semiHidden="0" w:uiPriority="32" w:unhideWhenUsed="0" w:qFormat="1"/>
+    <w:lsdException w:name="Book Title" w:semiHidden="0" w:uiPriority="33" w:unhideWhenUsed="0" w:qFormat="1"/>
+    <w:lsdException w:name="Bibliography" w:uiPriority="37"/>
+    <w:lsdException w:name="TOC Heading" w:uiPriority="39" w:qFormat="1"/>
   </w:latentStyles>
   <w:style w:type="paragraph" w:default="1" w:styleId="Normal">
     <w:name w:val="Normal"/>
@@ -3157,7 +2619,7 @@
       </w:tblCellMar>
     </w:tblPr>
   </w:style>
-  <w:style w:type="paragraph" w:styleId="Puesto">
+  <w:style w:type="paragraph" w:styleId="Ttulo">
     <w:name w:val="Title"/>
     <w:basedOn w:val="Normal"/>
     <w:next w:val="Normal"/>
@@ -3266,6 +2728,446 @@
     <w:link w:val="Piedepgina"/>
     <w:uiPriority w:val="99"/>
     <w:rsid w:val="00241754"/>
+  </w:style>
+  <w:style w:type="paragraph" w:styleId="NormalWeb">
+    <w:name w:val="Normal (Web)"/>
+    <w:basedOn w:val="Normal"/>
+    <w:uiPriority w:val="99"/>
+    <w:unhideWhenUsed/>
+    <w:rsid w:val="005D35FC"/>
+    <w:pPr>
+      <w:spacing w:before="100" w:beforeAutospacing="1" w:after="100" w:afterAutospacing="1" w:line="240" w:lineRule="auto"/>
+      <w:ind w:left="0" w:right="0"/>
+      <w:jc w:val="left"/>
+    </w:pPr>
+    <w:rPr>
+      <w:rFonts w:ascii="Times New Roman" w:eastAsia="Times New Roman" w:hAnsi="Times New Roman" w:cs="Times New Roman"/>
+      <w:lang w:val="es-AR"/>
+    </w:rPr>
+  </w:style>
+</w:styles>
+</file>
+
+<file path=word/stylesWithEffects.xml><?xml version="1.0" encoding="utf-8"?>
+<w:styles xmlns:wpc="http://schemas.microsoft.com/office/word/2010/wordprocessingCanvas" xmlns:mc="http://schemas.openxmlformats.org/markup-compatibility/2006" xmlns:o="urn:schemas-microsoft-com:office:office" xmlns:r="http://schemas.openxmlformats.org/officeDocument/2006/relationships" xmlns:m="http://schemas.openxmlformats.org/officeDocument/2006/math" xmlns:v="urn:schemas-microsoft-com:vml" xmlns:wp14="http://schemas.microsoft.com/office/word/2010/wordprocessingDrawing" xmlns:wp="http://schemas.openxmlformats.org/drawingml/2006/wordprocessingDrawing" xmlns:w10="urn:schemas-microsoft-com:office:word" xmlns:w="http://schemas.openxmlformats.org/wordprocessingml/2006/main" xmlns:w14="http://schemas.microsoft.com/office/word/2010/wordml" xmlns:wpg="http://schemas.microsoft.com/office/word/2010/wordprocessingGroup" xmlns:wpi="http://schemas.microsoft.com/office/word/2010/wordprocessingInk" xmlns:wne="http://schemas.microsoft.com/office/word/2006/wordml" xmlns:wps="http://schemas.microsoft.com/office/word/2010/wordprocessingShape" mc:Ignorable="w14 wp14">
+  <w:docDefaults>
+    <w:rPrDefault>
+      <w:rPr>
+        <w:rFonts w:ascii="Arial" w:eastAsia="Arial" w:hAnsi="Arial" w:cs="Arial"/>
+        <w:sz w:val="24"/>
+        <w:szCs w:val="24"/>
+        <w:lang w:val="en" w:eastAsia="es-AR" w:bidi="ar-SA"/>
+      </w:rPr>
+    </w:rPrDefault>
+    <w:pPrDefault>
+      <w:pPr>
+        <w:spacing w:after="200" w:line="360" w:lineRule="auto"/>
+        <w:ind w:left="720" w:right="-531"/>
+        <w:jc w:val="both"/>
+      </w:pPr>
+    </w:pPrDefault>
+  </w:docDefaults>
+  <w:latentStyles w:defLockedState="0" w:defUIPriority="99" w:defSemiHidden="1" w:defUnhideWhenUsed="1" w:defQFormat="0" w:count="267">
+    <w:lsdException w:name="Normal" w:semiHidden="0" w:uiPriority="0" w:unhideWhenUsed="0" w:qFormat="1"/>
+    <w:lsdException w:name="heading 1" w:semiHidden="0" w:uiPriority="9" w:unhideWhenUsed="0" w:qFormat="1"/>
+    <w:lsdException w:name="heading 2" w:uiPriority="9" w:qFormat="1"/>
+    <w:lsdException w:name="heading 3" w:uiPriority="9" w:qFormat="1"/>
+    <w:lsdException w:name="heading 4" w:uiPriority="9" w:qFormat="1"/>
+    <w:lsdException w:name="heading 5" w:uiPriority="9" w:qFormat="1"/>
+    <w:lsdException w:name="heading 6" w:uiPriority="9" w:qFormat="1"/>
+    <w:lsdException w:name="heading 7" w:uiPriority="9" w:qFormat="1"/>
+    <w:lsdException w:name="heading 8" w:uiPriority="9" w:qFormat="1"/>
+    <w:lsdException w:name="heading 9" w:uiPriority="9" w:qFormat="1"/>
+    <w:lsdException w:name="toc 1" w:uiPriority="39"/>
+    <w:lsdException w:name="toc 2" w:uiPriority="39"/>
+    <w:lsdException w:name="toc 3" w:uiPriority="39"/>
+    <w:lsdException w:name="toc 4" w:uiPriority="39"/>
+    <w:lsdException w:name="toc 5" w:uiPriority="39"/>
+    <w:lsdException w:name="toc 6" w:uiPriority="39"/>
+    <w:lsdException w:name="toc 7" w:uiPriority="39"/>
+    <w:lsdException w:name="toc 8" w:uiPriority="39"/>
+    <w:lsdException w:name="toc 9" w:uiPriority="39"/>
+    <w:lsdException w:name="caption" w:uiPriority="35" w:qFormat="1"/>
+    <w:lsdException w:name="Title" w:semiHidden="0" w:uiPriority="10" w:unhideWhenUsed="0" w:qFormat="1"/>
+    <w:lsdException w:name="Default Paragraph Font" w:uiPriority="1"/>
+    <w:lsdException w:name="Subtitle" w:semiHidden="0" w:uiPriority="11" w:unhideWhenUsed="0" w:qFormat="1"/>
+    <w:lsdException w:name="Strong" w:semiHidden="0" w:uiPriority="22" w:unhideWhenUsed="0" w:qFormat="1"/>
+    <w:lsdException w:name="Emphasis" w:semiHidden="0" w:uiPriority="20" w:unhideWhenUsed="0" w:qFormat="1"/>
+    <w:lsdException w:name="Table Grid" w:semiHidden="0" w:uiPriority="59" w:unhideWhenUsed="0"/>
+    <w:lsdException w:name="Placeholder Text" w:unhideWhenUsed="0"/>
+    <w:lsdException w:name="No Spacing" w:semiHidden="0" w:uiPriority="1" w:unhideWhenUsed="0" w:qFormat="1"/>
+    <w:lsdException w:name="Light Shading" w:semiHidden="0" w:uiPriority="60" w:unhideWhenUsed="0"/>
+    <w:lsdException w:name="Light List" w:semiHidden="0" w:uiPriority="61" w:unhideWhenUsed="0"/>
+    <w:lsdException w:name="Light Grid" w:semiHidden="0" w:uiPriority="62" w:unhideWhenUsed="0"/>
+    <w:lsdException w:name="Medium Shading 1" w:semiHidden="0" w:uiPriority="63" w:unhideWhenUsed="0"/>
+    <w:lsdException w:name="Medium Shading 2" w:semiHidden="0" w:uiPriority="64" w:unhideWhenUsed="0"/>
+    <w:lsdException w:name="Medium List 1" w:semiHidden="0" w:uiPriority="65" w:unhideWhenUsed="0"/>
+    <w:lsdException w:name="Medium List 2" w:semiHidden="0" w:uiPriority="66" w:unhideWhenUsed="0"/>
+    <w:lsdException w:name="Medium Grid 1" w:semiHidden="0" w:uiPriority="67" w:unhideWhenUsed="0"/>
+    <w:lsdException w:name="Medium Grid 2" w:semiHidden="0" w:uiPriority="68" w:unhideWhenUsed="0"/>
+    <w:lsdException w:name="Medium Grid 3" w:semiHidden="0" w:uiPriority="69" w:unhideWhenUsed="0"/>
+    <w:lsdException w:name="Dark List" w:semiHidden="0" w:uiPriority="70" w:unhideWhenUsed="0"/>
+    <w:lsdException w:name="Colorful Shading" w:semiHidden="0" w:uiPriority="71" w:unhideWhenUsed="0"/>
+    <w:lsdException w:name="Colorful List" w:semiHidden="0" w:uiPriority="72" w:unhideWhenUsed="0"/>
+    <w:lsdException w:name="Colorful Grid" w:semiHidden="0" w:uiPriority="73" w:unhideWhenUsed="0"/>
+    <w:lsdException w:name="Light Shading Accent 1" w:semiHidden="0" w:uiPriority="60" w:unhideWhenUsed="0"/>
+    <w:lsdException w:name="Light List Accent 1" w:semiHidden="0" w:uiPriority="61" w:unhideWhenUsed="0"/>
+    <w:lsdException w:name="Light Grid Accent 1" w:semiHidden="0" w:uiPriority="62" w:unhideWhenUsed="0"/>
+    <w:lsdException w:name="Medium Shading 1 Accent 1" w:semiHidden="0" w:uiPriority="63" w:unhideWhenUsed="0"/>
+    <w:lsdException w:name="Medium Shading 2 Accent 1" w:semiHidden="0" w:uiPriority="64" w:unhideWhenUsed="0"/>
+    <w:lsdException w:name="Medium List 1 Accent 1" w:semiHidden="0" w:uiPriority="65" w:unhideWhenUsed="0"/>
+    <w:lsdException w:name="Revision" w:unhideWhenUsed="0"/>
+    <w:lsdException w:name="List Paragraph" w:semiHidden="0" w:uiPriority="34" w:unhideWhenUsed="0" w:qFormat="1"/>
+    <w:lsdException w:name="Quote" w:semiHidden="0" w:uiPriority="29" w:unhideWhenUsed="0" w:qFormat="1"/>
+    <w:lsdException w:name="Intense Quote" w:semiHidden="0" w:uiPriority="30" w:unhideWhenUsed="0" w:qFormat="1"/>
+    <w:lsdException w:name="Medium List 2 Accent 1" w:semiHidden="0" w:uiPriority="66" w:unhideWhenUsed="0"/>
+    <w:lsdException w:name="Medium Grid 1 Accent 1" w:semiHidden="0" w:uiPriority="67" w:unhideWhenUsed="0"/>
+    <w:lsdException w:name="Medium Grid 2 Accent 1" w:semiHidden="0" w:uiPriority="68" w:unhideWhenUsed="0"/>
+    <w:lsdException w:name="Medium Grid 3 Accent 1" w:semiHidden="0" w:uiPriority="69" w:unhideWhenUsed="0"/>
+    <w:lsdException w:name="Dark List Accent 1" w:semiHidden="0" w:uiPriority="70" w:unhideWhenUsed="0"/>
+    <w:lsdException w:name="Colorful Shading Accent 1" w:semiHidden="0" w:uiPriority="71" w:unhideWhenUsed="0"/>
+    <w:lsdException w:name="Colorful List Accent 1" w:semiHidden="0" w:uiPriority="72" w:unhideWhenUsed="0"/>
+    <w:lsdException w:name="Colorful Grid Accent 1" w:semiHidden="0" w:uiPriority="73" w:unhideWhenUsed="0"/>
+    <w:lsdException w:name="Light Shading Accent 2" w:semiHidden="0" w:uiPriority="60" w:unhideWhenUsed="0"/>
+    <w:lsdException w:name="Light List Accent 2" w:semiHidden="0" w:uiPriority="61" w:unhideWhenUsed="0"/>
+    <w:lsdException w:name="Light Grid Accent 2" w:semiHidden="0" w:uiPriority="62" w:unhideWhenUsed="0"/>
+    <w:lsdException w:name="Medium Shading 1 Accent 2" w:semiHidden="0" w:uiPriority="63" w:unhideWhenUsed="0"/>
+    <w:lsdException w:name="Medium Shading 2 Accent 2" w:semiHidden="0" w:uiPriority="64" w:unhideWhenUsed="0"/>
+    <w:lsdException w:name="Medium List 1 Accent 2" w:semiHidden="0" w:uiPriority="65" w:unhideWhenUsed="0"/>
+    <w:lsdException w:name="Medium List 2 Accent 2" w:semiHidden="0" w:uiPriority="66" w:unhideWhenUsed="0"/>
+    <w:lsdException w:name="Medium Grid 1 Accent 2" w:semiHidden="0" w:uiPriority="67" w:unhideWhenUsed="0"/>
+    <w:lsdException w:name="Medium Grid 2 Accent 2" w:semiHidden="0" w:uiPriority="68" w:unhideWhenUsed="0"/>
+    <w:lsdException w:name="Medium Grid 3 Accent 2" w:semiHidden="0" w:uiPriority="69" w:unhideWhenUsed="0"/>
+    <w:lsdException w:name="Dark List Accent 2" w:semiHidden="0" w:uiPriority="70" w:unhideWhenUsed="0"/>
+    <w:lsdException w:name="Colorful Shading Accent 2" w:semiHidden="0" w:uiPriority="71" w:unhideWhenUsed="0"/>
+    <w:lsdException w:name="Colorful List Accent 2" w:semiHidden="0" w:uiPriority="72" w:unhideWhenUsed="0"/>
+    <w:lsdException w:name="Colorful Grid Accent 2" w:semiHidden="0" w:uiPriority="73" w:unhideWhenUsed="0"/>
+    <w:lsdException w:name="Light Shading Accent 3" w:semiHidden="0" w:uiPriority="60" w:unhideWhenUsed="0"/>
+    <w:lsdException w:name="Light List Accent 3" w:semiHidden="0" w:uiPriority="61" w:unhideWhenUsed="0"/>
+    <w:lsdException w:name="Light Grid Accent 3" w:semiHidden="0" w:uiPriority="62" w:unhideWhenUsed="0"/>
+    <w:lsdException w:name="Medium Shading 1 Accent 3" w:semiHidden="0" w:uiPriority="63" w:unhideWhenUsed="0"/>
+    <w:lsdException w:name="Medium Shading 2 Accent 3" w:semiHidden="0" w:uiPriority="64" w:unhideWhenUsed="0"/>
+    <w:lsdException w:name="Medium List 1 Accent 3" w:semiHidden="0" w:uiPriority="65" w:unhideWhenUsed="0"/>
+    <w:lsdException w:name="Medium List 2 Accent 3" w:semiHidden="0" w:uiPriority="66" w:unhideWhenUsed="0"/>
+    <w:lsdException w:name="Medium Grid 1 Accent 3" w:semiHidden="0" w:uiPriority="67" w:unhideWhenUsed="0"/>
+    <w:lsdException w:name="Medium Grid 2 Accent 3" w:semiHidden="0" w:uiPriority="68" w:unhideWhenUsed="0"/>
+    <w:lsdException w:name="Medium Grid 3 Accent 3" w:semiHidden="0" w:uiPriority="69" w:unhideWhenUsed="0"/>
+    <w:lsdException w:name="Dark List Accent 3" w:semiHidden="0" w:uiPriority="70" w:unhideWhenUsed="0"/>
+    <w:lsdException w:name="Colorful Shading Accent 3" w:semiHidden="0" w:uiPriority="71" w:unhideWhenUsed="0"/>
+    <w:lsdException w:name="Colorful List Accent 3" w:semiHidden="0" w:uiPriority="72" w:unhideWhenUsed="0"/>
+    <w:lsdException w:name="Colorful Grid Accent 3" w:semiHidden="0" w:uiPriority="73" w:unhideWhenUsed="0"/>
+    <w:lsdException w:name="Light Shading Accent 4" w:semiHidden="0" w:uiPriority="60" w:unhideWhenUsed="0"/>
+    <w:lsdException w:name="Light List Accent 4" w:semiHidden="0" w:uiPriority="61" w:unhideWhenUsed="0"/>
+    <w:lsdException w:name="Light Grid Accent 4" w:semiHidden="0" w:uiPriority="62" w:unhideWhenUsed="0"/>
+    <w:lsdException w:name="Medium Shading 1 Accent 4" w:semiHidden="0" w:uiPriority="63" w:unhideWhenUsed="0"/>
+    <w:lsdException w:name="Medium Shading 2 Accent 4" w:semiHidden="0" w:uiPriority="64" w:unhideWhenUsed="0"/>
+    <w:lsdException w:name="Medium List 1 Accent 4" w:semiHidden="0" w:uiPriority="65" w:unhideWhenUsed="0"/>
+    <w:lsdException w:name="Medium List 2 Accent 4" w:semiHidden="0" w:uiPriority="66" w:unhideWhenUsed="0"/>
+    <w:lsdException w:name="Medium Grid 1 Accent 4" w:semiHidden="0" w:uiPriority="67" w:unhideWhenUsed="0"/>
+    <w:lsdException w:name="Medium Grid 2 Accent 4" w:semiHidden="0" w:uiPriority="68" w:unhideWhenUsed="0"/>
+    <w:lsdException w:name="Medium Grid 3 Accent 4" w:semiHidden="0" w:uiPriority="69" w:unhideWhenUsed="0"/>
+    <w:lsdException w:name="Dark List Accent 4" w:semiHidden="0" w:uiPriority="70" w:unhideWhenUsed="0"/>
+    <w:lsdException w:name="Colorful Shading Accent 4" w:semiHidden="0" w:uiPriority="71" w:unhideWhenUsed="0"/>
+    <w:lsdException w:name="Colorful List Accent 4" w:semiHidden="0" w:uiPriority="72" w:unhideWhenUsed="0"/>
+    <w:lsdException w:name="Colorful Grid Accent 4" w:semiHidden="0" w:uiPriority="73" w:unhideWhenUsed="0"/>
+    <w:lsdException w:name="Light Shading Accent 5" w:semiHidden="0" w:uiPriority="60" w:unhideWhenUsed="0"/>
+    <w:lsdException w:name="Light List Accent 5" w:semiHidden="0" w:uiPriority="61" w:unhideWhenUsed="0"/>
+    <w:lsdException w:name="Light Grid Accent 5" w:semiHidden="0" w:uiPriority="62" w:unhideWhenUsed="0"/>
+    <w:lsdException w:name="Medium Shading 1 Accent 5" w:semiHidden="0" w:uiPriority="63" w:unhideWhenUsed="0"/>
+    <w:lsdException w:name="Medium Shading 2 Accent 5" w:semiHidden="0" w:uiPriority="64" w:unhideWhenUsed="0"/>
+    <w:lsdException w:name="Medium List 1 Accent 5" w:semiHidden="0" w:uiPriority="65" w:unhideWhenUsed="0"/>
+    <w:lsdException w:name="Medium List 2 Accent 5" w:semiHidden="0" w:uiPriority="66" w:unhideWhenUsed="0"/>
+    <w:lsdException w:name="Medium Grid 1 Accent 5" w:semiHidden="0" w:uiPriority="67" w:unhideWhenUsed="0"/>
+    <w:lsdException w:name="Medium Grid 2 Accent 5" w:semiHidden="0" w:uiPriority="68" w:unhideWhenUsed="0"/>
+    <w:lsdException w:name="Medium Grid 3 Accent 5" w:semiHidden="0" w:uiPriority="69" w:unhideWhenUsed="0"/>
+    <w:lsdException w:name="Dark List Accent 5" w:semiHidden="0" w:uiPriority="70" w:unhideWhenUsed="0"/>
+    <w:lsdException w:name="Colorful Shading Accent 5" w:semiHidden="0" w:uiPriority="71" w:unhideWhenUsed="0"/>
+    <w:lsdException w:name="Colorful List Accent 5" w:semiHidden="0" w:uiPriority="72" w:unhideWhenUsed="0"/>
+    <w:lsdException w:name="Colorful Grid Accent 5" w:semiHidden="0" w:uiPriority="73" w:unhideWhenUsed="0"/>
+    <w:lsdException w:name="Light Shading Accent 6" w:semiHidden="0" w:uiPriority="60" w:unhideWhenUsed="0"/>
+    <w:lsdException w:name="Light List Accent 6" w:semiHidden="0" w:uiPriority="61" w:unhideWhenUsed="0"/>
+    <w:lsdException w:name="Light Grid Accent 6" w:semiHidden="0" w:uiPriority="62" w:unhideWhenUsed="0"/>
+    <w:lsdException w:name="Medium Shading 1 Accent 6" w:semiHidden="0" w:uiPriority="63" w:unhideWhenUsed="0"/>
+    <w:lsdException w:name="Medium Shading 2 Accent 6" w:semiHidden="0" w:uiPriority="64" w:unhideWhenUsed="0"/>
+    <w:lsdException w:name="Medium List 1 Accent 6" w:semiHidden="0" w:uiPriority="65" w:unhideWhenUsed="0"/>
+    <w:lsdException w:name="Medium List 2 Accent 6" w:semiHidden="0" w:uiPriority="66" w:unhideWhenUsed="0"/>
+    <w:lsdException w:name="Medium Grid 1 Accent 6" w:semiHidden="0" w:uiPriority="67" w:unhideWhenUsed="0"/>
+    <w:lsdException w:name="Medium Grid 2 Accent 6" w:semiHidden="0" w:uiPriority="68" w:unhideWhenUsed="0"/>
+    <w:lsdException w:name="Medium Grid 3 Accent 6" w:semiHidden="0" w:uiPriority="69" w:unhideWhenUsed="0"/>
+    <w:lsdException w:name="Dark List Accent 6" w:semiHidden="0" w:uiPriority="70" w:unhideWhenUsed="0"/>
+    <w:lsdException w:name="Colorful Shading Accent 6" w:semiHidden="0" w:uiPriority="71" w:unhideWhenUsed="0"/>
+    <w:lsdException w:name="Colorful List Accent 6" w:semiHidden="0" w:uiPriority="72" w:unhideWhenUsed="0"/>
+    <w:lsdException w:name="Colorful Grid Accent 6" w:semiHidden="0" w:uiPriority="73" w:unhideWhenUsed="0"/>
+    <w:lsdException w:name="Subtle Emphasis" w:semiHidden="0" w:uiPriority="19" w:unhideWhenUsed="0" w:qFormat="1"/>
+    <w:lsdException w:name="Intense Emphasis" w:semiHidden="0" w:uiPriority="21" w:unhideWhenUsed="0" w:qFormat="1"/>
+    <w:lsdException w:name="Subtle Reference" w:semiHidden="0" w:uiPriority="31" w:unhideWhenUsed="0" w:qFormat="1"/>
+    <w:lsdException w:name="Intense Reference" w:semiHidden="0" w:uiPriority="32" w:unhideWhenUsed="0" w:qFormat="1"/>
+    <w:lsdException w:name="Book Title" w:semiHidden="0" w:uiPriority="33" w:unhideWhenUsed="0" w:qFormat="1"/>
+    <w:lsdException w:name="Bibliography" w:uiPriority="37"/>
+    <w:lsdException w:name="TOC Heading" w:uiPriority="39" w:qFormat="1"/>
+  </w:latentStyles>
+  <w:style w:type="paragraph" w:default="1" w:styleId="Normal">
+    <w:name w:val="Normal"/>
+  </w:style>
+  <w:style w:type="paragraph" w:styleId="Ttulo1">
+    <w:name w:val="heading 1"/>
+    <w:basedOn w:val="Normal"/>
+    <w:next w:val="Normal"/>
+    <w:pPr>
+      <w:keepNext/>
+      <w:keepLines/>
+      <w:ind w:right="-607"/>
+      <w:outlineLvl w:val="0"/>
+    </w:pPr>
+    <w:rPr>
+      <w:rFonts w:ascii="Economica" w:eastAsia="Economica" w:hAnsi="Economica" w:cs="Economica"/>
+      <w:sz w:val="28"/>
+      <w:szCs w:val="28"/>
+    </w:rPr>
+  </w:style>
+  <w:style w:type="paragraph" w:styleId="Ttulo2">
+    <w:name w:val="heading 2"/>
+    <w:basedOn w:val="Normal"/>
+    <w:next w:val="Normal"/>
+    <w:pPr>
+      <w:keepNext/>
+      <w:keepLines/>
+      <w:outlineLvl w:val="1"/>
+    </w:pPr>
+    <w:rPr>
+      <w:rFonts w:ascii="Open Sans ExtraBold" w:eastAsia="Open Sans ExtraBold" w:hAnsi="Open Sans ExtraBold" w:cs="Open Sans ExtraBold"/>
+      <w:color w:val="FFAA00"/>
+      <w:sz w:val="20"/>
+      <w:szCs w:val="20"/>
+    </w:rPr>
+  </w:style>
+  <w:style w:type="paragraph" w:styleId="Ttulo3">
+    <w:name w:val="heading 3"/>
+    <w:basedOn w:val="Normal"/>
+    <w:next w:val="Normal"/>
+    <w:pPr>
+      <w:keepNext/>
+      <w:keepLines/>
+      <w:spacing w:before="320" w:after="80"/>
+      <w:outlineLvl w:val="2"/>
+    </w:pPr>
+    <w:rPr>
+      <w:color w:val="434343"/>
+      <w:sz w:val="28"/>
+      <w:szCs w:val="28"/>
+    </w:rPr>
+  </w:style>
+  <w:style w:type="paragraph" w:styleId="Ttulo4">
+    <w:name w:val="heading 4"/>
+    <w:basedOn w:val="Normal"/>
+    <w:next w:val="Normal"/>
+    <w:pPr>
+      <w:keepNext/>
+      <w:keepLines/>
+      <w:spacing w:before="280" w:after="80"/>
+      <w:outlineLvl w:val="3"/>
+    </w:pPr>
+    <w:rPr>
+      <w:color w:val="666666"/>
+    </w:rPr>
+  </w:style>
+  <w:style w:type="paragraph" w:styleId="Ttulo5">
+    <w:name w:val="heading 5"/>
+    <w:basedOn w:val="Normal"/>
+    <w:next w:val="Normal"/>
+    <w:pPr>
+      <w:keepNext/>
+      <w:keepLines/>
+      <w:spacing w:before="240" w:after="80"/>
+      <w:outlineLvl w:val="4"/>
+    </w:pPr>
+    <w:rPr>
+      <w:color w:val="666666"/>
+      <w:sz w:val="22"/>
+      <w:szCs w:val="22"/>
+    </w:rPr>
+  </w:style>
+  <w:style w:type="paragraph" w:styleId="Ttulo6">
+    <w:name w:val="heading 6"/>
+    <w:basedOn w:val="Normal"/>
+    <w:next w:val="Normal"/>
+    <w:pPr>
+      <w:keepNext/>
+      <w:keepLines/>
+      <w:spacing w:before="240" w:after="80"/>
+      <w:outlineLvl w:val="5"/>
+    </w:pPr>
+    <w:rPr>
+      <w:i/>
+      <w:iCs/>
+      <w:color w:val="666666"/>
+      <w:sz w:val="22"/>
+      <w:szCs w:val="22"/>
+    </w:rPr>
+  </w:style>
+  <w:style w:type="character" w:default="1" w:styleId="Fuentedeprrafopredeter">
+    <w:name w:val="Default Paragraph Font"/>
+    <w:uiPriority w:val="1"/>
+    <w:semiHidden/>
+    <w:unhideWhenUsed/>
+  </w:style>
+  <w:style w:type="table" w:default="1" w:styleId="Tablanormal">
+    <w:name w:val="Normal Table"/>
+    <w:uiPriority w:val="99"/>
+    <w:semiHidden/>
+    <w:unhideWhenUsed/>
+    <w:tblPr>
+      <w:tblInd w:w="0" w:type="dxa"/>
+      <w:tblCellMar>
+        <w:top w:w="0" w:type="dxa"/>
+        <w:left w:w="108" w:type="dxa"/>
+        <w:bottom w:w="0" w:type="dxa"/>
+        <w:right w:w="108" w:type="dxa"/>
+      </w:tblCellMar>
+    </w:tblPr>
+  </w:style>
+  <w:style w:type="numbering" w:default="1" w:styleId="Sinlista">
+    <w:name w:val="No List"/>
+    <w:uiPriority w:val="99"/>
+    <w:semiHidden/>
+    <w:unhideWhenUsed/>
+  </w:style>
+  <w:style w:type="table" w:customStyle="1" w:styleId="TableNormal">
+    <w:name w:val="TableNormal"/>
+    <w:tblPr>
+      <w:tblCellMar>
+        <w:top w:w="100" w:type="dxa"/>
+        <w:left w:w="100" w:type="dxa"/>
+        <w:bottom w:w="100" w:type="dxa"/>
+        <w:right w:w="100" w:type="dxa"/>
+      </w:tblCellMar>
+    </w:tblPr>
+  </w:style>
+  <w:style w:type="paragraph" w:styleId="Ttulo">
+    <w:name w:val="Title"/>
+    <w:basedOn w:val="Normal"/>
+    <w:next w:val="Normal"/>
+    <w:pPr>
+      <w:keepNext/>
+      <w:keepLines/>
+      <w:spacing w:after="60"/>
+    </w:pPr>
+    <w:rPr>
+      <w:sz w:val="52"/>
+      <w:szCs w:val="52"/>
+    </w:rPr>
+  </w:style>
+  <w:style w:type="paragraph" w:styleId="Subttulo">
+    <w:name w:val="Subtitle"/>
+    <w:basedOn w:val="Normal"/>
+    <w:next w:val="Normal"/>
+    <w:pPr>
+      <w:keepNext/>
+      <w:keepLines/>
+      <w:spacing w:after="320"/>
+    </w:pPr>
+    <w:rPr>
+      <w:color w:val="666666"/>
+      <w:sz w:val="30"/>
+      <w:szCs w:val="30"/>
+    </w:rPr>
+  </w:style>
+  <w:style w:type="table" w:customStyle="1" w:styleId="a">
+    <w:basedOn w:val="TableNormal"/>
+    <w:tblPr>
+      <w:tblStyleRowBandSize w:val="1"/>
+      <w:tblStyleColBandSize w:val="1"/>
+    </w:tblPr>
+  </w:style>
+  <w:style w:type="paragraph" w:styleId="Textodeglobo">
+    <w:name w:val="Balloon Text"/>
+    <w:basedOn w:val="Normal"/>
+    <w:link w:val="TextodegloboCar"/>
+    <w:uiPriority w:val="99"/>
+    <w:semiHidden/>
+    <w:unhideWhenUsed/>
+    <w:rsid w:val="00241754"/>
+    <w:pPr>
+      <w:spacing w:after="0" w:line="240" w:lineRule="auto"/>
+    </w:pPr>
+    <w:rPr>
+      <w:rFonts w:ascii="Tahoma" w:hAnsi="Tahoma" w:cs="Tahoma"/>
+      <w:sz w:val="16"/>
+      <w:szCs w:val="16"/>
+    </w:rPr>
+  </w:style>
+  <w:style w:type="character" w:customStyle="1" w:styleId="TextodegloboCar">
+    <w:name w:val="Texto de globo Car"/>
+    <w:basedOn w:val="Fuentedeprrafopredeter"/>
+    <w:link w:val="Textodeglobo"/>
+    <w:uiPriority w:val="99"/>
+    <w:semiHidden/>
+    <w:rsid w:val="00241754"/>
+    <w:rPr>
+      <w:rFonts w:ascii="Tahoma" w:hAnsi="Tahoma" w:cs="Tahoma"/>
+      <w:sz w:val="16"/>
+      <w:szCs w:val="16"/>
+    </w:rPr>
+  </w:style>
+  <w:style w:type="paragraph" w:styleId="Encabezado">
+    <w:name w:val="header"/>
+    <w:basedOn w:val="Normal"/>
+    <w:link w:val="EncabezadoCar"/>
+    <w:uiPriority w:val="99"/>
+    <w:unhideWhenUsed/>
+    <w:rsid w:val="00241754"/>
+    <w:pPr>
+      <w:tabs>
+        <w:tab w:val="center" w:pos="4252"/>
+        <w:tab w:val="right" w:pos="8504"/>
+      </w:tabs>
+      <w:spacing w:after="0" w:line="240" w:lineRule="auto"/>
+    </w:pPr>
+  </w:style>
+  <w:style w:type="character" w:customStyle="1" w:styleId="EncabezadoCar">
+    <w:name w:val="Encabezado Car"/>
+    <w:basedOn w:val="Fuentedeprrafopredeter"/>
+    <w:link w:val="Encabezado"/>
+    <w:uiPriority w:val="99"/>
+    <w:rsid w:val="00241754"/>
+  </w:style>
+  <w:style w:type="paragraph" w:styleId="Piedepgina">
+    <w:name w:val="footer"/>
+    <w:basedOn w:val="Normal"/>
+    <w:link w:val="PiedepginaCar"/>
+    <w:uiPriority w:val="99"/>
+    <w:unhideWhenUsed/>
+    <w:rsid w:val="00241754"/>
+    <w:pPr>
+      <w:tabs>
+        <w:tab w:val="center" w:pos="4252"/>
+        <w:tab w:val="right" w:pos="8504"/>
+      </w:tabs>
+      <w:spacing w:after="0" w:line="240" w:lineRule="auto"/>
+    </w:pPr>
+  </w:style>
+  <w:style w:type="character" w:customStyle="1" w:styleId="PiedepginaCar">
+    <w:name w:val="Pie de página Car"/>
+    <w:basedOn w:val="Fuentedeprrafopredeter"/>
+    <w:link w:val="Piedepgina"/>
+    <w:uiPriority w:val="99"/>
+    <w:rsid w:val="00241754"/>
+  </w:style>
+  <w:style w:type="paragraph" w:styleId="NormalWeb">
+    <w:name w:val="Normal (Web)"/>
+    <w:basedOn w:val="Normal"/>
+    <w:uiPriority w:val="99"/>
+    <w:unhideWhenUsed/>
+    <w:rsid w:val="005D35FC"/>
+    <w:pPr>
+      <w:spacing w:before="100" w:beforeAutospacing="1" w:after="100" w:afterAutospacing="1" w:line="240" w:lineRule="auto"/>
+      <w:ind w:left="0" w:right="0"/>
+      <w:jc w:val="left"/>
+    </w:pPr>
+    <w:rPr>
+      <w:rFonts w:ascii="Times New Roman" w:eastAsia="Times New Roman" w:hAnsi="Times New Roman" w:cs="Times New Roman"/>
+      <w:lang w:val="es-AR"/>
+    </w:rPr>
   </w:style>
 </w:styles>
 </file>

</xml_diff>

<commit_message>
Correcion de Requerimientos Funcionales y agregacion de la investigacion en el Anexo I
</commit_message>
<xml_diff>
--- a/TPI Análisis de sistemas.docx
+++ b/TPI Análisis de sistemas.docx
@@ -87,7 +87,15 @@
       </w:r>
       <w:proofErr w:type="spellEnd"/>
       <w:r>
-        <w:t xml:space="preserve"> que agenda </w:t>
+        <w:t xml:space="preserve"> </w:t>
+      </w:r>
+      <w:proofErr w:type="spellStart"/>
+      <w:r>
+        <w:t>que</w:t>
+      </w:r>
+      <w:proofErr w:type="spellEnd"/>
+      <w:r>
+        <w:t xml:space="preserve"> agenda </w:t>
       </w:r>
       <w:proofErr w:type="gramStart"/>
       <w:r>
@@ -103,7 +111,15 @@
       </w:r>
       <w:proofErr w:type="spellEnd"/>
       <w:r>
-        <w:t xml:space="preserve"> hasta que lo </w:t>
+        <w:t xml:space="preserve"> hasta </w:t>
+      </w:r>
+      <w:proofErr w:type="spellStart"/>
+      <w:r>
+        <w:t>que</w:t>
+      </w:r>
+      <w:proofErr w:type="spellEnd"/>
+      <w:r>
+        <w:t xml:space="preserve"> lo </w:t>
       </w:r>
       <w:proofErr w:type="spellStart"/>
       <w:r>
@@ -317,7 +333,14 @@
         <w:rPr>
           <w:lang w:val="es-AR"/>
         </w:rPr>
-        <w:t xml:space="preserve">Por lo que Valeria necesita una aplicación móvil de uso personal que le permita organizarse, simplificando la elección y el seguimiento de sus retiros. </w:t>
+        <w:t xml:space="preserve">Por lo que Valeria necesita una aplicación móvil de uso personal que le permita organizarse, </w:t>
+      </w:r>
+      <w:bookmarkStart w:id="3" w:name="_GoBack"/>
+      <w:r>
+        <w:rPr>
+          <w:lang w:val="es-AR"/>
+        </w:rPr>
+        <w:t xml:space="preserve">simplificando la elección y el seguimiento de sus retiros. </w:t>
       </w:r>
       <w:proofErr w:type="spellStart"/>
       <w:r>
@@ -333,6 +356,7 @@
         </w:rPr>
         <w:t xml:space="preserve">, descartando los </w:t>
       </w:r>
+      <w:bookmarkEnd w:id="3"/>
       <w:r>
         <w:rPr>
           <w:lang w:val="es-AR"/>
@@ -378,8 +402,8 @@
         </w:rPr>
         <w:t xml:space="preserve"> </w:t>
       </w:r>
-      <w:bookmarkStart w:id="3" w:name="_u31e971vnvql" w:colFirst="0" w:colLast="0"/>
-      <w:bookmarkEnd w:id="3"/>
+      <w:bookmarkStart w:id="4" w:name="_u31e971vnvql" w:colFirst="0" w:colLast="0"/>
+      <w:bookmarkEnd w:id="4"/>
     </w:p>
     <w:tbl>
       <w:tblPr>
@@ -845,12 +869,7 @@
             </w:r>
             <w:proofErr w:type="spellStart"/>
             <w:r>
-              <w:t>dat</w:t>
-            </w:r>
-            <w:bookmarkStart w:id="4" w:name="_GoBack"/>
-            <w:bookmarkEnd w:id="4"/>
-            <w:r>
-              <w:t>os</w:t>
+              <w:t>datos</w:t>
             </w:r>
             <w:proofErr w:type="spellEnd"/>
             <w:r>
@@ -1216,21 +1235,7 @@
               <w:rPr>
                 <w:rFonts w:ascii="Helvetica" w:hAnsi="Helvetica" w:cs="Helvetica"/>
               </w:rPr>
-              <w:t xml:space="preserve"> </w:t>
-            </w:r>
-            <w:proofErr w:type="spellStart"/>
-            <w:r>
-              <w:rPr>
-                <w:rFonts w:ascii="Helvetica" w:hAnsi="Helvetica" w:cs="Helvetica"/>
-              </w:rPr>
-              <w:t>en</w:t>
-            </w:r>
-            <w:proofErr w:type="spellEnd"/>
-            <w:r>
-              <w:rPr>
-                <w:rFonts w:ascii="Helvetica" w:hAnsi="Helvetica" w:cs="Helvetica"/>
-              </w:rPr>
-              <w:t xml:space="preserve"> </w:t>
+              <w:t xml:space="preserve"> en </w:t>
             </w:r>
             <w:proofErr w:type="spellStart"/>
             <w:r>
@@ -1437,7 +1442,21 @@
               <w:rPr>
                 <w:rFonts w:ascii="Helvetica" w:hAnsi="Helvetica" w:cs="Helvetica"/>
               </w:rPr>
-              <w:t xml:space="preserve"> registrar una </w:t>
+              <w:t xml:space="preserve"> registrar </w:t>
+            </w:r>
+            <w:proofErr w:type="spellStart"/>
+            <w:r>
+              <w:rPr>
+                <w:rFonts w:ascii="Helvetica" w:hAnsi="Helvetica" w:cs="Helvetica"/>
+              </w:rPr>
+              <w:t>una</w:t>
+            </w:r>
+            <w:proofErr w:type="spellEnd"/>
+            <w:r>
+              <w:rPr>
+                <w:rFonts w:ascii="Helvetica" w:hAnsi="Helvetica" w:cs="Helvetica"/>
+              </w:rPr>
+              <w:t xml:space="preserve"> </w:t>
             </w:r>
             <w:proofErr w:type="spellStart"/>
             <w:r>
@@ -1976,8 +1995,404 @@
         </w:rPr>
       </w:pPr>
     </w:p>
+    <w:p>
+      <w:pPr>
+        <w:pStyle w:val="Ttulo1"/>
+        <w:spacing w:line="240" w:lineRule="auto"/>
+        <w:ind w:right="-531"/>
+        <w:rPr>
+          <w:b/>
+          <w:bCs/>
+          <w:color w:val="000000"/>
+        </w:rPr>
+      </w:pPr>
+      <w:r>
+        <w:rPr>
+          <w:b/>
+          <w:bCs/>
+          <w:color w:val="000000"/>
+        </w:rPr>
+        <w:lastRenderedPageBreak/>
+        <w:t>ANEXO 1</w:t>
+      </w:r>
+    </w:p>
+    <w:p>
+      <w:pPr>
+        <w:pStyle w:val="Ttulo1"/>
+        <w:spacing w:line="240" w:lineRule="auto"/>
+        <w:ind w:right="-531"/>
+        <w:rPr>
+          <w:rFonts w:ascii="Open Sans ExtraBold" w:eastAsia="Open Sans ExtraBold" w:hAnsi="Open Sans ExtraBold" w:cs="Open Sans ExtraBold"/>
+          <w:color w:val="FFAA00"/>
+          <w:sz w:val="20"/>
+          <w:szCs w:val="20"/>
+          <w:lang w:val="es-AR"/>
+        </w:rPr>
+      </w:pPr>
+      <w:r>
+        <w:rPr>
+          <w:rFonts w:ascii="Open Sans ExtraBold" w:eastAsia="Open Sans ExtraBold" w:hAnsi="Open Sans ExtraBold" w:cs="Open Sans ExtraBold"/>
+          <w:color w:val="FFAA00"/>
+          <w:sz w:val="20"/>
+          <w:szCs w:val="20"/>
+          <w:lang w:val="es-AR"/>
+        </w:rPr>
+        <w:t>INVESTIGACIÓN DE RETIROS</w:t>
+      </w:r>
+    </w:p>
+    <w:p>
+      <w:pPr>
+        <w:spacing w:line="240" w:lineRule="auto"/>
+        <w:ind w:left="0"/>
+        <w:jc w:val="left"/>
+        <w:rPr>
+          <w:color w:val="000000"/>
+        </w:rPr>
+      </w:pPr>
+      <w:r>
+        <w:rPr>
+          <w:noProof/>
+        </w:rPr>
+        <w:pict>
+          <v:shapetype id="_x0000_t75" coordsize="21600,21600" o:spt="75" o:preferrelative="t" path="m@4@5l@4@11@9@11@9@5xe" filled="f" stroked="f">
+            <v:stroke joinstyle="miter"/>
+            <v:formulas>
+              <v:f eqn="if lineDrawn pixelLineWidth 0"/>
+              <v:f eqn="sum @0 1 0"/>
+              <v:f eqn="sum 0 0 @1"/>
+              <v:f eqn="prod @2 1 2"/>
+              <v:f eqn="prod @3 21600 pixelWidth"/>
+              <v:f eqn="prod @3 21600 pixelHeight"/>
+              <v:f eqn="sum @0 0 1"/>
+              <v:f eqn="prod @6 1 2"/>
+              <v:f eqn="prod @7 21600 pixelWidth"/>
+              <v:f eqn="sum @8 21600 0"/>
+              <v:f eqn="prod @7 21600 pixelHeight"/>
+              <v:f eqn="sum @10 21600 0"/>
+            </v:formulas>
+            <v:path o:extrusionok="f" gradientshapeok="t" o:connecttype="rect"/>
+            <o:lock v:ext="edit" aspectratio="t"/>
+          </v:shapetype>
+          <v:shape id="_x0000_s1027" type="#_x0000_t75" style="position:absolute;margin-left:-10.05pt;margin-top:50.5pt;width:399.35pt;height:256.2pt;z-index:251659264;mso-position-horizontal-relative:margin;mso-position-vertical-relative:margin">
+            <v:imagedata r:id="rId8" o:title="Sin título"/>
+            <w10:wrap type="square" anchorx="margin" anchory="margin"/>
+          </v:shape>
+        </w:pict>
+      </w:r>
+    </w:p>
+    <w:p>
+      <w:pPr>
+        <w:spacing w:line="240" w:lineRule="auto"/>
+        <w:ind w:left="0"/>
+        <w:jc w:val="left"/>
+        <w:rPr>
+          <w:color w:val="000000"/>
+        </w:rPr>
+      </w:pPr>
+    </w:p>
+    <w:p>
+      <w:pPr>
+        <w:spacing w:line="240" w:lineRule="auto"/>
+        <w:ind w:left="0"/>
+        <w:jc w:val="left"/>
+        <w:rPr>
+          <w:color w:val="000000"/>
+        </w:rPr>
+      </w:pPr>
+    </w:p>
+    <w:p>
+      <w:pPr>
+        <w:spacing w:line="240" w:lineRule="auto"/>
+        <w:ind w:left="0"/>
+        <w:jc w:val="left"/>
+        <w:rPr>
+          <w:color w:val="000000"/>
+        </w:rPr>
+      </w:pPr>
+    </w:p>
+    <w:p>
+      <w:pPr>
+        <w:spacing w:line="240" w:lineRule="auto"/>
+        <w:ind w:left="0"/>
+        <w:jc w:val="left"/>
+        <w:rPr>
+          <w:color w:val="000000"/>
+        </w:rPr>
+      </w:pPr>
+    </w:p>
+    <w:p>
+      <w:pPr>
+        <w:spacing w:line="240" w:lineRule="auto"/>
+        <w:ind w:left="0"/>
+        <w:jc w:val="left"/>
+        <w:rPr>
+          <w:color w:val="000000"/>
+        </w:rPr>
+      </w:pPr>
+    </w:p>
+    <w:p>
+      <w:pPr>
+        <w:spacing w:line="240" w:lineRule="auto"/>
+        <w:ind w:left="0"/>
+        <w:jc w:val="left"/>
+        <w:rPr>
+          <w:color w:val="000000"/>
+        </w:rPr>
+      </w:pPr>
+    </w:p>
+    <w:p>
+      <w:pPr>
+        <w:spacing w:line="240" w:lineRule="auto"/>
+        <w:ind w:left="0"/>
+        <w:jc w:val="left"/>
+        <w:rPr>
+          <w:color w:val="000000"/>
+        </w:rPr>
+      </w:pPr>
+    </w:p>
+    <w:p>
+      <w:pPr>
+        <w:spacing w:line="240" w:lineRule="auto"/>
+        <w:ind w:left="0"/>
+        <w:jc w:val="left"/>
+        <w:rPr>
+          <w:color w:val="000000"/>
+        </w:rPr>
+      </w:pPr>
+    </w:p>
+    <w:p>
+      <w:pPr>
+        <w:spacing w:line="240" w:lineRule="auto"/>
+        <w:ind w:left="0"/>
+        <w:jc w:val="left"/>
+        <w:rPr>
+          <w:color w:val="000000"/>
+          <w:sz w:val="20"/>
+          <w:szCs w:val="20"/>
+        </w:rPr>
+      </w:pPr>
+    </w:p>
+    <w:p>
+      <w:pPr>
+        <w:spacing w:line="240" w:lineRule="auto"/>
+        <w:ind w:left="0"/>
+        <w:jc w:val="left"/>
+        <w:rPr>
+          <w:color w:val="000000"/>
+          <w:sz w:val="20"/>
+          <w:szCs w:val="20"/>
+        </w:rPr>
+      </w:pPr>
+    </w:p>
+    <w:p>
+      <w:pPr>
+        <w:spacing w:line="240" w:lineRule="auto"/>
+        <w:ind w:left="0"/>
+        <w:jc w:val="left"/>
+        <w:rPr>
+          <w:sz w:val="20"/>
+          <w:szCs w:val="20"/>
+        </w:rPr>
+      </w:pPr>
+      <w:r>
+        <w:rPr>
+          <w:noProof/>
+          <w:sz w:val="20"/>
+          <w:szCs w:val="20"/>
+          <w:lang w:val="es-AR"/>
+        </w:rPr>
+        <w:drawing>
+          <wp:anchor distT="0" distB="0" distL="114300" distR="114300" simplePos="0" relativeHeight="251660288" behindDoc="0" locked="0" layoutInCell="1" allowOverlap="1" wp14:anchorId="7F3CC947" wp14:editId="5A029F07">
+            <wp:simplePos x="0" y="0"/>
+            <wp:positionH relativeFrom="margin">
+              <wp:posOffset>-139700</wp:posOffset>
+            </wp:positionH>
+            <wp:positionV relativeFrom="margin">
+              <wp:posOffset>4314190</wp:posOffset>
+            </wp:positionV>
+            <wp:extent cx="5114290" cy="2987675"/>
+            <wp:effectExtent l="0" t="0" r="0" b="3175"/>
+            <wp:wrapSquare wrapText="bothSides"/>
+            <wp:docPr id="6" name="Imagen 6" descr="C:\Users\ADMIN\AppData\Local\Microsoft\Windows\INetCache\Content.Word\Sin título.png"/>
+            <wp:cNvGraphicFramePr>
+              <a:graphicFrameLocks xmlns:a="http://schemas.openxmlformats.org/drawingml/2006/main" noChangeAspect="1"/>
+            </wp:cNvGraphicFramePr>
+            <a:graphic xmlns:a="http://schemas.openxmlformats.org/drawingml/2006/main">
+              <a:graphicData uri="http://schemas.openxmlformats.org/drawingml/2006/picture">
+                <pic:pic xmlns:pic="http://schemas.openxmlformats.org/drawingml/2006/picture">
+                  <pic:nvPicPr>
+                    <pic:cNvPr id="0" name="Picture 44" descr="C:\Users\ADMIN\AppData\Local\Microsoft\Windows\INetCache\Content.Word\Sin título.png"/>
+                    <pic:cNvPicPr>
+                      <a:picLocks noChangeAspect="1" noChangeArrowheads="1"/>
+                    </pic:cNvPicPr>
+                  </pic:nvPicPr>
+                  <pic:blipFill>
+                    <a:blip r:embed="rId9">
+                      <a:extLst>
+                        <a:ext uri="{28A0092B-C50C-407E-A947-70E740481C1C}">
+                          <a14:useLocalDpi xmlns:a14="http://schemas.microsoft.com/office/drawing/2010/main" val="0"/>
+                        </a:ext>
+                      </a:extLst>
+                    </a:blip>
+                    <a:srcRect/>
+                    <a:stretch>
+                      <a:fillRect/>
+                    </a:stretch>
+                  </pic:blipFill>
+                  <pic:spPr bwMode="auto">
+                    <a:xfrm>
+                      <a:off x="0" y="0"/>
+                      <a:ext cx="5114290" cy="2987675"/>
+                    </a:xfrm>
+                    <a:prstGeom prst="rect">
+                      <a:avLst/>
+                    </a:prstGeom>
+                    <a:noFill/>
+                    <a:ln>
+                      <a:noFill/>
+                    </a:ln>
+                  </pic:spPr>
+                </pic:pic>
+              </a:graphicData>
+            </a:graphic>
+          </wp:anchor>
+        </w:drawing>
+      </w:r>
+      <w:r>
+        <w:rPr>
+          <w:color w:val="000000"/>
+          <w:sz w:val="20"/>
+          <w:szCs w:val="20"/>
+        </w:rPr>
+        <w:t>https://www.facebook.com/Frecuencia5Dretiros/#</w:t>
+      </w:r>
+    </w:p>
+    <w:p>
+      <w:pPr>
+        <w:pStyle w:val="NormalWeb"/>
+        <w:spacing w:before="0" w:beforeAutospacing="0" w:after="200" w:afterAutospacing="0"/>
+        <w:ind w:right="-531"/>
+        <w:jc w:val="both"/>
+      </w:pPr>
+    </w:p>
+    <w:p>
+      <w:pPr>
+        <w:pStyle w:val="NormalWeb"/>
+        <w:spacing w:before="0" w:beforeAutospacing="0" w:after="200" w:afterAutospacing="0"/>
+        <w:ind w:right="-531"/>
+        <w:jc w:val="both"/>
+      </w:pPr>
+    </w:p>
+    <w:p>
+      <w:pPr>
+        <w:pStyle w:val="NormalWeb"/>
+        <w:spacing w:before="0" w:beforeAutospacing="0" w:after="200" w:afterAutospacing="0"/>
+        <w:ind w:right="-531"/>
+        <w:jc w:val="both"/>
+      </w:pPr>
+    </w:p>
+    <w:p>
+      <w:pPr>
+        <w:pStyle w:val="NormalWeb"/>
+        <w:spacing w:before="0" w:beforeAutospacing="0" w:after="200" w:afterAutospacing="0"/>
+        <w:ind w:right="-531"/>
+        <w:jc w:val="both"/>
+      </w:pPr>
+    </w:p>
+    <w:p>
+      <w:pPr>
+        <w:pStyle w:val="NormalWeb"/>
+        <w:spacing w:before="0" w:beforeAutospacing="0" w:after="200" w:afterAutospacing="0"/>
+        <w:ind w:right="-531"/>
+        <w:jc w:val="both"/>
+      </w:pPr>
+    </w:p>
+    <w:p>
+      <w:pPr>
+        <w:pStyle w:val="NormalWeb"/>
+        <w:spacing w:before="0" w:beforeAutospacing="0" w:after="200" w:afterAutospacing="0"/>
+        <w:ind w:right="-531"/>
+        <w:jc w:val="both"/>
+      </w:pPr>
+    </w:p>
+    <w:p>
+      <w:pPr>
+        <w:pStyle w:val="NormalWeb"/>
+        <w:spacing w:before="0" w:beforeAutospacing="0" w:after="200" w:afterAutospacing="0"/>
+        <w:ind w:right="-531"/>
+        <w:jc w:val="both"/>
+      </w:pPr>
+    </w:p>
+    <w:p>
+      <w:pPr>
+        <w:pStyle w:val="NormalWeb"/>
+        <w:spacing w:before="0" w:beforeAutospacing="0" w:after="200" w:afterAutospacing="0"/>
+        <w:ind w:right="-531"/>
+        <w:jc w:val="both"/>
+      </w:pPr>
+    </w:p>
+    <w:p>
+      <w:pPr>
+        <w:pStyle w:val="NormalWeb"/>
+        <w:spacing w:before="0" w:beforeAutospacing="0" w:after="200" w:afterAutospacing="0"/>
+        <w:ind w:right="-531"/>
+        <w:jc w:val="both"/>
+      </w:pPr>
+    </w:p>
+    <w:p>
+      <w:pPr>
+        <w:pStyle w:val="NormalWeb"/>
+        <w:spacing w:before="0" w:beforeAutospacing="0" w:after="200" w:afterAutospacing="0"/>
+        <w:ind w:right="-531"/>
+        <w:jc w:val="both"/>
+      </w:pPr>
+    </w:p>
+    <w:p>
+      <w:pPr>
+        <w:pStyle w:val="NormalWeb"/>
+        <w:spacing w:before="0" w:beforeAutospacing="0" w:after="200" w:afterAutospacing="0"/>
+        <w:ind w:right="-531"/>
+        <w:jc w:val="both"/>
+        <w:rPr>
+          <w:sz w:val="20"/>
+          <w:szCs w:val="20"/>
+        </w:rPr>
+      </w:pPr>
+    </w:p>
+    <w:p>
+      <w:pPr>
+        <w:pStyle w:val="NormalWeb"/>
+        <w:spacing w:before="0" w:beforeAutospacing="0" w:after="200" w:afterAutospacing="0"/>
+        <w:ind w:right="-531"/>
+        <w:jc w:val="both"/>
+        <w:rPr>
+          <w:sz w:val="20"/>
+          <w:szCs w:val="20"/>
+        </w:rPr>
+      </w:pPr>
+      <w:hyperlink r:id="rId10" w:history="1">
+        <w:r>
+          <w:rPr>
+            <w:rStyle w:val="Hipervnculo"/>
+            <w:rFonts w:ascii="Arial" w:hAnsi="Arial" w:cs="Arial"/>
+            <w:color w:val="1155CC"/>
+            <w:sz w:val="20"/>
+            <w:szCs w:val="20"/>
+          </w:rPr>
+          <w:t>https://v0-retirosenlanaturalezaok.vercel.app</w:t>
+        </w:r>
+      </w:hyperlink>
+    </w:p>
+    <w:p>
+      <w:pPr>
+        <w:ind w:left="0"/>
+        <w:rPr>
+          <w:lang w:val="es-AR"/>
+        </w:rPr>
+      </w:pPr>
+    </w:p>
     <w:sectPr>
-      <w:headerReference w:type="default" r:id="rId8"/>
+      <w:headerReference w:type="default" r:id="rId11"/>
       <w:pgSz w:w="12240" w:h="15840"/>
       <w:pgMar w:top="1440" w:right="1440" w:bottom="1440" w:left="1440" w:header="720" w:footer="720" w:gutter="0"/>
       <w:pgNumType w:start="1"/>
@@ -2653,6 +3068,12 @@
     <w:tblPr>
       <w:tblStyleRowBandSize w:val="1"/>
       <w:tblStyleColBandSize w:val="1"/>
+      <w:tblCellMar>
+        <w:top w:w="100" w:type="dxa"/>
+        <w:left w:w="100" w:type="dxa"/>
+        <w:bottom w:w="100" w:type="dxa"/>
+        <w:right w:w="100" w:type="dxa"/>
+      </w:tblCellMar>
     </w:tblPr>
   </w:style>
   <w:style w:type="paragraph" w:styleId="Textodeglobo">
@@ -2743,6 +3164,17 @@
     <w:rPr>
       <w:rFonts w:ascii="Times New Roman" w:eastAsia="Times New Roman" w:hAnsi="Times New Roman" w:cs="Times New Roman"/>
       <w:lang w:val="es-AR"/>
+    </w:rPr>
+  </w:style>
+  <w:style w:type="character" w:styleId="Hipervnculo">
+    <w:name w:val="Hyperlink"/>
+    <w:basedOn w:val="Fuentedeprrafopredeter"/>
+    <w:uiPriority w:val="99"/>
+    <w:unhideWhenUsed/>
+    <w:rsid w:val="009E5E11"/>
+    <w:rPr>
+      <w:color w:val="0000FF"/>
+      <w:u w:val="single"/>
     </w:rPr>
   </w:style>
 </w:styles>
@@ -3077,6 +3509,12 @@
     <w:tblPr>
       <w:tblStyleRowBandSize w:val="1"/>
       <w:tblStyleColBandSize w:val="1"/>
+      <w:tblCellMar>
+        <w:top w:w="100" w:type="dxa"/>
+        <w:left w:w="100" w:type="dxa"/>
+        <w:bottom w:w="100" w:type="dxa"/>
+        <w:right w:w="100" w:type="dxa"/>
+      </w:tblCellMar>
     </w:tblPr>
   </w:style>
   <w:style w:type="paragraph" w:styleId="Textodeglobo">
@@ -3167,6 +3605,17 @@
     <w:rPr>
       <w:rFonts w:ascii="Times New Roman" w:eastAsia="Times New Roman" w:hAnsi="Times New Roman" w:cs="Times New Roman"/>
       <w:lang w:val="es-AR"/>
+    </w:rPr>
+  </w:style>
+  <w:style w:type="character" w:styleId="Hipervnculo">
+    <w:name w:val="Hyperlink"/>
+    <w:basedOn w:val="Fuentedeprrafopredeter"/>
+    <w:uiPriority w:val="99"/>
+    <w:unhideWhenUsed/>
+    <w:rsid w:val="009E5E11"/>
+    <w:rPr>
+      <w:color w:val="0000FF"/>
+      <w:u w:val="single"/>
     </w:rPr>
   </w:style>
 </w:styles>

</xml_diff>

<commit_message>
Corrección de enunciado del caso de estudio y agregacion de la elicitacion en el Anexo I
</commit_message>
<xml_diff>
--- a/TPI Análisis de sistemas.docx
+++ b/TPI Análisis de sistemas.docx
@@ -1,6 +1,6 @@
 
 <file path=word/document.xml><?xml version="1.0" encoding="utf-8"?>
-<w:document xmlns:wpc="http://schemas.microsoft.com/office/word/2010/wordprocessingCanvas" xmlns:mc="http://schemas.openxmlformats.org/markup-compatibility/2006" xmlns:o="urn:schemas-microsoft-com:office:office" xmlns:r="http://schemas.openxmlformats.org/officeDocument/2006/relationships" xmlns:m="http://schemas.openxmlformats.org/officeDocument/2006/math" xmlns:v="urn:schemas-microsoft-com:vml" xmlns:wp14="http://schemas.microsoft.com/office/word/2010/wordprocessingDrawing" xmlns:wp="http://schemas.openxmlformats.org/drawingml/2006/wordprocessingDrawing" xmlns:w10="urn:schemas-microsoft-com:office:word" xmlns:w="http://schemas.openxmlformats.org/wordprocessingml/2006/main" xmlns:w14="http://schemas.microsoft.com/office/word/2010/wordml" xmlns:wpg="http://schemas.microsoft.com/office/word/2010/wordprocessingGroup" xmlns:wpi="http://schemas.microsoft.com/office/word/2010/wordprocessingInk" xmlns:wne="http://schemas.microsoft.com/office/word/2006/wordml" xmlns:wps="http://schemas.microsoft.com/office/word/2010/wordprocessingShape" mc:Ignorable="w14 wp14">
+<w:document xmlns:wpc="http://schemas.microsoft.com/office/word/2010/wordprocessingCanvas" xmlns:cx="http://schemas.microsoft.com/office/drawing/2014/chartex" xmlns:cx1="http://schemas.microsoft.com/office/drawing/2015/9/8/chartex" xmlns:cx2="http://schemas.microsoft.com/office/drawing/2015/10/21/chartex" xmlns:cx3="http://schemas.microsoft.com/office/drawing/2016/5/9/chartex" xmlns:cx4="http://schemas.microsoft.com/office/drawing/2016/5/10/chartex" xmlns:cx5="http://schemas.microsoft.com/office/drawing/2016/5/11/chartex" xmlns:cx6="http://schemas.microsoft.com/office/drawing/2016/5/12/chartex" xmlns:cx7="http://schemas.microsoft.com/office/drawing/2016/5/13/chartex" xmlns:cx8="http://schemas.microsoft.com/office/drawing/2016/5/14/chartex" xmlns:mc="http://schemas.openxmlformats.org/markup-compatibility/2006" xmlns:aink="http://schemas.microsoft.com/office/drawing/2016/ink" xmlns:am3d="http://schemas.microsoft.com/office/drawing/2017/model3d" xmlns:o="urn:schemas-microsoft-com:office:office" xmlns:oel="http://schemas.microsoft.com/office/2019/extlst" xmlns:r="http://schemas.openxmlformats.org/officeDocument/2006/relationships" xmlns:m="http://schemas.openxmlformats.org/officeDocument/2006/math" xmlns:v="urn:schemas-microsoft-com:vml" xmlns:wp14="http://schemas.microsoft.com/office/word/2010/wordprocessingDrawing" xmlns:wp="http://schemas.openxmlformats.org/drawingml/2006/wordprocessingDrawing" xmlns:w10="urn:schemas-microsoft-com:office:word" xmlns:w="http://schemas.openxmlformats.org/wordprocessingml/2006/main" xmlns:w14="http://schemas.microsoft.com/office/word/2010/wordml" xmlns:w15="http://schemas.microsoft.com/office/word/2012/wordml" xmlns:w16cex="http://schemas.microsoft.com/office/word/2018/wordml/cex" xmlns:w16cid="http://schemas.microsoft.com/office/word/2016/wordml/cid" xmlns:w16="http://schemas.microsoft.com/office/word/2018/wordml" xmlns:w16du="http://schemas.microsoft.com/office/word/2023/wordml/word16du" xmlns:w16sdtdh="http://schemas.microsoft.com/office/word/2020/wordml/sdtdatahash" xmlns:w16sdtfl="http://schemas.microsoft.com/office/word/2024/wordml/sdtformatlock" xmlns:w16se="http://schemas.microsoft.com/office/word/2015/wordml/symex" xmlns:wpg="http://schemas.microsoft.com/office/word/2010/wordprocessingGroup" xmlns:wpi="http://schemas.microsoft.com/office/word/2010/wordprocessingInk" xmlns:wne="http://schemas.microsoft.com/office/word/2006/wordml" xmlns:wps="http://schemas.microsoft.com/office/word/2010/wordprocessingShape" mc:Ignorable="w14 w15 w16se w16cid w16 w16cex w16sdtdh w16sdtfl w16du wp14">
   <w:body>
     <w:p>
       <w:pPr>
@@ -95,15 +95,7 @@
       </w:r>
       <w:proofErr w:type="spellEnd"/>
       <w:r>
-        <w:t xml:space="preserve"> agenda </w:t>
-      </w:r>
-      <w:proofErr w:type="gramStart"/>
-      <w:r>
-        <w:t>un</w:t>
-      </w:r>
-      <w:proofErr w:type="gramEnd"/>
-      <w:r>
-        <w:t xml:space="preserve"> </w:t>
+        <w:t xml:space="preserve"> agenda un </w:t>
       </w:r>
       <w:proofErr w:type="spellStart"/>
       <w:r>
@@ -143,13 +135,8 @@
           <w:szCs w:val="20"/>
         </w:rPr>
       </w:pPr>
-      <w:proofErr w:type="spellStart"/>
-      <w:r>
-        <w:t>Lista</w:t>
-      </w:r>
-      <w:proofErr w:type="spellEnd"/>
-      <w:r>
-        <w:t xml:space="preserve"> de </w:t>
+      <w:r>
+        <w:t xml:space="preserve">Lista de </w:t>
       </w:r>
       <w:proofErr w:type="spellStart"/>
       <w:r>
@@ -187,21 +174,7 @@
         <w:rPr>
           <w:lang w:val="es-AR"/>
         </w:rPr>
-        <w:t>Anexo 1 con todas las páginas visitadas (</w:t>
-      </w:r>
-      <w:proofErr w:type="spellStart"/>
-      <w:r>
-        <w:rPr>
-          <w:lang w:val="es-AR"/>
-        </w:rPr>
-        <w:t>Elicitación</w:t>
-      </w:r>
-      <w:proofErr w:type="spellEnd"/>
-      <w:r>
-        <w:rPr>
-          <w:lang w:val="es-AR"/>
-        </w:rPr>
-        <w:t>, fotos de los retiros que investigamos).</w:t>
+        <w:t>Anexo 1 con todas las páginas visitadas (Elicitación, fotos de los retiros que investigamos).</w:t>
       </w:r>
     </w:p>
     <w:p>
@@ -217,168 +190,118 @@
     </w:p>
     <w:p>
       <w:pPr>
-        <w:ind w:left="0"/>
-        <w:rPr>
-          <w:rFonts w:ascii="Open Sans" w:eastAsia="Open Sans" w:hAnsi="Open Sans" w:cs="Open Sans"/>
-          <w:lang w:val="es-AR"/>
-        </w:rPr>
-      </w:pPr>
-      <w:r>
-        <w:rPr>
-          <w:b/>
-          <w:bCs/>
-          <w:highlight w:val="red"/>
-          <w:lang w:val="es-AR"/>
-        </w:rPr>
-        <w:t>Valeria</w:t>
-      </w:r>
-      <w:r>
-        <w:rPr>
-          <w:lang w:val="es-AR"/>
-        </w:rPr>
-        <w:t xml:space="preserve"> es una apasionada de los retiros holísticos </w:t>
-      </w:r>
-      <w:proofErr w:type="spellStart"/>
-      <w:r>
-        <w:rPr>
-          <w:lang w:val="es-AR"/>
-        </w:rPr>
-        <w:t>grupales</w:t>
-      </w:r>
-      <w:proofErr w:type="gramStart"/>
-      <w:r>
-        <w:rPr>
-          <w:lang w:val="es-AR"/>
-        </w:rPr>
-        <w:t>,los</w:t>
-      </w:r>
-      <w:proofErr w:type="spellEnd"/>
-      <w:proofErr w:type="gramEnd"/>
-      <w:r>
-        <w:rPr>
-          <w:lang w:val="es-AR"/>
-        </w:rPr>
-        <w:t xml:space="preserve"> cuáles descubre mediante sus redes sociales. Actualmente, su proceso de organización es completamente manual, cuando un retiro le interesa, solicita más información mediante chat de WhatsApp, Instagram o mail. Para no perder la información, </w:t>
-      </w:r>
-      <w:proofErr w:type="spellStart"/>
-      <w:r>
-        <w:rPr>
-          <w:highlight w:val="red"/>
-          <w:lang w:val="es-AR"/>
-        </w:rPr>
-        <w:t>valeria</w:t>
-      </w:r>
-      <w:proofErr w:type="spellEnd"/>
-      <w:r>
-        <w:rPr>
-          <w:lang w:val="es-AR"/>
-        </w:rPr>
-        <w:t xml:space="preserve"> utiliza una plantilla de organización, donde registrará los siguientes datos: </w:t>
-      </w:r>
-      <w:r>
-        <w:rPr>
+        <w:pStyle w:val="NormalWeb"/>
+        <w:spacing w:before="0" w:beforeAutospacing="0" w:after="200" w:afterAutospacing="0"/>
+        <w:ind w:right="-531"/>
+        <w:jc w:val="both"/>
+      </w:pPr>
+      <w:r>
+        <w:rPr>
+          <w:rFonts w:ascii="Arial" w:hAnsi="Arial" w:cs="Arial"/>
+          <w:color w:val="000000"/>
+        </w:rPr>
+        <w:t xml:space="preserve">Hay personas que son apasionadas de los retiros holísticos grupales, los cuáles descubren mediante sus redes sociales. Actualmente, sus procesos de organización son completamente manual, cuando un retiro les interesa, solicitan más información mediante chat de WhatsApp, Instagram o mail. Para no perder la información, los usuarios utilizan una plantilla de organización, donde registran los siguientes datos: </w:t>
+      </w:r>
+      <w:r>
+        <w:rPr>
+          <w:rFonts w:ascii="Arial" w:hAnsi="Arial" w:cs="Arial"/>
           <w:i/>
           <w:iCs/>
-          <w:lang w:val="es-AR"/>
+          <w:color w:val="000000"/>
         </w:rPr>
         <w:t xml:space="preserve">fecha de inicio del retiro, desde hasta cuándo (AAAA/MM/DD </w:t>
       </w:r>
       <w:proofErr w:type="spellStart"/>
       <w:r>
         <w:rPr>
+          <w:rFonts w:ascii="Arial" w:hAnsi="Arial" w:cs="Arial"/>
           <w:i/>
           <w:iCs/>
-          <w:lang w:val="es-AR"/>
+          <w:color w:val="000000"/>
         </w:rPr>
         <w:t>hh:mm</w:t>
       </w:r>
       <w:proofErr w:type="spellEnd"/>
       <w:r>
         <w:rPr>
+          <w:rFonts w:ascii="Arial" w:hAnsi="Arial" w:cs="Arial"/>
           <w:i/>
           <w:iCs/>
-          <w:lang w:val="es-AR"/>
-        </w:rPr>
-        <w:t>), nombre del retiro, ubicación, temática del retiro (Meditación, tracking, yoga, ceremonia del cacao, regresión a vidas pasadas, senderismo, armonización sonora), cronograma de actividades, costo, CON QUIÉN HABLÓ (Nombre del encargado, o Página)  ESTADO (lo reserve, me interesa, lo pague), cancelable o no</w:t>
-      </w:r>
-      <w:r>
-        <w:rPr>
-          <w:lang w:val="es-AR"/>
+          <w:color w:val="000000"/>
+        </w:rPr>
+        <w:t xml:space="preserve">), nombre del retiro, ubicación, temática del retiro (Meditación, tracking, yoga, ceremonia del cacao, regresión a vidas pasadas, senderismo, armonización sonora), cronograma de actividades, costo, CON QUIÉN HABLÓ (Nombre del encargado, o </w:t>
+      </w:r>
+      <w:r>
+        <w:rPr>
+          <w:rFonts w:ascii="Arial" w:hAnsi="Arial" w:cs="Arial"/>
+          <w:i/>
+          <w:iCs/>
+          <w:color w:val="000000"/>
+        </w:rPr>
+        <w:t>Página) ESTADO</w:t>
+      </w:r>
+      <w:r>
+        <w:rPr>
+          <w:rFonts w:ascii="Arial" w:hAnsi="Arial" w:cs="Arial"/>
+          <w:i/>
+          <w:iCs/>
+          <w:color w:val="000000"/>
+        </w:rPr>
+        <w:t xml:space="preserve"> (lo reserve, me interesa, lo pague), cancelable o no</w:t>
+      </w:r>
+      <w:r>
+        <w:rPr>
+          <w:rFonts w:ascii="Arial" w:hAnsi="Arial" w:cs="Arial"/>
+          <w:color w:val="000000"/>
         </w:rPr>
         <w:t>.</w:t>
       </w:r>
     </w:p>
     <w:p>
       <w:pPr>
-        <w:ind w:left="0"/>
-        <w:rPr>
-          <w:lang w:val="es-AR"/>
-        </w:rPr>
-      </w:pPr>
-      <w:r>
-        <w:rPr>
-          <w:lang w:val="es-AR"/>
-        </w:rPr>
-        <w:t xml:space="preserve">A medida que se comunica y obtiene la información con los organizadores de los diferentes retiros, actualiza el “estado” en su planilla. Sin embargo, la organización se le dificulta según aumenta la cantidad de retiros. </w:t>
-      </w:r>
-    </w:p>
-    <w:p>
-      <w:pPr>
-        <w:ind w:left="0"/>
-        <w:rPr>
-          <w:lang w:val="es-AR"/>
-        </w:rPr>
-      </w:pPr>
-      <w:r>
-        <w:rPr>
-          <w:lang w:val="es-AR"/>
-        </w:rPr>
-        <w:t xml:space="preserve">Por lo que Valeria necesita una aplicación móvil de uso personal que le permita organizarse, </w:t>
-      </w:r>
-      <w:bookmarkStart w:id="3" w:name="_GoBack"/>
-      <w:r>
-        <w:rPr>
-          <w:lang w:val="es-AR"/>
-        </w:rPr>
-        <w:t xml:space="preserve">simplificando la elección y el seguimiento de sus retiros. </w:t>
-      </w:r>
-      <w:proofErr w:type="spellStart"/>
-      <w:r>
-        <w:rPr>
-          <w:lang w:val="es-AR"/>
-        </w:rPr>
-        <w:t>Agendandolos</w:t>
-      </w:r>
-      <w:proofErr w:type="spellEnd"/>
-      <w:r>
-        <w:rPr>
-          <w:lang w:val="es-AR"/>
-        </w:rPr>
-        <w:t xml:space="preserve">, descartando los </w:t>
-      </w:r>
-      <w:bookmarkEnd w:id="3"/>
-      <w:r>
-        <w:rPr>
-          <w:lang w:val="es-AR"/>
-        </w:rPr>
-        <w:lastRenderedPageBreak/>
-        <w:t xml:space="preserve">retiros que no son de su agrado, filtros y búsqueda de  los retiros agendados, planificación de pagos, registrar acompañantes y dejar valoraciones/opiniones, </w:t>
-      </w:r>
-      <w:proofErr w:type="spellStart"/>
-      <w:r>
-        <w:rPr>
-          <w:lang w:val="es-AR"/>
-        </w:rPr>
-        <w:t>multimedias</w:t>
-      </w:r>
-      <w:proofErr w:type="spellEnd"/>
-      <w:r>
-        <w:rPr>
-          <w:lang w:val="es-AR"/>
-        </w:rPr>
-        <w:t xml:space="preserve"> de sus experiencias. Además, busca poder compartir las características de un retiro con otros usuarios para invitarlos a sumarse y que la aplicación le envíe alertas cuando se encuentra cerca a la fecha de un retiro o de la fecha de pago.</w:t>
-      </w:r>
-    </w:p>
+        <w:pStyle w:val="NormalWeb"/>
+        <w:spacing w:before="0" w:beforeAutospacing="0" w:after="200" w:afterAutospacing="0"/>
+        <w:ind w:right="-531"/>
+        <w:jc w:val="both"/>
+      </w:pPr>
+      <w:r>
+        <w:rPr>
+          <w:rFonts w:ascii="Arial" w:hAnsi="Arial" w:cs="Arial"/>
+          <w:color w:val="000000"/>
+        </w:rPr>
+        <w:t>A medida que se les comunica y obtienen la información con los organizadores de los diferentes retiros, actualizan el “estado” en sus planillas. Sin embargo, la organización se les dificulta según aumenta la cantidad de retiros. </w:t>
+      </w:r>
+    </w:p>
+    <w:p>
+      <w:pPr>
+        <w:pStyle w:val="NormalWeb"/>
+        <w:spacing w:before="0" w:beforeAutospacing="0" w:after="200" w:afterAutospacing="0"/>
+        <w:ind w:right="-531"/>
+        <w:jc w:val="both"/>
+      </w:pPr>
+      <w:r>
+        <w:rPr>
+          <w:rFonts w:ascii="Arial" w:hAnsi="Arial" w:cs="Arial"/>
+          <w:color w:val="000000"/>
+        </w:rPr>
+        <w:t xml:space="preserve">Por esto, los usuarios necesitan una aplicación móvil de uso personal que les permita organizarse, simplificando la elección y el seguimiento de sus retiros. </w:t>
+      </w:r>
+      <w:r>
+        <w:rPr>
+          <w:rFonts w:ascii="Arial" w:hAnsi="Arial" w:cs="Arial"/>
+          <w:color w:val="000000"/>
+        </w:rPr>
+        <w:t>Agendándolos</w:t>
+      </w:r>
+      <w:r>
+        <w:rPr>
+          <w:rFonts w:ascii="Arial" w:hAnsi="Arial" w:cs="Arial"/>
+          <w:color w:val="000000"/>
+        </w:rPr>
+        <w:t>, descartando los retiros que no son de su agrado, filtros y búsqueda de los retiros agendados, planificación de pagos, registrar acompañantes y dejar valoraciones/opiniones, multimedia de sus experiencias. Además, buscan poder compartir las características de un retiro con otros usuarios para invitarlos a sumarse y que la aplicación les envíe alertas cuando se encuentra cerca la fecha de un retiro o de la fecha de pago.</w:t>
+      </w:r>
+    </w:p>
+    <w:p/>
     <w:p>
       <w:pPr>
         <w:pStyle w:val="Ttulo2"/>
@@ -392,6 +315,7 @@
         <w:rPr>
           <w:lang w:val="es-AR"/>
         </w:rPr>
+        <w:lastRenderedPageBreak/>
         <w:t>LISTA DE REQUERIMIENTOS FUNCIONALES</w:t>
       </w:r>
       <w:r>
@@ -402,8 +326,8 @@
         </w:rPr>
         <w:t xml:space="preserve"> </w:t>
       </w:r>
-      <w:bookmarkStart w:id="4" w:name="_u31e971vnvql" w:colFirst="0" w:colLast="0"/>
-      <w:bookmarkEnd w:id="4"/>
+      <w:bookmarkStart w:id="3" w:name="_u31e971vnvql" w:colFirst="0" w:colLast="0"/>
+      <w:bookmarkEnd w:id="3"/>
     </w:p>
     <w:tbl>
       <w:tblPr>
@@ -429,7 +353,6 @@
         <w:tc>
           <w:tcPr>
             <w:tcW w:w="1335" w:type="dxa"/>
-            <w:shd w:val="clear" w:color="auto" w:fill="auto"/>
             <w:tcMar>
               <w:top w:w="5" w:type="dxa"/>
               <w:left w:w="5" w:type="dxa"/>
@@ -471,7 +394,6 @@
         <w:tc>
           <w:tcPr>
             <w:tcW w:w="8565" w:type="dxa"/>
-            <w:shd w:val="clear" w:color="auto" w:fill="auto"/>
             <w:tcMar>
               <w:top w:w="5" w:type="dxa"/>
               <w:left w:w="5" w:type="dxa"/>
@@ -537,7 +459,6 @@
         <w:tc>
           <w:tcPr>
             <w:tcW w:w="1335" w:type="dxa"/>
-            <w:shd w:val="clear" w:color="auto" w:fill="auto"/>
             <w:tcMar>
               <w:top w:w="5" w:type="dxa"/>
               <w:left w:w="5" w:type="dxa"/>
@@ -591,7 +512,6 @@
         <w:tc>
           <w:tcPr>
             <w:tcW w:w="8565" w:type="dxa"/>
-            <w:shd w:val="clear" w:color="auto" w:fill="auto"/>
             <w:tcMar>
               <w:top w:w="5" w:type="dxa"/>
               <w:left w:w="5" w:type="dxa"/>
@@ -623,19 +543,11 @@
                 <w:lang w:val="es-AR"/>
               </w:rPr>
             </w:pPr>
-            <w:proofErr w:type="gramStart"/>
             <w:r>
               <w:rPr>
                 <w:lang w:val="es-AR"/>
               </w:rPr>
-              <w:t>retiros</w:t>
-            </w:r>
-            <w:proofErr w:type="gramEnd"/>
-            <w:r>
-              <w:rPr>
-                <w:lang w:val="es-AR"/>
-              </w:rPr>
-              <w:t xml:space="preserve"> por distintos criterios de acuerdo a los datos ingresados.</w:t>
+              <w:t>retiros por distintos criterios de acuerdo a los datos ingresados.</w:t>
             </w:r>
           </w:p>
         </w:tc>
@@ -644,7 +556,6 @@
         <w:tc>
           <w:tcPr>
             <w:tcW w:w="1335" w:type="dxa"/>
-            <w:shd w:val="clear" w:color="auto" w:fill="auto"/>
             <w:tcMar>
               <w:top w:w="5" w:type="dxa"/>
               <w:left w:w="5" w:type="dxa"/>
@@ -698,7 +609,6 @@
         <w:tc>
           <w:tcPr>
             <w:tcW w:w="8565" w:type="dxa"/>
-            <w:shd w:val="clear" w:color="auto" w:fill="auto"/>
             <w:tcMar>
               <w:top w:w="5" w:type="dxa"/>
               <w:left w:w="5" w:type="dxa"/>
@@ -745,19 +655,11 @@
                 <w:lang w:val="es-AR"/>
               </w:rPr>
             </w:pPr>
-            <w:proofErr w:type="gramStart"/>
             <w:r>
               <w:rPr>
                 <w:lang w:val="es-AR"/>
               </w:rPr>
-              <w:t>retiro</w:t>
-            </w:r>
-            <w:proofErr w:type="gramEnd"/>
-            <w:r>
-              <w:rPr>
-                <w:lang w:val="es-AR"/>
-              </w:rPr>
-              <w:t>, la descripción, la ubicación, fecha, costo y demás datos asociados.</w:t>
+              <w:t>retiro, la descripción, la ubicación, fecha, costo y demás datos asociados.</w:t>
             </w:r>
           </w:p>
         </w:tc>
@@ -766,7 +668,6 @@
         <w:tc>
           <w:tcPr>
             <w:tcW w:w="1335" w:type="dxa"/>
-            <w:shd w:val="clear" w:color="auto" w:fill="auto"/>
             <w:tcMar>
               <w:top w:w="5" w:type="dxa"/>
               <w:left w:w="5" w:type="dxa"/>
@@ -820,7 +721,6 @@
         <w:tc>
           <w:tcPr>
             <w:tcW w:w="8565" w:type="dxa"/>
-            <w:shd w:val="clear" w:color="auto" w:fill="auto"/>
             <w:tcMar>
               <w:top w:w="5" w:type="dxa"/>
               <w:left w:w="5" w:type="dxa"/>
@@ -850,12 +750,10 @@
               <w:ind w:left="0" w:right="61"/>
             </w:pPr>
             <w:proofErr w:type="spellStart"/>
-            <w:proofErr w:type="gramStart"/>
             <w:r>
               <w:t>siguientes</w:t>
             </w:r>
             <w:proofErr w:type="spellEnd"/>
-            <w:proofErr w:type="gramEnd"/>
             <w:r>
               <w:t xml:space="preserve"> </w:t>
             </w:r>
@@ -882,7 +780,6 @@
         <w:tc>
           <w:tcPr>
             <w:tcW w:w="1335" w:type="dxa"/>
-            <w:shd w:val="clear" w:color="auto" w:fill="auto"/>
             <w:tcMar>
               <w:top w:w="5" w:type="dxa"/>
               <w:left w:w="5" w:type="dxa"/>
@@ -936,7 +833,6 @@
         <w:tc>
           <w:tcPr>
             <w:tcW w:w="8565" w:type="dxa"/>
-            <w:shd w:val="clear" w:color="auto" w:fill="auto"/>
             <w:tcMar>
               <w:top w:w="5" w:type="dxa"/>
               <w:left w:w="5" w:type="dxa"/>
@@ -966,7 +862,6 @@
         <w:tc>
           <w:tcPr>
             <w:tcW w:w="1335" w:type="dxa"/>
-            <w:shd w:val="clear" w:color="auto" w:fill="auto"/>
             <w:tcMar>
               <w:top w:w="5" w:type="dxa"/>
               <w:left w:w="5" w:type="dxa"/>
@@ -1004,7 +899,6 @@
         <w:tc>
           <w:tcPr>
             <w:tcW w:w="8565" w:type="dxa"/>
-            <w:shd w:val="clear" w:color="auto" w:fill="auto"/>
             <w:tcMar>
               <w:top w:w="5" w:type="dxa"/>
               <w:left w:w="5" w:type="dxa"/>
@@ -1034,7 +928,6 @@
         <w:tc>
           <w:tcPr>
             <w:tcW w:w="1335" w:type="dxa"/>
-            <w:shd w:val="clear" w:color="auto" w:fill="auto"/>
             <w:tcMar>
               <w:top w:w="5" w:type="dxa"/>
               <w:left w:w="5" w:type="dxa"/>
@@ -1088,7 +981,6 @@
         <w:tc>
           <w:tcPr>
             <w:tcW w:w="8565" w:type="dxa"/>
-            <w:shd w:val="clear" w:color="auto" w:fill="auto"/>
             <w:tcMar>
               <w:top w:w="5" w:type="dxa"/>
               <w:left w:w="5" w:type="dxa"/>
@@ -1109,7 +1001,21 @@
               <w:rPr>
                 <w:rFonts w:ascii="Helvetica" w:hAnsi="Helvetica" w:cs="Helvetica"/>
               </w:rPr>
-              <w:t xml:space="preserve">Registrar el </w:t>
+              <w:t xml:space="preserve">Registrar </w:t>
+            </w:r>
+            <w:proofErr w:type="spellStart"/>
+            <w:r>
+              <w:rPr>
+                <w:rFonts w:ascii="Helvetica" w:hAnsi="Helvetica" w:cs="Helvetica"/>
+              </w:rPr>
+              <w:t>el</w:t>
+            </w:r>
+            <w:proofErr w:type="spellEnd"/>
+            <w:r>
+              <w:rPr>
+                <w:rFonts w:ascii="Helvetica" w:hAnsi="Helvetica" w:cs="Helvetica"/>
+              </w:rPr>
+              <w:t xml:space="preserve"> </w:t>
             </w:r>
             <w:proofErr w:type="spellStart"/>
             <w:r>
@@ -1179,7 +1085,21 @@
               <w:rPr>
                 <w:rFonts w:ascii="Helvetica" w:hAnsi="Helvetica" w:cs="Helvetica"/>
               </w:rPr>
-              <w:t xml:space="preserve"> registrar el </w:t>
+              <w:t xml:space="preserve"> registrar </w:t>
+            </w:r>
+            <w:proofErr w:type="spellStart"/>
+            <w:r>
+              <w:rPr>
+                <w:rFonts w:ascii="Helvetica" w:hAnsi="Helvetica" w:cs="Helvetica"/>
+              </w:rPr>
+              <w:t>el</w:t>
+            </w:r>
+            <w:proofErr w:type="spellEnd"/>
+            <w:r>
+              <w:rPr>
+                <w:rFonts w:ascii="Helvetica" w:hAnsi="Helvetica" w:cs="Helvetica"/>
+              </w:rPr>
+              <w:t xml:space="preserve"> </w:t>
             </w:r>
             <w:proofErr w:type="spellStart"/>
             <w:r>
@@ -1235,7 +1155,21 @@
               <w:rPr>
                 <w:rFonts w:ascii="Helvetica" w:hAnsi="Helvetica" w:cs="Helvetica"/>
               </w:rPr>
-              <w:t xml:space="preserve"> en </w:t>
+              <w:t xml:space="preserve"> </w:t>
+            </w:r>
+            <w:proofErr w:type="spellStart"/>
+            <w:r>
+              <w:rPr>
+                <w:rFonts w:ascii="Helvetica" w:hAnsi="Helvetica" w:cs="Helvetica"/>
+              </w:rPr>
+              <w:t>en</w:t>
+            </w:r>
+            <w:proofErr w:type="spellEnd"/>
+            <w:r>
+              <w:rPr>
+                <w:rFonts w:ascii="Helvetica" w:hAnsi="Helvetica" w:cs="Helvetica"/>
+              </w:rPr>
+              <w:t xml:space="preserve"> </w:t>
             </w:r>
             <w:proofErr w:type="spellStart"/>
             <w:r>
@@ -1300,7 +1234,6 @@
         <w:tc>
           <w:tcPr>
             <w:tcW w:w="1335" w:type="dxa"/>
-            <w:shd w:val="clear" w:color="auto" w:fill="auto"/>
             <w:tcMar>
               <w:top w:w="5" w:type="dxa"/>
               <w:left w:w="5" w:type="dxa"/>
@@ -1354,7 +1287,6 @@
         <w:tc>
           <w:tcPr>
             <w:tcW w:w="8565" w:type="dxa"/>
-            <w:shd w:val="clear" w:color="auto" w:fill="auto"/>
             <w:tcMar>
               <w:top w:w="5" w:type="dxa"/>
               <w:left w:w="5" w:type="dxa"/>
@@ -1498,7 +1430,21 @@
               <w:rPr>
                 <w:rFonts w:ascii="Helvetica" w:hAnsi="Helvetica" w:cs="Helvetica"/>
               </w:rPr>
-              <w:t xml:space="preserve"> el </w:t>
+              <w:t xml:space="preserve"> </w:t>
+            </w:r>
+            <w:proofErr w:type="spellStart"/>
+            <w:r>
+              <w:rPr>
+                <w:rFonts w:ascii="Helvetica" w:hAnsi="Helvetica" w:cs="Helvetica"/>
+              </w:rPr>
+              <w:t>el</w:t>
+            </w:r>
+            <w:proofErr w:type="spellEnd"/>
+            <w:r>
+              <w:rPr>
+                <w:rFonts w:ascii="Helvetica" w:hAnsi="Helvetica" w:cs="Helvetica"/>
+              </w:rPr>
+              <w:t xml:space="preserve"> </w:t>
             </w:r>
             <w:proofErr w:type="spellStart"/>
             <w:r>
@@ -1529,7 +1475,6 @@
         <w:tc>
           <w:tcPr>
             <w:tcW w:w="1335" w:type="dxa"/>
-            <w:shd w:val="clear" w:color="auto" w:fill="auto"/>
             <w:tcMar>
               <w:top w:w="5" w:type="dxa"/>
               <w:left w:w="5" w:type="dxa"/>
@@ -1583,7 +1528,6 @@
         <w:tc>
           <w:tcPr>
             <w:tcW w:w="8565" w:type="dxa"/>
-            <w:shd w:val="clear" w:color="auto" w:fill="auto"/>
             <w:tcMar>
               <w:top w:w="5" w:type="dxa"/>
               <w:left w:w="5" w:type="dxa"/>
@@ -1640,7 +1584,21 @@
               <w:rPr>
                 <w:rFonts w:ascii="Helvetica" w:hAnsi="Helvetica" w:cs="Helvetica"/>
               </w:rPr>
-              <w:t xml:space="preserve"> el </w:t>
+              <w:t xml:space="preserve"> </w:t>
+            </w:r>
+            <w:proofErr w:type="spellStart"/>
+            <w:r>
+              <w:rPr>
+                <w:rFonts w:ascii="Helvetica" w:hAnsi="Helvetica" w:cs="Helvetica"/>
+              </w:rPr>
+              <w:t>el</w:t>
+            </w:r>
+            <w:proofErr w:type="spellEnd"/>
+            <w:r>
+              <w:rPr>
+                <w:rFonts w:ascii="Helvetica" w:hAnsi="Helvetica" w:cs="Helvetica"/>
+              </w:rPr>
+              <w:t xml:space="preserve"> </w:t>
             </w:r>
             <w:proofErr w:type="spellStart"/>
             <w:r>
@@ -1783,7 +1741,6 @@
         <w:tc>
           <w:tcPr>
             <w:tcW w:w="1335" w:type="dxa"/>
-            <w:shd w:val="clear" w:color="auto" w:fill="auto"/>
             <w:tcMar>
               <w:top w:w="5" w:type="dxa"/>
               <w:left w:w="5" w:type="dxa"/>
@@ -1837,7 +1794,6 @@
         <w:tc>
           <w:tcPr>
             <w:tcW w:w="8565" w:type="dxa"/>
-            <w:shd w:val="clear" w:color="auto" w:fill="auto"/>
             <w:tcMar>
               <w:top w:w="5" w:type="dxa"/>
               <w:left w:w="5" w:type="dxa"/>
@@ -1876,7 +1832,6 @@
         <w:tc>
           <w:tcPr>
             <w:tcW w:w="1335" w:type="dxa"/>
-            <w:shd w:val="clear" w:color="auto" w:fill="auto"/>
             <w:tcMar>
               <w:top w:w="5" w:type="dxa"/>
               <w:left w:w="5" w:type="dxa"/>
@@ -1930,7 +1885,6 @@
         <w:tc>
           <w:tcPr>
             <w:tcW w:w="8565" w:type="dxa"/>
-            <w:shd w:val="clear" w:color="auto" w:fill="auto"/>
             <w:tcMar>
               <w:top w:w="5" w:type="dxa"/>
               <w:left w:w="5" w:type="dxa"/>
@@ -2012,7 +1966,6 @@
           <w:bCs/>
           <w:color w:val="000000"/>
         </w:rPr>
-        <w:lastRenderedPageBreak/>
         <w:t>ANEXO 1</w:t>
       </w:r>
     </w:p>
@@ -2053,7 +2006,8 @@
         <w:rPr>
           <w:noProof/>
         </w:rPr>
-        <w:pict>
+        <w:lastRenderedPageBreak/>
+        <w:pict w14:anchorId="4385CC60">
           <v:shapetype id="_x0000_t75" coordsize="21600,21600" o:spt="75" o:preferrelative="t" path="m@4@5l@4@11@9@11@9@5xe" filled="f" stroked="f">
             <v:stroke joinstyle="miter"/>
             <v:formulas>
@@ -2074,7 +2028,7 @@
             <o:lock v:ext="edit" aspectratio="t"/>
           </v:shapetype>
           <v:shape id="_x0000_s1027" type="#_x0000_t75" style="position:absolute;margin-left:-10.05pt;margin-top:50.5pt;width:399.35pt;height:256.2pt;z-index:251659264;mso-position-horizontal-relative:margin;mso-position-vertical-relative:margin">
-            <v:imagedata r:id="rId8" o:title="Sin título"/>
+            <v:imagedata r:id="rId7" o:title="Sin título"/>
             <w10:wrap type="square" anchorx="margin" anchory="margin"/>
           </v:shape>
         </w:pict>
@@ -2227,7 +2181,7 @@
                     </pic:cNvPicPr>
                   </pic:nvPicPr>
                   <pic:blipFill>
-                    <a:blip r:embed="rId9">
+                    <a:blip r:embed="rId8">
                       <a:extLst>
                         <a:ext uri="{28A0092B-C50C-407E-A947-70E740481C1C}">
                           <a14:useLocalDpi xmlns:a14="http://schemas.microsoft.com/office/drawing/2010/main" val="0"/>
@@ -2370,7 +2324,7 @@
           <w:szCs w:val="20"/>
         </w:rPr>
       </w:pPr>
-      <w:hyperlink r:id="rId10" w:history="1">
+      <w:hyperlink r:id="rId9" w:history="1">
         <w:r>
           <w:rPr>
             <w:rStyle w:val="Hipervnculo"/>
@@ -2387,12 +2341,238 @@
       <w:pPr>
         <w:ind w:left="0"/>
         <w:rPr>
-          <w:lang w:val="es-AR"/>
-        </w:rPr>
-      </w:pPr>
+          <w:rFonts w:ascii="Open Sans ExtraBold" w:eastAsia="Open Sans ExtraBold" w:hAnsi="Open Sans ExtraBold" w:cs="Open Sans ExtraBold"/>
+          <w:color w:val="FFAA00"/>
+          <w:sz w:val="20"/>
+          <w:szCs w:val="20"/>
+          <w:lang w:val="es-AR"/>
+        </w:rPr>
+      </w:pPr>
+      <w:r>
+        <w:rPr>
+          <w:rFonts w:ascii="Open Sans ExtraBold" w:eastAsia="Open Sans ExtraBold" w:hAnsi="Open Sans ExtraBold" w:cs="Open Sans ExtraBold"/>
+          <w:color w:val="FFAA00"/>
+          <w:sz w:val="20"/>
+          <w:szCs w:val="20"/>
+          <w:lang w:val="es-AR"/>
+        </w:rPr>
+        <w:lastRenderedPageBreak/>
+        <w:t>E</w:t>
+      </w:r>
+      <w:r>
+        <w:rPr>
+          <w:rFonts w:ascii="Open Sans ExtraBold" w:eastAsia="Open Sans ExtraBold" w:hAnsi="Open Sans ExtraBold" w:cs="Open Sans ExtraBold"/>
+          <w:color w:val="FFAA00"/>
+          <w:sz w:val="20"/>
+          <w:szCs w:val="20"/>
+          <w:lang w:val="es-AR"/>
+        </w:rPr>
+        <w:t>LICITACION</w:t>
+      </w:r>
+    </w:p>
+    <w:p>
+      <w:pPr>
+        <w:ind w:left="0"/>
+        <w:rPr>
+          <w:lang w:val="es-AR"/>
+        </w:rPr>
+      </w:pPr>
+      <w:r>
+        <w:rPr>
+          <w:lang w:val="es-AR"/>
+        </w:rPr>
+        <w:t>Es una app para uso personal, es para una persona que le interesa hacer estos retiros holísticos, pueda organizarse mejor con todas las ofertas que hay, y las características distintas que hay. Permita organizarse, que sepa si pregunto o no. Registrado que le interesó. Si fue, cuál fue el resultado, que le pareció. </w:t>
+      </w:r>
+    </w:p>
+    <w:p>
+      <w:pPr>
+        <w:ind w:left="0"/>
+        <w:rPr>
+          <w:lang w:val="es-AR"/>
+        </w:rPr>
+      </w:pPr>
+      <w:r>
+        <w:rPr>
+          <w:lang w:val="es-AR"/>
+        </w:rPr>
+        <w:t>RETIROS GRUPALES, no individuales. LE GUSTA EL TEMA DE LA CANCELACIÓN, si no pueda asistir que pueda cancelar NO VAN FAMILIAS, SON RETIROS HOLÍSTICOS </w:t>
+      </w:r>
+    </w:p>
+    <w:p>
+      <w:pPr>
+        <w:ind w:left="0"/>
+        <w:rPr>
+          <w:lang w:val="es-AR"/>
+        </w:rPr>
+      </w:pPr>
+      <w:r>
+        <w:rPr>
+          <w:lang w:val="es-AR"/>
+        </w:rPr>
+        <w:t>VA A SER UNA APLICACIÓN PARA LAS PERSONAS QUE LES GUSTA IR A RETIROS, no para los organizadores de retiros.</w:t>
+      </w:r>
+    </w:p>
+    <w:p>
+      <w:pPr>
+        <w:ind w:left="0"/>
+        <w:rPr>
+          <w:lang w:val="es-AR"/>
+        </w:rPr>
+      </w:pPr>
+      <w:r>
+        <w:rPr>
+          <w:lang w:val="es-AR"/>
+        </w:rPr>
+        <w:t xml:space="preserve">Ellas son clientes y usuarios, pagan y usan LO que hace ella: ve un retiro, manda un mensaje que quiere más información. A veces la mandan por el mismo chat de </w:t>
+      </w:r>
+      <w:r>
+        <w:rPr>
+          <w:lang w:val="es-AR"/>
+        </w:rPr>
+        <w:t>Instagram</w:t>
+      </w:r>
+      <w:r>
+        <w:rPr>
+          <w:lang w:val="es-AR"/>
+        </w:rPr>
+        <w:t xml:space="preserve">, otras veces la mandan por </w:t>
+      </w:r>
+      <w:r>
+        <w:rPr>
+          <w:lang w:val="es-AR"/>
+        </w:rPr>
+        <w:t>WhatsApp</w:t>
+      </w:r>
+      <w:r>
+        <w:rPr>
+          <w:lang w:val="es-AR"/>
+        </w:rPr>
+        <w:t xml:space="preserve">, le piden el </w:t>
+      </w:r>
+      <w:r>
+        <w:rPr>
+          <w:lang w:val="es-AR"/>
+        </w:rPr>
+        <w:t>número</w:t>
+      </w:r>
+      <w:r>
+        <w:rPr>
+          <w:lang w:val="es-AR"/>
+        </w:rPr>
+        <w:t xml:space="preserve"> de </w:t>
+      </w:r>
+      <w:r>
+        <w:rPr>
+          <w:lang w:val="es-AR"/>
+        </w:rPr>
+        <w:t>teléfono</w:t>
+      </w:r>
+      <w:r>
+        <w:rPr>
+          <w:lang w:val="es-AR"/>
+        </w:rPr>
+        <w:t>. Otras por mail.</w:t>
+      </w:r>
+    </w:p>
+    <w:p>
+      <w:pPr>
+        <w:ind w:left="0"/>
+        <w:rPr>
+          <w:lang w:val="es-AR"/>
+        </w:rPr>
+      </w:pPr>
+      <w:r>
+        <w:rPr>
+          <w:lang w:val="es-AR"/>
+        </w:rPr>
+        <w:t xml:space="preserve">Tiene una planilla de </w:t>
+      </w:r>
+      <w:r>
+        <w:rPr>
+          <w:lang w:val="es-AR"/>
+        </w:rPr>
+        <w:t>Excel</w:t>
+      </w:r>
+      <w:r>
+        <w:rPr>
+          <w:lang w:val="es-AR"/>
+        </w:rPr>
+        <w:t xml:space="preserve">. Pone la fecha del retiro, desde hasta cuándo (Desde que hora hasta que hora), como se llama el retiro, donde va a ser el retiro, De que va a tratar el retiro (Meditación, tracking, yoga, ceremonia del cacao, regresión a vidas pasadas, senderismo, armonización sonora). En su </w:t>
+      </w:r>
+      <w:r>
+        <w:rPr>
+          <w:lang w:val="es-AR"/>
+        </w:rPr>
+        <w:t>Excel</w:t>
+      </w:r>
+      <w:r>
+        <w:rPr>
+          <w:lang w:val="es-AR"/>
+        </w:rPr>
+        <w:t xml:space="preserve"> también coloca el costo y CON QUIÉN HABLÓ (Nombre de una persona, o Página). Cuando le mandan un audio por </w:t>
+      </w:r>
+      <w:proofErr w:type="spellStart"/>
+      <w:r>
+        <w:rPr>
+          <w:lang w:val="es-AR"/>
+        </w:rPr>
+        <w:t>wpp</w:t>
+      </w:r>
+      <w:proofErr w:type="spellEnd"/>
+      <w:r>
+        <w:rPr>
+          <w:lang w:val="es-AR"/>
+        </w:rPr>
+        <w:t xml:space="preserve"> o por mail o por donde sea, cambia el </w:t>
+      </w:r>
+      <w:r>
+        <w:rPr>
+          <w:lang w:val="es-AR"/>
+        </w:rPr>
+        <w:t>Excel</w:t>
+      </w:r>
+      <w:r>
+        <w:rPr>
+          <w:lang w:val="es-AR"/>
+        </w:rPr>
+        <w:t xml:space="preserve"> en la parte de con quien hablo, cambia de la página a la persona. CON ESE EXCEL a veces le va poniendo un ESTADO (lo reserve, me interesa, lo pague). Tal vez entra el dato si entran cancelaciones o no.</w:t>
+      </w:r>
+    </w:p>
+    <w:p>
+      <w:pPr>
+        <w:ind w:left="0"/>
+        <w:rPr>
+          <w:lang w:val="es-AR"/>
+        </w:rPr>
+      </w:pPr>
+      <w:r>
+        <w:rPr>
+          <w:lang w:val="es-AR"/>
+        </w:rPr>
+        <w:t xml:space="preserve">Le gustaría tener eso en una app para que le simplifique la elección de los retiros. PONER FILTROS, ALERTAS PARA QUE LLEGUEN POR CORREO (alertas que se acerca uno que le interesa, que tiene que pagar el saldo) LA NECESIDAD BÁSICA es organizarse. Un plus sería buscar los retiros que quiere. Le gustaría TENER LOS RETIROS que le interesan, tenerlos organizados, si tiene que buscar un retiro en un lugar, con determinadas actividades, fechas. Que lo pueda buscar. Si tiene que contestar algo que le mandaron, si </w:t>
+      </w:r>
+      <w:r>
+        <w:rPr>
+          <w:lang w:val="es-AR"/>
+        </w:rPr>
+        <w:lastRenderedPageBreak/>
+        <w:t xml:space="preserve">tiene que pagar. TAMBIÉN SACAR Los retiros que no le interesan. Transferencia o efectivo en el lugar. </w:t>
+      </w:r>
+      <w:r>
+        <w:rPr>
+          <w:lang w:val="es-AR"/>
+        </w:rPr>
+        <w:t>Otro</w:t>
+      </w:r>
+      <w:r>
+        <w:rPr>
+          <w:lang w:val="es-AR"/>
+        </w:rPr>
+        <w:t xml:space="preserve"> dato puede ser el acompañante con el que va a cada retiro. TENER FOTOS DEL LUGAR. Para que se fije PUEDE TENER VALORACIÓN PERSONAL. Porque suele repetir retiros porque le gustaron Estaría bueno que pueda enviar características del retiro a un amigo, para invitar y que vea si se suma o no a ella. MANDAR RECORDATORIOS (fecha de inicio, pagos) NO HAY CONTRATO NO PONE COMENTARIOS DE OTRAS PERSONAS DE LOS RETIROS Se ve si es real o no el retiro por reseñas anteriores SABER CUANTO GASTO mensual o anual en retiros, REGISTRO DE GASTOS </w:t>
+      </w:r>
     </w:p>
     <w:sectPr>
-      <w:headerReference w:type="default" r:id="rId11"/>
+      <w:headerReference w:type="default" r:id="rId10"/>
       <w:pgSz w:w="12240" w:h="15840"/>
       <w:pgMar w:top="1440" w:right="1440" w:bottom="1440" w:left="1440" w:header="720" w:footer="720" w:gutter="0"/>
       <w:pgNumType w:start="1"/>
@@ -2403,7 +2583,7 @@
 </file>
 
 <file path=word/endnotes.xml><?xml version="1.0" encoding="utf-8"?>
-<w:endnotes xmlns:wpc="http://schemas.microsoft.com/office/word/2010/wordprocessingCanvas" xmlns:mc="http://schemas.openxmlformats.org/markup-compatibility/2006" xmlns:o="urn:schemas-microsoft-com:office:office" xmlns:r="http://schemas.openxmlformats.org/officeDocument/2006/relationships" xmlns:m="http://schemas.openxmlformats.org/officeDocument/2006/math" xmlns:v="urn:schemas-microsoft-com:vml" xmlns:wp14="http://schemas.microsoft.com/office/word/2010/wordprocessingDrawing" xmlns:wp="http://schemas.openxmlformats.org/drawingml/2006/wordprocessingDrawing" xmlns:w10="urn:schemas-microsoft-com:office:word" xmlns:w="http://schemas.openxmlformats.org/wordprocessingml/2006/main" xmlns:w14="http://schemas.microsoft.com/office/word/2010/wordml" xmlns:wpg="http://schemas.microsoft.com/office/word/2010/wordprocessingGroup" xmlns:wpi="http://schemas.microsoft.com/office/word/2010/wordprocessingInk" xmlns:wne="http://schemas.microsoft.com/office/word/2006/wordml" xmlns:wps="http://schemas.microsoft.com/office/word/2010/wordprocessingShape" mc:Ignorable="w14 wp14">
+<w:endnotes xmlns:wpc="http://schemas.microsoft.com/office/word/2010/wordprocessingCanvas" xmlns:cx="http://schemas.microsoft.com/office/drawing/2014/chartex" xmlns:cx1="http://schemas.microsoft.com/office/drawing/2015/9/8/chartex" xmlns:cx2="http://schemas.microsoft.com/office/drawing/2015/10/21/chartex" xmlns:cx3="http://schemas.microsoft.com/office/drawing/2016/5/9/chartex" xmlns:cx4="http://schemas.microsoft.com/office/drawing/2016/5/10/chartex" xmlns:cx5="http://schemas.microsoft.com/office/drawing/2016/5/11/chartex" xmlns:cx6="http://schemas.microsoft.com/office/drawing/2016/5/12/chartex" xmlns:cx7="http://schemas.microsoft.com/office/drawing/2016/5/13/chartex" xmlns:cx8="http://schemas.microsoft.com/office/drawing/2016/5/14/chartex" xmlns:mc="http://schemas.openxmlformats.org/markup-compatibility/2006" xmlns:aink="http://schemas.microsoft.com/office/drawing/2016/ink" xmlns:am3d="http://schemas.microsoft.com/office/drawing/2017/model3d" xmlns:o="urn:schemas-microsoft-com:office:office" xmlns:oel="http://schemas.microsoft.com/office/2019/extlst" xmlns:r="http://schemas.openxmlformats.org/officeDocument/2006/relationships" xmlns:m="http://schemas.openxmlformats.org/officeDocument/2006/math" xmlns:v="urn:schemas-microsoft-com:vml" xmlns:wp14="http://schemas.microsoft.com/office/word/2010/wordprocessingDrawing" xmlns:wp="http://schemas.openxmlformats.org/drawingml/2006/wordprocessingDrawing" xmlns:w10="urn:schemas-microsoft-com:office:word" xmlns:w="http://schemas.openxmlformats.org/wordprocessingml/2006/main" xmlns:w14="http://schemas.microsoft.com/office/word/2010/wordml" xmlns:w15="http://schemas.microsoft.com/office/word/2012/wordml" xmlns:w16cex="http://schemas.microsoft.com/office/word/2018/wordml/cex" xmlns:w16cid="http://schemas.microsoft.com/office/word/2016/wordml/cid" xmlns:w16="http://schemas.microsoft.com/office/word/2018/wordml" xmlns:w16du="http://schemas.microsoft.com/office/word/2023/wordml/word16du" xmlns:w16sdtdh="http://schemas.microsoft.com/office/word/2020/wordml/sdtdatahash" xmlns:w16sdtfl="http://schemas.microsoft.com/office/word/2024/wordml/sdtformatlock" xmlns:w16se="http://schemas.microsoft.com/office/word/2015/wordml/symex" xmlns:wpg="http://schemas.microsoft.com/office/word/2010/wordprocessingGroup" xmlns:wpi="http://schemas.microsoft.com/office/word/2010/wordprocessingInk" xmlns:wne="http://schemas.microsoft.com/office/word/2006/wordml" xmlns:wps="http://schemas.microsoft.com/office/word/2010/wordprocessingShape" mc:Ignorable="w14 w15 w16se w16cid w16 w16cex w16sdtdh w16sdtfl w16du wp14">
   <w:endnote w:type="separator" w:id="-1">
     <w:p>
       <w:pPr>
@@ -2428,7 +2608,7 @@
 </file>
 
 <file path=word/footnotes.xml><?xml version="1.0" encoding="utf-8"?>
-<w:footnotes xmlns:wpc="http://schemas.microsoft.com/office/word/2010/wordprocessingCanvas" xmlns:mc="http://schemas.openxmlformats.org/markup-compatibility/2006" xmlns:o="urn:schemas-microsoft-com:office:office" xmlns:r="http://schemas.openxmlformats.org/officeDocument/2006/relationships" xmlns:m="http://schemas.openxmlformats.org/officeDocument/2006/math" xmlns:v="urn:schemas-microsoft-com:vml" xmlns:wp14="http://schemas.microsoft.com/office/word/2010/wordprocessingDrawing" xmlns:wp="http://schemas.openxmlformats.org/drawingml/2006/wordprocessingDrawing" xmlns:w10="urn:schemas-microsoft-com:office:word" xmlns:w="http://schemas.openxmlformats.org/wordprocessingml/2006/main" xmlns:w14="http://schemas.microsoft.com/office/word/2010/wordml" xmlns:wpg="http://schemas.microsoft.com/office/word/2010/wordprocessingGroup" xmlns:wpi="http://schemas.microsoft.com/office/word/2010/wordprocessingInk" xmlns:wne="http://schemas.microsoft.com/office/word/2006/wordml" xmlns:wps="http://schemas.microsoft.com/office/word/2010/wordprocessingShape" mc:Ignorable="w14 wp14">
+<w:footnotes xmlns:wpc="http://schemas.microsoft.com/office/word/2010/wordprocessingCanvas" xmlns:cx="http://schemas.microsoft.com/office/drawing/2014/chartex" xmlns:cx1="http://schemas.microsoft.com/office/drawing/2015/9/8/chartex" xmlns:cx2="http://schemas.microsoft.com/office/drawing/2015/10/21/chartex" xmlns:cx3="http://schemas.microsoft.com/office/drawing/2016/5/9/chartex" xmlns:cx4="http://schemas.microsoft.com/office/drawing/2016/5/10/chartex" xmlns:cx5="http://schemas.microsoft.com/office/drawing/2016/5/11/chartex" xmlns:cx6="http://schemas.microsoft.com/office/drawing/2016/5/12/chartex" xmlns:cx7="http://schemas.microsoft.com/office/drawing/2016/5/13/chartex" xmlns:cx8="http://schemas.microsoft.com/office/drawing/2016/5/14/chartex" xmlns:mc="http://schemas.openxmlformats.org/markup-compatibility/2006" xmlns:aink="http://schemas.microsoft.com/office/drawing/2016/ink" xmlns:am3d="http://schemas.microsoft.com/office/drawing/2017/model3d" xmlns:o="urn:schemas-microsoft-com:office:office" xmlns:oel="http://schemas.microsoft.com/office/2019/extlst" xmlns:r="http://schemas.openxmlformats.org/officeDocument/2006/relationships" xmlns:m="http://schemas.openxmlformats.org/officeDocument/2006/math" xmlns:v="urn:schemas-microsoft-com:vml" xmlns:wp14="http://schemas.microsoft.com/office/word/2010/wordprocessingDrawing" xmlns:wp="http://schemas.openxmlformats.org/drawingml/2006/wordprocessingDrawing" xmlns:w10="urn:schemas-microsoft-com:office:word" xmlns:w="http://schemas.openxmlformats.org/wordprocessingml/2006/main" xmlns:w14="http://schemas.microsoft.com/office/word/2010/wordml" xmlns:w15="http://schemas.microsoft.com/office/word/2012/wordml" xmlns:w16cex="http://schemas.microsoft.com/office/word/2018/wordml/cex" xmlns:w16cid="http://schemas.microsoft.com/office/word/2016/wordml/cid" xmlns:w16="http://schemas.microsoft.com/office/word/2018/wordml" xmlns:w16du="http://schemas.microsoft.com/office/word/2023/wordml/word16du" xmlns:w16sdtdh="http://schemas.microsoft.com/office/word/2020/wordml/sdtdatahash" xmlns:w16sdtfl="http://schemas.microsoft.com/office/word/2024/wordml/sdtformatlock" xmlns:w16se="http://schemas.microsoft.com/office/word/2015/wordml/symex" xmlns:wpg="http://schemas.microsoft.com/office/word/2010/wordprocessingGroup" xmlns:wpi="http://schemas.microsoft.com/office/word/2010/wordprocessingInk" xmlns:wne="http://schemas.microsoft.com/office/word/2006/wordml" xmlns:wps="http://schemas.microsoft.com/office/word/2010/wordprocessingShape" mc:Ignorable="w14 w15 w16se w16cid w16 w16cex w16sdtdh w16sdtfl w16du wp14">
   <w:footnote w:type="separator" w:id="-1">
     <w:p>
       <w:pPr>
@@ -2453,7 +2633,7 @@
 </file>
 
 <file path=word/header1.xml><?xml version="1.0" encoding="utf-8"?>
-<w:hdr xmlns:wpc="http://schemas.microsoft.com/office/word/2010/wordprocessingCanvas" xmlns:mc="http://schemas.openxmlformats.org/markup-compatibility/2006" xmlns:o="urn:schemas-microsoft-com:office:office" xmlns:r="http://schemas.openxmlformats.org/officeDocument/2006/relationships" xmlns:m="http://schemas.openxmlformats.org/officeDocument/2006/math" xmlns:v="urn:schemas-microsoft-com:vml" xmlns:wp14="http://schemas.microsoft.com/office/word/2010/wordprocessingDrawing" xmlns:wp="http://schemas.openxmlformats.org/drawingml/2006/wordprocessingDrawing" xmlns:w10="urn:schemas-microsoft-com:office:word" xmlns:w="http://schemas.openxmlformats.org/wordprocessingml/2006/main" xmlns:w14="http://schemas.microsoft.com/office/word/2010/wordml" xmlns:wpg="http://schemas.microsoft.com/office/word/2010/wordprocessingGroup" xmlns:wpi="http://schemas.microsoft.com/office/word/2010/wordprocessingInk" xmlns:wne="http://schemas.microsoft.com/office/word/2006/wordml" xmlns:wps="http://schemas.microsoft.com/office/word/2010/wordprocessingShape" mc:Ignorable="w14 wp14">
+<w:hdr xmlns:wpc="http://schemas.microsoft.com/office/word/2010/wordprocessingCanvas" xmlns:cx="http://schemas.microsoft.com/office/drawing/2014/chartex" xmlns:cx1="http://schemas.microsoft.com/office/drawing/2015/9/8/chartex" xmlns:cx2="http://schemas.microsoft.com/office/drawing/2015/10/21/chartex" xmlns:cx3="http://schemas.microsoft.com/office/drawing/2016/5/9/chartex" xmlns:cx4="http://schemas.microsoft.com/office/drawing/2016/5/10/chartex" xmlns:cx5="http://schemas.microsoft.com/office/drawing/2016/5/11/chartex" xmlns:cx6="http://schemas.microsoft.com/office/drawing/2016/5/12/chartex" xmlns:cx7="http://schemas.microsoft.com/office/drawing/2016/5/13/chartex" xmlns:cx8="http://schemas.microsoft.com/office/drawing/2016/5/14/chartex" xmlns:mc="http://schemas.openxmlformats.org/markup-compatibility/2006" xmlns:aink="http://schemas.microsoft.com/office/drawing/2016/ink" xmlns:am3d="http://schemas.microsoft.com/office/drawing/2017/model3d" xmlns:o="urn:schemas-microsoft-com:office:office" xmlns:oel="http://schemas.microsoft.com/office/2019/extlst" xmlns:r="http://schemas.openxmlformats.org/officeDocument/2006/relationships" xmlns:m="http://schemas.openxmlformats.org/officeDocument/2006/math" xmlns:v="urn:schemas-microsoft-com:vml" xmlns:wp14="http://schemas.microsoft.com/office/word/2010/wordprocessingDrawing" xmlns:wp="http://schemas.openxmlformats.org/drawingml/2006/wordprocessingDrawing" xmlns:w10="urn:schemas-microsoft-com:office:word" xmlns:w="http://schemas.openxmlformats.org/wordprocessingml/2006/main" xmlns:w14="http://schemas.microsoft.com/office/word/2010/wordml" xmlns:w15="http://schemas.microsoft.com/office/word/2012/wordml" xmlns:w16cex="http://schemas.microsoft.com/office/word/2018/wordml/cex" xmlns:w16cid="http://schemas.microsoft.com/office/word/2016/wordml/cid" xmlns:w16="http://schemas.microsoft.com/office/word/2018/wordml" xmlns:w16du="http://schemas.microsoft.com/office/word/2023/wordml/word16du" xmlns:w16sdtdh="http://schemas.microsoft.com/office/word/2020/wordml/sdtdatahash" xmlns:w16sdtfl="http://schemas.microsoft.com/office/word/2024/wordml/sdtformatlock" xmlns:w16se="http://schemas.microsoft.com/office/word/2015/wordml/symex" xmlns:wpg="http://schemas.microsoft.com/office/word/2010/wordprocessingGroup" xmlns:wpi="http://schemas.microsoft.com/office/word/2010/wordprocessingInk" xmlns:wne="http://schemas.microsoft.com/office/word/2006/wordml" xmlns:wps="http://schemas.microsoft.com/office/word/2010/wordprocessingShape" mc:Ignorable="w14 w15 w16se w16cid w16 w16cex w16sdtdh w16sdtfl w16du wp14">
   <w:p>
     <w:pPr>
       <w:spacing w:before="200" w:after="0"/>
@@ -2619,8 +2799,8 @@
 </file>
 
 <file path=word/numbering.xml><?xml version="1.0" encoding="utf-8"?>
-<w:numbering xmlns:wpc="http://schemas.microsoft.com/office/word/2010/wordprocessingCanvas" xmlns:mc="http://schemas.openxmlformats.org/markup-compatibility/2006" xmlns:o="urn:schemas-microsoft-com:office:office" xmlns:r="http://schemas.openxmlformats.org/officeDocument/2006/relationships" xmlns:m="http://schemas.openxmlformats.org/officeDocument/2006/math" xmlns:v="urn:schemas-microsoft-com:vml" xmlns:wp14="http://schemas.microsoft.com/office/word/2010/wordprocessingDrawing" xmlns:wp="http://schemas.openxmlformats.org/drawingml/2006/wordprocessingDrawing" xmlns:w10="urn:schemas-microsoft-com:office:word" xmlns:w="http://schemas.openxmlformats.org/wordprocessingml/2006/main" xmlns:w14="http://schemas.microsoft.com/office/word/2010/wordml" xmlns:wpg="http://schemas.microsoft.com/office/word/2010/wordprocessingGroup" xmlns:wpi="http://schemas.microsoft.com/office/word/2010/wordprocessingInk" xmlns:wne="http://schemas.microsoft.com/office/word/2006/wordml" xmlns:wps="http://schemas.microsoft.com/office/word/2010/wordprocessingShape" mc:Ignorable="w14 wp14">
-  <w:abstractNum w:abstractNumId="0">
+<w:numbering xmlns:wpc="http://schemas.microsoft.com/office/word/2010/wordprocessingCanvas" xmlns:cx="http://schemas.microsoft.com/office/drawing/2014/chartex" xmlns:cx1="http://schemas.microsoft.com/office/drawing/2015/9/8/chartex" xmlns:cx2="http://schemas.microsoft.com/office/drawing/2015/10/21/chartex" xmlns:cx3="http://schemas.microsoft.com/office/drawing/2016/5/9/chartex" xmlns:cx4="http://schemas.microsoft.com/office/drawing/2016/5/10/chartex" xmlns:cx5="http://schemas.microsoft.com/office/drawing/2016/5/11/chartex" xmlns:cx6="http://schemas.microsoft.com/office/drawing/2016/5/12/chartex" xmlns:cx7="http://schemas.microsoft.com/office/drawing/2016/5/13/chartex" xmlns:cx8="http://schemas.microsoft.com/office/drawing/2016/5/14/chartex" xmlns:mc="http://schemas.openxmlformats.org/markup-compatibility/2006" xmlns:aink="http://schemas.microsoft.com/office/drawing/2016/ink" xmlns:am3d="http://schemas.microsoft.com/office/drawing/2017/model3d" xmlns:o="urn:schemas-microsoft-com:office:office" xmlns:oel="http://schemas.microsoft.com/office/2019/extlst" xmlns:r="http://schemas.openxmlformats.org/officeDocument/2006/relationships" xmlns:m="http://schemas.openxmlformats.org/officeDocument/2006/math" xmlns:v="urn:schemas-microsoft-com:vml" xmlns:wp14="http://schemas.microsoft.com/office/word/2010/wordprocessingDrawing" xmlns:wp="http://schemas.openxmlformats.org/drawingml/2006/wordprocessingDrawing" xmlns:w10="urn:schemas-microsoft-com:office:word" xmlns:w="http://schemas.openxmlformats.org/wordprocessingml/2006/main" xmlns:w14="http://schemas.microsoft.com/office/word/2010/wordml" xmlns:w15="http://schemas.microsoft.com/office/word/2012/wordml" xmlns:w16cex="http://schemas.microsoft.com/office/word/2018/wordml/cex" xmlns:w16cid="http://schemas.microsoft.com/office/word/2016/wordml/cid" xmlns:w16="http://schemas.microsoft.com/office/word/2018/wordml" xmlns:w16du="http://schemas.microsoft.com/office/word/2023/wordml/word16du" xmlns:w16sdtdh="http://schemas.microsoft.com/office/word/2020/wordml/sdtdatahash" xmlns:w16sdtfl="http://schemas.microsoft.com/office/word/2024/wordml/sdtformatlock" xmlns:w16se="http://schemas.microsoft.com/office/word/2015/wordml/symex" xmlns:wpg="http://schemas.microsoft.com/office/word/2010/wordprocessingGroup" xmlns:wpi="http://schemas.microsoft.com/office/word/2010/wordprocessingInk" xmlns:wne="http://schemas.microsoft.com/office/word/2006/wordml" xmlns:wps="http://schemas.microsoft.com/office/word/2010/wordprocessingShape" mc:Ignorable="w14 w15 w16se w16cid w16 w16cex w16sdtdh w16sdtfl w16du wp14">
+  <w:abstractNum w:abstractNumId="0" w15:restartNumberingAfterBreak="0">
     <w:nsid w:val="0ED06403"/>
     <w:multiLevelType w:val="multilevel"/>
     <w:tmpl w:val="42A2A5C6"/>
@@ -2733,14 +2913,14 @@
       </w:rPr>
     </w:lvl>
   </w:abstractNum>
-  <w:num w:numId="1">
+  <w:num w:numId="1" w16cid:durableId="1038775378">
     <w:abstractNumId w:val="0"/>
   </w:num>
 </w:numbering>
 </file>
 
 <file path=word/styles.xml><?xml version="1.0" encoding="utf-8"?>
-<w:styles xmlns:mc="http://schemas.openxmlformats.org/markup-compatibility/2006" xmlns:r="http://schemas.openxmlformats.org/officeDocument/2006/relationships" xmlns:w="http://schemas.openxmlformats.org/wordprocessingml/2006/main" xmlns:w14="http://schemas.microsoft.com/office/word/2010/wordml" mc:Ignorable="w14">
+<w:styles xmlns:mc="http://schemas.openxmlformats.org/markup-compatibility/2006" xmlns:r="http://schemas.openxmlformats.org/officeDocument/2006/relationships" xmlns:w="http://schemas.openxmlformats.org/wordprocessingml/2006/main" xmlns:w14="http://schemas.microsoft.com/office/word/2010/wordml" xmlns:w15="http://schemas.microsoft.com/office/word/2012/wordml" xmlns:w16cex="http://schemas.microsoft.com/office/word/2018/wordml/cex" xmlns:w16cid="http://schemas.microsoft.com/office/word/2016/wordml/cid" xmlns:w16="http://schemas.microsoft.com/office/word/2018/wordml" xmlns:w16du="http://schemas.microsoft.com/office/word/2023/wordml/word16du" xmlns:w16sdtdh="http://schemas.microsoft.com/office/word/2020/wordml/sdtdatahash" xmlns:w16sdtfl="http://schemas.microsoft.com/office/word/2024/wordml/sdtformatlock" xmlns:w16se="http://schemas.microsoft.com/office/word/2015/wordml/symex" mc:Ignorable="w14 w15 w16se w16cid w16 w16cex w16sdtdh w16sdtfl w16du">
   <w:docDefaults>
     <w:rPrDefault>
       <w:rPr>
@@ -2758,144 +2938,383 @@
       </w:pPr>
     </w:pPrDefault>
   </w:docDefaults>
-  <w:latentStyles w:defLockedState="0" w:defUIPriority="99" w:defSemiHidden="1" w:defUnhideWhenUsed="1" w:defQFormat="0" w:count="267">
-    <w:lsdException w:name="Normal" w:semiHidden="0" w:uiPriority="0" w:unhideWhenUsed="0" w:qFormat="1"/>
-    <w:lsdException w:name="heading 1" w:semiHidden="0" w:uiPriority="9" w:unhideWhenUsed="0" w:qFormat="1"/>
-    <w:lsdException w:name="heading 2" w:uiPriority="9" w:qFormat="1"/>
-    <w:lsdException w:name="heading 3" w:uiPriority="9" w:qFormat="1"/>
-    <w:lsdException w:name="heading 4" w:uiPriority="9" w:qFormat="1"/>
-    <w:lsdException w:name="heading 5" w:uiPriority="9" w:qFormat="1"/>
-    <w:lsdException w:name="heading 6" w:uiPriority="9" w:qFormat="1"/>
-    <w:lsdException w:name="heading 7" w:uiPriority="9" w:qFormat="1"/>
-    <w:lsdException w:name="heading 8" w:uiPriority="9" w:qFormat="1"/>
-    <w:lsdException w:name="heading 9" w:uiPriority="9" w:qFormat="1"/>
-    <w:lsdException w:name="toc 1" w:uiPriority="39"/>
-    <w:lsdException w:name="toc 2" w:uiPriority="39"/>
-    <w:lsdException w:name="toc 3" w:uiPriority="39"/>
-    <w:lsdException w:name="toc 4" w:uiPriority="39"/>
-    <w:lsdException w:name="toc 5" w:uiPriority="39"/>
-    <w:lsdException w:name="toc 6" w:uiPriority="39"/>
-    <w:lsdException w:name="toc 7" w:uiPriority="39"/>
-    <w:lsdException w:name="toc 8" w:uiPriority="39"/>
-    <w:lsdException w:name="toc 9" w:uiPriority="39"/>
-    <w:lsdException w:name="caption" w:uiPriority="35" w:qFormat="1"/>
-    <w:lsdException w:name="Title" w:semiHidden="0" w:uiPriority="10" w:unhideWhenUsed="0" w:qFormat="1"/>
-    <w:lsdException w:name="Default Paragraph Font" w:uiPriority="1"/>
-    <w:lsdException w:name="Subtitle" w:semiHidden="0" w:uiPriority="11" w:unhideWhenUsed="0" w:qFormat="1"/>
-    <w:lsdException w:name="Strong" w:semiHidden="0" w:uiPriority="22" w:unhideWhenUsed="0" w:qFormat="1"/>
-    <w:lsdException w:name="Emphasis" w:semiHidden="0" w:uiPriority="20" w:unhideWhenUsed="0" w:qFormat="1"/>
-    <w:lsdException w:name="Table Grid" w:semiHidden="0" w:uiPriority="59" w:unhideWhenUsed="0"/>
-    <w:lsdException w:name="Placeholder Text" w:unhideWhenUsed="0"/>
-    <w:lsdException w:name="No Spacing" w:semiHidden="0" w:uiPriority="1" w:unhideWhenUsed="0" w:qFormat="1"/>
-    <w:lsdException w:name="Light Shading" w:semiHidden="0" w:uiPriority="60" w:unhideWhenUsed="0"/>
-    <w:lsdException w:name="Light List" w:semiHidden="0" w:uiPriority="61" w:unhideWhenUsed="0"/>
-    <w:lsdException w:name="Light Grid" w:semiHidden="0" w:uiPriority="62" w:unhideWhenUsed="0"/>
-    <w:lsdException w:name="Medium Shading 1" w:semiHidden="0" w:uiPriority="63" w:unhideWhenUsed="0"/>
-    <w:lsdException w:name="Medium Shading 2" w:semiHidden="0" w:uiPriority="64" w:unhideWhenUsed="0"/>
-    <w:lsdException w:name="Medium List 1" w:semiHidden="0" w:uiPriority="65" w:unhideWhenUsed="0"/>
-    <w:lsdException w:name="Medium List 2" w:semiHidden="0" w:uiPriority="66" w:unhideWhenUsed="0"/>
-    <w:lsdException w:name="Medium Grid 1" w:semiHidden="0" w:uiPriority="67" w:unhideWhenUsed="0"/>
-    <w:lsdException w:name="Medium Grid 2" w:semiHidden="0" w:uiPriority="68" w:unhideWhenUsed="0"/>
-    <w:lsdException w:name="Medium Grid 3" w:semiHidden="0" w:uiPriority="69" w:unhideWhenUsed="0"/>
-    <w:lsdException w:name="Dark List" w:semiHidden="0" w:uiPriority="70" w:unhideWhenUsed="0"/>
-    <w:lsdException w:name="Colorful Shading" w:semiHidden="0" w:uiPriority="71" w:unhideWhenUsed="0"/>
-    <w:lsdException w:name="Colorful List" w:semiHidden="0" w:uiPriority="72" w:unhideWhenUsed="0"/>
-    <w:lsdException w:name="Colorful Grid" w:semiHidden="0" w:uiPriority="73" w:unhideWhenUsed="0"/>
-    <w:lsdException w:name="Light Shading Accent 1" w:semiHidden="0" w:uiPriority="60" w:unhideWhenUsed="0"/>
-    <w:lsdException w:name="Light List Accent 1" w:semiHidden="0" w:uiPriority="61" w:unhideWhenUsed="0"/>
-    <w:lsdException w:name="Light Grid Accent 1" w:semiHidden="0" w:uiPriority="62" w:unhideWhenUsed="0"/>
-    <w:lsdException w:name="Medium Shading 1 Accent 1" w:semiHidden="0" w:uiPriority="63" w:unhideWhenUsed="0"/>
-    <w:lsdException w:name="Medium Shading 2 Accent 1" w:semiHidden="0" w:uiPriority="64" w:unhideWhenUsed="0"/>
-    <w:lsdException w:name="Medium List 1 Accent 1" w:semiHidden="0" w:uiPriority="65" w:unhideWhenUsed="0"/>
-    <w:lsdException w:name="Revision" w:unhideWhenUsed="0"/>
-    <w:lsdException w:name="List Paragraph" w:semiHidden="0" w:uiPriority="34" w:unhideWhenUsed="0" w:qFormat="1"/>
-    <w:lsdException w:name="Quote" w:semiHidden="0" w:uiPriority="29" w:unhideWhenUsed="0" w:qFormat="1"/>
-    <w:lsdException w:name="Intense Quote" w:semiHidden="0" w:uiPriority="30" w:unhideWhenUsed="0" w:qFormat="1"/>
-    <w:lsdException w:name="Medium List 2 Accent 1" w:semiHidden="0" w:uiPriority="66" w:unhideWhenUsed="0"/>
-    <w:lsdException w:name="Medium Grid 1 Accent 1" w:semiHidden="0" w:uiPriority="67" w:unhideWhenUsed="0"/>
-    <w:lsdException w:name="Medium Grid 2 Accent 1" w:semiHidden="0" w:uiPriority="68" w:unhideWhenUsed="0"/>
-    <w:lsdException w:name="Medium Grid 3 Accent 1" w:semiHidden="0" w:uiPriority="69" w:unhideWhenUsed="0"/>
-    <w:lsdException w:name="Dark List Accent 1" w:semiHidden="0" w:uiPriority="70" w:unhideWhenUsed="0"/>
-    <w:lsdException w:name="Colorful Shading Accent 1" w:semiHidden="0" w:uiPriority="71" w:unhideWhenUsed="0"/>
-    <w:lsdException w:name="Colorful List Accent 1" w:semiHidden="0" w:uiPriority="72" w:unhideWhenUsed="0"/>
-    <w:lsdException w:name="Colorful Grid Accent 1" w:semiHidden="0" w:uiPriority="73" w:unhideWhenUsed="0"/>
-    <w:lsdException w:name="Light Shading Accent 2" w:semiHidden="0" w:uiPriority="60" w:unhideWhenUsed="0"/>
-    <w:lsdException w:name="Light List Accent 2" w:semiHidden="0" w:uiPriority="61" w:unhideWhenUsed="0"/>
-    <w:lsdException w:name="Light Grid Accent 2" w:semiHidden="0" w:uiPriority="62" w:unhideWhenUsed="0"/>
-    <w:lsdException w:name="Medium Shading 1 Accent 2" w:semiHidden="0" w:uiPriority="63" w:unhideWhenUsed="0"/>
-    <w:lsdException w:name="Medium Shading 2 Accent 2" w:semiHidden="0" w:uiPriority="64" w:unhideWhenUsed="0"/>
-    <w:lsdException w:name="Medium List 1 Accent 2" w:semiHidden="0" w:uiPriority="65" w:unhideWhenUsed="0"/>
-    <w:lsdException w:name="Medium List 2 Accent 2" w:semiHidden="0" w:uiPriority="66" w:unhideWhenUsed="0"/>
-    <w:lsdException w:name="Medium Grid 1 Accent 2" w:semiHidden="0" w:uiPriority="67" w:unhideWhenUsed="0"/>
-    <w:lsdException w:name="Medium Grid 2 Accent 2" w:semiHidden="0" w:uiPriority="68" w:unhideWhenUsed="0"/>
-    <w:lsdException w:name="Medium Grid 3 Accent 2" w:semiHidden="0" w:uiPriority="69" w:unhideWhenUsed="0"/>
-    <w:lsdException w:name="Dark List Accent 2" w:semiHidden="0" w:uiPriority="70" w:unhideWhenUsed="0"/>
-    <w:lsdException w:name="Colorful Shading Accent 2" w:semiHidden="0" w:uiPriority="71" w:unhideWhenUsed="0"/>
-    <w:lsdException w:name="Colorful List Accent 2" w:semiHidden="0" w:uiPriority="72" w:unhideWhenUsed="0"/>
-    <w:lsdException w:name="Colorful Grid Accent 2" w:semiHidden="0" w:uiPriority="73" w:unhideWhenUsed="0"/>
-    <w:lsdException w:name="Light Shading Accent 3" w:semiHidden="0" w:uiPriority="60" w:unhideWhenUsed="0"/>
-    <w:lsdException w:name="Light List Accent 3" w:semiHidden="0" w:uiPriority="61" w:unhideWhenUsed="0"/>
-    <w:lsdException w:name="Light Grid Accent 3" w:semiHidden="0" w:uiPriority="62" w:unhideWhenUsed="0"/>
-    <w:lsdException w:name="Medium Shading 1 Accent 3" w:semiHidden="0" w:uiPriority="63" w:unhideWhenUsed="0"/>
-    <w:lsdException w:name="Medium Shading 2 Accent 3" w:semiHidden="0" w:uiPriority="64" w:unhideWhenUsed="0"/>
-    <w:lsdException w:name="Medium List 1 Accent 3" w:semiHidden="0" w:uiPriority="65" w:unhideWhenUsed="0"/>
-    <w:lsdException w:name="Medium List 2 Accent 3" w:semiHidden="0" w:uiPriority="66" w:unhideWhenUsed="0"/>
-    <w:lsdException w:name="Medium Grid 1 Accent 3" w:semiHidden="0" w:uiPriority="67" w:unhideWhenUsed="0"/>
-    <w:lsdException w:name="Medium Grid 2 Accent 3" w:semiHidden="0" w:uiPriority="68" w:unhideWhenUsed="0"/>
-    <w:lsdException w:name="Medium Grid 3 Accent 3" w:semiHidden="0" w:uiPriority="69" w:unhideWhenUsed="0"/>
-    <w:lsdException w:name="Dark List Accent 3" w:semiHidden="0" w:uiPriority="70" w:unhideWhenUsed="0"/>
-    <w:lsdException w:name="Colorful Shading Accent 3" w:semiHidden="0" w:uiPriority="71" w:unhideWhenUsed="0"/>
-    <w:lsdException w:name="Colorful List Accent 3" w:semiHidden="0" w:uiPriority="72" w:unhideWhenUsed="0"/>
-    <w:lsdException w:name="Colorful Grid Accent 3" w:semiHidden="0" w:uiPriority="73" w:unhideWhenUsed="0"/>
-    <w:lsdException w:name="Light Shading Accent 4" w:semiHidden="0" w:uiPriority="60" w:unhideWhenUsed="0"/>
-    <w:lsdException w:name="Light List Accent 4" w:semiHidden="0" w:uiPriority="61" w:unhideWhenUsed="0"/>
-    <w:lsdException w:name="Light Grid Accent 4" w:semiHidden="0" w:uiPriority="62" w:unhideWhenUsed="0"/>
-    <w:lsdException w:name="Medium Shading 1 Accent 4" w:semiHidden="0" w:uiPriority="63" w:unhideWhenUsed="0"/>
-    <w:lsdException w:name="Medium Shading 2 Accent 4" w:semiHidden="0" w:uiPriority="64" w:unhideWhenUsed="0"/>
-    <w:lsdException w:name="Medium List 1 Accent 4" w:semiHidden="0" w:uiPriority="65" w:unhideWhenUsed="0"/>
-    <w:lsdException w:name="Medium List 2 Accent 4" w:semiHidden="0" w:uiPriority="66" w:unhideWhenUsed="0"/>
-    <w:lsdException w:name="Medium Grid 1 Accent 4" w:semiHidden="0" w:uiPriority="67" w:unhideWhenUsed="0"/>
-    <w:lsdException w:name="Medium Grid 2 Accent 4" w:semiHidden="0" w:uiPriority="68" w:unhideWhenUsed="0"/>
-    <w:lsdException w:name="Medium Grid 3 Accent 4" w:semiHidden="0" w:uiPriority="69" w:unhideWhenUsed="0"/>
-    <w:lsdException w:name="Dark List Accent 4" w:semiHidden="0" w:uiPriority="70" w:unhideWhenUsed="0"/>
-    <w:lsdException w:name="Colorful Shading Accent 4" w:semiHidden="0" w:uiPriority="71" w:unhideWhenUsed="0"/>
-    <w:lsdException w:name="Colorful List Accent 4" w:semiHidden="0" w:uiPriority="72" w:unhideWhenUsed="0"/>
-    <w:lsdException w:name="Colorful Grid Accent 4" w:semiHidden="0" w:uiPriority="73" w:unhideWhenUsed="0"/>
-    <w:lsdException w:name="Light Shading Accent 5" w:semiHidden="0" w:uiPriority="60" w:unhideWhenUsed="0"/>
-    <w:lsdException w:name="Light List Accent 5" w:semiHidden="0" w:uiPriority="61" w:unhideWhenUsed="0"/>
-    <w:lsdException w:name="Light Grid Accent 5" w:semiHidden="0" w:uiPriority="62" w:unhideWhenUsed="0"/>
-    <w:lsdException w:name="Medium Shading 1 Accent 5" w:semiHidden="0" w:uiPriority="63" w:unhideWhenUsed="0"/>
-    <w:lsdException w:name="Medium Shading 2 Accent 5" w:semiHidden="0" w:uiPriority="64" w:unhideWhenUsed="0"/>
-    <w:lsdException w:name="Medium List 1 Accent 5" w:semiHidden="0" w:uiPriority="65" w:unhideWhenUsed="0"/>
-    <w:lsdException w:name="Medium List 2 Accent 5" w:semiHidden="0" w:uiPriority="66" w:unhideWhenUsed="0"/>
-    <w:lsdException w:name="Medium Grid 1 Accent 5" w:semiHidden="0" w:uiPriority="67" w:unhideWhenUsed="0"/>
-    <w:lsdException w:name="Medium Grid 2 Accent 5" w:semiHidden="0" w:uiPriority="68" w:unhideWhenUsed="0"/>
-    <w:lsdException w:name="Medium Grid 3 Accent 5" w:semiHidden="0" w:uiPriority="69" w:unhideWhenUsed="0"/>
-    <w:lsdException w:name="Dark List Accent 5" w:semiHidden="0" w:uiPriority="70" w:unhideWhenUsed="0"/>
-    <w:lsdException w:name="Colorful Shading Accent 5" w:semiHidden="0" w:uiPriority="71" w:unhideWhenUsed="0"/>
-    <w:lsdException w:name="Colorful List Accent 5" w:semiHidden="0" w:uiPriority="72" w:unhideWhenUsed="0"/>
-    <w:lsdException w:name="Colorful Grid Accent 5" w:semiHidden="0" w:uiPriority="73" w:unhideWhenUsed="0"/>
-    <w:lsdException w:name="Light Shading Accent 6" w:semiHidden="0" w:uiPriority="60" w:unhideWhenUsed="0"/>
-    <w:lsdException w:name="Light List Accent 6" w:semiHidden="0" w:uiPriority="61" w:unhideWhenUsed="0"/>
-    <w:lsdException w:name="Light Grid Accent 6" w:semiHidden="0" w:uiPriority="62" w:unhideWhenUsed="0"/>
-    <w:lsdException w:name="Medium Shading 1 Accent 6" w:semiHidden="0" w:uiPriority="63" w:unhideWhenUsed="0"/>
-    <w:lsdException w:name="Medium Shading 2 Accent 6" w:semiHidden="0" w:uiPriority="64" w:unhideWhenUsed="0"/>
-    <w:lsdException w:name="Medium List 1 Accent 6" w:semiHidden="0" w:uiPriority="65" w:unhideWhenUsed="0"/>
-    <w:lsdException w:name="Medium List 2 Accent 6" w:semiHidden="0" w:uiPriority="66" w:unhideWhenUsed="0"/>
-    <w:lsdException w:name="Medium Grid 1 Accent 6" w:semiHidden="0" w:uiPriority="67" w:unhideWhenUsed="0"/>
-    <w:lsdException w:name="Medium Grid 2 Accent 6" w:semiHidden="0" w:uiPriority="68" w:unhideWhenUsed="0"/>
-    <w:lsdException w:name="Medium Grid 3 Accent 6" w:semiHidden="0" w:uiPriority="69" w:unhideWhenUsed="0"/>
-    <w:lsdException w:name="Dark List Accent 6" w:semiHidden="0" w:uiPriority="70" w:unhideWhenUsed="0"/>
-    <w:lsdException w:name="Colorful Shading Accent 6" w:semiHidden="0" w:uiPriority="71" w:unhideWhenUsed="0"/>
-    <w:lsdException w:name="Colorful List Accent 6" w:semiHidden="0" w:uiPriority="72" w:unhideWhenUsed="0"/>
-    <w:lsdException w:name="Colorful Grid Accent 6" w:semiHidden="0" w:uiPriority="73" w:unhideWhenUsed="0"/>
-    <w:lsdException w:name="Subtle Emphasis" w:semiHidden="0" w:uiPriority="19" w:unhideWhenUsed="0" w:qFormat="1"/>
-    <w:lsdException w:name="Intense Emphasis" w:semiHidden="0" w:uiPriority="21" w:unhideWhenUsed="0" w:qFormat="1"/>
-    <w:lsdException w:name="Subtle Reference" w:semiHidden="0" w:uiPriority="31" w:unhideWhenUsed="0" w:qFormat="1"/>
-    <w:lsdException w:name="Intense Reference" w:semiHidden="0" w:uiPriority="32" w:unhideWhenUsed="0" w:qFormat="1"/>
-    <w:lsdException w:name="Book Title" w:semiHidden="0" w:uiPriority="33" w:unhideWhenUsed="0" w:qFormat="1"/>
-    <w:lsdException w:name="Bibliography" w:uiPriority="37"/>
-    <w:lsdException w:name="TOC Heading" w:uiPriority="39" w:qFormat="1"/>
+  <w:latentStyles w:defLockedState="0" w:defUIPriority="99" w:defSemiHidden="0" w:defUnhideWhenUsed="0" w:defQFormat="0" w:count="376">
+    <w:lsdException w:name="Normal" w:uiPriority="0" w:qFormat="1"/>
+    <w:lsdException w:name="heading 1" w:uiPriority="9" w:qFormat="1"/>
+    <w:lsdException w:name="heading 2" w:semiHidden="1" w:uiPriority="9" w:unhideWhenUsed="1" w:qFormat="1"/>
+    <w:lsdException w:name="heading 3" w:semiHidden="1" w:uiPriority="9" w:unhideWhenUsed="1" w:qFormat="1"/>
+    <w:lsdException w:name="heading 4" w:semiHidden="1" w:uiPriority="9" w:unhideWhenUsed="1" w:qFormat="1"/>
+    <w:lsdException w:name="heading 5" w:semiHidden="1" w:uiPriority="9" w:unhideWhenUsed="1" w:qFormat="1"/>
+    <w:lsdException w:name="heading 6" w:semiHidden="1" w:uiPriority="9" w:unhideWhenUsed="1" w:qFormat="1"/>
+    <w:lsdException w:name="heading 7" w:semiHidden="1" w:uiPriority="9" w:unhideWhenUsed="1" w:qFormat="1"/>
+    <w:lsdException w:name="heading 8" w:semiHidden="1" w:uiPriority="9" w:unhideWhenUsed="1" w:qFormat="1"/>
+    <w:lsdException w:name="heading 9" w:semiHidden="1" w:uiPriority="9" w:unhideWhenUsed="1" w:qFormat="1"/>
+    <w:lsdException w:name="index 1" w:semiHidden="1" w:unhideWhenUsed="1"/>
+    <w:lsdException w:name="index 2" w:semiHidden="1" w:unhideWhenUsed="1"/>
+    <w:lsdException w:name="index 3" w:semiHidden="1" w:unhideWhenUsed="1"/>
+    <w:lsdException w:name="index 4" w:semiHidden="1" w:unhideWhenUsed="1"/>
+    <w:lsdException w:name="index 5" w:semiHidden="1" w:unhideWhenUsed="1"/>
+    <w:lsdException w:name="index 6" w:semiHidden="1" w:unhideWhenUsed="1"/>
+    <w:lsdException w:name="index 7" w:semiHidden="1" w:unhideWhenUsed="1"/>
+    <w:lsdException w:name="index 8" w:semiHidden="1" w:unhideWhenUsed="1"/>
+    <w:lsdException w:name="index 9" w:semiHidden="1" w:unhideWhenUsed="1"/>
+    <w:lsdException w:name="toc 1" w:semiHidden="1" w:uiPriority="39" w:unhideWhenUsed="1"/>
+    <w:lsdException w:name="toc 2" w:semiHidden="1" w:uiPriority="39" w:unhideWhenUsed="1"/>
+    <w:lsdException w:name="toc 3" w:semiHidden="1" w:uiPriority="39" w:unhideWhenUsed="1"/>
+    <w:lsdException w:name="toc 4" w:semiHidden="1" w:uiPriority="39" w:unhideWhenUsed="1"/>
+    <w:lsdException w:name="toc 5" w:semiHidden="1" w:uiPriority="39" w:unhideWhenUsed="1"/>
+    <w:lsdException w:name="toc 6" w:semiHidden="1" w:uiPriority="39" w:unhideWhenUsed="1"/>
+    <w:lsdException w:name="toc 7" w:semiHidden="1" w:uiPriority="39" w:unhideWhenUsed="1"/>
+    <w:lsdException w:name="toc 8" w:semiHidden="1" w:uiPriority="39" w:unhideWhenUsed="1"/>
+    <w:lsdException w:name="toc 9" w:semiHidden="1" w:uiPriority="39" w:unhideWhenUsed="1"/>
+    <w:lsdException w:name="Normal Indent" w:semiHidden="1" w:unhideWhenUsed="1"/>
+    <w:lsdException w:name="footnote text" w:semiHidden="1" w:unhideWhenUsed="1"/>
+    <w:lsdException w:name="annotation text" w:semiHidden="1" w:unhideWhenUsed="1"/>
+    <w:lsdException w:name="header" w:semiHidden="1" w:unhideWhenUsed="1"/>
+    <w:lsdException w:name="footer" w:semiHidden="1" w:unhideWhenUsed="1"/>
+    <w:lsdException w:name="index heading" w:semiHidden="1" w:unhideWhenUsed="1"/>
+    <w:lsdException w:name="caption" w:semiHidden="1" w:uiPriority="35" w:unhideWhenUsed="1" w:qFormat="1"/>
+    <w:lsdException w:name="table of figures" w:semiHidden="1" w:unhideWhenUsed="1"/>
+    <w:lsdException w:name="envelope address" w:semiHidden="1" w:unhideWhenUsed="1"/>
+    <w:lsdException w:name="envelope return" w:semiHidden="1" w:unhideWhenUsed="1"/>
+    <w:lsdException w:name="footnote reference" w:semiHidden="1" w:unhideWhenUsed="1"/>
+    <w:lsdException w:name="annotation reference" w:semiHidden="1" w:unhideWhenUsed="1"/>
+    <w:lsdException w:name="line number" w:semiHidden="1" w:unhideWhenUsed="1"/>
+    <w:lsdException w:name="page number" w:semiHidden="1" w:unhideWhenUsed="1"/>
+    <w:lsdException w:name="endnote reference" w:semiHidden="1" w:unhideWhenUsed="1"/>
+    <w:lsdException w:name="endnote text" w:semiHidden="1" w:unhideWhenUsed="1"/>
+    <w:lsdException w:name="table of authorities" w:semiHidden="1" w:unhideWhenUsed="1"/>
+    <w:lsdException w:name="macro" w:semiHidden="1" w:unhideWhenUsed="1"/>
+    <w:lsdException w:name="toa heading" w:semiHidden="1" w:unhideWhenUsed="1"/>
+    <w:lsdException w:name="List" w:semiHidden="1" w:unhideWhenUsed="1"/>
+    <w:lsdException w:name="List Bullet" w:semiHidden="1" w:unhideWhenUsed="1"/>
+    <w:lsdException w:name="List Number" w:semiHidden="1" w:unhideWhenUsed="1"/>
+    <w:lsdException w:name="List 2" w:semiHidden="1" w:unhideWhenUsed="1"/>
+    <w:lsdException w:name="List 3" w:semiHidden="1" w:unhideWhenUsed="1"/>
+    <w:lsdException w:name="List 4" w:semiHidden="1" w:unhideWhenUsed="1"/>
+    <w:lsdException w:name="List 5" w:semiHidden="1" w:unhideWhenUsed="1"/>
+    <w:lsdException w:name="List Bullet 2" w:semiHidden="1" w:unhideWhenUsed="1"/>
+    <w:lsdException w:name="List Bullet 3" w:semiHidden="1" w:unhideWhenUsed="1"/>
+    <w:lsdException w:name="List Bullet 4" w:semiHidden="1" w:unhideWhenUsed="1"/>
+    <w:lsdException w:name="List Bullet 5" w:semiHidden="1" w:unhideWhenUsed="1"/>
+    <w:lsdException w:name="List Number 2" w:semiHidden="1" w:unhideWhenUsed="1"/>
+    <w:lsdException w:name="List Number 3" w:semiHidden="1" w:unhideWhenUsed="1"/>
+    <w:lsdException w:name="List Number 4" w:semiHidden="1" w:unhideWhenUsed="1"/>
+    <w:lsdException w:name="List Number 5" w:semiHidden="1" w:unhideWhenUsed="1"/>
+    <w:lsdException w:name="Title" w:uiPriority="10" w:qFormat="1"/>
+    <w:lsdException w:name="Closing" w:semiHidden="1" w:unhideWhenUsed="1"/>
+    <w:lsdException w:name="Signature" w:semiHidden="1" w:unhideWhenUsed="1"/>
+    <w:lsdException w:name="Default Paragraph Font" w:semiHidden="1" w:uiPriority="1" w:unhideWhenUsed="1"/>
+    <w:lsdException w:name="Body Text" w:semiHidden="1" w:unhideWhenUsed="1"/>
+    <w:lsdException w:name="Body Text Indent" w:semiHidden="1" w:unhideWhenUsed="1"/>
+    <w:lsdException w:name="List Continue" w:semiHidden="1" w:unhideWhenUsed="1"/>
+    <w:lsdException w:name="List Continue 2" w:semiHidden="1" w:unhideWhenUsed="1"/>
+    <w:lsdException w:name="List Continue 3" w:semiHidden="1" w:unhideWhenUsed="1"/>
+    <w:lsdException w:name="List Continue 4" w:semiHidden="1" w:unhideWhenUsed="1"/>
+    <w:lsdException w:name="List Continue 5" w:semiHidden="1" w:unhideWhenUsed="1"/>
+    <w:lsdException w:name="Message Header" w:semiHidden="1" w:unhideWhenUsed="1"/>
+    <w:lsdException w:name="Subtitle" w:uiPriority="11" w:qFormat="1"/>
+    <w:lsdException w:name="Salutation" w:semiHidden="1" w:unhideWhenUsed="1"/>
+    <w:lsdException w:name="Date" w:semiHidden="1" w:unhideWhenUsed="1"/>
+    <w:lsdException w:name="Body Text First Indent" w:semiHidden="1" w:unhideWhenUsed="1"/>
+    <w:lsdException w:name="Body Text First Indent 2" w:semiHidden="1" w:unhideWhenUsed="1"/>
+    <w:lsdException w:name="Note Heading" w:semiHidden="1" w:unhideWhenUsed="1"/>
+    <w:lsdException w:name="Body Text 2" w:semiHidden="1" w:unhideWhenUsed="1"/>
+    <w:lsdException w:name="Body Text 3" w:semiHidden="1" w:unhideWhenUsed="1"/>
+    <w:lsdException w:name="Body Text Indent 2" w:semiHidden="1" w:unhideWhenUsed="1"/>
+    <w:lsdException w:name="Body Text Indent 3" w:semiHidden="1" w:unhideWhenUsed="1"/>
+    <w:lsdException w:name="Block Text" w:semiHidden="1" w:unhideWhenUsed="1"/>
+    <w:lsdException w:name="Hyperlink" w:semiHidden="1" w:unhideWhenUsed="1"/>
+    <w:lsdException w:name="FollowedHyperlink" w:semiHidden="1" w:unhideWhenUsed="1"/>
+    <w:lsdException w:name="Strong" w:uiPriority="22" w:qFormat="1"/>
+    <w:lsdException w:name="Emphasis" w:uiPriority="20" w:qFormat="1"/>
+    <w:lsdException w:name="Document Map" w:semiHidden="1" w:unhideWhenUsed="1"/>
+    <w:lsdException w:name="Plain Text" w:semiHidden="1" w:unhideWhenUsed="1"/>
+    <w:lsdException w:name="E-mail Signature" w:semiHidden="1" w:unhideWhenUsed="1"/>
+    <w:lsdException w:name="HTML Top of Form" w:semiHidden="1" w:unhideWhenUsed="1"/>
+    <w:lsdException w:name="HTML Bottom of Form" w:semiHidden="1" w:unhideWhenUsed="1"/>
+    <w:lsdException w:name="Normal (Web)" w:semiHidden="1" w:unhideWhenUsed="1"/>
+    <w:lsdException w:name="HTML Acronym" w:semiHidden="1" w:unhideWhenUsed="1"/>
+    <w:lsdException w:name="HTML Address" w:semiHidden="1" w:unhideWhenUsed="1"/>
+    <w:lsdException w:name="HTML Cite" w:semiHidden="1" w:unhideWhenUsed="1"/>
+    <w:lsdException w:name="HTML Code" w:semiHidden="1" w:unhideWhenUsed="1"/>
+    <w:lsdException w:name="HTML Definition" w:semiHidden="1" w:unhideWhenUsed="1"/>
+    <w:lsdException w:name="HTML Keyboard" w:semiHidden="1" w:unhideWhenUsed="1"/>
+    <w:lsdException w:name="HTML Preformatted" w:semiHidden="1" w:unhideWhenUsed="1"/>
+    <w:lsdException w:name="HTML Sample" w:semiHidden="1" w:unhideWhenUsed="1"/>
+    <w:lsdException w:name="HTML Typewriter" w:semiHidden="1" w:unhideWhenUsed="1"/>
+    <w:lsdException w:name="HTML Variable" w:semiHidden="1" w:unhideWhenUsed="1"/>
+    <w:lsdException w:name="Normal Table" w:semiHidden="1" w:unhideWhenUsed="1"/>
+    <w:lsdException w:name="annotation subject" w:semiHidden="1" w:unhideWhenUsed="1"/>
+    <w:lsdException w:name="No List" w:semiHidden="1" w:unhideWhenUsed="1"/>
+    <w:lsdException w:name="Outline List 1" w:semiHidden="1" w:unhideWhenUsed="1"/>
+    <w:lsdException w:name="Outline List 2" w:semiHidden="1" w:unhideWhenUsed="1"/>
+    <w:lsdException w:name="Outline List 3" w:semiHidden="1" w:unhideWhenUsed="1"/>
+    <w:lsdException w:name="Table Simple 1" w:semiHidden="1" w:unhideWhenUsed="1"/>
+    <w:lsdException w:name="Table Simple 2" w:semiHidden="1" w:unhideWhenUsed="1"/>
+    <w:lsdException w:name="Table Simple 3" w:semiHidden="1" w:unhideWhenUsed="1"/>
+    <w:lsdException w:name="Table Classic 1" w:semiHidden="1" w:unhideWhenUsed="1"/>
+    <w:lsdException w:name="Table Classic 2" w:semiHidden="1" w:unhideWhenUsed="1"/>
+    <w:lsdException w:name="Table Classic 3" w:semiHidden="1" w:unhideWhenUsed="1"/>
+    <w:lsdException w:name="Table Classic 4" w:semiHidden="1" w:unhideWhenUsed="1"/>
+    <w:lsdException w:name="Table Colorful 1" w:semiHidden="1" w:unhideWhenUsed="1"/>
+    <w:lsdException w:name="Table Colorful 2" w:semiHidden="1" w:unhideWhenUsed="1"/>
+    <w:lsdException w:name="Table Colorful 3" w:semiHidden="1" w:unhideWhenUsed="1"/>
+    <w:lsdException w:name="Table Columns 1" w:semiHidden="1" w:unhideWhenUsed="1"/>
+    <w:lsdException w:name="Table Columns 2" w:semiHidden="1" w:unhideWhenUsed="1"/>
+    <w:lsdException w:name="Table Columns 3" w:semiHidden="1" w:unhideWhenUsed="1"/>
+    <w:lsdException w:name="Table Columns 4" w:semiHidden="1" w:unhideWhenUsed="1"/>
+    <w:lsdException w:name="Table Columns 5" w:semiHidden="1" w:unhideWhenUsed="1"/>
+    <w:lsdException w:name="Table Grid 1" w:semiHidden="1" w:unhideWhenUsed="1"/>
+    <w:lsdException w:name="Table Grid 2" w:semiHidden="1" w:unhideWhenUsed="1"/>
+    <w:lsdException w:name="Table Grid 3" w:semiHidden="1" w:unhideWhenUsed="1"/>
+    <w:lsdException w:name="Table Grid 4" w:semiHidden="1" w:unhideWhenUsed="1"/>
+    <w:lsdException w:name="Table Grid 5" w:semiHidden="1" w:unhideWhenUsed="1"/>
+    <w:lsdException w:name="Table Grid 6" w:semiHidden="1" w:unhideWhenUsed="1"/>
+    <w:lsdException w:name="Table Grid 7" w:semiHidden="1" w:unhideWhenUsed="1"/>
+    <w:lsdException w:name="Table Grid 8" w:semiHidden="1" w:unhideWhenUsed="1"/>
+    <w:lsdException w:name="Table List 1" w:semiHidden="1" w:unhideWhenUsed="1"/>
+    <w:lsdException w:name="Table List 2" w:semiHidden="1" w:unhideWhenUsed="1"/>
+    <w:lsdException w:name="Table List 3" w:semiHidden="1" w:unhideWhenUsed="1"/>
+    <w:lsdException w:name="Table List 4" w:semiHidden="1" w:unhideWhenUsed="1"/>
+    <w:lsdException w:name="Table List 5" w:semiHidden="1" w:unhideWhenUsed="1"/>
+    <w:lsdException w:name="Table List 6" w:semiHidden="1" w:unhideWhenUsed="1"/>
+    <w:lsdException w:name="Table List 7" w:semiHidden="1" w:unhideWhenUsed="1"/>
+    <w:lsdException w:name="Table List 8" w:semiHidden="1" w:unhideWhenUsed="1"/>
+    <w:lsdException w:name="Table 3D effects 1" w:semiHidden="1" w:unhideWhenUsed="1"/>
+    <w:lsdException w:name="Table 3D effects 2" w:semiHidden="1" w:unhideWhenUsed="1"/>
+    <w:lsdException w:name="Table 3D effects 3" w:semiHidden="1" w:unhideWhenUsed="1"/>
+    <w:lsdException w:name="Table Contemporary" w:semiHidden="1" w:unhideWhenUsed="1"/>
+    <w:lsdException w:name="Table Elegant" w:semiHidden="1" w:unhideWhenUsed="1"/>
+    <w:lsdException w:name="Table Professional" w:semiHidden="1" w:unhideWhenUsed="1"/>
+    <w:lsdException w:name="Table Subtle 1" w:semiHidden="1" w:unhideWhenUsed="1"/>
+    <w:lsdException w:name="Table Subtle 2" w:semiHidden="1" w:unhideWhenUsed="1"/>
+    <w:lsdException w:name="Table Web 1" w:semiHidden="1" w:unhideWhenUsed="1"/>
+    <w:lsdException w:name="Table Web 2" w:semiHidden="1" w:unhideWhenUsed="1"/>
+    <w:lsdException w:name="Table Web 3" w:semiHidden="1" w:unhideWhenUsed="1"/>
+    <w:lsdException w:name="Balloon Text" w:semiHidden="1" w:unhideWhenUsed="1"/>
+    <w:lsdException w:name="Table Grid" w:uiPriority="59"/>
+    <w:lsdException w:name="Table Theme" w:semiHidden="1" w:unhideWhenUsed="1"/>
+    <w:lsdException w:name="Placeholder Text" w:semiHidden="1"/>
+    <w:lsdException w:name="No Spacing" w:uiPriority="1" w:qFormat="1"/>
+    <w:lsdException w:name="Light Shading" w:uiPriority="60"/>
+    <w:lsdException w:name="Light List" w:uiPriority="61"/>
+    <w:lsdException w:name="Light Grid" w:uiPriority="62"/>
+    <w:lsdException w:name="Medium Shading 1" w:uiPriority="63"/>
+    <w:lsdException w:name="Medium Shading 2" w:uiPriority="64"/>
+    <w:lsdException w:name="Medium List 1" w:uiPriority="65"/>
+    <w:lsdException w:name="Medium List 2" w:uiPriority="66"/>
+    <w:lsdException w:name="Medium Grid 1" w:uiPriority="67"/>
+    <w:lsdException w:name="Medium Grid 2" w:uiPriority="68"/>
+    <w:lsdException w:name="Medium Grid 3" w:uiPriority="69"/>
+    <w:lsdException w:name="Dark List" w:uiPriority="70"/>
+    <w:lsdException w:name="Colorful Shading" w:uiPriority="71"/>
+    <w:lsdException w:name="Colorful List" w:uiPriority="72"/>
+    <w:lsdException w:name="Colorful Grid" w:uiPriority="73"/>
+    <w:lsdException w:name="Light Shading Accent 1" w:uiPriority="60"/>
+    <w:lsdException w:name="Light List Accent 1" w:uiPriority="61"/>
+    <w:lsdException w:name="Light Grid Accent 1" w:uiPriority="62"/>
+    <w:lsdException w:name="Medium Shading 1 Accent 1" w:uiPriority="63"/>
+    <w:lsdException w:name="Medium Shading 2 Accent 1" w:uiPriority="64"/>
+    <w:lsdException w:name="Medium List 1 Accent 1" w:uiPriority="65"/>
+    <w:lsdException w:name="Revision" w:semiHidden="1"/>
+    <w:lsdException w:name="List Paragraph" w:uiPriority="34" w:qFormat="1"/>
+    <w:lsdException w:name="Quote" w:uiPriority="29" w:qFormat="1"/>
+    <w:lsdException w:name="Intense Quote" w:uiPriority="30" w:qFormat="1"/>
+    <w:lsdException w:name="Medium List 2 Accent 1" w:uiPriority="66"/>
+    <w:lsdException w:name="Medium Grid 1 Accent 1" w:uiPriority="67"/>
+    <w:lsdException w:name="Medium Grid 2 Accent 1" w:uiPriority="68"/>
+    <w:lsdException w:name="Medium Grid 3 Accent 1" w:uiPriority="69"/>
+    <w:lsdException w:name="Dark List Accent 1" w:uiPriority="70"/>
+    <w:lsdException w:name="Colorful Shading Accent 1" w:uiPriority="71"/>
+    <w:lsdException w:name="Colorful List Accent 1" w:uiPriority="72"/>
+    <w:lsdException w:name="Colorful Grid Accent 1" w:uiPriority="73"/>
+    <w:lsdException w:name="Light Shading Accent 2" w:uiPriority="60"/>
+    <w:lsdException w:name="Light List Accent 2" w:uiPriority="61"/>
+    <w:lsdException w:name="Light Grid Accent 2" w:uiPriority="62"/>
+    <w:lsdException w:name="Medium Shading 1 Accent 2" w:uiPriority="63"/>
+    <w:lsdException w:name="Medium Shading 2 Accent 2" w:uiPriority="64"/>
+    <w:lsdException w:name="Medium List 1 Accent 2" w:uiPriority="65"/>
+    <w:lsdException w:name="Medium List 2 Accent 2" w:uiPriority="66"/>
+    <w:lsdException w:name="Medium Grid 1 Accent 2" w:uiPriority="67"/>
+    <w:lsdException w:name="Medium Grid 2 Accent 2" w:uiPriority="68"/>
+    <w:lsdException w:name="Medium Grid 3 Accent 2" w:uiPriority="69"/>
+    <w:lsdException w:name="Dark List Accent 2" w:uiPriority="70"/>
+    <w:lsdException w:name="Colorful Shading Accent 2" w:uiPriority="71"/>
+    <w:lsdException w:name="Colorful List Accent 2" w:uiPriority="72"/>
+    <w:lsdException w:name="Colorful Grid Accent 2" w:uiPriority="73"/>
+    <w:lsdException w:name="Light Shading Accent 3" w:uiPriority="60"/>
+    <w:lsdException w:name="Light List Accent 3" w:uiPriority="61"/>
+    <w:lsdException w:name="Light Grid Accent 3" w:uiPriority="62"/>
+    <w:lsdException w:name="Medium Shading 1 Accent 3" w:uiPriority="63"/>
+    <w:lsdException w:name="Medium Shading 2 Accent 3" w:uiPriority="64"/>
+    <w:lsdException w:name="Medium List 1 Accent 3" w:uiPriority="65"/>
+    <w:lsdException w:name="Medium List 2 Accent 3" w:uiPriority="66"/>
+    <w:lsdException w:name="Medium Grid 1 Accent 3" w:uiPriority="67"/>
+    <w:lsdException w:name="Medium Grid 2 Accent 3" w:uiPriority="68"/>
+    <w:lsdException w:name="Medium Grid 3 Accent 3" w:uiPriority="69"/>
+    <w:lsdException w:name="Dark List Accent 3" w:uiPriority="70"/>
+    <w:lsdException w:name="Colorful Shading Accent 3" w:uiPriority="71"/>
+    <w:lsdException w:name="Colorful List Accent 3" w:uiPriority="72"/>
+    <w:lsdException w:name="Colorful Grid Accent 3" w:uiPriority="73"/>
+    <w:lsdException w:name="Light Shading Accent 4" w:uiPriority="60"/>
+    <w:lsdException w:name="Light List Accent 4" w:uiPriority="61"/>
+    <w:lsdException w:name="Light Grid Accent 4" w:uiPriority="62"/>
+    <w:lsdException w:name="Medium Shading 1 Accent 4" w:uiPriority="63"/>
+    <w:lsdException w:name="Medium Shading 2 Accent 4" w:uiPriority="64"/>
+    <w:lsdException w:name="Medium List 1 Accent 4" w:uiPriority="65"/>
+    <w:lsdException w:name="Medium List 2 Accent 4" w:uiPriority="66"/>
+    <w:lsdException w:name="Medium Grid 1 Accent 4" w:uiPriority="67"/>
+    <w:lsdException w:name="Medium Grid 2 Accent 4" w:uiPriority="68"/>
+    <w:lsdException w:name="Medium Grid 3 Accent 4" w:uiPriority="69"/>
+    <w:lsdException w:name="Dark List Accent 4" w:uiPriority="70"/>
+    <w:lsdException w:name="Colorful Shading Accent 4" w:uiPriority="71"/>
+    <w:lsdException w:name="Colorful List Accent 4" w:uiPriority="72"/>
+    <w:lsdException w:name="Colorful Grid Accent 4" w:uiPriority="73"/>
+    <w:lsdException w:name="Light Shading Accent 5" w:uiPriority="60"/>
+    <w:lsdException w:name="Light List Accent 5" w:uiPriority="61"/>
+    <w:lsdException w:name="Light Grid Accent 5" w:uiPriority="62"/>
+    <w:lsdException w:name="Medium Shading 1 Accent 5" w:uiPriority="63"/>
+    <w:lsdException w:name="Medium Shading 2 Accent 5" w:uiPriority="64"/>
+    <w:lsdException w:name="Medium List 1 Accent 5" w:uiPriority="65"/>
+    <w:lsdException w:name="Medium List 2 Accent 5" w:uiPriority="66"/>
+    <w:lsdException w:name="Medium Grid 1 Accent 5" w:uiPriority="67"/>
+    <w:lsdException w:name="Medium Grid 2 Accent 5" w:uiPriority="68"/>
+    <w:lsdException w:name="Medium Grid 3 Accent 5" w:uiPriority="69"/>
+    <w:lsdException w:name="Dark List Accent 5" w:uiPriority="70"/>
+    <w:lsdException w:name="Colorful Shading Accent 5" w:uiPriority="71"/>
+    <w:lsdException w:name="Colorful List Accent 5" w:uiPriority="72"/>
+    <w:lsdException w:name="Colorful Grid Accent 5" w:uiPriority="73"/>
+    <w:lsdException w:name="Light Shading Accent 6" w:uiPriority="60"/>
+    <w:lsdException w:name="Light List Accent 6" w:uiPriority="61"/>
+    <w:lsdException w:name="Light Grid Accent 6" w:uiPriority="62"/>
+    <w:lsdException w:name="Medium Shading 1 Accent 6" w:uiPriority="63"/>
+    <w:lsdException w:name="Medium Shading 2 Accent 6" w:uiPriority="64"/>
+    <w:lsdException w:name="Medium List 1 Accent 6" w:uiPriority="65"/>
+    <w:lsdException w:name="Medium List 2 Accent 6" w:uiPriority="66"/>
+    <w:lsdException w:name="Medium Grid 1 Accent 6" w:uiPriority="67"/>
+    <w:lsdException w:name="Medium Grid 2 Accent 6" w:uiPriority="68"/>
+    <w:lsdException w:name="Medium Grid 3 Accent 6" w:uiPriority="69"/>
+    <w:lsdException w:name="Dark List Accent 6" w:uiPriority="70"/>
+    <w:lsdException w:name="Colorful Shading Accent 6" w:uiPriority="71"/>
+    <w:lsdException w:name="Colorful List Accent 6" w:uiPriority="72"/>
+    <w:lsdException w:name="Colorful Grid Accent 6" w:uiPriority="73"/>
+    <w:lsdException w:name="Subtle Emphasis" w:uiPriority="19" w:qFormat="1"/>
+    <w:lsdException w:name="Intense Emphasis" w:uiPriority="21" w:qFormat="1"/>
+    <w:lsdException w:name="Subtle Reference" w:uiPriority="31" w:qFormat="1"/>
+    <w:lsdException w:name="Intense Reference" w:uiPriority="32" w:qFormat="1"/>
+    <w:lsdException w:name="Book Title" w:uiPriority="33" w:qFormat="1"/>
+    <w:lsdException w:name="Bibliography" w:semiHidden="1" w:uiPriority="37" w:unhideWhenUsed="1"/>
+    <w:lsdException w:name="TOC Heading" w:semiHidden="1" w:uiPriority="39" w:unhideWhenUsed="1" w:qFormat="1"/>
+    <w:lsdException w:name="Plain Table 1" w:uiPriority="41"/>
+    <w:lsdException w:name="Plain Table 2" w:uiPriority="42"/>
+    <w:lsdException w:name="Plain Table 3" w:uiPriority="43"/>
+    <w:lsdException w:name="Plain Table 4" w:uiPriority="44"/>
+    <w:lsdException w:name="Plain Table 5" w:uiPriority="45"/>
+    <w:lsdException w:name="Grid Table Light" w:uiPriority="40"/>
+    <w:lsdException w:name="Grid Table 1 Light" w:uiPriority="46"/>
+    <w:lsdException w:name="Grid Table 2" w:uiPriority="47"/>
+    <w:lsdException w:name="Grid Table 3" w:uiPriority="48"/>
+    <w:lsdException w:name="Grid Table 4" w:uiPriority="49"/>
+    <w:lsdException w:name="Grid Table 5 Dark" w:uiPriority="50"/>
+    <w:lsdException w:name="Grid Table 6 Colorful" w:uiPriority="51"/>
+    <w:lsdException w:name="Grid Table 7 Colorful" w:uiPriority="52"/>
+    <w:lsdException w:name="Grid Table 1 Light Accent 1" w:uiPriority="46"/>
+    <w:lsdException w:name="Grid Table 2 Accent 1" w:uiPriority="47"/>
+    <w:lsdException w:name="Grid Table 3 Accent 1" w:uiPriority="48"/>
+    <w:lsdException w:name="Grid Table 4 Accent 1" w:uiPriority="49"/>
+    <w:lsdException w:name="Grid Table 5 Dark Accent 1" w:uiPriority="50"/>
+    <w:lsdException w:name="Grid Table 6 Colorful Accent 1" w:uiPriority="51"/>
+    <w:lsdException w:name="Grid Table 7 Colorful Accent 1" w:uiPriority="52"/>
+    <w:lsdException w:name="Grid Table 1 Light Accent 2" w:uiPriority="46"/>
+    <w:lsdException w:name="Grid Table 2 Accent 2" w:uiPriority="47"/>
+    <w:lsdException w:name="Grid Table 3 Accent 2" w:uiPriority="48"/>
+    <w:lsdException w:name="Grid Table 4 Accent 2" w:uiPriority="49"/>
+    <w:lsdException w:name="Grid Table 5 Dark Accent 2" w:uiPriority="50"/>
+    <w:lsdException w:name="Grid Table 6 Colorful Accent 2" w:uiPriority="51"/>
+    <w:lsdException w:name="Grid Table 7 Colorful Accent 2" w:uiPriority="52"/>
+    <w:lsdException w:name="Grid Table 1 Light Accent 3" w:uiPriority="46"/>
+    <w:lsdException w:name="Grid Table 2 Accent 3" w:uiPriority="47"/>
+    <w:lsdException w:name="Grid Table 3 Accent 3" w:uiPriority="48"/>
+    <w:lsdException w:name="Grid Table 4 Accent 3" w:uiPriority="49"/>
+    <w:lsdException w:name="Grid Table 5 Dark Accent 3" w:uiPriority="50"/>
+    <w:lsdException w:name="Grid Table 6 Colorful Accent 3" w:uiPriority="51"/>
+    <w:lsdException w:name="Grid Table 7 Colorful Accent 3" w:uiPriority="52"/>
+    <w:lsdException w:name="Grid Table 1 Light Accent 4" w:uiPriority="46"/>
+    <w:lsdException w:name="Grid Table 2 Accent 4" w:uiPriority="47"/>
+    <w:lsdException w:name="Grid Table 3 Accent 4" w:uiPriority="48"/>
+    <w:lsdException w:name="Grid Table 4 Accent 4" w:uiPriority="49"/>
+    <w:lsdException w:name="Grid Table 5 Dark Accent 4" w:uiPriority="50"/>
+    <w:lsdException w:name="Grid Table 6 Colorful Accent 4" w:uiPriority="51"/>
+    <w:lsdException w:name="Grid Table 7 Colorful Accent 4" w:uiPriority="52"/>
+    <w:lsdException w:name="Grid Table 1 Light Accent 5" w:uiPriority="46"/>
+    <w:lsdException w:name="Grid Table 2 Accent 5" w:uiPriority="47"/>
+    <w:lsdException w:name="Grid Table 3 Accent 5" w:uiPriority="48"/>
+    <w:lsdException w:name="Grid Table 4 Accent 5" w:uiPriority="49"/>
+    <w:lsdException w:name="Grid Table 5 Dark Accent 5" w:uiPriority="50"/>
+    <w:lsdException w:name="Grid Table 6 Colorful Accent 5" w:uiPriority="51"/>
+    <w:lsdException w:name="Grid Table 7 Colorful Accent 5" w:uiPriority="52"/>
+    <w:lsdException w:name="Grid Table 1 Light Accent 6" w:uiPriority="46"/>
+    <w:lsdException w:name="Grid Table 2 Accent 6" w:uiPriority="47"/>
+    <w:lsdException w:name="Grid Table 3 Accent 6" w:uiPriority="48"/>
+    <w:lsdException w:name="Grid Table 4 Accent 6" w:uiPriority="49"/>
+    <w:lsdException w:name="Grid Table 5 Dark Accent 6" w:uiPriority="50"/>
+    <w:lsdException w:name="Grid Table 6 Colorful Accent 6" w:uiPriority="51"/>
+    <w:lsdException w:name="Grid Table 7 Colorful Accent 6" w:uiPriority="52"/>
+    <w:lsdException w:name="List Table 1 Light" w:uiPriority="46"/>
+    <w:lsdException w:name="List Table 2" w:uiPriority="47"/>
+    <w:lsdException w:name="List Table 3" w:uiPriority="48"/>
+    <w:lsdException w:name="List Table 4" w:uiPriority="49"/>
+    <w:lsdException w:name="List Table 5 Dark" w:uiPriority="50"/>
+    <w:lsdException w:name="List Table 6 Colorful" w:uiPriority="51"/>
+    <w:lsdException w:name="List Table 7 Colorful" w:uiPriority="52"/>
+    <w:lsdException w:name="List Table 1 Light Accent 1" w:uiPriority="46"/>
+    <w:lsdException w:name="List Table 2 Accent 1" w:uiPriority="47"/>
+    <w:lsdException w:name="List Table 3 Accent 1" w:uiPriority="48"/>
+    <w:lsdException w:name="List Table 4 Accent 1" w:uiPriority="49"/>
+    <w:lsdException w:name="List Table 5 Dark Accent 1" w:uiPriority="50"/>
+    <w:lsdException w:name="List Table 6 Colorful Accent 1" w:uiPriority="51"/>
+    <w:lsdException w:name="List Table 7 Colorful Accent 1" w:uiPriority="52"/>
+    <w:lsdException w:name="List Table 1 Light Accent 2" w:uiPriority="46"/>
+    <w:lsdException w:name="List Table 2 Accent 2" w:uiPriority="47"/>
+    <w:lsdException w:name="List Table 3 Accent 2" w:uiPriority="48"/>
+    <w:lsdException w:name="List Table 4 Accent 2" w:uiPriority="49"/>
+    <w:lsdException w:name="List Table 5 Dark Accent 2" w:uiPriority="50"/>
+    <w:lsdException w:name="List Table 6 Colorful Accent 2" w:uiPriority="51"/>
+    <w:lsdException w:name="List Table 7 Colorful Accent 2" w:uiPriority="52"/>
+    <w:lsdException w:name="List Table 1 Light Accent 3" w:uiPriority="46"/>
+    <w:lsdException w:name="List Table 2 Accent 3" w:uiPriority="47"/>
+    <w:lsdException w:name="List Table 3 Accent 3" w:uiPriority="48"/>
+    <w:lsdException w:name="List Table 4 Accent 3" w:uiPriority="49"/>
+    <w:lsdException w:name="List Table 5 Dark Accent 3" w:uiPriority="50"/>
+    <w:lsdException w:name="List Table 6 Colorful Accent 3" w:uiPriority="51"/>
+    <w:lsdException w:name="List Table 7 Colorful Accent 3" w:uiPriority="52"/>
+    <w:lsdException w:name="List Table 1 Light Accent 4" w:uiPriority="46"/>
+    <w:lsdException w:name="List Table 2 Accent 4" w:uiPriority="47"/>
+    <w:lsdException w:name="List Table 3 Accent 4" w:uiPriority="48"/>
+    <w:lsdException w:name="List Table 4 Accent 4" w:uiPriority="49"/>
+    <w:lsdException w:name="List Table 5 Dark Accent 4" w:uiPriority="50"/>
+    <w:lsdException w:name="List Table 6 Colorful Accent 4" w:uiPriority="51"/>
+    <w:lsdException w:name="List Table 7 Colorful Accent 4" w:uiPriority="52"/>
+    <w:lsdException w:name="List Table 1 Light Accent 5" w:uiPriority="46"/>
+    <w:lsdException w:name="List Table 2 Accent 5" w:uiPriority="47"/>
+    <w:lsdException w:name="List Table 3 Accent 5" w:uiPriority="48"/>
+    <w:lsdException w:name="List Table 4 Accent 5" w:uiPriority="49"/>
+    <w:lsdException w:name="List Table 5 Dark Accent 5" w:uiPriority="50"/>
+    <w:lsdException w:name="List Table 6 Colorful Accent 5" w:uiPriority="51"/>
+    <w:lsdException w:name="List Table 7 Colorful Accent 5" w:uiPriority="52"/>
+    <w:lsdException w:name="List Table 1 Light Accent 6" w:uiPriority="46"/>
+    <w:lsdException w:name="List Table 2 Accent 6" w:uiPriority="47"/>
+    <w:lsdException w:name="List Table 3 Accent 6" w:uiPriority="48"/>
+    <w:lsdException w:name="List Table 4 Accent 6" w:uiPriority="49"/>
+    <w:lsdException w:name="List Table 5 Dark Accent 6" w:uiPriority="50"/>
+    <w:lsdException w:name="List Table 6 Colorful Accent 6" w:uiPriority="51"/>
+    <w:lsdException w:name="List Table 7 Colorful Accent 6" w:uiPriority="52"/>
+    <w:lsdException w:name="Mention" w:semiHidden="1" w:unhideWhenUsed="1"/>
+    <w:lsdException w:name="Smart Hyperlink" w:semiHidden="1" w:unhideWhenUsed="1"/>
+    <w:lsdException w:name="Hashtag" w:semiHidden="1" w:unhideWhenUsed="1"/>
+    <w:lsdException w:name="Unresolved Mention" w:semiHidden="1" w:unhideWhenUsed="1"/>
+    <w:lsdException w:name="Smart Link" w:semiHidden="1" w:unhideWhenUsed="1"/>
   </w:latentStyles>
   <w:style w:type="paragraph" w:default="1" w:styleId="Normal">
     <w:name w:val="Normal"/>
@@ -2999,7 +3418,6 @@
   <w:style w:type="character" w:default="1" w:styleId="Fuentedeprrafopredeter">
     <w:name w:val="Default Paragraph Font"/>
     <w:uiPriority w:val="1"/>
-    <w:semiHidden/>
     <w:unhideWhenUsed/>
   </w:style>
   <w:style w:type="table" w:default="1" w:styleId="Tablanormal">
@@ -3068,453 +3486,6 @@
     <w:tblPr>
       <w:tblStyleRowBandSize w:val="1"/>
       <w:tblStyleColBandSize w:val="1"/>
-      <w:tblCellMar>
-        <w:top w:w="100" w:type="dxa"/>
-        <w:left w:w="100" w:type="dxa"/>
-        <w:bottom w:w="100" w:type="dxa"/>
-        <w:right w:w="100" w:type="dxa"/>
-      </w:tblCellMar>
-    </w:tblPr>
-  </w:style>
-  <w:style w:type="paragraph" w:styleId="Textodeglobo">
-    <w:name w:val="Balloon Text"/>
-    <w:basedOn w:val="Normal"/>
-    <w:link w:val="TextodegloboCar"/>
-    <w:uiPriority w:val="99"/>
-    <w:semiHidden/>
-    <w:unhideWhenUsed/>
-    <w:rsid w:val="00241754"/>
-    <w:pPr>
-      <w:spacing w:after="0" w:line="240" w:lineRule="auto"/>
-    </w:pPr>
-    <w:rPr>
-      <w:rFonts w:ascii="Tahoma" w:hAnsi="Tahoma" w:cs="Tahoma"/>
-      <w:sz w:val="16"/>
-      <w:szCs w:val="16"/>
-    </w:rPr>
-  </w:style>
-  <w:style w:type="character" w:customStyle="1" w:styleId="TextodegloboCar">
-    <w:name w:val="Texto de globo Car"/>
-    <w:basedOn w:val="Fuentedeprrafopredeter"/>
-    <w:link w:val="Textodeglobo"/>
-    <w:uiPriority w:val="99"/>
-    <w:semiHidden/>
-    <w:rsid w:val="00241754"/>
-    <w:rPr>
-      <w:rFonts w:ascii="Tahoma" w:hAnsi="Tahoma" w:cs="Tahoma"/>
-      <w:sz w:val="16"/>
-      <w:szCs w:val="16"/>
-    </w:rPr>
-  </w:style>
-  <w:style w:type="paragraph" w:styleId="Encabezado">
-    <w:name w:val="header"/>
-    <w:basedOn w:val="Normal"/>
-    <w:link w:val="EncabezadoCar"/>
-    <w:uiPriority w:val="99"/>
-    <w:unhideWhenUsed/>
-    <w:rsid w:val="00241754"/>
-    <w:pPr>
-      <w:tabs>
-        <w:tab w:val="center" w:pos="4252"/>
-        <w:tab w:val="right" w:pos="8504"/>
-      </w:tabs>
-      <w:spacing w:after="0" w:line="240" w:lineRule="auto"/>
-    </w:pPr>
-  </w:style>
-  <w:style w:type="character" w:customStyle="1" w:styleId="EncabezadoCar">
-    <w:name w:val="Encabezado Car"/>
-    <w:basedOn w:val="Fuentedeprrafopredeter"/>
-    <w:link w:val="Encabezado"/>
-    <w:uiPriority w:val="99"/>
-    <w:rsid w:val="00241754"/>
-  </w:style>
-  <w:style w:type="paragraph" w:styleId="Piedepgina">
-    <w:name w:val="footer"/>
-    <w:basedOn w:val="Normal"/>
-    <w:link w:val="PiedepginaCar"/>
-    <w:uiPriority w:val="99"/>
-    <w:unhideWhenUsed/>
-    <w:rsid w:val="00241754"/>
-    <w:pPr>
-      <w:tabs>
-        <w:tab w:val="center" w:pos="4252"/>
-        <w:tab w:val="right" w:pos="8504"/>
-      </w:tabs>
-      <w:spacing w:after="0" w:line="240" w:lineRule="auto"/>
-    </w:pPr>
-  </w:style>
-  <w:style w:type="character" w:customStyle="1" w:styleId="PiedepginaCar">
-    <w:name w:val="Pie de página Car"/>
-    <w:basedOn w:val="Fuentedeprrafopredeter"/>
-    <w:link w:val="Piedepgina"/>
-    <w:uiPriority w:val="99"/>
-    <w:rsid w:val="00241754"/>
-  </w:style>
-  <w:style w:type="paragraph" w:styleId="NormalWeb">
-    <w:name w:val="Normal (Web)"/>
-    <w:basedOn w:val="Normal"/>
-    <w:uiPriority w:val="99"/>
-    <w:unhideWhenUsed/>
-    <w:rsid w:val="005D35FC"/>
-    <w:pPr>
-      <w:spacing w:before="100" w:beforeAutospacing="1" w:after="100" w:afterAutospacing="1" w:line="240" w:lineRule="auto"/>
-      <w:ind w:left="0" w:right="0"/>
-      <w:jc w:val="left"/>
-    </w:pPr>
-    <w:rPr>
-      <w:rFonts w:ascii="Times New Roman" w:eastAsia="Times New Roman" w:hAnsi="Times New Roman" w:cs="Times New Roman"/>
-      <w:lang w:val="es-AR"/>
-    </w:rPr>
-  </w:style>
-  <w:style w:type="character" w:styleId="Hipervnculo">
-    <w:name w:val="Hyperlink"/>
-    <w:basedOn w:val="Fuentedeprrafopredeter"/>
-    <w:uiPriority w:val="99"/>
-    <w:unhideWhenUsed/>
-    <w:rsid w:val="009E5E11"/>
-    <w:rPr>
-      <w:color w:val="0000FF"/>
-      <w:u w:val="single"/>
-    </w:rPr>
-  </w:style>
-</w:styles>
-</file>
-
-<file path=word/stylesWithEffects.xml><?xml version="1.0" encoding="utf-8"?>
-<w:styles xmlns:wpc="http://schemas.microsoft.com/office/word/2010/wordprocessingCanvas" xmlns:mc="http://schemas.openxmlformats.org/markup-compatibility/2006" xmlns:o="urn:schemas-microsoft-com:office:office" xmlns:r="http://schemas.openxmlformats.org/officeDocument/2006/relationships" xmlns:m="http://schemas.openxmlformats.org/officeDocument/2006/math" xmlns:v="urn:schemas-microsoft-com:vml" xmlns:wp14="http://schemas.microsoft.com/office/word/2010/wordprocessingDrawing" xmlns:wp="http://schemas.openxmlformats.org/drawingml/2006/wordprocessingDrawing" xmlns:w10="urn:schemas-microsoft-com:office:word" xmlns:w="http://schemas.openxmlformats.org/wordprocessingml/2006/main" xmlns:w14="http://schemas.microsoft.com/office/word/2010/wordml" xmlns:wpg="http://schemas.microsoft.com/office/word/2010/wordprocessingGroup" xmlns:wpi="http://schemas.microsoft.com/office/word/2010/wordprocessingInk" xmlns:wne="http://schemas.microsoft.com/office/word/2006/wordml" xmlns:wps="http://schemas.microsoft.com/office/word/2010/wordprocessingShape" mc:Ignorable="w14 wp14">
-  <w:docDefaults>
-    <w:rPrDefault>
-      <w:rPr>
-        <w:rFonts w:ascii="Arial" w:eastAsia="Arial" w:hAnsi="Arial" w:cs="Arial"/>
-        <w:sz w:val="24"/>
-        <w:szCs w:val="24"/>
-        <w:lang w:val="en" w:eastAsia="es-AR" w:bidi="ar-SA"/>
-      </w:rPr>
-    </w:rPrDefault>
-    <w:pPrDefault>
-      <w:pPr>
-        <w:spacing w:after="200" w:line="360" w:lineRule="auto"/>
-        <w:ind w:left="720" w:right="-531"/>
-        <w:jc w:val="both"/>
-      </w:pPr>
-    </w:pPrDefault>
-  </w:docDefaults>
-  <w:latentStyles w:defLockedState="0" w:defUIPriority="99" w:defSemiHidden="1" w:defUnhideWhenUsed="1" w:defQFormat="0" w:count="267">
-    <w:lsdException w:name="Normal" w:semiHidden="0" w:uiPriority="0" w:unhideWhenUsed="0" w:qFormat="1"/>
-    <w:lsdException w:name="heading 1" w:semiHidden="0" w:uiPriority="9" w:unhideWhenUsed="0" w:qFormat="1"/>
-    <w:lsdException w:name="heading 2" w:uiPriority="9" w:qFormat="1"/>
-    <w:lsdException w:name="heading 3" w:uiPriority="9" w:qFormat="1"/>
-    <w:lsdException w:name="heading 4" w:uiPriority="9" w:qFormat="1"/>
-    <w:lsdException w:name="heading 5" w:uiPriority="9" w:qFormat="1"/>
-    <w:lsdException w:name="heading 6" w:uiPriority="9" w:qFormat="1"/>
-    <w:lsdException w:name="heading 7" w:uiPriority="9" w:qFormat="1"/>
-    <w:lsdException w:name="heading 8" w:uiPriority="9" w:qFormat="1"/>
-    <w:lsdException w:name="heading 9" w:uiPriority="9" w:qFormat="1"/>
-    <w:lsdException w:name="toc 1" w:uiPriority="39"/>
-    <w:lsdException w:name="toc 2" w:uiPriority="39"/>
-    <w:lsdException w:name="toc 3" w:uiPriority="39"/>
-    <w:lsdException w:name="toc 4" w:uiPriority="39"/>
-    <w:lsdException w:name="toc 5" w:uiPriority="39"/>
-    <w:lsdException w:name="toc 6" w:uiPriority="39"/>
-    <w:lsdException w:name="toc 7" w:uiPriority="39"/>
-    <w:lsdException w:name="toc 8" w:uiPriority="39"/>
-    <w:lsdException w:name="toc 9" w:uiPriority="39"/>
-    <w:lsdException w:name="caption" w:uiPriority="35" w:qFormat="1"/>
-    <w:lsdException w:name="Title" w:semiHidden="0" w:uiPriority="10" w:unhideWhenUsed="0" w:qFormat="1"/>
-    <w:lsdException w:name="Default Paragraph Font" w:uiPriority="1"/>
-    <w:lsdException w:name="Subtitle" w:semiHidden="0" w:uiPriority="11" w:unhideWhenUsed="0" w:qFormat="1"/>
-    <w:lsdException w:name="Strong" w:semiHidden="0" w:uiPriority="22" w:unhideWhenUsed="0" w:qFormat="1"/>
-    <w:lsdException w:name="Emphasis" w:semiHidden="0" w:uiPriority="20" w:unhideWhenUsed="0" w:qFormat="1"/>
-    <w:lsdException w:name="Table Grid" w:semiHidden="0" w:uiPriority="59" w:unhideWhenUsed="0"/>
-    <w:lsdException w:name="Placeholder Text" w:unhideWhenUsed="0"/>
-    <w:lsdException w:name="No Spacing" w:semiHidden="0" w:uiPriority="1" w:unhideWhenUsed="0" w:qFormat="1"/>
-    <w:lsdException w:name="Light Shading" w:semiHidden="0" w:uiPriority="60" w:unhideWhenUsed="0"/>
-    <w:lsdException w:name="Light List" w:semiHidden="0" w:uiPriority="61" w:unhideWhenUsed="0"/>
-    <w:lsdException w:name="Light Grid" w:semiHidden="0" w:uiPriority="62" w:unhideWhenUsed="0"/>
-    <w:lsdException w:name="Medium Shading 1" w:semiHidden="0" w:uiPriority="63" w:unhideWhenUsed="0"/>
-    <w:lsdException w:name="Medium Shading 2" w:semiHidden="0" w:uiPriority="64" w:unhideWhenUsed="0"/>
-    <w:lsdException w:name="Medium List 1" w:semiHidden="0" w:uiPriority="65" w:unhideWhenUsed="0"/>
-    <w:lsdException w:name="Medium List 2" w:semiHidden="0" w:uiPriority="66" w:unhideWhenUsed="0"/>
-    <w:lsdException w:name="Medium Grid 1" w:semiHidden="0" w:uiPriority="67" w:unhideWhenUsed="0"/>
-    <w:lsdException w:name="Medium Grid 2" w:semiHidden="0" w:uiPriority="68" w:unhideWhenUsed="0"/>
-    <w:lsdException w:name="Medium Grid 3" w:semiHidden="0" w:uiPriority="69" w:unhideWhenUsed="0"/>
-    <w:lsdException w:name="Dark List" w:semiHidden="0" w:uiPriority="70" w:unhideWhenUsed="0"/>
-    <w:lsdException w:name="Colorful Shading" w:semiHidden="0" w:uiPriority="71" w:unhideWhenUsed="0"/>
-    <w:lsdException w:name="Colorful List" w:semiHidden="0" w:uiPriority="72" w:unhideWhenUsed="0"/>
-    <w:lsdException w:name="Colorful Grid" w:semiHidden="0" w:uiPriority="73" w:unhideWhenUsed="0"/>
-    <w:lsdException w:name="Light Shading Accent 1" w:semiHidden="0" w:uiPriority="60" w:unhideWhenUsed="0"/>
-    <w:lsdException w:name="Light List Accent 1" w:semiHidden="0" w:uiPriority="61" w:unhideWhenUsed="0"/>
-    <w:lsdException w:name="Light Grid Accent 1" w:semiHidden="0" w:uiPriority="62" w:unhideWhenUsed="0"/>
-    <w:lsdException w:name="Medium Shading 1 Accent 1" w:semiHidden="0" w:uiPriority="63" w:unhideWhenUsed="0"/>
-    <w:lsdException w:name="Medium Shading 2 Accent 1" w:semiHidden="0" w:uiPriority="64" w:unhideWhenUsed="0"/>
-    <w:lsdException w:name="Medium List 1 Accent 1" w:semiHidden="0" w:uiPriority="65" w:unhideWhenUsed="0"/>
-    <w:lsdException w:name="Revision" w:unhideWhenUsed="0"/>
-    <w:lsdException w:name="List Paragraph" w:semiHidden="0" w:uiPriority="34" w:unhideWhenUsed="0" w:qFormat="1"/>
-    <w:lsdException w:name="Quote" w:semiHidden="0" w:uiPriority="29" w:unhideWhenUsed="0" w:qFormat="1"/>
-    <w:lsdException w:name="Intense Quote" w:semiHidden="0" w:uiPriority="30" w:unhideWhenUsed="0" w:qFormat="1"/>
-    <w:lsdException w:name="Medium List 2 Accent 1" w:semiHidden="0" w:uiPriority="66" w:unhideWhenUsed="0"/>
-    <w:lsdException w:name="Medium Grid 1 Accent 1" w:semiHidden="0" w:uiPriority="67" w:unhideWhenUsed="0"/>
-    <w:lsdException w:name="Medium Grid 2 Accent 1" w:semiHidden="0" w:uiPriority="68" w:unhideWhenUsed="0"/>
-    <w:lsdException w:name="Medium Grid 3 Accent 1" w:semiHidden="0" w:uiPriority="69" w:unhideWhenUsed="0"/>
-    <w:lsdException w:name="Dark List Accent 1" w:semiHidden="0" w:uiPriority="70" w:unhideWhenUsed="0"/>
-    <w:lsdException w:name="Colorful Shading Accent 1" w:semiHidden="0" w:uiPriority="71" w:unhideWhenUsed="0"/>
-    <w:lsdException w:name="Colorful List Accent 1" w:semiHidden="0" w:uiPriority="72" w:unhideWhenUsed="0"/>
-    <w:lsdException w:name="Colorful Grid Accent 1" w:semiHidden="0" w:uiPriority="73" w:unhideWhenUsed="0"/>
-    <w:lsdException w:name="Light Shading Accent 2" w:semiHidden="0" w:uiPriority="60" w:unhideWhenUsed="0"/>
-    <w:lsdException w:name="Light List Accent 2" w:semiHidden="0" w:uiPriority="61" w:unhideWhenUsed="0"/>
-    <w:lsdException w:name="Light Grid Accent 2" w:semiHidden="0" w:uiPriority="62" w:unhideWhenUsed="0"/>
-    <w:lsdException w:name="Medium Shading 1 Accent 2" w:semiHidden="0" w:uiPriority="63" w:unhideWhenUsed="0"/>
-    <w:lsdException w:name="Medium Shading 2 Accent 2" w:semiHidden="0" w:uiPriority="64" w:unhideWhenUsed="0"/>
-    <w:lsdException w:name="Medium List 1 Accent 2" w:semiHidden="0" w:uiPriority="65" w:unhideWhenUsed="0"/>
-    <w:lsdException w:name="Medium List 2 Accent 2" w:semiHidden="0" w:uiPriority="66" w:unhideWhenUsed="0"/>
-    <w:lsdException w:name="Medium Grid 1 Accent 2" w:semiHidden="0" w:uiPriority="67" w:unhideWhenUsed="0"/>
-    <w:lsdException w:name="Medium Grid 2 Accent 2" w:semiHidden="0" w:uiPriority="68" w:unhideWhenUsed="0"/>
-    <w:lsdException w:name="Medium Grid 3 Accent 2" w:semiHidden="0" w:uiPriority="69" w:unhideWhenUsed="0"/>
-    <w:lsdException w:name="Dark List Accent 2" w:semiHidden="0" w:uiPriority="70" w:unhideWhenUsed="0"/>
-    <w:lsdException w:name="Colorful Shading Accent 2" w:semiHidden="0" w:uiPriority="71" w:unhideWhenUsed="0"/>
-    <w:lsdException w:name="Colorful List Accent 2" w:semiHidden="0" w:uiPriority="72" w:unhideWhenUsed="0"/>
-    <w:lsdException w:name="Colorful Grid Accent 2" w:semiHidden="0" w:uiPriority="73" w:unhideWhenUsed="0"/>
-    <w:lsdException w:name="Light Shading Accent 3" w:semiHidden="0" w:uiPriority="60" w:unhideWhenUsed="0"/>
-    <w:lsdException w:name="Light List Accent 3" w:semiHidden="0" w:uiPriority="61" w:unhideWhenUsed="0"/>
-    <w:lsdException w:name="Light Grid Accent 3" w:semiHidden="0" w:uiPriority="62" w:unhideWhenUsed="0"/>
-    <w:lsdException w:name="Medium Shading 1 Accent 3" w:semiHidden="0" w:uiPriority="63" w:unhideWhenUsed="0"/>
-    <w:lsdException w:name="Medium Shading 2 Accent 3" w:semiHidden="0" w:uiPriority="64" w:unhideWhenUsed="0"/>
-    <w:lsdException w:name="Medium List 1 Accent 3" w:semiHidden="0" w:uiPriority="65" w:unhideWhenUsed="0"/>
-    <w:lsdException w:name="Medium List 2 Accent 3" w:semiHidden="0" w:uiPriority="66" w:unhideWhenUsed="0"/>
-    <w:lsdException w:name="Medium Grid 1 Accent 3" w:semiHidden="0" w:uiPriority="67" w:unhideWhenUsed="0"/>
-    <w:lsdException w:name="Medium Grid 2 Accent 3" w:semiHidden="0" w:uiPriority="68" w:unhideWhenUsed="0"/>
-    <w:lsdException w:name="Medium Grid 3 Accent 3" w:semiHidden="0" w:uiPriority="69" w:unhideWhenUsed="0"/>
-    <w:lsdException w:name="Dark List Accent 3" w:semiHidden="0" w:uiPriority="70" w:unhideWhenUsed="0"/>
-    <w:lsdException w:name="Colorful Shading Accent 3" w:semiHidden="0" w:uiPriority="71" w:unhideWhenUsed="0"/>
-    <w:lsdException w:name="Colorful List Accent 3" w:semiHidden="0" w:uiPriority="72" w:unhideWhenUsed="0"/>
-    <w:lsdException w:name="Colorful Grid Accent 3" w:semiHidden="0" w:uiPriority="73" w:unhideWhenUsed="0"/>
-    <w:lsdException w:name="Light Shading Accent 4" w:semiHidden="0" w:uiPriority="60" w:unhideWhenUsed="0"/>
-    <w:lsdException w:name="Light List Accent 4" w:semiHidden="0" w:uiPriority="61" w:unhideWhenUsed="0"/>
-    <w:lsdException w:name="Light Grid Accent 4" w:semiHidden="0" w:uiPriority="62" w:unhideWhenUsed="0"/>
-    <w:lsdException w:name="Medium Shading 1 Accent 4" w:semiHidden="0" w:uiPriority="63" w:unhideWhenUsed="0"/>
-    <w:lsdException w:name="Medium Shading 2 Accent 4" w:semiHidden="0" w:uiPriority="64" w:unhideWhenUsed="0"/>
-    <w:lsdException w:name="Medium List 1 Accent 4" w:semiHidden="0" w:uiPriority="65" w:unhideWhenUsed="0"/>
-    <w:lsdException w:name="Medium List 2 Accent 4" w:semiHidden="0" w:uiPriority="66" w:unhideWhenUsed="0"/>
-    <w:lsdException w:name="Medium Grid 1 Accent 4" w:semiHidden="0" w:uiPriority="67" w:unhideWhenUsed="0"/>
-    <w:lsdException w:name="Medium Grid 2 Accent 4" w:semiHidden="0" w:uiPriority="68" w:unhideWhenUsed="0"/>
-    <w:lsdException w:name="Medium Grid 3 Accent 4" w:semiHidden="0" w:uiPriority="69" w:unhideWhenUsed="0"/>
-    <w:lsdException w:name="Dark List Accent 4" w:semiHidden="0" w:uiPriority="70" w:unhideWhenUsed="0"/>
-    <w:lsdException w:name="Colorful Shading Accent 4" w:semiHidden="0" w:uiPriority="71" w:unhideWhenUsed="0"/>
-    <w:lsdException w:name="Colorful List Accent 4" w:semiHidden="0" w:uiPriority="72" w:unhideWhenUsed="0"/>
-    <w:lsdException w:name="Colorful Grid Accent 4" w:semiHidden="0" w:uiPriority="73" w:unhideWhenUsed="0"/>
-    <w:lsdException w:name="Light Shading Accent 5" w:semiHidden="0" w:uiPriority="60" w:unhideWhenUsed="0"/>
-    <w:lsdException w:name="Light List Accent 5" w:semiHidden="0" w:uiPriority="61" w:unhideWhenUsed="0"/>
-    <w:lsdException w:name="Light Grid Accent 5" w:semiHidden="0" w:uiPriority="62" w:unhideWhenUsed="0"/>
-    <w:lsdException w:name="Medium Shading 1 Accent 5" w:semiHidden="0" w:uiPriority="63" w:unhideWhenUsed="0"/>
-    <w:lsdException w:name="Medium Shading 2 Accent 5" w:semiHidden="0" w:uiPriority="64" w:unhideWhenUsed="0"/>
-    <w:lsdException w:name="Medium List 1 Accent 5" w:semiHidden="0" w:uiPriority="65" w:unhideWhenUsed="0"/>
-    <w:lsdException w:name="Medium List 2 Accent 5" w:semiHidden="0" w:uiPriority="66" w:unhideWhenUsed="0"/>
-    <w:lsdException w:name="Medium Grid 1 Accent 5" w:semiHidden="0" w:uiPriority="67" w:unhideWhenUsed="0"/>
-    <w:lsdException w:name="Medium Grid 2 Accent 5" w:semiHidden="0" w:uiPriority="68" w:unhideWhenUsed="0"/>
-    <w:lsdException w:name="Medium Grid 3 Accent 5" w:semiHidden="0" w:uiPriority="69" w:unhideWhenUsed="0"/>
-    <w:lsdException w:name="Dark List Accent 5" w:semiHidden="0" w:uiPriority="70" w:unhideWhenUsed="0"/>
-    <w:lsdException w:name="Colorful Shading Accent 5" w:semiHidden="0" w:uiPriority="71" w:unhideWhenUsed="0"/>
-    <w:lsdException w:name="Colorful List Accent 5" w:semiHidden="0" w:uiPriority="72" w:unhideWhenUsed="0"/>
-    <w:lsdException w:name="Colorful Grid Accent 5" w:semiHidden="0" w:uiPriority="73" w:unhideWhenUsed="0"/>
-    <w:lsdException w:name="Light Shading Accent 6" w:semiHidden="0" w:uiPriority="60" w:unhideWhenUsed="0"/>
-    <w:lsdException w:name="Light List Accent 6" w:semiHidden="0" w:uiPriority="61" w:unhideWhenUsed="0"/>
-    <w:lsdException w:name="Light Grid Accent 6" w:semiHidden="0" w:uiPriority="62" w:unhideWhenUsed="0"/>
-    <w:lsdException w:name="Medium Shading 1 Accent 6" w:semiHidden="0" w:uiPriority="63" w:unhideWhenUsed="0"/>
-    <w:lsdException w:name="Medium Shading 2 Accent 6" w:semiHidden="0" w:uiPriority="64" w:unhideWhenUsed="0"/>
-    <w:lsdException w:name="Medium List 1 Accent 6" w:semiHidden="0" w:uiPriority="65" w:unhideWhenUsed="0"/>
-    <w:lsdException w:name="Medium List 2 Accent 6" w:semiHidden="0" w:uiPriority="66" w:unhideWhenUsed="0"/>
-    <w:lsdException w:name="Medium Grid 1 Accent 6" w:semiHidden="0" w:uiPriority="67" w:unhideWhenUsed="0"/>
-    <w:lsdException w:name="Medium Grid 2 Accent 6" w:semiHidden="0" w:uiPriority="68" w:unhideWhenUsed="0"/>
-    <w:lsdException w:name="Medium Grid 3 Accent 6" w:semiHidden="0" w:uiPriority="69" w:unhideWhenUsed="0"/>
-    <w:lsdException w:name="Dark List Accent 6" w:semiHidden="0" w:uiPriority="70" w:unhideWhenUsed="0"/>
-    <w:lsdException w:name="Colorful Shading Accent 6" w:semiHidden="0" w:uiPriority="71" w:unhideWhenUsed="0"/>
-    <w:lsdException w:name="Colorful List Accent 6" w:semiHidden="0" w:uiPriority="72" w:unhideWhenUsed="0"/>
-    <w:lsdException w:name="Colorful Grid Accent 6" w:semiHidden="0" w:uiPriority="73" w:unhideWhenUsed="0"/>
-    <w:lsdException w:name="Subtle Emphasis" w:semiHidden="0" w:uiPriority="19" w:unhideWhenUsed="0" w:qFormat="1"/>
-    <w:lsdException w:name="Intense Emphasis" w:semiHidden="0" w:uiPriority="21" w:unhideWhenUsed="0" w:qFormat="1"/>
-    <w:lsdException w:name="Subtle Reference" w:semiHidden="0" w:uiPriority="31" w:unhideWhenUsed="0" w:qFormat="1"/>
-    <w:lsdException w:name="Intense Reference" w:semiHidden="0" w:uiPriority="32" w:unhideWhenUsed="0" w:qFormat="1"/>
-    <w:lsdException w:name="Book Title" w:semiHidden="0" w:uiPriority="33" w:unhideWhenUsed="0" w:qFormat="1"/>
-    <w:lsdException w:name="Bibliography" w:uiPriority="37"/>
-    <w:lsdException w:name="TOC Heading" w:uiPriority="39" w:qFormat="1"/>
-  </w:latentStyles>
-  <w:style w:type="paragraph" w:default="1" w:styleId="Normal">
-    <w:name w:val="Normal"/>
-  </w:style>
-  <w:style w:type="paragraph" w:styleId="Ttulo1">
-    <w:name w:val="heading 1"/>
-    <w:basedOn w:val="Normal"/>
-    <w:next w:val="Normal"/>
-    <w:pPr>
-      <w:keepNext/>
-      <w:keepLines/>
-      <w:ind w:right="-607"/>
-      <w:outlineLvl w:val="0"/>
-    </w:pPr>
-    <w:rPr>
-      <w:rFonts w:ascii="Economica" w:eastAsia="Economica" w:hAnsi="Economica" w:cs="Economica"/>
-      <w:sz w:val="28"/>
-      <w:szCs w:val="28"/>
-    </w:rPr>
-  </w:style>
-  <w:style w:type="paragraph" w:styleId="Ttulo2">
-    <w:name w:val="heading 2"/>
-    <w:basedOn w:val="Normal"/>
-    <w:next w:val="Normal"/>
-    <w:pPr>
-      <w:keepNext/>
-      <w:keepLines/>
-      <w:outlineLvl w:val="1"/>
-    </w:pPr>
-    <w:rPr>
-      <w:rFonts w:ascii="Open Sans ExtraBold" w:eastAsia="Open Sans ExtraBold" w:hAnsi="Open Sans ExtraBold" w:cs="Open Sans ExtraBold"/>
-      <w:color w:val="FFAA00"/>
-      <w:sz w:val="20"/>
-      <w:szCs w:val="20"/>
-    </w:rPr>
-  </w:style>
-  <w:style w:type="paragraph" w:styleId="Ttulo3">
-    <w:name w:val="heading 3"/>
-    <w:basedOn w:val="Normal"/>
-    <w:next w:val="Normal"/>
-    <w:pPr>
-      <w:keepNext/>
-      <w:keepLines/>
-      <w:spacing w:before="320" w:after="80"/>
-      <w:outlineLvl w:val="2"/>
-    </w:pPr>
-    <w:rPr>
-      <w:color w:val="434343"/>
-      <w:sz w:val="28"/>
-      <w:szCs w:val="28"/>
-    </w:rPr>
-  </w:style>
-  <w:style w:type="paragraph" w:styleId="Ttulo4">
-    <w:name w:val="heading 4"/>
-    <w:basedOn w:val="Normal"/>
-    <w:next w:val="Normal"/>
-    <w:pPr>
-      <w:keepNext/>
-      <w:keepLines/>
-      <w:spacing w:before="280" w:after="80"/>
-      <w:outlineLvl w:val="3"/>
-    </w:pPr>
-    <w:rPr>
-      <w:color w:val="666666"/>
-    </w:rPr>
-  </w:style>
-  <w:style w:type="paragraph" w:styleId="Ttulo5">
-    <w:name w:val="heading 5"/>
-    <w:basedOn w:val="Normal"/>
-    <w:next w:val="Normal"/>
-    <w:pPr>
-      <w:keepNext/>
-      <w:keepLines/>
-      <w:spacing w:before="240" w:after="80"/>
-      <w:outlineLvl w:val="4"/>
-    </w:pPr>
-    <w:rPr>
-      <w:color w:val="666666"/>
-      <w:sz w:val="22"/>
-      <w:szCs w:val="22"/>
-    </w:rPr>
-  </w:style>
-  <w:style w:type="paragraph" w:styleId="Ttulo6">
-    <w:name w:val="heading 6"/>
-    <w:basedOn w:val="Normal"/>
-    <w:next w:val="Normal"/>
-    <w:pPr>
-      <w:keepNext/>
-      <w:keepLines/>
-      <w:spacing w:before="240" w:after="80"/>
-      <w:outlineLvl w:val="5"/>
-    </w:pPr>
-    <w:rPr>
-      <w:i/>
-      <w:iCs/>
-      <w:color w:val="666666"/>
-      <w:sz w:val="22"/>
-      <w:szCs w:val="22"/>
-    </w:rPr>
-  </w:style>
-  <w:style w:type="character" w:default="1" w:styleId="Fuentedeprrafopredeter">
-    <w:name w:val="Default Paragraph Font"/>
-    <w:uiPriority w:val="1"/>
-    <w:semiHidden/>
-    <w:unhideWhenUsed/>
-  </w:style>
-  <w:style w:type="table" w:default="1" w:styleId="Tablanormal">
-    <w:name w:val="Normal Table"/>
-    <w:uiPriority w:val="99"/>
-    <w:semiHidden/>
-    <w:unhideWhenUsed/>
-    <w:tblPr>
-      <w:tblInd w:w="0" w:type="dxa"/>
-      <w:tblCellMar>
-        <w:top w:w="0" w:type="dxa"/>
-        <w:left w:w="108" w:type="dxa"/>
-        <w:bottom w:w="0" w:type="dxa"/>
-        <w:right w:w="108" w:type="dxa"/>
-      </w:tblCellMar>
-    </w:tblPr>
-  </w:style>
-  <w:style w:type="numbering" w:default="1" w:styleId="Sinlista">
-    <w:name w:val="No List"/>
-    <w:uiPriority w:val="99"/>
-    <w:semiHidden/>
-    <w:unhideWhenUsed/>
-  </w:style>
-  <w:style w:type="table" w:customStyle="1" w:styleId="TableNormal">
-    <w:name w:val="TableNormal"/>
-    <w:tblPr>
-      <w:tblCellMar>
-        <w:top w:w="100" w:type="dxa"/>
-        <w:left w:w="100" w:type="dxa"/>
-        <w:bottom w:w="100" w:type="dxa"/>
-        <w:right w:w="100" w:type="dxa"/>
-      </w:tblCellMar>
-    </w:tblPr>
-  </w:style>
-  <w:style w:type="paragraph" w:styleId="Ttulo">
-    <w:name w:val="Title"/>
-    <w:basedOn w:val="Normal"/>
-    <w:next w:val="Normal"/>
-    <w:pPr>
-      <w:keepNext/>
-      <w:keepLines/>
-      <w:spacing w:after="60"/>
-    </w:pPr>
-    <w:rPr>
-      <w:sz w:val="52"/>
-      <w:szCs w:val="52"/>
-    </w:rPr>
-  </w:style>
-  <w:style w:type="paragraph" w:styleId="Subttulo">
-    <w:name w:val="Subtitle"/>
-    <w:basedOn w:val="Normal"/>
-    <w:next w:val="Normal"/>
-    <w:pPr>
-      <w:keepNext/>
-      <w:keepLines/>
-      <w:spacing w:after="320"/>
-    </w:pPr>
-    <w:rPr>
-      <w:color w:val="666666"/>
-      <w:sz w:val="30"/>
-      <w:szCs w:val="30"/>
-    </w:rPr>
-  </w:style>
-  <w:style w:type="table" w:customStyle="1" w:styleId="a">
-    <w:basedOn w:val="TableNormal"/>
-    <w:tblPr>
-      <w:tblStyleRowBandSize w:val="1"/>
-      <w:tblStyleColBandSize w:val="1"/>
-      <w:tblCellMar>
-        <w:top w:w="100" w:type="dxa"/>
-        <w:left w:w="100" w:type="dxa"/>
-        <w:bottom w:w="100" w:type="dxa"/>
-        <w:right w:w="100" w:type="dxa"/>
-      </w:tblCellMar>
     </w:tblPr>
   </w:style>
   <w:style w:type="paragraph" w:styleId="Textodeglobo">

</xml_diff>

<commit_message>
Agregación de carátula, presentación del equipo y logo
</commit_message>
<xml_diff>
--- a/TPI Análisis de sistemas.docx
+++ b/TPI Análisis de sistemas.docx
@@ -14,6 +14,85 @@
       </w:pPr>
       <w:bookmarkStart w:id="0" w:name="_i4jvud2ywpcp" w:colFirst="0" w:colLast="0"/>
       <w:bookmarkEnd w:id="0"/>
+      <w:r>
+        <w:rPr>
+          <w:noProof/>
+          <w:color w:val="000000"/>
+          <w:sz w:val="26"/>
+          <w:szCs w:val="26"/>
+          <w:bdr w:val="none" w:sz="0" w:space="0" w:color="auto" w:frame="1"/>
+        </w:rPr>
+        <w:drawing>
+          <wp:inline distT="0" distB="0" distL="0" distR="0" wp14:anchorId="1CCAA310" wp14:editId="19110C2F">
+            <wp:extent cx="5811520" cy="8229600"/>
+            <wp:effectExtent l="0" t="0" r="0" b="0"/>
+            <wp:docPr id="973793488" name="Imagen 1"/>
+            <wp:cNvGraphicFramePr>
+              <a:graphicFrameLocks xmlns:a="http://schemas.openxmlformats.org/drawingml/2006/main" noChangeAspect="1"/>
+            </wp:cNvGraphicFramePr>
+            <a:graphic xmlns:a="http://schemas.openxmlformats.org/drawingml/2006/main">
+              <a:graphicData uri="http://schemas.openxmlformats.org/drawingml/2006/picture">
+                <pic:pic xmlns:pic="http://schemas.openxmlformats.org/drawingml/2006/picture">
+                  <pic:nvPicPr>
+                    <pic:cNvPr id="0" name="Picture 1"/>
+                    <pic:cNvPicPr>
+                      <a:picLocks noChangeAspect="1" noChangeArrowheads="1"/>
+                    </pic:cNvPicPr>
+                  </pic:nvPicPr>
+                  <pic:blipFill>
+                    <a:blip r:embed="rId7" cstate="print">
+                      <a:extLst>
+                        <a:ext uri="{28A0092B-C50C-407E-A947-70E740481C1C}">
+                          <a14:useLocalDpi xmlns:a14="http://schemas.microsoft.com/office/drawing/2010/main" val="0"/>
+                        </a:ext>
+                      </a:extLst>
+                    </a:blip>
+                    <a:srcRect/>
+                    <a:stretch>
+                      <a:fillRect/>
+                    </a:stretch>
+                  </pic:blipFill>
+                  <pic:spPr bwMode="auto">
+                    <a:xfrm>
+                      <a:off x="0" y="0"/>
+                      <a:ext cx="5811520" cy="8229600"/>
+                    </a:xfrm>
+                    <a:prstGeom prst="rect">
+                      <a:avLst/>
+                    </a:prstGeom>
+                    <a:noFill/>
+                    <a:ln>
+                      <a:noFill/>
+                    </a:ln>
+                  </pic:spPr>
+                </pic:pic>
+              </a:graphicData>
+            </a:graphic>
+          </wp:inline>
+        </w:drawing>
+      </w:r>
+    </w:p>
+    <w:p>
+      <w:pPr>
+        <w:pStyle w:val="Ttulo1"/>
+        <w:ind w:left="0"/>
+        <w:rPr>
+          <w:sz w:val="26"/>
+          <w:szCs w:val="26"/>
+          <w:lang w:val="es-AR"/>
+        </w:rPr>
+      </w:pPr>
+    </w:p>
+    <w:p>
+      <w:pPr>
+        <w:pStyle w:val="Ttulo1"/>
+        <w:ind w:left="0"/>
+        <w:rPr>
+          <w:sz w:val="26"/>
+          <w:szCs w:val="26"/>
+          <w:lang w:val="es-AR"/>
+        </w:rPr>
+      </w:pPr>
       <w:r>
         <w:rPr>
           <w:sz w:val="26"/>
@@ -181,10 +260,383 @@
       <w:pPr>
         <w:pStyle w:val="Ttulo2"/>
         <w:ind w:left="0"/>
+        <w:rPr>
+          <w:lang w:val="es-ES"/>
+        </w:rPr>
+      </w:pPr>
+      <w:r>
+        <w:rPr>
+          <w:lang w:val="es-ES"/>
+        </w:rPr>
+        <w:t>PRESENTACION DEL EQUIPO DE TRABAJO</w:t>
+      </w:r>
+    </w:p>
+    <w:p>
+      <w:pPr>
+        <w:pStyle w:val="Ttulo2"/>
+        <w:ind w:left="0"/>
+        <w:rPr>
+          <w:rFonts w:ascii="Arial" w:hAnsi="Arial" w:cs="Arial"/>
+          <w:color w:val="auto"/>
+          <w:sz w:val="24"/>
+          <w:szCs w:val="24"/>
+          <w:lang w:val="es-ES"/>
+        </w:rPr>
+      </w:pPr>
+      <w:r>
+        <w:rPr>
+          <w:color w:val="auto"/>
+          <w:lang w:val="es-AR"/>
+        </w:rPr>
+        <w:t>NOMBRE DE LA EMPRESA:</w:t>
+      </w:r>
+      <w:r>
+        <w:rPr>
+          <w:rFonts w:ascii="Arial" w:hAnsi="Arial" w:cs="Arial"/>
+          <w:color w:val="auto"/>
+          <w:sz w:val="24"/>
+          <w:szCs w:val="24"/>
+          <w:lang w:val="es-AR"/>
+        </w:rPr>
+        <w:t xml:space="preserve"> </w:t>
+      </w:r>
+      <w:proofErr w:type="spellStart"/>
+      <w:r>
+        <w:rPr>
+          <w:rFonts w:ascii="Arial" w:hAnsi="Arial" w:cs="Arial"/>
+          <w:color w:val="auto"/>
+          <w:sz w:val="24"/>
+          <w:szCs w:val="24"/>
+          <w:lang w:val="es-ES"/>
+        </w:rPr>
+        <w:t>Nexura</w:t>
+      </w:r>
+      <w:proofErr w:type="spellEnd"/>
+    </w:p>
+    <w:p>
+      <w:pPr>
+        <w:pStyle w:val="Ttulo2"/>
+        <w:ind w:left="0"/>
+        <w:rPr>
+          <w:color w:val="auto"/>
+          <w:lang w:val="es-AR"/>
+        </w:rPr>
+      </w:pPr>
+      <w:r>
+        <w:rPr>
+          <w:color w:val="auto"/>
+          <w:lang w:val="es-AR"/>
+        </w:rPr>
+        <w:t>INTEGRANTES:</w:t>
+      </w:r>
+    </w:p>
+    <w:p>
+      <w:pPr>
+        <w:numPr>
+          <w:ilvl w:val="0"/>
+          <w:numId w:val="2"/>
+        </w:numPr>
+        <w:spacing w:after="200"/>
+        <w:rPr>
+          <w:b/>
+          <w:bCs/>
+          <w:lang w:val="es-ES"/>
+        </w:rPr>
+      </w:pPr>
+      <w:r>
+        <w:rPr>
+          <w:lang w:val="es-ES"/>
+        </w:rPr>
+        <w:t>Augusto, Tomás</w:t>
+      </w:r>
+    </w:p>
+    <w:p>
+      <w:pPr>
+        <w:numPr>
+          <w:ilvl w:val="0"/>
+          <w:numId w:val="2"/>
+        </w:numPr>
+        <w:spacing w:after="200"/>
+        <w:rPr>
+          <w:b/>
+          <w:bCs/>
+          <w:lang w:val="es-ES"/>
+        </w:rPr>
+      </w:pPr>
+      <w:r>
+        <w:rPr>
+          <w:lang w:val="es-ES"/>
+        </w:rPr>
+        <w:t>Fernández, Manolo</w:t>
+      </w:r>
+    </w:p>
+    <w:p>
+      <w:pPr>
+        <w:numPr>
+          <w:ilvl w:val="0"/>
+          <w:numId w:val="2"/>
+        </w:numPr>
+        <w:spacing w:after="200"/>
+        <w:rPr>
+          <w:b/>
+          <w:bCs/>
+          <w:lang w:val="es-ES"/>
+        </w:rPr>
+      </w:pPr>
+      <w:r>
+        <w:rPr>
+          <w:lang w:val="es-ES"/>
+        </w:rPr>
+        <w:t>Ludueña, Sofía Milagros</w:t>
+      </w:r>
+    </w:p>
+    <w:p>
+      <w:pPr>
+        <w:numPr>
+          <w:ilvl w:val="0"/>
+          <w:numId w:val="2"/>
+        </w:numPr>
+        <w:spacing w:after="200"/>
+        <w:rPr>
+          <w:b/>
+          <w:bCs/>
+          <w:lang w:val="es-ES"/>
+        </w:rPr>
+      </w:pPr>
+      <w:r>
+        <w:rPr>
+          <w:lang w:val="es-ES"/>
+        </w:rPr>
+        <w:t>Maldonado Marini, Facundo</w:t>
+      </w:r>
+    </w:p>
+    <w:p>
+      <w:pPr>
+        <w:numPr>
+          <w:ilvl w:val="0"/>
+          <w:numId w:val="2"/>
+        </w:numPr>
+        <w:spacing w:after="200"/>
+        <w:rPr>
+          <w:b/>
+          <w:bCs/>
+          <w:lang w:val="es-ES"/>
+        </w:rPr>
+      </w:pPr>
+      <w:r>
+        <w:rPr>
+          <w:lang w:val="es-ES"/>
+        </w:rPr>
+        <w:t xml:space="preserve">Rovera </w:t>
+      </w:r>
+      <w:proofErr w:type="spellStart"/>
+      <w:r>
+        <w:rPr>
+          <w:lang w:val="es-ES"/>
+        </w:rPr>
+        <w:t>Porporato</w:t>
+      </w:r>
+      <w:proofErr w:type="spellEnd"/>
+      <w:r>
+        <w:rPr>
+          <w:lang w:val="es-ES"/>
+        </w:rPr>
+        <w:t>, Felipe</w:t>
+      </w:r>
+    </w:p>
+    <w:p>
+      <w:pPr>
+        <w:numPr>
+          <w:ilvl w:val="0"/>
+          <w:numId w:val="2"/>
+        </w:numPr>
+        <w:spacing w:after="200"/>
+        <w:rPr>
+          <w:b/>
+          <w:bCs/>
+          <w:lang w:val="es-ES"/>
+        </w:rPr>
+      </w:pPr>
+      <w:proofErr w:type="spellStart"/>
+      <w:r>
+        <w:rPr>
+          <w:lang w:val="es-ES"/>
+        </w:rPr>
+        <w:t>Sanchez</w:t>
+      </w:r>
+      <w:proofErr w:type="spellEnd"/>
+      <w:r>
+        <w:rPr>
+          <w:lang w:val="es-ES"/>
+        </w:rPr>
+        <w:t xml:space="preserve"> Toranzo, Lisandro </w:t>
+      </w:r>
+    </w:p>
+    <w:p>
+      <w:pPr>
+        <w:pStyle w:val="Ttulo2"/>
+        <w:shd w:val="clear" w:color="auto" w:fill="FFFFFF"/>
+        <w:spacing w:before="60" w:after="0"/>
+        <w:ind w:left="360" w:right="-278"/>
+        <w:rPr>
+          <w:rFonts w:ascii="Arial" w:hAnsi="Arial" w:cs="Arial"/>
+          <w:color w:val="000000"/>
+          <w:sz w:val="24"/>
+          <w:szCs w:val="24"/>
+          <w:lang w:val="es-ES"/>
+        </w:rPr>
+      </w:pPr>
+      <w:r>
+        <w:rPr>
+          <w:rFonts w:ascii="Arial" w:hAnsi="Arial" w:cs="Arial"/>
+          <w:b/>
+          <w:bCs/>
+          <w:color w:val="000000"/>
+          <w:lang w:val="es-ES"/>
+        </w:rPr>
+        <w:lastRenderedPageBreak/>
+        <w:t xml:space="preserve">¿QUIENES SOMOS?  </w:t>
+      </w:r>
+      <w:r>
+        <w:rPr>
+          <w:rFonts w:ascii="Arial" w:hAnsi="Arial" w:cs="Arial"/>
+          <w:noProof/>
+          <w:bdr w:val="none" w:sz="0" w:space="0" w:color="auto" w:frame="1"/>
+          <w:lang w:val="es-ES"/>
+        </w:rPr>
+        <w:t xml:space="preserve"> </w:t>
+      </w:r>
+      <w:r>
+        <w:rPr>
+          <w:rFonts w:ascii="Arial" w:hAnsi="Arial" w:cs="Arial"/>
+          <w:noProof/>
+          <w:bdr w:val="none" w:sz="0" w:space="0" w:color="auto" w:frame="1"/>
+        </w:rPr>
+        <w:drawing>
+          <wp:anchor distT="0" distB="0" distL="114300" distR="114300" simplePos="0" relativeHeight="251654656" behindDoc="0" locked="0" layoutInCell="1" allowOverlap="1" wp14:anchorId="7C86037C" wp14:editId="3C40AB6D">
+            <wp:simplePos x="914400" y="2087880"/>
+            <wp:positionH relativeFrom="margin">
+              <wp:align>left</wp:align>
+            </wp:positionH>
+            <wp:positionV relativeFrom="margin">
+              <wp:align>top</wp:align>
+            </wp:positionV>
+            <wp:extent cx="2781300" cy="1569720"/>
+            <wp:effectExtent l="0" t="0" r="0" b="0"/>
+            <wp:wrapSquare wrapText="bothSides"/>
+            <wp:docPr id="395671270" name="Imagen 3"/>
+            <wp:cNvGraphicFramePr>
+              <a:graphicFrameLocks xmlns:a="http://schemas.openxmlformats.org/drawingml/2006/main" noChangeAspect="1"/>
+            </wp:cNvGraphicFramePr>
+            <a:graphic xmlns:a="http://schemas.openxmlformats.org/drawingml/2006/main">
+              <a:graphicData uri="http://schemas.openxmlformats.org/drawingml/2006/picture">
+                <pic:pic xmlns:pic="http://schemas.openxmlformats.org/drawingml/2006/picture">
+                  <pic:nvPicPr>
+                    <pic:cNvPr id="0" name="Picture 8"/>
+                    <pic:cNvPicPr>
+                      <a:picLocks noChangeAspect="1" noChangeArrowheads="1"/>
+                    </pic:cNvPicPr>
+                  </pic:nvPicPr>
+                  <pic:blipFill>
+                    <a:blip r:embed="rId8" cstate="print">
+                      <a:extLst>
+                        <a:ext uri="{28A0092B-C50C-407E-A947-70E740481C1C}">
+                          <a14:useLocalDpi xmlns:a14="http://schemas.microsoft.com/office/drawing/2010/main" val="0"/>
+                        </a:ext>
+                      </a:extLst>
+                    </a:blip>
+                    <a:srcRect/>
+                    <a:stretch>
+                      <a:fillRect/>
+                    </a:stretch>
+                  </pic:blipFill>
+                  <pic:spPr bwMode="auto">
+                    <a:xfrm>
+                      <a:off x="0" y="0"/>
+                      <a:ext cx="2781300" cy="1569720"/>
+                    </a:xfrm>
+                    <a:prstGeom prst="rect">
+                      <a:avLst/>
+                    </a:prstGeom>
+                    <a:noFill/>
+                    <a:ln>
+                      <a:noFill/>
+                    </a:ln>
+                  </pic:spPr>
+                </pic:pic>
+              </a:graphicData>
+            </a:graphic>
+          </wp:anchor>
+        </w:drawing>
+      </w:r>
+      <w:proofErr w:type="spellStart"/>
+      <w:r>
+        <w:rPr>
+          <w:rFonts w:ascii="Arial" w:hAnsi="Arial" w:cs="Arial"/>
+          <w:b/>
+          <w:bCs/>
+          <w:color w:val="000000"/>
+          <w:sz w:val="24"/>
+          <w:szCs w:val="24"/>
+          <w:lang w:val="es-ES"/>
+        </w:rPr>
+        <w:t>Nexura</w:t>
+      </w:r>
+      <w:proofErr w:type="spellEnd"/>
+      <w:r>
+        <w:rPr>
+          <w:rFonts w:ascii="Arial" w:hAnsi="Arial" w:cs="Arial"/>
+          <w:color w:val="000000"/>
+          <w:sz w:val="24"/>
+          <w:szCs w:val="24"/>
+          <w:lang w:val="es-ES"/>
+        </w:rPr>
+        <w:t xml:space="preserve"> es una consultora tecnológica conformada por un equipo de seis estudiantes avanzados de Ingeniería en Sistemas, unidos por la pasión de transformar dinámicas organizacionales complejas en soluciones de software eficientes, escalables y centradas en el usuario.  Nuestro nombre nace del concepto de "</w:t>
+      </w:r>
+      <w:r>
+        <w:rPr>
+          <w:rFonts w:ascii="Arial" w:hAnsi="Arial" w:cs="Arial"/>
+          <w:b/>
+          <w:bCs/>
+          <w:color w:val="000000"/>
+          <w:sz w:val="24"/>
+          <w:szCs w:val="24"/>
+          <w:lang w:val="es-ES"/>
+        </w:rPr>
+        <w:t>nexo</w:t>
+      </w:r>
+      <w:r>
+        <w:rPr>
+          <w:rFonts w:ascii="Arial" w:hAnsi="Arial" w:cs="Arial"/>
+          <w:color w:val="000000"/>
+          <w:sz w:val="24"/>
+          <w:szCs w:val="24"/>
+          <w:lang w:val="es-ES"/>
+        </w:rPr>
+        <w:t>", representando nuestra misión principal dentro del Análisis de Sistemas: actuar como el puente conector fundamental entre las necesidades reales del negocio, los usuarios y el desarrollo técnico de infraestructura tecnológica. Con una identidad impulsada por la energía de la innovación (naranja) y la claridad metodológica (blanco y amarillo), nos especializamos en desglosar problemas complejos para diseñar estructuras de información lógicas, sólidas y preparadas para el futuro.</w:t>
+      </w:r>
+    </w:p>
+    <w:p>
+      <w:pPr>
+        <w:rPr>
+          <w:lang w:val="es-ES"/>
+        </w:rPr>
+      </w:pPr>
+    </w:p>
+    <w:p>
+      <w:pPr>
+        <w:pStyle w:val="Ttulo2"/>
+        <w:ind w:left="0"/>
+        <w:rPr>
+          <w:lang w:val="es-ES"/>
+        </w:rPr>
       </w:pPr>
       <w:bookmarkStart w:id="2" w:name="_c3lfpgl42md5" w:colFirst="0" w:colLast="0"/>
       <w:bookmarkEnd w:id="2"/>
       <w:r>
+        <w:rPr>
+          <w:lang w:val="es-ES"/>
+        </w:rPr>
         <w:t>ENUNCIADO DEL CASO DE ESTUDIO</w:t>
       </w:r>
     </w:p>
@@ -229,25 +681,7 @@
           <w:iCs/>
           <w:color w:val="000000"/>
         </w:rPr>
-        <w:t xml:space="preserve">), nombre del retiro, ubicación, temática del retiro (Meditación, tracking, yoga, ceremonia del cacao, regresión a vidas pasadas, senderismo, armonización sonora), cronograma de actividades, costo, CON QUIÉN HABLÓ (Nombre del encargado, o </w:t>
-      </w:r>
-      <w:r>
-        <w:rPr>
-          <w:rFonts w:ascii="Arial" w:hAnsi="Arial" w:cs="Arial"/>
-          <w:i/>
-          <w:iCs/>
-          <w:color w:val="000000"/>
-        </w:rPr>
-        <w:t>Página) ESTADO</w:t>
-      </w:r>
-      <w:r>
-        <w:rPr>
-          <w:rFonts w:ascii="Arial" w:hAnsi="Arial" w:cs="Arial"/>
-          <w:i/>
-          <w:iCs/>
-          <w:color w:val="000000"/>
-        </w:rPr>
-        <w:t xml:space="preserve"> (lo reserve, me interesa, lo pague), cancelable o no</w:t>
+        <w:t>), nombre del retiro, ubicación, temática del retiro (Meditación, tracking, yoga, ceremonia del cacao, regresión a vidas pasadas, senderismo, armonización sonora), cronograma de actividades, costo, CON QUIÉN HABLÓ (Nombre del encargado, o Página) ESTADO (lo reserve, me interesa, lo pague), cancelable o no</w:t>
       </w:r>
       <w:r>
         <w:rPr>
@@ -284,24 +718,24 @@
           <w:rFonts w:ascii="Arial" w:hAnsi="Arial" w:cs="Arial"/>
           <w:color w:val="000000"/>
         </w:rPr>
-        <w:t xml:space="preserve">Por esto, los usuarios necesitan una aplicación móvil de uso personal que les permita organizarse, simplificando la elección y el seguimiento de sus retiros. </w:t>
+        <w:t xml:space="preserve">Por esto, los usuarios necesitan una aplicación móvil de uso personal que les permita organizarse, simplificando la elección y el seguimiento de sus retiros. Agendándolos, descartando los retiros que no son de su agrado, filtros y búsqueda de los retiros agendados, planificación de pagos, registrar acompañantes y dejar valoraciones/opiniones, multimedia de sus experiencias. Además, buscan poder compartir las características de un </w:t>
       </w:r>
       <w:r>
         <w:rPr>
           <w:rFonts w:ascii="Arial" w:hAnsi="Arial" w:cs="Arial"/>
           <w:color w:val="000000"/>
         </w:rPr>
-        <w:t>Agendándolos</w:t>
-      </w:r>
-      <w:r>
-        <w:rPr>
-          <w:rFonts w:ascii="Arial" w:hAnsi="Arial" w:cs="Arial"/>
-          <w:color w:val="000000"/>
-        </w:rPr>
-        <w:t>, descartando los retiros que no son de su agrado, filtros y búsqueda de los retiros agendados, planificación de pagos, registrar acompañantes y dejar valoraciones/opiniones, multimedia de sus experiencias. Además, buscan poder compartir las características de un retiro con otros usuarios para invitarlos a sumarse y que la aplicación les envíe alertas cuando se encuentra cerca la fecha de un retiro o de la fecha de pago.</w:t>
-      </w:r>
-    </w:p>
-    <w:p/>
+        <w:lastRenderedPageBreak/>
+        <w:t>retiro con otros usuarios para invitarlos a sumarse y que la aplicación les envíe alertas cuando se encuentra cerca la fecha de un retiro o de la fecha de pago.</w:t>
+      </w:r>
+    </w:p>
+    <w:p>
+      <w:pPr>
+        <w:rPr>
+          <w:lang w:val="es-ES"/>
+        </w:rPr>
+      </w:pPr>
+    </w:p>
     <w:p>
       <w:pPr>
         <w:pStyle w:val="Ttulo2"/>
@@ -315,7 +749,6 @@
         <w:rPr>
           <w:lang w:val="es-AR"/>
         </w:rPr>
-        <w:lastRenderedPageBreak/>
         <w:t>LISTA DE REQUERIMIENTOS FUNCIONALES</w:t>
       </w:r>
       <w:r>
@@ -1000,232 +1433,9 @@
             <w:r>
               <w:rPr>
                 <w:rFonts w:ascii="Helvetica" w:hAnsi="Helvetica" w:cs="Helvetica"/>
-              </w:rPr>
-              <w:t xml:space="preserve">Registrar </w:t>
-            </w:r>
-            <w:proofErr w:type="spellStart"/>
-            <w:r>
-              <w:rPr>
-                <w:rFonts w:ascii="Helvetica" w:hAnsi="Helvetica" w:cs="Helvetica"/>
-              </w:rPr>
-              <w:t>el</w:t>
-            </w:r>
-            <w:proofErr w:type="spellEnd"/>
-            <w:r>
-              <w:rPr>
-                <w:rFonts w:ascii="Helvetica" w:hAnsi="Helvetica" w:cs="Helvetica"/>
-              </w:rPr>
-              <w:t xml:space="preserve"> </w:t>
-            </w:r>
-            <w:proofErr w:type="spellStart"/>
-            <w:r>
-              <w:rPr>
-                <w:rFonts w:ascii="Helvetica" w:hAnsi="Helvetica" w:cs="Helvetica"/>
-              </w:rPr>
-              <w:t>pago</w:t>
-            </w:r>
-            <w:proofErr w:type="spellEnd"/>
-            <w:r>
-              <w:rPr>
-                <w:rFonts w:ascii="Helvetica" w:hAnsi="Helvetica" w:cs="Helvetica"/>
-              </w:rPr>
-              <w:t xml:space="preserve"> de un </w:t>
-            </w:r>
-            <w:proofErr w:type="spellStart"/>
-            <w:r>
-              <w:rPr>
-                <w:rFonts w:ascii="Helvetica" w:hAnsi="Helvetica" w:cs="Helvetica"/>
-              </w:rPr>
-              <w:t>retiro</w:t>
-            </w:r>
-            <w:proofErr w:type="spellEnd"/>
-            <w:r>
-              <w:rPr>
-                <w:rFonts w:ascii="Helvetica" w:hAnsi="Helvetica" w:cs="Helvetica"/>
-              </w:rPr>
-              <w:t xml:space="preserve">. El </w:t>
-            </w:r>
-            <w:proofErr w:type="spellStart"/>
-            <w:r>
-              <w:rPr>
-                <w:rFonts w:ascii="Helvetica" w:hAnsi="Helvetica" w:cs="Helvetica"/>
-              </w:rPr>
-              <w:t>sistema</w:t>
-            </w:r>
-            <w:proofErr w:type="spellEnd"/>
-            <w:r>
-              <w:rPr>
-                <w:rFonts w:ascii="Helvetica" w:hAnsi="Helvetica" w:cs="Helvetica"/>
-              </w:rPr>
-              <w:t xml:space="preserve"> </w:t>
-            </w:r>
-            <w:proofErr w:type="spellStart"/>
-            <w:r>
-              <w:rPr>
-                <w:rFonts w:ascii="Helvetica" w:hAnsi="Helvetica" w:cs="Helvetica"/>
-              </w:rPr>
-              <w:t>deberá</w:t>
-            </w:r>
-            <w:proofErr w:type="spellEnd"/>
-            <w:r>
-              <w:rPr>
-                <w:rFonts w:ascii="Helvetica" w:hAnsi="Helvetica" w:cs="Helvetica"/>
-              </w:rPr>
-              <w:t xml:space="preserve"> </w:t>
-            </w:r>
-            <w:proofErr w:type="spellStart"/>
-            <w:r>
-              <w:rPr>
-                <w:rFonts w:ascii="Helvetica" w:hAnsi="Helvetica" w:cs="Helvetica"/>
-              </w:rPr>
-              <w:t>permitir</w:t>
-            </w:r>
-            <w:proofErr w:type="spellEnd"/>
-            <w:r>
-              <w:rPr>
-                <w:rFonts w:ascii="Helvetica" w:hAnsi="Helvetica" w:cs="Helvetica"/>
-              </w:rPr>
-              <w:t xml:space="preserve"> registrar </w:t>
-            </w:r>
-            <w:proofErr w:type="spellStart"/>
-            <w:r>
-              <w:rPr>
-                <w:rFonts w:ascii="Helvetica" w:hAnsi="Helvetica" w:cs="Helvetica"/>
-              </w:rPr>
-              <w:t>el</w:t>
-            </w:r>
-            <w:proofErr w:type="spellEnd"/>
-            <w:r>
-              <w:rPr>
-                <w:rFonts w:ascii="Helvetica" w:hAnsi="Helvetica" w:cs="Helvetica"/>
-              </w:rPr>
-              <w:t xml:space="preserve"> </w:t>
-            </w:r>
-            <w:proofErr w:type="spellStart"/>
-            <w:r>
-              <w:rPr>
-                <w:rFonts w:ascii="Helvetica" w:hAnsi="Helvetica" w:cs="Helvetica"/>
-              </w:rPr>
-              <w:t>pago</w:t>
-            </w:r>
-            <w:proofErr w:type="spellEnd"/>
-            <w:r>
-              <w:rPr>
-                <w:rFonts w:ascii="Helvetica" w:hAnsi="Helvetica" w:cs="Helvetica"/>
-              </w:rPr>
-              <w:t xml:space="preserve"> total y/o </w:t>
-            </w:r>
-            <w:proofErr w:type="spellStart"/>
-            <w:r>
-              <w:rPr>
-                <w:rFonts w:ascii="Helvetica" w:hAnsi="Helvetica" w:cs="Helvetica"/>
-              </w:rPr>
-              <w:t>parcial</w:t>
-            </w:r>
-            <w:proofErr w:type="spellEnd"/>
-            <w:r>
-              <w:rPr>
-                <w:rFonts w:ascii="Helvetica" w:hAnsi="Helvetica" w:cs="Helvetica"/>
-              </w:rPr>
-              <w:t xml:space="preserve"> del </w:t>
-            </w:r>
-            <w:proofErr w:type="spellStart"/>
-            <w:r>
-              <w:rPr>
-                <w:rFonts w:ascii="Helvetica" w:hAnsi="Helvetica" w:cs="Helvetica"/>
-              </w:rPr>
-              <w:t>retiro</w:t>
-            </w:r>
-            <w:proofErr w:type="spellEnd"/>
-            <w:r>
-              <w:rPr>
-                <w:rFonts w:ascii="Helvetica" w:hAnsi="Helvetica" w:cs="Helvetica"/>
-              </w:rPr>
-              <w:t xml:space="preserve"> </w:t>
-            </w:r>
-            <w:proofErr w:type="spellStart"/>
-            <w:r>
-              <w:rPr>
-                <w:rFonts w:ascii="Helvetica" w:hAnsi="Helvetica" w:cs="Helvetica"/>
-              </w:rPr>
-              <w:t>teniendo</w:t>
-            </w:r>
-            <w:proofErr w:type="spellEnd"/>
-            <w:r>
-              <w:rPr>
-                <w:rFonts w:ascii="Helvetica" w:hAnsi="Helvetica" w:cs="Helvetica"/>
-              </w:rPr>
-              <w:t xml:space="preserve"> </w:t>
-            </w:r>
-            <w:proofErr w:type="spellStart"/>
-            <w:r>
-              <w:rPr>
-                <w:rFonts w:ascii="Helvetica" w:hAnsi="Helvetica" w:cs="Helvetica"/>
-              </w:rPr>
-              <w:t>en</w:t>
-            </w:r>
-            <w:proofErr w:type="spellEnd"/>
-            <w:r>
-              <w:rPr>
-                <w:rFonts w:ascii="Helvetica" w:hAnsi="Helvetica" w:cs="Helvetica"/>
-              </w:rPr>
-              <w:t xml:space="preserve"> </w:t>
-            </w:r>
-            <w:proofErr w:type="spellStart"/>
-            <w:r>
-              <w:rPr>
-                <w:rFonts w:ascii="Helvetica" w:hAnsi="Helvetica" w:cs="Helvetica"/>
-              </w:rPr>
-              <w:t>cuenta</w:t>
-            </w:r>
-            <w:proofErr w:type="spellEnd"/>
-            <w:r>
-              <w:rPr>
-                <w:rFonts w:ascii="Helvetica" w:hAnsi="Helvetica" w:cs="Helvetica"/>
-              </w:rPr>
-              <w:t xml:space="preserve"> </w:t>
-            </w:r>
-            <w:proofErr w:type="spellStart"/>
-            <w:r>
-              <w:rPr>
-                <w:rFonts w:ascii="Helvetica" w:hAnsi="Helvetica" w:cs="Helvetica"/>
-              </w:rPr>
-              <w:t>fecha</w:t>
-            </w:r>
-            <w:proofErr w:type="spellEnd"/>
-            <w:r>
-              <w:rPr>
-                <w:rFonts w:ascii="Helvetica" w:hAnsi="Helvetica" w:cs="Helvetica"/>
-              </w:rPr>
-              <w:t xml:space="preserve">, </w:t>
-            </w:r>
-            <w:proofErr w:type="spellStart"/>
-            <w:r>
-              <w:rPr>
-                <w:rFonts w:ascii="Helvetica" w:hAnsi="Helvetica" w:cs="Helvetica"/>
-              </w:rPr>
-              <w:t>monto</w:t>
-            </w:r>
-            <w:proofErr w:type="spellEnd"/>
-            <w:r>
-              <w:rPr>
-                <w:rFonts w:ascii="Helvetica" w:hAnsi="Helvetica" w:cs="Helvetica"/>
-              </w:rPr>
-              <w:t xml:space="preserve">, </w:t>
-            </w:r>
-            <w:proofErr w:type="spellStart"/>
-            <w:r>
-              <w:rPr>
-                <w:rFonts w:ascii="Helvetica" w:hAnsi="Helvetica" w:cs="Helvetica"/>
-              </w:rPr>
-              <w:t>método</w:t>
-            </w:r>
-            <w:proofErr w:type="spellEnd"/>
-            <w:r>
-              <w:rPr>
-                <w:rFonts w:ascii="Helvetica" w:hAnsi="Helvetica" w:cs="Helvetica"/>
-              </w:rPr>
-              <w:t>.</w:t>
+                <w:lang w:val="es-ES"/>
+              </w:rPr>
+              <w:t>Registrar el pago de un retiro. El sistema deberá permitir registrar el pago total y/o parcial del retiro teniendo en cuenta fecha, monto, método.</w:t>
             </w:r>
           </w:p>
         </w:tc>
@@ -1299,175 +1509,17 @@
             <w:pPr>
               <w:spacing w:line="240" w:lineRule="auto"/>
               <w:ind w:left="0"/>
+              <w:rPr>
+                <w:lang w:val="es-ES"/>
+              </w:rPr>
             </w:pPr>
             <w:r>
               <w:rPr>
                 <w:rFonts w:ascii="Helvetica" w:hAnsi="Helvetica" w:cs="Helvetica"/>
-              </w:rPr>
-              <w:t xml:space="preserve">Registrar la </w:t>
+                <w:lang w:val="es-ES"/>
+              </w:rPr>
+              <w:t>Registrar la valoración personal del retiro. El sistema deberá permitir registrar una puntuación y/o reseña sobre el retiro asistido</w:t>
             </w:r>
-            <w:proofErr w:type="spellStart"/>
-            <w:r>
-              <w:rPr>
-                <w:rFonts w:ascii="Helvetica" w:hAnsi="Helvetica" w:cs="Helvetica"/>
-              </w:rPr>
-              <w:t>valoración</w:t>
-            </w:r>
-            <w:proofErr w:type="spellEnd"/>
-            <w:r>
-              <w:rPr>
-                <w:rFonts w:ascii="Helvetica" w:hAnsi="Helvetica" w:cs="Helvetica"/>
-              </w:rPr>
-              <w:t xml:space="preserve"> personal del </w:t>
-            </w:r>
-            <w:proofErr w:type="spellStart"/>
-            <w:r>
-              <w:rPr>
-                <w:rFonts w:ascii="Helvetica" w:hAnsi="Helvetica" w:cs="Helvetica"/>
-              </w:rPr>
-              <w:t>retiro</w:t>
-            </w:r>
-            <w:proofErr w:type="spellEnd"/>
-            <w:r>
-              <w:rPr>
-                <w:rFonts w:ascii="Helvetica" w:hAnsi="Helvetica" w:cs="Helvetica"/>
-              </w:rPr>
-              <w:t xml:space="preserve">. El </w:t>
-            </w:r>
-            <w:proofErr w:type="spellStart"/>
-            <w:r>
-              <w:rPr>
-                <w:rFonts w:ascii="Helvetica" w:hAnsi="Helvetica" w:cs="Helvetica"/>
-              </w:rPr>
-              <w:t>sistema</w:t>
-            </w:r>
-            <w:proofErr w:type="spellEnd"/>
-            <w:r>
-              <w:rPr>
-                <w:rFonts w:ascii="Helvetica" w:hAnsi="Helvetica" w:cs="Helvetica"/>
-              </w:rPr>
-              <w:t xml:space="preserve"> </w:t>
-            </w:r>
-            <w:proofErr w:type="spellStart"/>
-            <w:r>
-              <w:rPr>
-                <w:rFonts w:ascii="Helvetica" w:hAnsi="Helvetica" w:cs="Helvetica"/>
-              </w:rPr>
-              <w:t>deberá</w:t>
-            </w:r>
-            <w:proofErr w:type="spellEnd"/>
-            <w:r>
-              <w:rPr>
-                <w:rFonts w:ascii="Helvetica" w:hAnsi="Helvetica" w:cs="Helvetica"/>
-              </w:rPr>
-              <w:t xml:space="preserve"> </w:t>
-            </w:r>
-            <w:proofErr w:type="spellStart"/>
-            <w:r>
-              <w:rPr>
-                <w:rFonts w:ascii="Helvetica" w:hAnsi="Helvetica" w:cs="Helvetica"/>
-              </w:rPr>
-              <w:t>permitir</w:t>
-            </w:r>
-            <w:proofErr w:type="spellEnd"/>
-            <w:r>
-              <w:rPr>
-                <w:rFonts w:ascii="Helvetica" w:hAnsi="Helvetica" w:cs="Helvetica"/>
-              </w:rPr>
-              <w:t xml:space="preserve"> registrar </w:t>
-            </w:r>
-            <w:proofErr w:type="spellStart"/>
-            <w:r>
-              <w:rPr>
-                <w:rFonts w:ascii="Helvetica" w:hAnsi="Helvetica" w:cs="Helvetica"/>
-              </w:rPr>
-              <w:t>una</w:t>
-            </w:r>
-            <w:proofErr w:type="spellEnd"/>
-            <w:r>
-              <w:rPr>
-                <w:rFonts w:ascii="Helvetica" w:hAnsi="Helvetica" w:cs="Helvetica"/>
-              </w:rPr>
-              <w:t xml:space="preserve"> </w:t>
-            </w:r>
-            <w:proofErr w:type="spellStart"/>
-            <w:r>
-              <w:rPr>
-                <w:rFonts w:ascii="Helvetica" w:hAnsi="Helvetica" w:cs="Helvetica"/>
-              </w:rPr>
-              <w:t>puntuación</w:t>
-            </w:r>
-            <w:proofErr w:type="spellEnd"/>
-            <w:r>
-              <w:rPr>
-                <w:rFonts w:ascii="Helvetica" w:hAnsi="Helvetica" w:cs="Helvetica"/>
-              </w:rPr>
-              <w:t xml:space="preserve"> y/o </w:t>
-            </w:r>
-            <w:proofErr w:type="spellStart"/>
-            <w:r>
-              <w:rPr>
-                <w:rFonts w:ascii="Helvetica" w:hAnsi="Helvetica" w:cs="Helvetica"/>
-              </w:rPr>
-              <w:t>reseña</w:t>
-            </w:r>
-            <w:proofErr w:type="spellEnd"/>
-            <w:r>
-              <w:rPr>
-                <w:rFonts w:ascii="Helvetica" w:hAnsi="Helvetica" w:cs="Helvetica"/>
-              </w:rPr>
-              <w:t xml:space="preserve"> </w:t>
-            </w:r>
-            <w:proofErr w:type="spellStart"/>
-            <w:r>
-              <w:rPr>
-                <w:rFonts w:ascii="Helvetica" w:hAnsi="Helvetica" w:cs="Helvetica"/>
-              </w:rPr>
-              <w:t>sobre</w:t>
-            </w:r>
-            <w:proofErr w:type="spellEnd"/>
-            <w:r>
-              <w:rPr>
-                <w:rFonts w:ascii="Helvetica" w:hAnsi="Helvetica" w:cs="Helvetica"/>
-              </w:rPr>
-              <w:t xml:space="preserve"> </w:t>
-            </w:r>
-            <w:proofErr w:type="spellStart"/>
-            <w:r>
-              <w:rPr>
-                <w:rFonts w:ascii="Helvetica" w:hAnsi="Helvetica" w:cs="Helvetica"/>
-              </w:rPr>
-              <w:t>el</w:t>
-            </w:r>
-            <w:proofErr w:type="spellEnd"/>
-            <w:r>
-              <w:rPr>
-                <w:rFonts w:ascii="Helvetica" w:hAnsi="Helvetica" w:cs="Helvetica"/>
-              </w:rPr>
-              <w:t xml:space="preserve"> </w:t>
-            </w:r>
-            <w:proofErr w:type="spellStart"/>
-            <w:r>
-              <w:rPr>
-                <w:rFonts w:ascii="Helvetica" w:hAnsi="Helvetica" w:cs="Helvetica"/>
-              </w:rPr>
-              <w:t>retiro</w:t>
-            </w:r>
-            <w:proofErr w:type="spellEnd"/>
-            <w:r>
-              <w:rPr>
-                <w:rFonts w:ascii="Helvetica" w:hAnsi="Helvetica" w:cs="Helvetica"/>
-              </w:rPr>
-              <w:t xml:space="preserve"> </w:t>
-            </w:r>
-            <w:proofErr w:type="spellStart"/>
-            <w:r>
-              <w:rPr>
-                <w:rFonts w:ascii="Helvetica" w:hAnsi="Helvetica" w:cs="Helvetica"/>
-              </w:rPr>
-              <w:t>asistido</w:t>
-            </w:r>
-            <w:proofErr w:type="spellEnd"/>
           </w:p>
         </w:tc>
       </w:tr>
@@ -1544,196 +1596,13 @@
                 <w:lang w:val="es-AR"/>
               </w:rPr>
             </w:pPr>
-            <w:proofErr w:type="spellStart"/>
             <w:r>
               <w:rPr>
                 <w:rFonts w:ascii="Helvetica" w:hAnsi="Helvetica" w:cs="Helvetica"/>
-              </w:rPr>
-              <w:t>Compartir</w:t>
+                <w:lang w:val="es-ES"/>
+              </w:rPr>
+              <w:t>Compartir información sobre el retiro. El sistema deberá permitir compartir la información registrada de un retiro con otros usuarios</w:t>
             </w:r>
-            <w:proofErr w:type="spellEnd"/>
-            <w:r>
-              <w:rPr>
-                <w:rFonts w:ascii="Helvetica" w:hAnsi="Helvetica" w:cs="Helvetica"/>
-              </w:rPr>
-              <w:t xml:space="preserve"> </w:t>
-            </w:r>
-            <w:proofErr w:type="spellStart"/>
-            <w:r>
-              <w:rPr>
-                <w:rFonts w:ascii="Helvetica" w:hAnsi="Helvetica" w:cs="Helvetica"/>
-              </w:rPr>
-              <w:t>información</w:t>
-            </w:r>
-            <w:proofErr w:type="spellEnd"/>
-            <w:r>
-              <w:rPr>
-                <w:rFonts w:ascii="Helvetica" w:hAnsi="Helvetica" w:cs="Helvetica"/>
-              </w:rPr>
-              <w:t xml:space="preserve"> </w:t>
-            </w:r>
-            <w:proofErr w:type="spellStart"/>
-            <w:r>
-              <w:rPr>
-                <w:rFonts w:ascii="Helvetica" w:hAnsi="Helvetica" w:cs="Helvetica"/>
-              </w:rPr>
-              <w:t>sobre</w:t>
-            </w:r>
-            <w:proofErr w:type="spellEnd"/>
-            <w:r>
-              <w:rPr>
-                <w:rFonts w:ascii="Helvetica" w:hAnsi="Helvetica" w:cs="Helvetica"/>
-              </w:rPr>
-              <w:t xml:space="preserve"> </w:t>
-            </w:r>
-            <w:proofErr w:type="spellStart"/>
-            <w:r>
-              <w:rPr>
-                <w:rFonts w:ascii="Helvetica" w:hAnsi="Helvetica" w:cs="Helvetica"/>
-              </w:rPr>
-              <w:t>el</w:t>
-            </w:r>
-            <w:proofErr w:type="spellEnd"/>
-            <w:r>
-              <w:rPr>
-                <w:rFonts w:ascii="Helvetica" w:hAnsi="Helvetica" w:cs="Helvetica"/>
-              </w:rPr>
-              <w:t xml:space="preserve"> </w:t>
-            </w:r>
-            <w:proofErr w:type="spellStart"/>
-            <w:r>
-              <w:rPr>
-                <w:rFonts w:ascii="Helvetica" w:hAnsi="Helvetica" w:cs="Helvetica"/>
-              </w:rPr>
-              <w:t>retiro</w:t>
-            </w:r>
-            <w:proofErr w:type="spellEnd"/>
-            <w:r>
-              <w:rPr>
-                <w:rFonts w:ascii="Helvetica" w:hAnsi="Helvetica" w:cs="Helvetica"/>
-              </w:rPr>
-              <w:t xml:space="preserve">. El </w:t>
-            </w:r>
-            <w:proofErr w:type="spellStart"/>
-            <w:r>
-              <w:rPr>
-                <w:rFonts w:ascii="Helvetica" w:hAnsi="Helvetica" w:cs="Helvetica"/>
-              </w:rPr>
-              <w:t>sistema</w:t>
-            </w:r>
-            <w:proofErr w:type="spellEnd"/>
-            <w:r>
-              <w:rPr>
-                <w:rFonts w:ascii="Helvetica" w:hAnsi="Helvetica" w:cs="Helvetica"/>
-              </w:rPr>
-              <w:t xml:space="preserve"> </w:t>
-            </w:r>
-            <w:proofErr w:type="spellStart"/>
-            <w:r>
-              <w:rPr>
-                <w:rFonts w:ascii="Helvetica" w:hAnsi="Helvetica" w:cs="Helvetica"/>
-              </w:rPr>
-              <w:t>deberá</w:t>
-            </w:r>
-            <w:proofErr w:type="spellEnd"/>
-            <w:r>
-              <w:rPr>
-                <w:rFonts w:ascii="Helvetica" w:hAnsi="Helvetica" w:cs="Helvetica"/>
-              </w:rPr>
-              <w:t xml:space="preserve"> </w:t>
-            </w:r>
-            <w:proofErr w:type="spellStart"/>
-            <w:r>
-              <w:rPr>
-                <w:rFonts w:ascii="Helvetica" w:hAnsi="Helvetica" w:cs="Helvetica"/>
-              </w:rPr>
-              <w:t>permitir</w:t>
-            </w:r>
-            <w:proofErr w:type="spellEnd"/>
-            <w:r>
-              <w:rPr>
-                <w:rFonts w:ascii="Helvetica" w:hAnsi="Helvetica" w:cs="Helvetica"/>
-              </w:rPr>
-              <w:t xml:space="preserve"> </w:t>
-            </w:r>
-            <w:proofErr w:type="spellStart"/>
-            <w:r>
-              <w:rPr>
-                <w:rFonts w:ascii="Helvetica" w:hAnsi="Helvetica" w:cs="Helvetica"/>
-              </w:rPr>
-              <w:t>compartir</w:t>
-            </w:r>
-            <w:proofErr w:type="spellEnd"/>
-            <w:r>
-              <w:rPr>
-                <w:rFonts w:ascii="Helvetica" w:hAnsi="Helvetica" w:cs="Helvetica"/>
-              </w:rPr>
-              <w:t xml:space="preserve"> la </w:t>
-            </w:r>
-            <w:proofErr w:type="spellStart"/>
-            <w:r>
-              <w:rPr>
-                <w:rFonts w:ascii="Helvetica" w:hAnsi="Helvetica" w:cs="Helvetica"/>
-              </w:rPr>
-              <w:t>información</w:t>
-            </w:r>
-            <w:proofErr w:type="spellEnd"/>
-            <w:r>
-              <w:rPr>
-                <w:rFonts w:ascii="Helvetica" w:hAnsi="Helvetica" w:cs="Helvetica"/>
-              </w:rPr>
-              <w:t xml:space="preserve"> </w:t>
-            </w:r>
-            <w:proofErr w:type="spellStart"/>
-            <w:r>
-              <w:rPr>
-                <w:rFonts w:ascii="Helvetica" w:hAnsi="Helvetica" w:cs="Helvetica"/>
-              </w:rPr>
-              <w:t>registrada</w:t>
-            </w:r>
-            <w:proofErr w:type="spellEnd"/>
-            <w:r>
-              <w:rPr>
-                <w:rFonts w:ascii="Helvetica" w:hAnsi="Helvetica" w:cs="Helvetica"/>
-              </w:rPr>
-              <w:t xml:space="preserve"> de un </w:t>
-            </w:r>
-            <w:proofErr w:type="spellStart"/>
-            <w:r>
-              <w:rPr>
-                <w:rFonts w:ascii="Helvetica" w:hAnsi="Helvetica" w:cs="Helvetica"/>
-              </w:rPr>
-              <w:t>retiro</w:t>
-            </w:r>
-            <w:proofErr w:type="spellEnd"/>
-            <w:r>
-              <w:rPr>
-                <w:rFonts w:ascii="Helvetica" w:hAnsi="Helvetica" w:cs="Helvetica"/>
-              </w:rPr>
-              <w:t xml:space="preserve"> con </w:t>
-            </w:r>
-            <w:proofErr w:type="spellStart"/>
-            <w:r>
-              <w:rPr>
-                <w:rFonts w:ascii="Helvetica" w:hAnsi="Helvetica" w:cs="Helvetica"/>
-              </w:rPr>
-              <w:t>otros</w:t>
-            </w:r>
-            <w:proofErr w:type="spellEnd"/>
-            <w:r>
-              <w:rPr>
-                <w:rFonts w:ascii="Helvetica" w:hAnsi="Helvetica" w:cs="Helvetica"/>
-              </w:rPr>
-              <w:t xml:space="preserve"> </w:t>
-            </w:r>
-            <w:proofErr w:type="spellStart"/>
-            <w:r>
-              <w:rPr>
-                <w:rFonts w:ascii="Helvetica" w:hAnsi="Helvetica" w:cs="Helvetica"/>
-              </w:rPr>
-              <w:t>usuarios</w:t>
-            </w:r>
-            <w:proofErr w:type="spellEnd"/>
           </w:p>
         </w:tc>
       </w:tr>
@@ -1823,6 +1692,7 @@
               <w:ind w:left="0" w:right="61"/>
               <w:rPr>
                 <w:shd w:val="clear" w:color="auto" w:fill="A61C00"/>
+                <w:lang w:val="es-ES"/>
               </w:rPr>
             </w:pPr>
           </w:p>
@@ -1943,34 +1813,6 @@
     </w:tbl>
     <w:p>
       <w:pPr>
-        <w:ind w:left="0"/>
-        <w:rPr>
-          <w:lang w:val="es-AR"/>
-        </w:rPr>
-      </w:pPr>
-    </w:p>
-    <w:p>
-      <w:pPr>
-        <w:pStyle w:val="Ttulo1"/>
-        <w:spacing w:line="240" w:lineRule="auto"/>
-        <w:ind w:right="-531"/>
-        <w:rPr>
-          <w:b/>
-          <w:bCs/>
-          <w:color w:val="000000"/>
-        </w:rPr>
-      </w:pPr>
-      <w:r>
-        <w:rPr>
-          <w:b/>
-          <w:bCs/>
-          <w:color w:val="000000"/>
-        </w:rPr>
-        <w:t>ANEXO 1</w:t>
-      </w:r>
-    </w:p>
-    <w:p>
-      <w:pPr>
         <w:pStyle w:val="Ttulo1"/>
         <w:spacing w:line="240" w:lineRule="auto"/>
         <w:ind w:right="-531"/>
@@ -1984,13 +1826,111 @@
       </w:pPr>
       <w:r>
         <w:rPr>
+          <w:b/>
+          <w:bCs/>
+          <w:color w:val="000000"/>
+        </w:rPr>
+        <w:lastRenderedPageBreak/>
+        <w:t>ANEXO 1</w:t>
+      </w:r>
+      <w:r>
+        <w:rPr>
           <w:rFonts w:ascii="Open Sans ExtraBold" w:eastAsia="Open Sans ExtraBold" w:hAnsi="Open Sans ExtraBold" w:cs="Open Sans ExtraBold"/>
           <w:color w:val="FFAA00"/>
           <w:sz w:val="20"/>
           <w:szCs w:val="20"/>
           <w:lang w:val="es-AR"/>
         </w:rPr>
+        <w:t xml:space="preserve"> </w:t>
+      </w:r>
+    </w:p>
+    <w:p>
+      <w:pPr>
+        <w:pStyle w:val="Ttulo1"/>
+        <w:spacing w:line="240" w:lineRule="auto"/>
+        <w:ind w:right="-531"/>
+        <w:rPr>
+          <w:rFonts w:ascii="Open Sans ExtraBold" w:eastAsia="Open Sans ExtraBold" w:hAnsi="Open Sans ExtraBold" w:cs="Open Sans ExtraBold"/>
+          <w:color w:val="FFAA00"/>
+          <w:sz w:val="20"/>
+          <w:szCs w:val="20"/>
+          <w:lang w:val="es-AR"/>
+        </w:rPr>
+      </w:pPr>
+      <w:r>
+        <w:rPr>
+          <w:rFonts w:ascii="Open Sans ExtraBold" w:eastAsia="Open Sans ExtraBold" w:hAnsi="Open Sans ExtraBold" w:cs="Open Sans ExtraBold"/>
+          <w:color w:val="FFAA00"/>
+          <w:sz w:val="20"/>
+          <w:szCs w:val="20"/>
+          <w:lang w:val="es-AR"/>
+        </w:rPr>
         <w:t>INVESTIGACIÓN DE RETIROS</w:t>
+      </w:r>
+    </w:p>
+    <w:p>
+      <w:pPr>
+        <w:pStyle w:val="Ttulo1"/>
+        <w:spacing w:line="240" w:lineRule="auto"/>
+        <w:ind w:left="0" w:right="-531"/>
+        <w:rPr>
+          <w:rFonts w:ascii="Open Sans ExtraBold" w:eastAsia="Open Sans ExtraBold" w:hAnsi="Open Sans ExtraBold" w:cs="Open Sans ExtraBold"/>
+          <w:color w:val="FFAA00"/>
+          <w:sz w:val="20"/>
+          <w:szCs w:val="20"/>
+          <w:lang w:val="es-AR"/>
+        </w:rPr>
+      </w:pPr>
+      <w:r>
+        <w:rPr>
+          <w:noProof/>
+          <w:lang w:val="es-AR"/>
+        </w:rPr>
+        <w:drawing>
+          <wp:inline distT="0" distB="0" distL="0" distR="0" wp14:anchorId="4385CC60" wp14:editId="186AD37C">
+            <wp:extent cx="4727294" cy="3032760"/>
+            <wp:effectExtent l="0" t="0" r="0" b="0"/>
+            <wp:docPr id="1699998273" name="Imagen 2"/>
+            <wp:cNvGraphicFramePr>
+              <a:graphicFrameLocks xmlns:a="http://schemas.openxmlformats.org/drawingml/2006/main" noChangeAspect="1"/>
+            </wp:cNvGraphicFramePr>
+            <a:graphic xmlns:a="http://schemas.openxmlformats.org/drawingml/2006/main">
+              <a:graphicData uri="http://schemas.openxmlformats.org/drawingml/2006/picture">
+                <pic:pic xmlns:pic="http://schemas.openxmlformats.org/drawingml/2006/picture">
+                  <pic:nvPicPr>
+                    <pic:cNvPr id="0" name="Picture 4"/>
+                    <pic:cNvPicPr>
+                      <a:picLocks noChangeAspect="1" noChangeArrowheads="1"/>
+                    </pic:cNvPicPr>
+                  </pic:nvPicPr>
+                  <pic:blipFill>
+                    <a:blip r:embed="rId9">
+                      <a:extLst>
+                        <a:ext uri="{28A0092B-C50C-407E-A947-70E740481C1C}">
+                          <a14:useLocalDpi xmlns:a14="http://schemas.microsoft.com/office/drawing/2010/main" val="0"/>
+                        </a:ext>
+                      </a:extLst>
+                    </a:blip>
+                    <a:srcRect/>
+                    <a:stretch>
+                      <a:fillRect/>
+                    </a:stretch>
+                  </pic:blipFill>
+                  <pic:spPr bwMode="auto">
+                    <a:xfrm>
+                      <a:off x="0" y="0"/>
+                      <a:ext cx="4731363" cy="3035371"/>
+                    </a:xfrm>
+                    <a:prstGeom prst="rect">
+                      <a:avLst/>
+                    </a:prstGeom>
+                    <a:noFill/>
+                  </pic:spPr>
+                </pic:pic>
+              </a:graphicData>
+            </a:graphic>
+          </wp:inline>
+        </w:drawing>
       </w:r>
     </w:p>
     <w:p>
@@ -2000,152 +1940,41 @@
         <w:jc w:val="left"/>
         <w:rPr>
           <w:color w:val="000000"/>
-        </w:rPr>
-      </w:pPr>
-      <w:r>
-        <w:rPr>
-          <w:noProof/>
-        </w:rPr>
-        <w:lastRenderedPageBreak/>
-        <w:pict w14:anchorId="4385CC60">
-          <v:shapetype id="_x0000_t75" coordsize="21600,21600" o:spt="75" o:preferrelative="t" path="m@4@5l@4@11@9@11@9@5xe" filled="f" stroked="f">
-            <v:stroke joinstyle="miter"/>
-            <v:formulas>
-              <v:f eqn="if lineDrawn pixelLineWidth 0"/>
-              <v:f eqn="sum @0 1 0"/>
-              <v:f eqn="sum 0 0 @1"/>
-              <v:f eqn="prod @2 1 2"/>
-              <v:f eqn="prod @3 21600 pixelWidth"/>
-              <v:f eqn="prod @3 21600 pixelHeight"/>
-              <v:f eqn="sum @0 0 1"/>
-              <v:f eqn="prod @6 1 2"/>
-              <v:f eqn="prod @7 21600 pixelWidth"/>
-              <v:f eqn="sum @8 21600 0"/>
-              <v:f eqn="prod @7 21600 pixelHeight"/>
-              <v:f eqn="sum @10 21600 0"/>
-            </v:formulas>
-            <v:path o:extrusionok="f" gradientshapeok="t" o:connecttype="rect"/>
-            <o:lock v:ext="edit" aspectratio="t"/>
-          </v:shapetype>
-          <v:shape id="_x0000_s1027" type="#_x0000_t75" style="position:absolute;margin-left:-10.05pt;margin-top:50.5pt;width:399.35pt;height:256.2pt;z-index:251659264;mso-position-horizontal-relative:margin;mso-position-vertical-relative:margin">
-            <v:imagedata r:id="rId7" o:title="Sin título"/>
-            <w10:wrap type="square" anchorx="margin" anchory="margin"/>
-          </v:shape>
-        </w:pict>
-      </w:r>
-    </w:p>
-    <w:p>
-      <w:pPr>
-        <w:spacing w:line="240" w:lineRule="auto"/>
-        <w:ind w:left="0"/>
-        <w:jc w:val="left"/>
-        <w:rPr>
-          <w:color w:val="000000"/>
-        </w:rPr>
-      </w:pPr>
-    </w:p>
-    <w:p>
-      <w:pPr>
-        <w:spacing w:line="240" w:lineRule="auto"/>
-        <w:ind w:left="0"/>
-        <w:jc w:val="left"/>
-        <w:rPr>
-          <w:color w:val="000000"/>
-        </w:rPr>
-      </w:pPr>
-    </w:p>
-    <w:p>
-      <w:pPr>
-        <w:spacing w:line="240" w:lineRule="auto"/>
-        <w:ind w:left="0"/>
-        <w:jc w:val="left"/>
-        <w:rPr>
-          <w:color w:val="000000"/>
-        </w:rPr>
-      </w:pPr>
-    </w:p>
-    <w:p>
-      <w:pPr>
-        <w:spacing w:line="240" w:lineRule="auto"/>
-        <w:ind w:left="0"/>
-        <w:jc w:val="left"/>
-        <w:rPr>
-          <w:color w:val="000000"/>
-        </w:rPr>
-      </w:pPr>
-    </w:p>
-    <w:p>
-      <w:pPr>
-        <w:spacing w:line="240" w:lineRule="auto"/>
-        <w:ind w:left="0"/>
-        <w:jc w:val="left"/>
-        <w:rPr>
-          <w:color w:val="000000"/>
-        </w:rPr>
-      </w:pPr>
-    </w:p>
-    <w:p>
-      <w:pPr>
-        <w:spacing w:line="240" w:lineRule="auto"/>
-        <w:ind w:left="0"/>
-        <w:jc w:val="left"/>
-        <w:rPr>
-          <w:color w:val="000000"/>
-        </w:rPr>
-      </w:pPr>
-    </w:p>
-    <w:p>
-      <w:pPr>
-        <w:spacing w:line="240" w:lineRule="auto"/>
-        <w:ind w:left="0"/>
-        <w:jc w:val="left"/>
-        <w:rPr>
-          <w:color w:val="000000"/>
-        </w:rPr>
-      </w:pPr>
-    </w:p>
-    <w:p>
-      <w:pPr>
-        <w:spacing w:line="240" w:lineRule="auto"/>
-        <w:ind w:left="0"/>
-        <w:jc w:val="left"/>
-        <w:rPr>
-          <w:color w:val="000000"/>
-        </w:rPr>
-      </w:pPr>
-    </w:p>
-    <w:p>
-      <w:pPr>
-        <w:spacing w:line="240" w:lineRule="auto"/>
-        <w:ind w:left="0"/>
-        <w:jc w:val="left"/>
+          <w:sz w:val="20"/>
+          <w:szCs w:val="20"/>
+          <w:lang w:val="es-AR"/>
+        </w:rPr>
+      </w:pPr>
+      <w:r>
         <w:rPr>
           <w:color w:val="000000"/>
           <w:sz w:val="20"/>
           <w:szCs w:val="20"/>
-        </w:rPr>
-      </w:pPr>
+          <w:lang w:val="es-AR"/>
+        </w:rPr>
+        <w:t xml:space="preserve"> </w:t>
+      </w:r>
+      <w:hyperlink r:id="rId10" w:history="1">
+        <w:r>
+          <w:rPr>
+            <w:rStyle w:val="Hipervnculo"/>
+            <w:sz w:val="20"/>
+            <w:szCs w:val="20"/>
+            <w:lang w:val="es-AR"/>
+          </w:rPr>
+          <w:t>https://www.facebook.com/Frecuencia5Dretiros/#</w:t>
+        </w:r>
+      </w:hyperlink>
     </w:p>
     <w:p>
       <w:pPr>
         <w:spacing w:line="240" w:lineRule="auto"/>
         <w:ind w:left="0"/>
-        <w:jc w:val="left"/>
         <w:rPr>
           <w:color w:val="000000"/>
           <w:sz w:val="20"/>
           <w:szCs w:val="20"/>
-        </w:rPr>
-      </w:pPr>
-    </w:p>
-    <w:p>
-      <w:pPr>
-        <w:spacing w:line="240" w:lineRule="auto"/>
-        <w:ind w:left="0"/>
-        <w:jc w:val="left"/>
-        <w:rPr>
-          <w:sz w:val="20"/>
-          <w:szCs w:val="20"/>
+          <w:lang w:val="es-AR"/>
         </w:rPr>
       </w:pPr>
       <w:r>
@@ -2156,17 +1985,9 @@
           <w:lang w:val="es-AR"/>
         </w:rPr>
         <w:drawing>
-          <wp:anchor distT="0" distB="0" distL="114300" distR="114300" simplePos="0" relativeHeight="251660288" behindDoc="0" locked="0" layoutInCell="1" allowOverlap="1" wp14:anchorId="7F3CC947" wp14:editId="5A029F07">
-            <wp:simplePos x="0" y="0"/>
-            <wp:positionH relativeFrom="margin">
-              <wp:posOffset>-139700</wp:posOffset>
-            </wp:positionH>
-            <wp:positionV relativeFrom="margin">
-              <wp:posOffset>4314190</wp:posOffset>
-            </wp:positionV>
-            <wp:extent cx="5114290" cy="2987675"/>
-            <wp:effectExtent l="0" t="0" r="0" b="3175"/>
-            <wp:wrapSquare wrapText="bothSides"/>
+          <wp:inline distT="0" distB="0" distL="0" distR="0" wp14:anchorId="04216D33" wp14:editId="094CADD9">
+            <wp:extent cx="4958849" cy="2896870"/>
+            <wp:effectExtent l="0" t="0" r="0" b="0"/>
             <wp:docPr id="6" name="Imagen 6" descr="C:\Users\ADMIN\AppData\Local\Microsoft\Windows\INetCache\Content.Word\Sin título.png"/>
             <wp:cNvGraphicFramePr>
               <a:graphicFrameLocks xmlns:a="http://schemas.openxmlformats.org/drawingml/2006/main" noChangeAspect="1"/>
@@ -2181,7 +2002,7 @@
                     </pic:cNvPicPr>
                   </pic:nvPicPr>
                   <pic:blipFill>
-                    <a:blip r:embed="rId8">
+                    <a:blip r:embed="rId11">
                       <a:extLst>
                         <a:ext uri="{28A0092B-C50C-407E-A947-70E740481C1C}">
                           <a14:useLocalDpi xmlns:a14="http://schemas.microsoft.com/office/drawing/2010/main" val="0"/>
@@ -2196,7 +2017,7 @@
                   <pic:spPr bwMode="auto">
                     <a:xfrm>
                       <a:off x="0" y="0"/>
-                      <a:ext cx="5114290" cy="2987675"/>
+                      <a:ext cx="4976774" cy="2907342"/>
                     </a:xfrm>
                     <a:prstGeom prst="rect">
                       <a:avLst/>
@@ -2209,16 +2030,8 @@
                 </pic:pic>
               </a:graphicData>
             </a:graphic>
-          </wp:anchor>
+          </wp:inline>
         </w:drawing>
-      </w:r>
-      <w:r>
-        <w:rPr>
-          <w:color w:val="000000"/>
-          <w:sz w:val="20"/>
-          <w:szCs w:val="20"/>
-        </w:rPr>
-        <w:t>https://www.facebook.com/Frecuencia5Dretiros/#</w:t>
       </w:r>
     </w:p>
     <w:p>
@@ -2227,6 +2040,12 @@
         <w:spacing w:before="0" w:beforeAutospacing="0" w:after="200" w:afterAutospacing="0"/>
         <w:ind w:right="-531"/>
         <w:jc w:val="both"/>
+        <w:rPr>
+          <w:rFonts w:ascii="Arial" w:hAnsi="Arial" w:cs="Arial"/>
+          <w:sz w:val="20"/>
+          <w:szCs w:val="20"/>
+          <w:lang w:val="en"/>
+        </w:rPr>
       </w:pPr>
     </w:p>
     <w:p>
@@ -2235,103 +2054,20 @@
         <w:spacing w:before="0" w:beforeAutospacing="0" w:after="200" w:afterAutospacing="0"/>
         <w:ind w:right="-531"/>
         <w:jc w:val="both"/>
-      </w:pPr>
-    </w:p>
-    <w:p>
-      <w:pPr>
-        <w:pStyle w:val="NormalWeb"/>
-        <w:spacing w:before="0" w:beforeAutospacing="0" w:after="200" w:afterAutospacing="0"/>
-        <w:ind w:right="-531"/>
-        <w:jc w:val="both"/>
-      </w:pPr>
-    </w:p>
-    <w:p>
-      <w:pPr>
-        <w:pStyle w:val="NormalWeb"/>
-        <w:spacing w:before="0" w:beforeAutospacing="0" w:after="200" w:afterAutospacing="0"/>
-        <w:ind w:right="-531"/>
-        <w:jc w:val="both"/>
-      </w:pPr>
-    </w:p>
-    <w:p>
-      <w:pPr>
-        <w:pStyle w:val="NormalWeb"/>
-        <w:spacing w:before="0" w:beforeAutospacing="0" w:after="200" w:afterAutospacing="0"/>
-        <w:ind w:right="-531"/>
-        <w:jc w:val="both"/>
-      </w:pPr>
-    </w:p>
-    <w:p>
-      <w:pPr>
-        <w:pStyle w:val="NormalWeb"/>
-        <w:spacing w:before="0" w:beforeAutospacing="0" w:after="200" w:afterAutospacing="0"/>
-        <w:ind w:right="-531"/>
-        <w:jc w:val="both"/>
-      </w:pPr>
-    </w:p>
-    <w:p>
-      <w:pPr>
-        <w:pStyle w:val="NormalWeb"/>
-        <w:spacing w:before="0" w:beforeAutospacing="0" w:after="200" w:afterAutospacing="0"/>
-        <w:ind w:right="-531"/>
-        <w:jc w:val="both"/>
-      </w:pPr>
-    </w:p>
-    <w:p>
-      <w:pPr>
-        <w:pStyle w:val="NormalWeb"/>
-        <w:spacing w:before="0" w:beforeAutospacing="0" w:after="200" w:afterAutospacing="0"/>
-        <w:ind w:right="-531"/>
-        <w:jc w:val="both"/>
-      </w:pPr>
-    </w:p>
-    <w:p>
-      <w:pPr>
-        <w:pStyle w:val="NormalWeb"/>
-        <w:spacing w:before="0" w:beforeAutospacing="0" w:after="200" w:afterAutospacing="0"/>
-        <w:ind w:right="-531"/>
-        <w:jc w:val="both"/>
-      </w:pPr>
-    </w:p>
-    <w:p>
-      <w:pPr>
-        <w:pStyle w:val="NormalWeb"/>
-        <w:spacing w:before="0" w:beforeAutospacing="0" w:after="200" w:afterAutospacing="0"/>
-        <w:ind w:right="-531"/>
-        <w:jc w:val="both"/>
-      </w:pPr>
-    </w:p>
-    <w:p>
-      <w:pPr>
-        <w:pStyle w:val="NormalWeb"/>
-        <w:spacing w:before="0" w:beforeAutospacing="0" w:after="200" w:afterAutospacing="0"/>
-        <w:ind w:right="-531"/>
-        <w:jc w:val="both"/>
         <w:rPr>
           <w:sz w:val="20"/>
           <w:szCs w:val="20"/>
-        </w:rPr>
-      </w:pPr>
-    </w:p>
-    <w:p>
-      <w:pPr>
-        <w:pStyle w:val="NormalWeb"/>
-        <w:spacing w:before="0" w:beforeAutospacing="0" w:after="200" w:afterAutospacing="0"/>
-        <w:ind w:right="-531"/>
-        <w:jc w:val="both"/>
-        <w:rPr>
-          <w:sz w:val="20"/>
-          <w:szCs w:val="20"/>
-        </w:rPr>
-      </w:pPr>
-      <w:hyperlink r:id="rId9" w:history="1">
+          <w:lang w:val="en"/>
+        </w:rPr>
+      </w:pPr>
+      <w:hyperlink r:id="rId12" w:history="1">
         <w:r>
           <w:rPr>
             <w:rStyle w:val="Hipervnculo"/>
             <w:rFonts w:ascii="Arial" w:hAnsi="Arial" w:cs="Arial"/>
-            <w:color w:val="1155CC"/>
             <w:sz w:val="20"/>
             <w:szCs w:val="20"/>
+            <w:lang w:val="en"/>
           </w:rPr>
           <w:t>https://v0-retirosenlanaturalezaok.vercel.app</w:t>
         </w:r>
@@ -2345,29 +2081,30 @@
           <w:color w:val="FFAA00"/>
           <w:sz w:val="20"/>
           <w:szCs w:val="20"/>
-          <w:lang w:val="es-AR"/>
-        </w:rPr>
-      </w:pPr>
-      <w:r>
+        </w:rPr>
+      </w:pPr>
+    </w:p>
+    <w:p>
+      <w:pPr>
+        <w:ind w:left="0"/>
         <w:rPr>
           <w:rFonts w:ascii="Open Sans ExtraBold" w:eastAsia="Open Sans ExtraBold" w:hAnsi="Open Sans ExtraBold" w:cs="Open Sans ExtraBold"/>
           <w:color w:val="FFAA00"/>
           <w:sz w:val="20"/>
           <w:szCs w:val="20"/>
-          <w:lang w:val="es-AR"/>
-        </w:rPr>
-        <w:lastRenderedPageBreak/>
-        <w:t>E</w:t>
-      </w:r>
+          <w:lang w:val="es-ES"/>
+        </w:rPr>
+      </w:pPr>
       <w:r>
         <w:rPr>
           <w:rFonts w:ascii="Open Sans ExtraBold" w:eastAsia="Open Sans ExtraBold" w:hAnsi="Open Sans ExtraBold" w:cs="Open Sans ExtraBold"/>
           <w:color w:val="FFAA00"/>
           <w:sz w:val="20"/>
           <w:szCs w:val="20"/>
-          <w:lang w:val="es-AR"/>
-        </w:rPr>
-        <w:t>LICITACION</w:t>
+          <w:lang w:val="es-ES"/>
+        </w:rPr>
+        <w:lastRenderedPageBreak/>
+        <w:t>ELICITACION</w:t>
       </w:r>
     </w:p>
     <w:p>
@@ -2423,55 +2160,7 @@
         <w:rPr>
           <w:lang w:val="es-AR"/>
         </w:rPr>
-        <w:t xml:space="preserve">Ellas son clientes y usuarios, pagan y usan LO que hace ella: ve un retiro, manda un mensaje que quiere más información. A veces la mandan por el mismo chat de </w:t>
-      </w:r>
-      <w:r>
-        <w:rPr>
-          <w:lang w:val="es-AR"/>
-        </w:rPr>
-        <w:t>Instagram</w:t>
-      </w:r>
-      <w:r>
-        <w:rPr>
-          <w:lang w:val="es-AR"/>
-        </w:rPr>
-        <w:t xml:space="preserve">, otras veces la mandan por </w:t>
-      </w:r>
-      <w:r>
-        <w:rPr>
-          <w:lang w:val="es-AR"/>
-        </w:rPr>
-        <w:t>WhatsApp</w:t>
-      </w:r>
-      <w:r>
-        <w:rPr>
-          <w:lang w:val="es-AR"/>
-        </w:rPr>
-        <w:t xml:space="preserve">, le piden el </w:t>
-      </w:r>
-      <w:r>
-        <w:rPr>
-          <w:lang w:val="es-AR"/>
-        </w:rPr>
-        <w:t>número</w:t>
-      </w:r>
-      <w:r>
-        <w:rPr>
-          <w:lang w:val="es-AR"/>
-        </w:rPr>
-        <w:t xml:space="preserve"> de </w:t>
-      </w:r>
-      <w:r>
-        <w:rPr>
-          <w:lang w:val="es-AR"/>
-        </w:rPr>
-        <w:t>teléfono</w:t>
-      </w:r>
-      <w:r>
-        <w:rPr>
-          <w:lang w:val="es-AR"/>
-        </w:rPr>
-        <w:t>. Otras por mail.</w:t>
+        <w:t>Ellas son clientes y usuarios, pagan y usan LO que hace ella: ve un retiro, manda un mensaje que quiere más información. A veces la mandan por el mismo chat de Instagram, otras veces la mandan por WhatsApp, le piden el número de teléfono. Otras por mail.</w:t>
       </w:r>
     </w:p>
     <w:p>
@@ -2485,31 +2174,7 @@
         <w:rPr>
           <w:lang w:val="es-AR"/>
         </w:rPr>
-        <w:t xml:space="preserve">Tiene una planilla de </w:t>
-      </w:r>
-      <w:r>
-        <w:rPr>
-          <w:lang w:val="es-AR"/>
-        </w:rPr>
-        <w:t>Excel</w:t>
-      </w:r>
-      <w:r>
-        <w:rPr>
-          <w:lang w:val="es-AR"/>
-        </w:rPr>
-        <w:t xml:space="preserve">. Pone la fecha del retiro, desde hasta cuándo (Desde que hora hasta que hora), como se llama el retiro, donde va a ser el retiro, De que va a tratar el retiro (Meditación, tracking, yoga, ceremonia del cacao, regresión a vidas pasadas, senderismo, armonización sonora). En su </w:t>
-      </w:r>
-      <w:r>
-        <w:rPr>
-          <w:lang w:val="es-AR"/>
-        </w:rPr>
-        <w:t>Excel</w:t>
-      </w:r>
-      <w:r>
-        <w:rPr>
-          <w:lang w:val="es-AR"/>
-        </w:rPr>
-        <w:t xml:space="preserve"> también coloca el costo y CON QUIÉN HABLÓ (Nombre de una persona, o Página). Cuando le mandan un audio por </w:t>
+        <w:t xml:space="preserve">Tiene una planilla de Excel. Pone la fecha del retiro, desde hasta cuándo (Desde que hora hasta que hora), como se llama el retiro, donde va a ser el retiro, De que va a tratar el retiro (Meditación, tracking, yoga, ceremonia del cacao, regresión a vidas pasadas, senderismo, armonización sonora). En su Excel también coloca el costo y CON QUIÉN HABLÓ (Nombre de una persona, o Página). Cuando le mandan un audio por </w:t>
       </w:r>
       <w:proofErr w:type="spellStart"/>
       <w:r>
@@ -2523,19 +2188,7 @@
         <w:rPr>
           <w:lang w:val="es-AR"/>
         </w:rPr>
-        <w:t xml:space="preserve"> o por mail o por donde sea, cambia el </w:t>
-      </w:r>
-      <w:r>
-        <w:rPr>
-          <w:lang w:val="es-AR"/>
-        </w:rPr>
-        <w:t>Excel</w:t>
-      </w:r>
-      <w:r>
-        <w:rPr>
-          <w:lang w:val="es-AR"/>
-        </w:rPr>
-        <w:t xml:space="preserve"> en la parte de con quien hablo, cambia de la página a la persona. CON ESE EXCEL a veces le va poniendo un ESTADO (lo reserve, me interesa, lo pague). Tal vez entra el dato si entran cancelaciones o no.</w:t>
+        <w:t xml:space="preserve"> o por mail o por donde sea, cambia el Excel en la parte de con quien hablo, cambia de la página a la persona. CON ESE EXCEL a veces le va poniendo un ESTADO (lo reserve, me interesa, lo pague). Tal vez entra el dato si entran cancelaciones o no.</w:t>
       </w:r>
     </w:p>
     <w:p>
@@ -2549,34 +2202,30 @@
         <w:rPr>
           <w:lang w:val="es-AR"/>
         </w:rPr>
-        <w:t xml:space="preserve">Le gustaría tener eso en una app para que le simplifique la elección de los retiros. PONER FILTROS, ALERTAS PARA QUE LLEGUEN POR CORREO (alertas que se acerca uno que le interesa, que tiene que pagar el saldo) LA NECESIDAD BÁSICA es organizarse. Un plus sería buscar los retiros que quiere. Le gustaría TENER LOS RETIROS que le interesan, tenerlos organizados, si tiene que buscar un retiro en un lugar, con determinadas actividades, fechas. Que lo pueda buscar. Si tiene que contestar algo que le mandaron, si </w:t>
+        <w:t xml:space="preserve">Le gustaría tener eso en una app para que le simplifique la elección de los retiros. PONER FILTROS, ALERTAS PARA QUE LLEGUEN POR CORREO (alertas que se acerca uno que le interesa, que tiene que pagar el saldo) LA NECESIDAD BÁSICA es organizarse. Un plus sería buscar los retiros que quiere. Le gustaría TENER LOS RETIROS que le interesan, tenerlos organizados, si tiene que buscar un retiro en un lugar, con determinadas actividades, fechas. Que lo pueda buscar. Si tiene que contestar algo que le mandaron, si tiene que pagar. TAMBIÉN SACAR Los retiros que no le interesan. Transferencia o efectivo </w:t>
       </w:r>
       <w:r>
         <w:rPr>
           <w:lang w:val="es-AR"/>
         </w:rPr>
         <w:lastRenderedPageBreak/>
-        <w:t xml:space="preserve">tiene que pagar. TAMBIÉN SACAR Los retiros que no le interesan. Transferencia o efectivo en el lugar. </w:t>
-      </w:r>
-      <w:r>
-        <w:rPr>
-          <w:lang w:val="es-AR"/>
-        </w:rPr>
-        <w:t>Otro</w:t>
-      </w:r>
-      <w:r>
-        <w:rPr>
-          <w:lang w:val="es-AR"/>
-        </w:rPr>
-        <w:t xml:space="preserve"> dato puede ser el acompañante con el que va a cada retiro. TENER FOTOS DEL LUGAR. Para que se fije PUEDE TENER VALORACIÓN PERSONAL. Porque suele repetir retiros porque le gustaron Estaría bueno que pueda enviar características del retiro a un amigo, para invitar y que vea si se suma o no a ella. MANDAR RECORDATORIOS (fecha de inicio, pagos) NO HAY CONTRATO NO PONE COMENTARIOS DE OTRAS PERSONAS DE LOS RETIROS Se ve si es real o no el retiro por reseñas anteriores SABER CUANTO GASTO mensual o anual en retiros, REGISTRO DE GASTOS </w:t>
+        <w:t>en el lugar. Otro dato puede ser el acompañante con el que va a cada retiro. TENER FOTOS DEL LUGAR. Para que se fije PUEDE TENER VALORACIÓN PERSONAL. Porque suele repetir retiros porque le gustaron Estaría bueno que pueda enviar características del retiro a un amigo, para invitar y que vea si se suma o no a ella. MANDAR RECORDATORIOS (fecha de inicio, pagos) NO HAY CONTRATO NO PONE COMENTARIOS DE OTRAS PERSONAS DE LOS RETIROS Se ve si es real o no el retiro por reseñas anteriores SABER CUANTO GASTO mensual o anual en retiros, REGISTRO DE GASTOS</w:t>
+      </w:r>
+      <w:r>
+        <w:rPr>
+          <w:lang w:val="es-AR"/>
+        </w:rPr>
+        <w:t>.</w:t>
       </w:r>
     </w:p>
     <w:sectPr>
-      <w:headerReference w:type="default" r:id="rId10"/>
+      <w:headerReference w:type="default" r:id="rId13"/>
       <w:pgSz w:w="12240" w:h="15840"/>
       <w:pgMar w:top="1440" w:right="1440" w:bottom="1440" w:left="1440" w:header="720" w:footer="720" w:gutter="0"/>
       <w:pgNumType w:start="1"/>
       <w:cols w:space="720"/>
+      <w:titlePg/>
+      <w:docGrid w:linePitch="326"/>
     </w:sectPr>
   </w:body>
 </w:document>
@@ -2913,8 +2562,160 @@
       </w:rPr>
     </w:lvl>
   </w:abstractNum>
+  <w:abstractNum w:abstractNumId="1" w15:restartNumberingAfterBreak="0">
+    <w:nsid w:val="3FBB2A00"/>
+    <w:multiLevelType w:val="multilevel"/>
+    <w:tmpl w:val="E3641A00"/>
+    <w:lvl w:ilvl="0">
+      <w:start w:val="1"/>
+      <w:numFmt w:val="bullet"/>
+      <w:lvlText w:val=""/>
+      <w:lvlJc w:val="left"/>
+      <w:pPr>
+        <w:tabs>
+          <w:tab w:val="num" w:pos="720"/>
+        </w:tabs>
+        <w:ind w:left="720" w:hanging="360"/>
+      </w:pPr>
+      <w:rPr>
+        <w:rFonts w:ascii="Symbol" w:hAnsi="Symbol" w:hint="default"/>
+        <w:sz w:val="20"/>
+      </w:rPr>
+    </w:lvl>
+    <w:lvl w:ilvl="1" w:tentative="1">
+      <w:start w:val="1"/>
+      <w:numFmt w:val="bullet"/>
+      <w:lvlText w:val="o"/>
+      <w:lvlJc w:val="left"/>
+      <w:pPr>
+        <w:tabs>
+          <w:tab w:val="num" w:pos="1440"/>
+        </w:tabs>
+        <w:ind w:left="1440" w:hanging="360"/>
+      </w:pPr>
+      <w:rPr>
+        <w:rFonts w:ascii="Courier New" w:hAnsi="Courier New" w:hint="default"/>
+        <w:sz w:val="20"/>
+      </w:rPr>
+    </w:lvl>
+    <w:lvl w:ilvl="2" w:tentative="1">
+      <w:start w:val="1"/>
+      <w:numFmt w:val="bullet"/>
+      <w:lvlText w:val=""/>
+      <w:lvlJc w:val="left"/>
+      <w:pPr>
+        <w:tabs>
+          <w:tab w:val="num" w:pos="2160"/>
+        </w:tabs>
+        <w:ind w:left="2160" w:hanging="360"/>
+      </w:pPr>
+      <w:rPr>
+        <w:rFonts w:ascii="Wingdings" w:hAnsi="Wingdings" w:hint="default"/>
+        <w:sz w:val="20"/>
+      </w:rPr>
+    </w:lvl>
+    <w:lvl w:ilvl="3" w:tentative="1">
+      <w:start w:val="1"/>
+      <w:numFmt w:val="bullet"/>
+      <w:lvlText w:val=""/>
+      <w:lvlJc w:val="left"/>
+      <w:pPr>
+        <w:tabs>
+          <w:tab w:val="num" w:pos="2880"/>
+        </w:tabs>
+        <w:ind w:left="2880" w:hanging="360"/>
+      </w:pPr>
+      <w:rPr>
+        <w:rFonts w:ascii="Wingdings" w:hAnsi="Wingdings" w:hint="default"/>
+        <w:sz w:val="20"/>
+      </w:rPr>
+    </w:lvl>
+    <w:lvl w:ilvl="4" w:tentative="1">
+      <w:start w:val="1"/>
+      <w:numFmt w:val="bullet"/>
+      <w:lvlText w:val=""/>
+      <w:lvlJc w:val="left"/>
+      <w:pPr>
+        <w:tabs>
+          <w:tab w:val="num" w:pos="3600"/>
+        </w:tabs>
+        <w:ind w:left="3600" w:hanging="360"/>
+      </w:pPr>
+      <w:rPr>
+        <w:rFonts w:ascii="Wingdings" w:hAnsi="Wingdings" w:hint="default"/>
+        <w:sz w:val="20"/>
+      </w:rPr>
+    </w:lvl>
+    <w:lvl w:ilvl="5" w:tentative="1">
+      <w:start w:val="1"/>
+      <w:numFmt w:val="bullet"/>
+      <w:lvlText w:val=""/>
+      <w:lvlJc w:val="left"/>
+      <w:pPr>
+        <w:tabs>
+          <w:tab w:val="num" w:pos="4320"/>
+        </w:tabs>
+        <w:ind w:left="4320" w:hanging="360"/>
+      </w:pPr>
+      <w:rPr>
+        <w:rFonts w:ascii="Wingdings" w:hAnsi="Wingdings" w:hint="default"/>
+        <w:sz w:val="20"/>
+      </w:rPr>
+    </w:lvl>
+    <w:lvl w:ilvl="6" w:tentative="1">
+      <w:start w:val="1"/>
+      <w:numFmt w:val="bullet"/>
+      <w:lvlText w:val=""/>
+      <w:lvlJc w:val="left"/>
+      <w:pPr>
+        <w:tabs>
+          <w:tab w:val="num" w:pos="5040"/>
+        </w:tabs>
+        <w:ind w:left="5040" w:hanging="360"/>
+      </w:pPr>
+      <w:rPr>
+        <w:rFonts w:ascii="Wingdings" w:hAnsi="Wingdings" w:hint="default"/>
+        <w:sz w:val="20"/>
+      </w:rPr>
+    </w:lvl>
+    <w:lvl w:ilvl="7" w:tentative="1">
+      <w:start w:val="1"/>
+      <w:numFmt w:val="bullet"/>
+      <w:lvlText w:val=""/>
+      <w:lvlJc w:val="left"/>
+      <w:pPr>
+        <w:tabs>
+          <w:tab w:val="num" w:pos="5760"/>
+        </w:tabs>
+        <w:ind w:left="5760" w:hanging="360"/>
+      </w:pPr>
+      <w:rPr>
+        <w:rFonts w:ascii="Wingdings" w:hAnsi="Wingdings" w:hint="default"/>
+        <w:sz w:val="20"/>
+      </w:rPr>
+    </w:lvl>
+    <w:lvl w:ilvl="8" w:tentative="1">
+      <w:start w:val="1"/>
+      <w:numFmt w:val="bullet"/>
+      <w:lvlText w:val=""/>
+      <w:lvlJc w:val="left"/>
+      <w:pPr>
+        <w:tabs>
+          <w:tab w:val="num" w:pos="6480"/>
+        </w:tabs>
+        <w:ind w:left="6480" w:hanging="360"/>
+      </w:pPr>
+      <w:rPr>
+        <w:rFonts w:ascii="Wingdings" w:hAnsi="Wingdings" w:hint="default"/>
+        <w:sz w:val="20"/>
+      </w:rPr>
+    </w:lvl>
+  </w:abstractNum>
   <w:num w:numId="1" w16cid:durableId="1038775378">
     <w:abstractNumId w:val="0"/>
+  </w:num>
+  <w:num w:numId="2" w16cid:durableId="1616211793">
+    <w:abstractNumId w:val="1"/>
   </w:num>
 </w:numbering>
 </file>
@@ -2932,7 +2733,7 @@
     </w:rPrDefault>
     <w:pPrDefault>
       <w:pPr>
-        <w:spacing w:after="200" w:line="360" w:lineRule="auto"/>
+        <w:spacing w:after="120" w:line="360" w:lineRule="auto"/>
         <w:ind w:left="720" w:right="-531"/>
         <w:jc w:val="both"/>
       </w:pPr>
@@ -3418,6 +3219,7 @@
   <w:style w:type="character" w:default="1" w:styleId="Fuentedeprrafopredeter">
     <w:name w:val="Default Paragraph Font"/>
     <w:uiPriority w:val="1"/>
+    <w:semiHidden/>
     <w:unhideWhenUsed/>
   </w:style>
   <w:style w:type="table" w:default="1" w:styleId="Tablanormal">
@@ -3587,6 +3389,18 @@
     <w:rPr>
       <w:color w:val="0000FF"/>
       <w:u w:val="single"/>
+    </w:rPr>
+  </w:style>
+  <w:style w:type="character" w:styleId="Mencinsinresolver">
+    <w:name w:val="Unresolved Mention"/>
+    <w:basedOn w:val="Fuentedeprrafopredeter"/>
+    <w:uiPriority w:val="99"/>
+    <w:semiHidden/>
+    <w:unhideWhenUsed/>
+    <w:rsid w:val="00465D85"/>
+    <w:rPr>
+      <w:color w:val="605E5C"/>
+      <w:shd w:val="clear" w:color="auto" w:fill="E1DFDD"/>
     </w:rPr>
   </w:style>
 </w:styles>

</xml_diff>

<commit_message>
Eliminación del requerimiento 'Eliminar retiro'
</commit_message>
<xml_diff>
--- a/TPI Análisis de sistemas.docx
+++ b/TPI Análisis de sistemas.docx
@@ -1308,6 +1308,11 @@
               <w:spacing w:line="240" w:lineRule="auto"/>
               <w:jc w:val="left"/>
               <w:rPr>
+                <w:color w:val="FFAA00"/>
+              </w:rPr>
+            </w:pPr>
+            <w:r>
+              <w:rPr>
                 <w:rFonts w:ascii="Open Sans ExtraBold" w:eastAsia="Open Sans ExtraBold" w:hAnsi="Open Sans ExtraBold" w:cs="Open Sans ExtraBold"/>
                 <w:b/>
                 <w:bCs/>
@@ -1315,7 +1320,8 @@
                 <w:sz w:val="20"/>
                 <w:szCs w:val="20"/>
               </w:rPr>
-            </w:pPr>
+              <w:t>00</w:t>
+            </w:r>
             <w:r>
               <w:rPr>
                 <w:rFonts w:ascii="Open Sans ExtraBold" w:eastAsia="Open Sans ExtraBold" w:hAnsi="Open Sans ExtraBold" w:cs="Open Sans ExtraBold"/>
@@ -1325,68 +1331,7 @@
                 <w:sz w:val="20"/>
                 <w:szCs w:val="20"/>
               </w:rPr>
-              <w:t>005</w:t>
-            </w:r>
-          </w:p>
-        </w:tc>
-        <w:tc>
-          <w:tcPr>
-            <w:tcW w:w="8565" w:type="dxa"/>
-            <w:tcMar>
-              <w:top w:w="5" w:type="dxa"/>
-              <w:left w:w="5" w:type="dxa"/>
-              <w:bottom w:w="5" w:type="dxa"/>
-              <w:right w:w="5" w:type="dxa"/>
-            </w:tcMar>
-            <w:vAlign w:val="center"/>
-          </w:tcPr>
-          <w:p>
-            <w:pPr>
-              <w:spacing w:after="0" w:line="240" w:lineRule="auto"/>
-              <w:ind w:left="0" w:right="61"/>
-              <w:rPr>
-                <w:lang w:val="es-AR"/>
-              </w:rPr>
-            </w:pPr>
-            <w:r>
-              <w:rPr>
-                <w:lang w:val="es-AR"/>
-              </w:rPr>
-              <w:t>Eliminar retiro registrado. El sistema deberá permitir eliminar los retiros registrados de uno o más a la vez.</w:t>
-            </w:r>
-          </w:p>
-        </w:tc>
-      </w:tr>
-      <w:tr>
-        <w:tc>
-          <w:tcPr>
-            <w:tcW w:w="1335" w:type="dxa"/>
-            <w:tcMar>
-              <w:top w:w="5" w:type="dxa"/>
-              <w:left w:w="5" w:type="dxa"/>
-              <w:bottom w:w="5" w:type="dxa"/>
-              <w:right w:w="5" w:type="dxa"/>
-            </w:tcMar>
-            <w:vAlign w:val="center"/>
-          </w:tcPr>
-          <w:p>
-            <w:pPr>
-              <w:spacing w:line="240" w:lineRule="auto"/>
-              <w:jc w:val="left"/>
-              <w:rPr>
-                <w:color w:val="FFAA00"/>
-              </w:rPr>
-            </w:pPr>
-            <w:r>
-              <w:rPr>
-                <w:rFonts w:ascii="Open Sans ExtraBold" w:eastAsia="Open Sans ExtraBold" w:hAnsi="Open Sans ExtraBold" w:cs="Open Sans ExtraBold"/>
-                <w:b/>
-                <w:bCs/>
-                <w:color w:val="FFAA00"/>
-                <w:sz w:val="20"/>
-                <w:szCs w:val="20"/>
-              </w:rPr>
-              <w:t>006</w:t>
+              <w:t>5</w:t>
             </w:r>
           </w:p>
           <w:p>
@@ -1469,7 +1414,18 @@
                 <w:sz w:val="20"/>
                 <w:szCs w:val="20"/>
               </w:rPr>
-              <w:t>007</w:t>
+              <w:t>00</w:t>
+            </w:r>
+            <w:r>
+              <w:rPr>
+                <w:rFonts w:ascii="Open Sans ExtraBold" w:eastAsia="Open Sans ExtraBold" w:hAnsi="Open Sans ExtraBold" w:cs="Open Sans ExtraBold"/>
+                <w:b/>
+                <w:bCs/>
+                <w:color w:val="FFAA00"/>
+                <w:sz w:val="20"/>
+                <w:szCs w:val="20"/>
+              </w:rPr>
+              <w:t>6</w:t>
             </w:r>
           </w:p>
           <w:p>
@@ -1552,7 +1508,18 @@
                 <w:sz w:val="20"/>
                 <w:szCs w:val="20"/>
               </w:rPr>
-              <w:t>008</w:t>
+              <w:t>00</w:t>
+            </w:r>
+            <w:r>
+              <w:rPr>
+                <w:rFonts w:ascii="Open Sans ExtraBold" w:eastAsia="Open Sans ExtraBold" w:hAnsi="Open Sans ExtraBold" w:cs="Open Sans ExtraBold"/>
+                <w:b/>
+                <w:bCs/>
+                <w:color w:val="FFAA00"/>
+                <w:sz w:val="20"/>
+                <w:szCs w:val="20"/>
+              </w:rPr>
+              <w:t>7</w:t>
             </w:r>
           </w:p>
           <w:p>
@@ -1635,7 +1602,18 @@
                 <w:sz w:val="20"/>
                 <w:szCs w:val="20"/>
               </w:rPr>
-              <w:t>009</w:t>
+              <w:t>00</w:t>
+            </w:r>
+            <w:r>
+              <w:rPr>
+                <w:rFonts w:ascii="Open Sans ExtraBold" w:eastAsia="Open Sans ExtraBold" w:hAnsi="Open Sans ExtraBold" w:cs="Open Sans ExtraBold"/>
+                <w:b/>
+                <w:bCs/>
+                <w:color w:val="FFAA00"/>
+                <w:sz w:val="20"/>
+                <w:szCs w:val="20"/>
+              </w:rPr>
+              <w:t>8</w:t>
             </w:r>
           </w:p>
           <w:p>
@@ -1727,7 +1705,18 @@
                 <w:sz w:val="20"/>
                 <w:szCs w:val="20"/>
               </w:rPr>
-              <w:t>010</w:t>
+              <w:t>0</w:t>
+            </w:r>
+            <w:r>
+              <w:rPr>
+                <w:rFonts w:ascii="Open Sans ExtraBold" w:eastAsia="Open Sans ExtraBold" w:hAnsi="Open Sans ExtraBold" w:cs="Open Sans ExtraBold"/>
+                <w:b/>
+                <w:bCs/>
+                <w:color w:val="FFAA00"/>
+                <w:sz w:val="20"/>
+                <w:szCs w:val="20"/>
+              </w:rPr>
+              <w:t>09</w:t>
             </w:r>
           </w:p>
           <w:p>

</xml_diff>